<commit_message>
Document cached reproducibility workflow
</commit_message>
<xml_diff>
--- a/manuscript_vital_with_figures_tables.docx
+++ b/manuscript_vital_with_figures_tables.docx
@@ -122,6 +122,11 @@
       </w:r>
     </w:p>
     <w:p>
+      <w:r>
+        <w:t>To reduce dependence on changing external APIs, the April 21, 2026 freeze is preserved as cached intermediate files in the project repository. ClinVar-derived variant tables, gnomAD exact-match tables, population AF tables, exome-genome comparison files, VITAL score tables, historical 2023-to-2026 prediction tables, and external-domain stress-test outputs are all written as machine-readable CSV/TSV files under data/processed/ and supplementary_tables/. The API pipeline also writes .meta.json cache metadata for core ClinVar, gnomAD, and coverage caches, recording the gene list, dataset, cache type, and pipeline settings used to produce each cache.</w:t>
+      </w:r>
+    </w:p>
+    <w:p>
       <w:pPr>
         <w:pStyle w:val="Heading2"/>
       </w:pPr>
@@ -177,6 +182,11 @@
     <w:p>
       <w:r>
         <w:t>This design prevents silent conversion of missing frequency evidence into false rarity. Variants without observed AF retain missing AF fields and are assigned a gray no-frequency-evidence VITAL band.</w:t>
+      </w:r>
+    </w:p>
+    <w:p>
+      <w:r>
+        <w:t>The analysis can be reproduced in two modes. The full online mode re-queries NCBI Entrez, gnomAD GraphQL, and UCSC APIs using the frozen dataset versions. The offline/cached mode reuses committed intermediate files and therefore does not depend on future API schema stability or live database availability. For example, the ClinVar/gnomAD matching stage can be rerun from cache with --skip-clinvar --skip-gnomad --skip-coverage, while downstream VITAL, historical, external-domain, calibration, and manuscript-generation scripts consume the cached CSV/TSV outputs directly. We treat the online API run as data acquisition and the cached rerun as the reproducibility path. A containerized execution environment (Docker) is planned for full end-to-end reproducibility of package versions and command-line dependencies.</w:t>
       </w:r>
     </w:p>
     <w:p>
@@ -6617,7 +6627,7 @@
     </w:p>
     <w:p>
       <w:r>
-        <w:t>Analyses were conducted in April 2026 using gnomAD v4.1.1 exome and genome data queried through the gnomAD GraphQL API. ClinVar data were retrieved through the NCBI Entrez API and the ClinVar bulk variant summary file, including the January 2023 archived snapshot for historical enrichment analysis. UCSC genome sequence and annotation APIs were used for GC and repeat-context analyses. Pipeline source code, cached intermediate files, figures, and machine-readable outputs are available in the project repository.</w:t>
+        <w:t>Analyses were conducted under an April 21, 2026 data freeze using gnomAD v4.1.1 exome and genome data queried through the gnomAD GraphQL API. ClinVar data were retrieved through the NCBI Entrez API and the ClinVar bulk variant summary file; the historical analysis used the archived January 2023 ClinVar variant_summary snapshot. UCSC genome sequence and annotation APIs were used for GC and repeat-context analyses. Pipeline source code, cached intermediate files, cache metadata, figures, and machine-readable outputs are available in the project repository. The committed intermediate outputs allow downstream analyses and manuscript tables to be regenerated without re-querying external APIs. A Docker/containerized environment is planned as the next reproducibility layer so that package versions and system dependencies can be fixed in addition to the data freeze.</w:t>
       </w:r>
     </w:p>
     <w:p>

</xml_diff>

<commit_message>
Frame VITAL cases as pathogenicity label distortion
</commit_message>
<xml_diff>
--- a/manuscript_vital_with_figures_tables.docx
+++ b/manuscript_vital_with_figures_tables.docx
@@ -26,7 +26,7 @@
         <w:t>Purpose:</w:t>
       </w:r>
       <w:r>
-        <w:t xml:space="preserve"> Severe variant annotations can coexist with ancestry-aware population-frequency contradiction. We tested whether ClinVar pathogenic/likely pathogenic (P/LP) arrhythmia assertions remain frequency-consistent when evaluated with popmax, allele count (AC), variant representation, and review support rather than global AF alone.</w:t>
+        <w:t xml:space="preserve"> Severe variant annotations can coexist with ancestry-aware population-frequency contradiction. We tested whether ClinVar pathogenic/likely pathogenic (P/LP) arrhythmia assertions remain frequency-consistent when evaluated with popmax, allele count (AC), variant representation, and review support rather than global AF alone, and whether discordant assertions reveal systematically misframed biology rather than random noise.</w:t>
       </w:r>
     </w:p>
     <w:p>
@@ -48,7 +48,7 @@
         <w:t>Results:</w:t>
       </w:r>
       <w:r>
-        <w:t xml:space="preserve"> Only 350/1,731 variants (20.2%) had exact gnomAD allele matches, and 334 had usable AF evidence. Global AF alone identified 13 variants above AF &gt;1e-5, whereas popmax/global screening identified 115; global-AF-only review therefore missed 102/115 (88.7%) ancestry-aware frequency alerts. Severe annotation did not protect against this signal: 92/262 AF-observed LOF/splice assertions (35.1%) had popmax/global AF &gt;1e-5, similar to missense assertions (19/66, 28.8%). Mechanism triage showed that this was a tension universe rather than an error-rate estimate: 35/92 severe-discordant assertions were in carrier-compatible CASQ2/TRDN contexts, while only 1/57 non-recessive severe-discordant assertions was AC-supported. VITAL compressed 115 naive AF alerts to 3 red-priority review cases. In an independent 3,000-variant cross-disease historical audit, VITAL-red captured one real P/LP-to-VUS reclassification (CFAP91 VCV000812096), while an expert-panel RYR1 downgrade without frequency tension remained outside scope.</w:t>
+        <w:t xml:space="preserve"> Only 350/1,731 variants (20.2%) had exact gnomAD allele matches, and 334 had usable AF evidence. Global AF alone identified 13 variants above AF &gt;1e-5, whereas popmax/global screening identified 115; global-AF-only review therefore missed 102/115 (88.7%) ancestry-aware frequency alerts. Severe annotation did not protect against this signal: 92/262 AF-observed LOF/splice assertions (35.1%) had popmax/global AF &gt;1e-5, similar to missense assertions (19/66, 28.8%). Mechanism triage showed recurrent label-framing distortion rather than a simple error-rate estimate: carrier-compatible recessive assertions were presented as generic P/LP, context-dependent susceptibility appeared as Mendelian pathogenicity, and severe annotation sometimes substituted for mechanism-specific evidence. VITAL compressed 115 naive AF alerts to 3 red-priority review cases. In an independent 3,000-variant cross-disease historical audit, VITAL-red captured one real P/LP-to-VUS reclassification (CFAP91 VCV000812096), while an expert-panel RYR1 downgrade without frequency tension remained outside scope.</w:t>
       </w:r>
     </w:p>
     <w:p>
@@ -59,7 +59,7 @@
         <w:t>Conclusion:</w:t>
       </w:r>
       <w:r>
-        <w:t xml:space="preserve"> Severe annotation alone is not sufficient to override population-frequency contradiction. Global-AF-only ACMG/AMP implementations can systematically miss ancestry-aware frequency tension; popmax-aware, AC-aware, representation-aware review prioritization is needed to make these conflicts clinically inspectable without automating final classification.</w:t>
+        <w:t xml:space="preserve"> Severe annotation alone is not sufficient to override population-frequency contradiction. A subset of public P/LP assertions appears biologically misframed rather than merely uncertain: susceptibility is not equivalent to Mendelian disease, carrier architecture is not equivalent to dominant pathogenicity, and severe annotation is not equivalent to high penetrance. Popmax-aware, AC-aware, representation-aware review prioritization makes these distortions clinically inspectable without automating final classification.</w:t>
       </w:r>
     </w:p>
     <w:p>
@@ -87,7 +87,7 @@
     </w:p>
     <w:p>
       <w:r>
-        <w:t>Here, we ask whether ClinVar P/LP arrhythmia assertions remain coherent when evaluated with exact allele matching, popmax, AC, variant type, detectability, and review support. We introduce VITAL as an explainable re-review prioritization framework. VITAL does not classify variants as benign or pathogenic. It identifies where archived clinical assertions and population-frequency evidence are sufficiently discordant to justify expert review.</w:t>
+        <w:t>Here, we ask whether ClinVar P/LP arrhythmia assertions remain coherent when evaluated with exact allele matching, popmax, AC, variant type, detectability, and review support. Our premise is not simply that some variants are "too frequent," but that some public pathogenicity labels may be biologically misframed: susceptibility or drug-response haplotypes can be flattened into Mendelian pathogenicity, recessive carrier states can masquerade as dominant disease assertions, and severe annotations can inflate confidence when mechanism-specific evidence is thin. We introduce VITAL as an explainable re-review prioritization framework that identifies these frequency-assertion distortions for expert review without classifying variants as benign or pathogenic.</w:t>
       </w:r>
     </w:p>
     <w:p>
@@ -557,7 +557,7 @@
     </w:p>
     <w:p>
       <w:r>
-        <w:t>We compared global AF, popmax/global AF, AC-supported frequency screening, and VITAL red-priority calls. We assessed variant-type enrichment among non-overlap records, severe-annotation frequency discordance, LOF subtype patterns, and mechanism triage of severe-discordant variants. We performed supporting audits in a 3,000-variant cross-disease ClinVar P/LP sample, including historical January 2023 to April 2026 reclassification, expert-panel reviewed assertions, and real strict P/LP-to-VUS/B/LB events. Threshold sensitivity, AC-gate sensitivity, weight sensitivity, KCNH2 diagnostics, and time-series details are provided in supplementary outputs.</w:t>
+        <w:t>We compared global AF, popmax/global AF, AC-supported frequency screening, and VITAL red-priority calls. We assessed variant-type enrichment among non-overlap records, severe-annotation frequency discordance, LOF subtype patterns, and mechanism triage of severe-discordant variants. Mechanism triage was used to separate probable label-framing modes, including carrier-compatible architecture, context-dependent susceptibility, annotation inflation, and unresolved high-penetrance tension. We performed supporting audits in a 3,000-variant cross-disease ClinVar P/LP sample, including historical January 2023 to April 2026 reclassification, expert-panel reviewed assertions, and real strict P/LP-to-VUS/B/LB events. Threshold sensitivity, AC-gate sensitivity, weight sensitivity, KCNH2 diagnostics, and time-series details are provided in supplementary outputs.</w:t>
       </w:r>
     </w:p>
     <w:p>
@@ -1107,17 +1107,17 @@
         <w:pStyle w:val="Heading2"/>
       </w:pPr>
       <w:r>
-        <w:t>Severe annotation does not protect against frequency discordance</w:t>
+        <w:t>Severe annotation exposes pathogenicity-label distortion</w:t>
       </w:r>
     </w:p>
     <w:p>
       <w:r>
-        <w:t>The main biological result is that severe annotation does not make a ClinVar P/LP assertion frequency-clean. Among 334 AF-observed arrhythmia variants, 115 (34.4%) had popmax/global AF &gt;1e-5. Among LOF/splice assertions, 92/262 (35.1%) were frequency-discordant, similar to missense assertions (19/66, 28.8%; Fisher OR=1.34, p=0.384). Frameshift, stop-gained, and canonical splice variants all showed naive frequency discordance.</w:t>
+        <w:t>The main biological result is not simply that severe annotation can coexist with frequency tension. It is that frequency-discordant severe assertions reveal recurring distortion in how pathogenicity is labeled. Among 334 AF-observed arrhythmia variants, 115 (34.4%) had popmax/global AF &gt;1e-5. Among LOF/splice assertions, 92/262 (35.1%) were frequency-discordant, similar to missense assertions (19/66, 28.8%; Fisher OR=1.34, p=0.384). Frameshift, stop-gained, and canonical splice variants all showed naive frequency discordance.</w:t>
       </w:r>
     </w:p>
     <w:p>
       <w:r>
-        <w:t>This result does not mean that 35.1% of LOF/splice assertions are wrong. Mechanism triage showed that 35/92 severe-discordant assertions were in CASQ2 or TRDN, where recessive/biallelic disease architecture can make heterozygous carrier frequency biologically compatible. After excluding CASQ2/TRDN, 57/197 severe annotations (28.9%) remained discordant across 8 genes, but only 1/57 non-recessive severe-discordant assertions was AC-supported.</w:t>
+        <w:t>This result does not mean that 35.1% of LOF/splice assertions are wrong. It means that the P/LP label often lacks the biological frame needed to interpret the assertion safely. Mechanism triage showed that 35/92 severe-discordant assertions were in CASQ2 or TRDN, where recessive/biallelic disease architecture can make heterozygous carrier frequency biologically compatible. After excluding CASQ2/TRDN, 57/197 severe annotations (28.9%) remained discordant across 8 genes, but only 1/57 non-recessive severe-discordant assertions was AC-supported.</w:t>
       </w:r>
     </w:p>
     <w:p>
@@ -1262,7 +1262,7 @@
                 <w:b/>
                 <w:sz w:val="16"/>
               </w:rPr>
-              <w:t>Interpretation</w:t>
+              <w:t>Label-framing implication</w:t>
             </w:r>
           </w:p>
         </w:tc>
@@ -1340,7 +1340,7 @@
                 <w:b w:val="0"/>
                 <w:sz w:val="16"/>
               </w:rPr>
-              <w:t>Not misclassification by itself</w:t>
+              <w:t>Carrier architecture can masquerade as generic P/LP</w:t>
             </w:r>
           </w:p>
         </w:tc>
@@ -1418,7 +1418,7 @@
                 <w:b w:val="0"/>
                 <w:sz w:val="16"/>
               </w:rPr>
-              <w:t>Highest-priority adjudication</w:t>
+              <w:t>Possible annotation inflation requiring urgent adjudication</w:t>
             </w:r>
           </w:p>
         </w:tc>
@@ -1496,7 +1496,7 @@
                 <w:b w:val="0"/>
                 <w:sz w:val="16"/>
               </w:rPr>
-              <w:t>Monitor; insufficient AC for urgent action</w:t>
+              <w:t>Severe annotation creates concern, but AC is insufficient</w:t>
             </w:r>
           </w:p>
         </w:tc>
@@ -1574,7 +1574,7 @@
                 <w:b w:val="0"/>
                 <w:sz w:val="16"/>
               </w:rPr>
-              <w:t>Routine mechanism review</w:t>
+              <w:t>Biology remains unresolved; not an automatic downgrade</w:t>
             </w:r>
           </w:p>
         </w:tc>
@@ -1583,7 +1583,7 @@
     <w:p/>
     <w:p>
       <w:r>
-        <w:t>The claim is therefore narrower and stronger than "LOF variants are often benign": severe annotation is not sufficient to override population-frequency contradiction. It identifies a mechanism hypothesis that must be reconciled with ancestry, AC, inheritance, penetrance, transcript context, and review strength.</w:t>
+        <w:t>The claim is therefore narrower and stronger than "LOF variants are often benign": severe annotation is not sufficient to override population-frequency contradiction, and some public P/LP labels conflate different biological objects. Susceptibility is not Mendelian pathogenicity; carrier architecture is not dominant disease; severe annotation is not proof of high penetrance. Each discordant assertion identifies a mechanism hypothesis that must be reconciled with ancestry, AC, inheritance, penetrance, transcript context, and review strength.</w:t>
       </w:r>
     </w:p>
     <w:p>
@@ -1978,12 +1978,12 @@
         <w:pStyle w:val="Heading2"/>
       </w:pPr>
       <w:r>
-        <w:t>Red-priority cases show distinct biological tension types</w:t>
+        <w:t>Red-priority cases show distinct pathogenicity-label distortion modes</w:t>
       </w:r>
     </w:p>
     <w:p>
       <w:r>
-        <w:t>The 3 red-priority arrhythmia variants were not interchangeable AF outliers. They represented three different interpretation problems: a high-frequency haplotype/susceptibility assertion, a recessive-carrier-compatible LOF assertion, and a borderline constrained-gene splice assertion.</w:t>
+        <w:t>The 3 red-priority arrhythmia variants were not interchangeable AF outliers. They represented three different ways in which biology can be compressed into an overly broad P/LP label: a high-frequency haplotype/susceptibility assertion, a recessive-carrier-compatible LOF assertion, and a borderline constrained-gene splice assertion.</w:t>
       </w:r>
     </w:p>
     <w:tbl>
@@ -2097,7 +2097,7 @@
                 <w:b/>
                 <w:sz w:val="16"/>
               </w:rPr>
-              <w:t>Interpretation question</w:t>
+              <w:t>Misframed-biology mode</w:t>
             </w:r>
           </w:p>
         </w:tc>
@@ -2194,7 +2194,7 @@
                 <w:b w:val="0"/>
                 <w:sz w:val="16"/>
               </w:rPr>
-              <w:t>Haplotype/drug-response susceptibility vs broad Mendelian pathogenic label</w:t>
+              <w:t>Susceptibility/haplotype inflated into Mendelian P/LP</w:t>
             </w:r>
           </w:p>
         </w:tc>
@@ -2291,7 +2291,7 @@
                 <w:b w:val="0"/>
                 <w:sz w:val="16"/>
               </w:rPr>
-              <w:t>Recessive carrier frequency vs affected-state pathogenicity</w:t>
+              <w:t>Carrier architecture framed without affected-state context</w:t>
             </w:r>
           </w:p>
         </w:tc>
@@ -2388,7 +2388,7 @@
                 <w:b w:val="0"/>
                 <w:sz w:val="16"/>
               </w:rPr>
-              <w:t>Borderline splice assertion in constrained dominant LQTS gene</w:t>
+              <w:t>Borderline severe-annotation inflation under weak evidence</w:t>
             </w:r>
           </w:p>
         </w:tc>
@@ -2449,7 +2449,7 @@
     <w:p/>
     <w:p>
       <w:r>
-        <w:t>Manual review of live ClinVar records confirmed that these cases remained weakly supported or single-submitter assertions with unresolved mechanism-specific interpretation questions. VITAL does not declare them benign. It identifies them as the records a laboratory should inspect first.</w:t>
+        <w:t>Manual review of live ClinVar records confirmed that these cases remained weakly supported or single-submitter assertions with unresolved mechanism-specific interpretation questions. VITAL does not declare them benign. It identifies records in which the public label may be too broad for the underlying biology.</w:t>
       </w:r>
     </w:p>
     <w:p>
@@ -2480,7 +2480,7 @@
     </w:p>
     <w:p>
       <w:r>
-        <w:t>The central finding is that severe annotation does not override population evidence. Up to 35.1% of AF-observed LOF/splice ClinVar P/LP arrhythmia assertions showed ancestry-aware frequency discordance. That figure is not an error rate: many cases are compatible with recessive carrier architecture or lack AC support for immediate action. The clinical risk is subtler. A severe-looking ClinVar assertion can be mechanistically plausible and still too frequent for the high-penetrance label attached to it.</w:t>
+        <w:t>The central finding is that severe annotation does not override population evidence, and the deeper problem is pathogenicity-label distortion. Up to 35.1% of AF-observed LOF/splice ClinVar P/LP arrhythmia assertions showed ancestry-aware frequency discordance. That figure is not an error rate: many cases are compatible with recessive carrier architecture or lack AC support for immediate action. The clinical risk is subtler. A severe-looking ClinVar assertion can be mechanistically plausible in one frame and still misleading as a generic high-penetrance P/LP label.</w:t>
       </w:r>
     </w:p>
     <w:p>
@@ -2490,12 +2490,12 @@
     </w:p>
     <w:p>
       <w:r>
-        <w:t>VITAL's contribution is workflow compression with explainability. It transforms 115 naive AF alerts into 3 urgent review cases while preserving gray no-frequency-evidence states and component-level explanations. This is not a replacement for ACMG/AMP interpretation, ClinGen specification, functional evidence, phenotype review, or laboratory judgment. It is a way to decide what to inspect first when frequency and clinical assertion are visibly in tension.</w:t>
+        <w:t>VITAL's contribution is workflow compression with explainability, but its scientific role is to make this label distortion inspectable. It transforms 115 naive AF alerts into 3 urgent review cases while preserving gray no-frequency-evidence states and component-level explanations. This is not a replacement for ACMG/AMP interpretation, ClinGen specification, functional evidence, phenotype review, or laboratory judgment. It is a way to decide what to inspect first when frequency and clinical assertion are visibly misaligned.</w:t>
       </w:r>
     </w:p>
     <w:p>
       <w:r>
-        <w:t>The three red-priority arrhythmia cases illustrate why a single AF threshold is insufficient. SCN5A VCV000440850 is most consistent with a context-dependent haplotype or susceptibility assertion rather than a straightforward high-penetrance monogenic label. TRDN VCV001325231 shows that a frameshift can be frequency-tolerable under recessive/biallelic architecture. KCNH2 VCV004535537 is the borderline case: biologically uncomfortable in a constrained dominant gene, but still unresolved and weight-sensitive.</w:t>
+        <w:t>The three red-priority arrhythmia cases illustrate why a single AF threshold is insufficient and why label framing matters clinically. SCN5A VCV000440850 is most consistent with a context-dependent haplotype or susceptibility assertion rather than a straightforward high-penetrance monogenic label. TRDN VCV001325231 shows that a frameshift can be frequency-tolerable under recessive/biallelic architecture. KCNH2 VCV004535537 is the borderline case: biologically uncomfortable in a constrained dominant gene, but still unresolved and weight-sensitive.</w:t>
       </w:r>
     </w:p>
     <w:p>
@@ -2574,6 +2574,14 @@
       </w:pPr>
       <w:r>
         <w:t>Do not treat severe annotation as self-validating; frameshift, stop-gained, and splice labels do not cancel population-frequency contradiction.</w:t>
+      </w:r>
+    </w:p>
+    <w:p>
+      <w:pPr>
+        <w:pStyle w:val="ListNumber"/>
+      </w:pPr>
+      <w:r>
+        <w:t>Treat frequency-discordant P/LP assertions as possible label-framing problems: susceptibility, carrier state, low penetrance, founder effect, and annotation inflation require different clinical responses.</w:t>
       </w:r>
     </w:p>
     <w:p>

</xml_diff>

<commit_message>
Add pathogenicity label ontology
</commit_message>
<xml_diff>
--- a/manuscript_vital_with_figures_tables.docx
+++ b/manuscript_vital_with_figures_tables.docx
@@ -37,7 +37,7 @@
         <w:t>Methods:</w:t>
       </w:r>
       <w:r>
-        <w:t xml:space="preserve"> We collapsed ClinVar P/LP records across 20 inherited arrhythmia genes to 1,731 unique variants and cross-referenced them with gnomAD v4.1.1 exome data. Exact allele matches, allele-discordant sites, no-record states, global AF, popmax AF, AC, variant type, and ClinVar review strength were retained. We developed VITAL (Variant Interpretation Tension and Allele Load) as an explainable re-review prioritization framework, not an automated reclassification engine.</w:t>
+        <w:t xml:space="preserve"> We collapsed ClinVar P/LP records across 20 inherited arrhythmia genes to 1,731 unique variants and cross-referenced them with gnomAD v4.1.1 exome data. Exact allele matches, allele-discordant sites, no-record states, global AF, popmax AF, AC, variant type, and ClinVar review strength were retained. We developed VITAL (Variant Interpretation Tension and Allele Load) as an explainable re-review prioritization framework and defined a compact pathogenicity-label ontology for routing discordant assertions, not an automated reclassification engine.</w:t>
       </w:r>
     </w:p>
     <w:p>
@@ -59,7 +59,7 @@
         <w:t>Conclusion:</w:t>
       </w:r>
       <w:r>
-        <w:t xml:space="preserve"> Severe annotation alone is not sufficient to override population-frequency contradiction. A subset of public P/LP assertions appears biologically misframed rather than merely uncertain: susceptibility is not equivalent to Mendelian disease, carrier architecture is not equivalent to dominant pathogenicity, and severe annotation is not equivalent to high penetrance. Popmax-aware, AC-aware, representation-aware review prioritization makes these distortions clinically inspectable without automating final classification.</w:t>
+        <w:t xml:space="preserve"> Severe annotation alone is not sufficient to override population-frequency contradiction. A subset of public P/LP assertions appears biologically misframed rather than merely uncertain: susceptibility is not equivalent to Mendelian disease, carrier architecture is not equivalent to dominant pathogenicity, and severe annotation is not equivalent to high penetrance. A label-state ontology makes these distortions clinically actionable as review routes while preserving expert responsibility for final classification.</w:t>
       </w:r>
     </w:p>
     <w:p>
@@ -87,7 +87,7 @@
     </w:p>
     <w:p>
       <w:r>
-        <w:t>Here, we ask whether ClinVar P/LP arrhythmia assertions remain coherent when evaluated with exact allele matching, popmax, AC, variant type, detectability, and review support. Our premise is not simply that some variants are "too frequent," but that some public pathogenicity labels may be biologically misframed: susceptibility or drug-response haplotypes can be flattened into Mendelian pathogenicity, recessive carrier states can masquerade as dominant disease assertions, and severe annotations can inflate confidence when mechanism-specific evidence is thin. We introduce VITAL as an explainable re-review prioritization framework that identifies these frequency-assertion distortions for expert review without classifying variants as benign or pathogenic.</w:t>
+        <w:t>Here, we ask whether ClinVar P/LP arrhythmia assertions remain coherent when evaluated with exact allele matching, popmax, AC, variant type, detectability, and review support. Our premise is not simply that some variants are "too frequent," but that some public pathogenicity labels may be biologically misframed: susceptibility or drug-response haplotypes can be flattened into Mendelian pathogenicity, recessive carrier states can masquerade as dominant disease assertions, and severe annotations can inflate confidence when mechanism-specific evidence is thin. We introduce VITAL as an explainable re-review prioritization framework and propose a pathogenicity-label ontology that separates Mendelian pathogenicity, susceptibility, carrier architecture, low penetrance, annotation inflation, and representation uncertainty.</w:t>
       </w:r>
     </w:p>
     <w:p>
@@ -557,7 +557,7 @@
     </w:p>
     <w:p>
       <w:r>
-        <w:t>We compared global AF, popmax/global AF, AC-supported frequency screening, and VITAL red-priority calls. We assessed variant-type enrichment among non-overlap records, severe-annotation frequency discordance, LOF subtype patterns, and mechanism triage of severe-discordant variants. Mechanism triage was used to separate probable label-framing modes, including carrier-compatible architecture, context-dependent susceptibility, annotation inflation, and unresolved high-penetrance tension. We performed supporting audits in a 3,000-variant cross-disease ClinVar P/LP sample, including historical January 2023 to April 2026 reclassification, expert-panel reviewed assertions, and real strict P/LP-to-VUS/B/LB events. Threshold sensitivity, AC-gate sensitivity, weight sensitivity, KCNH2 diagnostics, and time-series details are provided in supplementary outputs.</w:t>
+        <w:t>We compared global AF, popmax/global AF, AC-supported frequency screening, and VITAL red-priority calls. We assessed variant-type enrichment among non-overlap records, severe-annotation frequency discordance, LOF subtype patterns, and mechanism triage of severe-discordant variants. Mechanism triage was used to separate probable label-framing modes, including carrier-compatible architecture, context-dependent susceptibility, annotation inflation, and unresolved high-penetrance tension. We then mapped these modes to review-routing classes with explicit entry rules, transition rules, and clinical consequences. We performed supporting audits in a 3,000-variant cross-disease ClinVar P/LP sample, including historical January 2023 to April 2026 reclassification, expert-panel reviewed assertions, and real strict P/LP-to-VUS/B/LB events. Threshold sensitivity, AC-gate sensitivity, weight sensitivity, KCNH2 diagnostics, and time-series details are provided in supplementary outputs.</w:t>
       </w:r>
     </w:p>
     <w:p>
@@ -2457,12 +2457,590 @@
         <w:pStyle w:val="Heading2"/>
       </w:pPr>
       <w:r>
+        <w:t>A pathogenicity-label ontology turns tension into review action</w:t>
+      </w:r>
+    </w:p>
+    <w:p>
+      <w:r>
+        <w:t>We therefore treat frequency discordance as a label-state problem rather than a binary pathogenic/benign problem. The ontology below separates biological mechanism from review action. Its transition rules are not automatic reclassifications; they are routing rules for expert review.</w:t>
+      </w:r>
+    </w:p>
+    <w:tbl>
+      <w:tblPr>
+        <w:tblStyle w:val="TableGrid"/>
+        <w:tblW w:type="auto" w:w="0"/>
+        <w:jc w:val="center"/>
+        <w:tblLook w:firstColumn="1" w:firstRow="1" w:lastColumn="0" w:lastRow="0" w:noHBand="0" w:noVBand="1" w:val="04A0"/>
+      </w:tblPr>
+      <w:tblGrid>
+        <w:gridCol w:w="2592"/>
+        <w:gridCol w:w="2592"/>
+        <w:gridCol w:w="2592"/>
+        <w:gridCol w:w="2592"/>
+      </w:tblGrid>
+      <w:tr>
+        <w:tc>
+          <w:tcPr>
+            <w:tcW w:type="dxa" w:w="2592"/>
+            <w:vAlign w:val="top"/>
+            <w:shd w:fill="D9EAF7"/>
+          </w:tcPr>
+          <w:p>
+            <w:pPr>
+              <w:jc w:val="left"/>
+            </w:pPr>
+            <w:r/>
+            <w:r>
+              <w:rPr>
+                <w:b/>
+                <w:sz w:val="16"/>
+              </w:rPr>
+              <w:t>Label-state class</w:t>
+            </w:r>
+          </w:p>
+        </w:tc>
+        <w:tc>
+          <w:tcPr>
+            <w:tcW w:type="dxa" w:w="2592"/>
+            <w:vAlign w:val="top"/>
+            <w:shd w:fill="D9EAF7"/>
+          </w:tcPr>
+          <w:p>
+            <w:pPr>
+              <w:jc w:val="left"/>
+            </w:pPr>
+            <w:r/>
+            <w:r>
+              <w:rPr>
+                <w:b/>
+                <w:sz w:val="16"/>
+              </w:rPr>
+              <w:t>Entry rule</w:t>
+            </w:r>
+          </w:p>
+        </w:tc>
+        <w:tc>
+          <w:tcPr>
+            <w:tcW w:type="dxa" w:w="2592"/>
+            <w:vAlign w:val="top"/>
+            <w:shd w:fill="D9EAF7"/>
+          </w:tcPr>
+          <w:p>
+            <w:pPr>
+              <w:jc w:val="left"/>
+            </w:pPr>
+            <w:r/>
+            <w:r>
+              <w:rPr>
+                <w:b/>
+                <w:sz w:val="16"/>
+              </w:rPr>
+              <w:t>Transition rule</w:t>
+            </w:r>
+          </w:p>
+        </w:tc>
+        <w:tc>
+          <w:tcPr>
+            <w:tcW w:type="dxa" w:w="2592"/>
+            <w:vAlign w:val="top"/>
+            <w:shd w:fill="D9EAF7"/>
+          </w:tcPr>
+          <w:p>
+            <w:pPr>
+              <w:jc w:val="left"/>
+            </w:pPr>
+            <w:r/>
+            <w:r>
+              <w:rPr>
+                <w:b/>
+                <w:sz w:val="16"/>
+              </w:rPr>
+              <w:t>Clinical consequence</w:t>
+            </w:r>
+          </w:p>
+        </w:tc>
+      </w:tr>
+      <w:tr>
+        <w:tc>
+          <w:tcPr>
+            <w:tcW w:type="dxa" w:w="2592"/>
+            <w:vAlign w:val="top"/>
+          </w:tcPr>
+          <w:p>
+            <w:pPr>
+              <w:jc w:val="left"/>
+            </w:pPr>
+            <w:r/>
+            <w:r>
+              <w:rPr>
+                <w:b w:val="0"/>
+                <w:sz w:val="16"/>
+              </w:rPr>
+              <w:t>High-penetrance Mendelian assertion</w:t>
+            </w:r>
+          </w:p>
+        </w:tc>
+        <w:tc>
+          <w:tcPr>
+            <w:tcW w:type="dxa" w:w="2592"/>
+            <w:vAlign w:val="top"/>
+          </w:tcPr>
+          <w:p>
+            <w:pPr>
+              <w:jc w:val="left"/>
+            </w:pPr>
+            <w:r/>
+            <w:r>
+              <w:rPr>
+                <w:b w:val="0"/>
+                <w:sz w:val="16"/>
+              </w:rPr>
+              <w:t>Frequency-consistent P/LP with mechanism-specific support</w:t>
+            </w:r>
+          </w:p>
+        </w:tc>
+        <w:tc>
+          <w:tcPr>
+            <w:tcW w:type="dxa" w:w="2592"/>
+            <w:vAlign w:val="top"/>
+          </w:tcPr>
+          <w:p>
+            <w:pPr>
+              <w:jc w:val="left"/>
+            </w:pPr>
+            <w:r/>
+            <w:r>
+              <w:rPr>
+                <w:b w:val="0"/>
+                <w:sz w:val="16"/>
+              </w:rPr>
+              <w:t>Remain in standard ACMG/ClinGen interpretation</w:t>
+            </w:r>
+          </w:p>
+        </w:tc>
+        <w:tc>
+          <w:tcPr>
+            <w:tcW w:type="dxa" w:w="2592"/>
+            <w:vAlign w:val="top"/>
+          </w:tcPr>
+          <w:p>
+            <w:pPr>
+              <w:jc w:val="left"/>
+            </w:pPr>
+            <w:r/>
+            <w:r>
+              <w:rPr>
+                <w:b w:val="0"/>
+                <w:sz w:val="16"/>
+              </w:rPr>
+              <w:t>Can support diagnosis, cascade testing, and surveillance if phenotype matches</w:t>
+            </w:r>
+          </w:p>
+        </w:tc>
+      </w:tr>
+      <w:tr>
+        <w:tc>
+          <w:tcPr>
+            <w:tcW w:type="dxa" w:w="2592"/>
+            <w:vAlign w:val="top"/>
+          </w:tcPr>
+          <w:p>
+            <w:pPr>
+              <w:jc w:val="left"/>
+            </w:pPr>
+            <w:r/>
+            <w:r>
+              <w:rPr>
+                <w:b w:val="0"/>
+                <w:sz w:val="16"/>
+              </w:rPr>
+              <w:t>Susceptibility or context-dependent risk allele</w:t>
+            </w:r>
+          </w:p>
+        </w:tc>
+        <w:tc>
+          <w:tcPr>
+            <w:tcW w:type="dxa" w:w="2592"/>
+            <w:vAlign w:val="top"/>
+          </w:tcPr>
+          <w:p>
+            <w:pPr>
+              <w:jc w:val="left"/>
+            </w:pPr>
+            <w:r/>
+            <w:r>
+              <w:rPr>
+                <w:b w:val="0"/>
+                <w:sz w:val="16"/>
+              </w:rPr>
+              <w:t>AF incompatible with Mendelian penetrance, conditional phenotype, haplotype, drug trigger, or ancestry enrichment</w:t>
+            </w:r>
+          </w:p>
+        </w:tc>
+        <w:tc>
+          <w:tcPr>
+            <w:tcW w:type="dxa" w:w="2592"/>
+            <w:vAlign w:val="top"/>
+          </w:tcPr>
+          <w:p>
+            <w:pPr>
+              <w:jc w:val="left"/>
+            </w:pPr>
+            <w:r/>
+            <w:r>
+              <w:rPr>
+                <w:b w:val="0"/>
+                <w:sz w:val="16"/>
+              </w:rPr>
+              <w:t>Move from generic P/LP toward risk-allele or context-qualified assertion</w:t>
+            </w:r>
+          </w:p>
+        </w:tc>
+        <w:tc>
+          <w:tcPr>
+            <w:tcW w:type="dxa" w:w="2592"/>
+            <w:vAlign w:val="top"/>
+          </w:tcPr>
+          <w:p>
+            <w:pPr>
+              <w:jc w:val="left"/>
+            </w:pPr>
+            <w:r/>
+            <w:r>
+              <w:rPr>
+                <w:b w:val="0"/>
+                <w:sz w:val="16"/>
+              </w:rPr>
+              <w:t>Avoid diagnostic closure and broad cascade testing as a monogenic disease allele</w:t>
+            </w:r>
+          </w:p>
+        </w:tc>
+      </w:tr>
+      <w:tr>
+        <w:tc>
+          <w:tcPr>
+            <w:tcW w:type="dxa" w:w="2592"/>
+            <w:vAlign w:val="top"/>
+          </w:tcPr>
+          <w:p>
+            <w:pPr>
+              <w:jc w:val="left"/>
+            </w:pPr>
+            <w:r/>
+            <w:r>
+              <w:rPr>
+                <w:b w:val="0"/>
+                <w:sz w:val="16"/>
+              </w:rPr>
+              <w:t>Carrier-compatible recessive assertion</w:t>
+            </w:r>
+          </w:p>
+        </w:tc>
+        <w:tc>
+          <w:tcPr>
+            <w:tcW w:type="dxa" w:w="2592"/>
+            <w:vAlign w:val="top"/>
+          </w:tcPr>
+          <w:p>
+            <w:pPr>
+              <w:jc w:val="left"/>
+            </w:pPr>
+            <w:r/>
+            <w:r>
+              <w:rPr>
+                <w:b w:val="0"/>
+                <w:sz w:val="16"/>
+              </w:rPr>
+              <w:t>Severe allele in recessive/biallelic architecture with heterozygous AF compatible with carrier state</w:t>
+            </w:r>
+          </w:p>
+        </w:tc>
+        <w:tc>
+          <w:tcPr>
+            <w:tcW w:type="dxa" w:w="2592"/>
+            <w:vAlign w:val="top"/>
+          </w:tcPr>
+          <w:p>
+            <w:pPr>
+              <w:jc w:val="left"/>
+            </w:pPr>
+            <w:r/>
+            <w:r>
+              <w:rPr>
+                <w:b w:val="0"/>
+                <w:sz w:val="16"/>
+              </w:rPr>
+              <w:t>Reframe as carrier or affected-state-specific assertion; require phase/second allele</w:t>
+            </w:r>
+          </w:p>
+        </w:tc>
+        <w:tc>
+          <w:tcPr>
+            <w:tcW w:type="dxa" w:w="2592"/>
+            <w:vAlign w:val="top"/>
+          </w:tcPr>
+          <w:p>
+            <w:pPr>
+              <w:jc w:val="left"/>
+            </w:pPr>
+            <w:r/>
+            <w:r>
+              <w:rPr>
+                <w:b w:val="0"/>
+                <w:sz w:val="16"/>
+              </w:rPr>
+              <w:t>Prevent inappropriate dominant-disease counseling or surveillance</w:t>
+            </w:r>
+          </w:p>
+        </w:tc>
+      </w:tr>
+      <w:tr>
+        <w:tc>
+          <w:tcPr>
+            <w:tcW w:type="dxa" w:w="2592"/>
+            <w:vAlign w:val="top"/>
+          </w:tcPr>
+          <w:p>
+            <w:pPr>
+              <w:jc w:val="left"/>
+            </w:pPr>
+            <w:r/>
+            <w:r>
+              <w:rPr>
+                <w:b w:val="0"/>
+                <w:sz w:val="16"/>
+              </w:rPr>
+              <w:t>Founder or low-penetrance allele</w:t>
+            </w:r>
+          </w:p>
+        </w:tc>
+        <w:tc>
+          <w:tcPr>
+            <w:tcW w:type="dxa" w:w="2592"/>
+            <w:vAlign w:val="top"/>
+          </w:tcPr>
+          <w:p>
+            <w:pPr>
+              <w:jc w:val="left"/>
+            </w:pPr>
+            <w:r/>
+            <w:r>
+              <w:rPr>
+                <w:b w:val="0"/>
+                <w:sz w:val="16"/>
+              </w:rPr>
+              <w:t>AC-supported high popmax with plausible founder effect or reduced penetrance</w:t>
+            </w:r>
+          </w:p>
+        </w:tc>
+        <w:tc>
+          <w:tcPr>
+            <w:tcW w:type="dxa" w:w="2592"/>
+            <w:vAlign w:val="top"/>
+          </w:tcPr>
+          <w:p>
+            <w:pPr>
+              <w:jc w:val="left"/>
+            </w:pPr>
+            <w:r/>
+            <w:r>
+              <w:rPr>
+                <w:b w:val="0"/>
+                <w:sz w:val="16"/>
+              </w:rPr>
+              <w:t>Retain only with penetrance and ancestry qualifiers</w:t>
+            </w:r>
+          </w:p>
+        </w:tc>
+        <w:tc>
+          <w:tcPr>
+            <w:tcW w:type="dxa" w:w="2592"/>
+            <w:vAlign w:val="top"/>
+          </w:tcPr>
+          <w:p>
+            <w:pPr>
+              <w:jc w:val="left"/>
+            </w:pPr>
+            <w:r/>
+            <w:r>
+              <w:rPr>
+                <w:b w:val="0"/>
+                <w:sz w:val="16"/>
+              </w:rPr>
+              <w:t>Tailor counseling to ancestry- and penetrance-aware risk rather than binary P/LP</w:t>
+            </w:r>
+          </w:p>
+        </w:tc>
+      </w:tr>
+      <w:tr>
+        <w:tc>
+          <w:tcPr>
+            <w:tcW w:type="dxa" w:w="2592"/>
+            <w:vAlign w:val="top"/>
+          </w:tcPr>
+          <w:p>
+            <w:pPr>
+              <w:jc w:val="left"/>
+            </w:pPr>
+            <w:r/>
+            <w:r>
+              <w:rPr>
+                <w:b w:val="0"/>
+                <w:sz w:val="16"/>
+              </w:rPr>
+              <w:t>Annotation-inflated assertion</w:t>
+            </w:r>
+          </w:p>
+        </w:tc>
+        <w:tc>
+          <w:tcPr>
+            <w:tcW w:type="dxa" w:w="2592"/>
+            <w:vAlign w:val="top"/>
+          </w:tcPr>
+          <w:p>
+            <w:pPr>
+              <w:jc w:val="left"/>
+            </w:pPr>
+            <w:r/>
+            <w:r>
+              <w:rPr>
+                <w:b w:val="0"/>
+                <w:sz w:val="16"/>
+              </w:rPr>
+              <w:t>Severe annotation plus weak review and AC-supported frequency contradiction</w:t>
+            </w:r>
+          </w:p>
+        </w:tc>
+        <w:tc>
+          <w:tcPr>
+            <w:tcW w:type="dxa" w:w="2592"/>
+            <w:vAlign w:val="top"/>
+          </w:tcPr>
+          <w:p>
+            <w:pPr>
+              <w:jc w:val="left"/>
+            </w:pPr>
+            <w:r/>
+            <w:r>
+              <w:rPr>
+                <w:b w:val="0"/>
+                <w:sz w:val="16"/>
+              </w:rPr>
+              <w:t>Route to urgent expert review; candidate for VUS/LB or mechanism-qualified label</w:t>
+            </w:r>
+          </w:p>
+        </w:tc>
+        <w:tc>
+          <w:tcPr>
+            <w:tcW w:type="dxa" w:w="2592"/>
+            <w:vAlign w:val="top"/>
+          </w:tcPr>
+          <w:p>
+            <w:pPr>
+              <w:jc w:val="left"/>
+            </w:pPr>
+            <w:r/>
+            <w:r>
+              <w:rPr>
+                <w:b w:val="0"/>
+                <w:sz w:val="16"/>
+              </w:rPr>
+              <w:t>Avoid using the assertion for irreversible clinical decisions until adjudicated</w:t>
+            </w:r>
+          </w:p>
+        </w:tc>
+      </w:tr>
+      <w:tr>
+        <w:tc>
+          <w:tcPr>
+            <w:tcW w:type="dxa" w:w="2592"/>
+            <w:vAlign w:val="top"/>
+          </w:tcPr>
+          <w:p>
+            <w:pPr>
+              <w:jc w:val="left"/>
+            </w:pPr>
+            <w:r/>
+            <w:r>
+              <w:rPr>
+                <w:b w:val="0"/>
+                <w:sz w:val="16"/>
+              </w:rPr>
+              <w:t>Representation-uncertain gray state</w:t>
+            </w:r>
+          </w:p>
+        </w:tc>
+        <w:tc>
+          <w:tcPr>
+            <w:tcW w:type="dxa" w:w="2592"/>
+            <w:vAlign w:val="top"/>
+          </w:tcPr>
+          <w:p>
+            <w:pPr>
+              <w:jc w:val="left"/>
+            </w:pPr>
+            <w:r/>
+            <w:r>
+              <w:rPr>
+                <w:b w:val="0"/>
+                <w:sz w:val="16"/>
+              </w:rPr>
+              <w:t>No exact usable AF because of allele discordance, no record, or variant-type detectability limits</w:t>
+            </w:r>
+          </w:p>
+        </w:tc>
+        <w:tc>
+          <w:tcPr>
+            <w:tcW w:type="dxa" w:w="2592"/>
+            <w:vAlign w:val="top"/>
+          </w:tcPr>
+          <w:p>
+            <w:pPr>
+              <w:jc w:val="left"/>
+            </w:pPr>
+            <w:r/>
+            <w:r>
+              <w:rPr>
+                <w:b w:val="0"/>
+                <w:sz w:val="16"/>
+              </w:rPr>
+              <w:t>Route to orthogonal validation or deferred review rather than rarity inference</w:t>
+            </w:r>
+          </w:p>
+        </w:tc>
+        <w:tc>
+          <w:tcPr>
+            <w:tcW w:type="dxa" w:w="2592"/>
+            <w:vAlign w:val="top"/>
+          </w:tcPr>
+          <w:p>
+            <w:pPr>
+              <w:jc w:val="left"/>
+            </w:pPr>
+            <w:r/>
+            <w:r>
+              <w:rPr>
+                <w:b w:val="0"/>
+                <w:sz w:val="16"/>
+              </w:rPr>
+              <w:t>Do not treat absence from gnomAD as evidence of rarity by default</w:t>
+            </w:r>
+          </w:p>
+        </w:tc>
+      </w:tr>
+    </w:tbl>
+    <w:p/>
+    <w:p>
+      <w:pPr>
+        <w:pStyle w:val="Heading2"/>
+      </w:pPr>
+      <w:r>
         <w:t>Cross-disease and historical audits support scope, not broad prediction</w:t>
       </w:r>
     </w:p>
     <w:p>
       <w:r>
-        <w:t>In an independent 3,000-variant cross-disease current ClinVar P/LP sample, naive popmax/global AF screening flagged 332 variants (11.1%; 95% CI 10.0%-12.2%), while VITAL red-priority contained 3 (0.10%; 95% CI 0.034%-0.294%). Among 204 expert-panel reviewed P/LP assertions in that set, 39 had naive AF tension and 13 were AC-supported, but none were VITAL red-priority. Curated high-frequency exceptions therefore remained visible without being converted into urgent downgrade calls.</w:t>
+        <w:t>In an independent 3,000-variant cross-disease current ClinVar P/LP sample, naive popmax/global AF screening flagged 332 variants (11.1%; 95% CI 10.0%-12.2%), while VITAL red-priority contained 3 (0.10%; 95% CI 0.034%-0.294%). Among 204 expert-panel reviewed P/LP assertions in that set, 39 had naive AF tension and 13 were AC-supported, but none were VITAL red-priority. Curated high-frequency exceptions therefore remained visible without being converted into urgent downgrade calls. Because the ontology is mechanism-based rather than arrhythmia-specific, this cross-disease audit supports the general principle that public P/LP labels need state-aware review rather than a single pathogenicity bucket.</w:t>
       </w:r>
     </w:p>
     <w:p>
@@ -2500,7 +3078,12 @@
     </w:p>
     <w:p>
       <w:r>
-        <w:t>Prior ClinVar-gnomAD studies have described rarity patterns and gene constraint. This analysis adds three operational distinctions: exact allele absence is separated from allele discordance and no-record states; popmax plus AC is placed at the center of frequency review; and review burden is treated as a clinical workflow endpoint rather than an incidental byproduct.</w:t>
+        <w:t>The clinical consequence is not abstract. A susceptibility allele labeled as Mendelian P/LP can promote diagnostic closure, inappropriate cascade testing, and surveillance framed as monogenic disease. A recessive carrier allele interpreted without phase can imply dominant risk where none is established. An annotation-inflated severe variant can drive family testing or management before the mechanism has been adjudicated. VITAL does not measure these downstream outcomes directly, but it identifies the public assertions most capable of creating those decision risks.</w:t>
+      </w:r>
+    </w:p>
+    <w:p>
+      <w:r>
+        <w:t>Prior ClinVar-gnomAD studies have described rarity patterns and gene constraint. This analysis adds three operational distinctions: exact allele absence is separated from allele discordance and no-record states; popmax plus AC is placed at the center of frequency review; and review burden is treated as a clinical workflow endpoint rather than an incidental byproduct. The proposed label-state ontology extends those distinctions beyond arrhythmia by making pathogenicity a structured state, not a single undifferentiated P/LP bucket.</w:t>
       </w:r>
     </w:p>
     <w:p>
@@ -2523,7 +3106,7 @@
     </w:p>
     <w:p>
       <w:r>
-        <w:t>Third, the score does not directly model penetrance, phase, zygosity, inheritance, phenotype specificity, segregation, MAVE/functional data, transcript rescue, NMD, or private laboratory evidence. These remain expert review tasks.</w:t>
+        <w:t>Third, the score and ontology do not directly model penetrance, phase, zygosity, inheritance, phenotype specificity, segregation, MAVE/functional data, transcript rescue, NMD, or private laboratory evidence. These remain expert review tasks.</w:t>
       </w:r>
     </w:p>
     <w:p>
@@ -2533,7 +3116,7 @@
     </w:p>
     <w:p>
       <w:r>
-        <w:t>Fifth, public ClinVar captures classification-level changes, not patient-level downstream effects. We can identify P/LP-to-VUS/B/LB movement, but not diagnosis reversal, cascade-testing changes, surveillance changes, or therapy changes.</w:t>
+        <w:t>Fifth, public ClinVar captures classification-level changes, not patient-level downstream effects. We can identify decision-risk pathways such as diagnostic closure or cascade-testing pressure, but not actual diagnosis reversal, surveillance changes, reproductive decisions, or therapy changes.</w:t>
       </w:r>
     </w:p>
     <w:p>
@@ -2582,6 +3165,14 @@
       </w:pPr>
       <w:r>
         <w:t>Treat frequency-discordant P/LP assertions as possible label-framing problems: susceptibility, carrier state, low penetrance, founder effect, and annotation inflation require different clinical responses.</w:t>
+      </w:r>
+    </w:p>
+    <w:p>
+      <w:pPr>
+        <w:pStyle w:val="ListNumber"/>
+      </w:pPr>
+      <w:r>
+        <w:t>Use the label-state ontology as a transition map: move from generic P/LP to context-qualified assertion, carrier assertion, penetrance-qualified assertion, urgent re-review, or gray representation-uncertain queue as evidence dictates.</w:t>
       </w:r>
     </w:p>
     <w:p>

</xml_diff>

<commit_message>
Add temporal VITAL robustness audit
</commit_message>
<xml_diff>
--- a/manuscript_vital_with_figures_tables.docx
+++ b/manuscript_vital_with_figures_tables.docx
@@ -3049,6 +3049,11 @@
       </w:r>
     </w:p>
     <w:p>
+      <w:r>
+        <w:t>A temporal robustness audit across January 2023, January 2024, and the canonical April 2026 current arrhythmia score table supported the same operating profile. Red-priority queues remained sparse (2, 2, and 3 variants, respectively), while composition changed: TRDN persisted across all three snapshots, KCNE1 was red in 2023/2024 but not current, and SCN5A plus KCNH2 entered the current queue. AC-threshold sensitivity supported AC&gt;=20 as a compromise gate: AC&gt;=5 added lower-reliability calls, while AC&gt;=50 removed most actionable cases. The inheritance flag explicitly separated TRDN as recessive-context-required in every red queue.</w:t>
+      </w:r>
+    </w:p>
+    <w:p>
       <w:pPr>
         <w:pStyle w:val="Heading1"/>
       </w:pPr>
@@ -3198,7 +3203,7 @@
     </w:p>
     <w:p>
       <w:r>
-        <w:t>Code, cached intermediate files, figures, and supplementary outputs required to reproduce downstream analyses are available in the project repository. The April 21, 2026 data freeze used ClinVar records retrieved through NCBI Entrez and bulk variant_summary files, gnomAD v4.1.1 exome/genome data queried through the gnomAD GraphQL API, and UCSC annotation resources. Machine-readable supplementary tables include VITAL scores, frequency flags, severe-annotation discordance, mechanism triage, red-priority case summaries, historical audits, expert-panel comparator outputs, and sensitivity analyses.</w:t>
+        <w:t>Code, cached intermediate files, figures, and supplementary outputs required to reproduce downstream analyses are available in the project repository. The April 21, 2026 data freeze used ClinVar records retrieved through NCBI Entrez and bulk variant_summary files, gnomAD v4.1.1 exome/genome data queried through the gnomAD GraphQL API, and UCSC annotation resources. Machine-readable supplementary tables include VITAL scores, frequency flags, severe-annotation discordance, mechanism triage, red-priority case summaries, temporal robustness outputs, historical audits, expert-panel comparator outputs, and sensitivity analyses.</w:t>
       </w:r>
     </w:p>
     <w:sectPr>

</xml_diff>

<commit_message>
Add clinical decision-risk exposure proxy
</commit_message>
<xml_diff>
--- a/manuscript_vital_with_figures_tables.docx
+++ b/manuscript_vital_with_figures_tables.docx
@@ -48,7 +48,7 @@
         <w:t>Results:</w:t>
       </w:r>
       <w:r>
-        <w:t xml:space="preserve"> Only 350/1,731 variants (20.2%) had exact gnomAD allele matches, and 334 had usable AF evidence. Global AF alone identified 13 variants above AF &gt;1e-5, whereas popmax/global screening identified 115; global-AF-only review therefore missed 102/115 (88.7%) ancestry-aware frequency alerts. Severe annotation did not protect against this signal: 92/262 AF-observed LOF/splice assertions (35.1%) had popmax/global AF &gt;1e-5, similar to missense assertions (19/66, 28.8%). Mechanism triage showed recurrent label-framing distortion rather than a simple error-rate estimate: carrier-compatible recessive assertions were presented as generic P/LP, context-dependent susceptibility appeared as Mendelian pathogenicity, and severe annotation sometimes substituted for mechanism-specific evidence. VITAL compressed 115 naive AF alerts to 3 red-priority review cases. In an independent 3,000-variant cross-disease historical audit, VITAL-red captured one real P/LP-to-VUS reclassification (CFAP91 VCV000812096), while an expert-panel RYR1 downgrade without frequency tension remained outside scope.</w:t>
+        <w:t xml:space="preserve"> Only 350/1,731 variants (20.2%) had exact gnomAD allele matches, and 334 had usable AF evidence. Global AF alone identified 13 variants above AF &gt;1e-5, whereas popmax/global screening identified 115; global-AF-only review therefore missed 102/115 (88.7%) ancestry-aware frequency alerts. Severe annotation did not protect against this signal: 92/262 AF-observed LOF/splice assertions (35.1%) had popmax/global AF &gt;1e-5, similar to missense assertions (19/66, 28.8%). Mechanism triage showed recurrent label-framing distortion rather than a simple error-rate estimate: carrier-compatible recessive assertions were presented as generic P/LP, context-dependent susceptibility appeared as Mendelian pathogenicity, and severe annotation sometimes substituted for mechanism-specific evidence. Because patient-level outcomes are not observable in public ClinVar, we quantified decision-risk exposure: the 115 frequency-discordant arrhythmia records represented at least 168 submitter-exposure units, 9 AC-supported records represented 15 units, and VITAL compressed these to 3 urgent records. In an independent 3,000-variant cross-disease historical audit, VITAL-red captured one real P/LP-to-VUS reclassification (CFAP91 VCV000812096), while an expert-panel RYR1 downgrade without frequency tension remained outside scope.</w:t>
       </w:r>
     </w:p>
     <w:p>
@@ -557,7 +557,7 @@
     </w:p>
     <w:p>
       <w:r>
-        <w:t>We compared global AF, popmax/global AF, AC-supported frequency screening, and VITAL red-priority calls. We assessed variant-type enrichment among non-overlap records, severe-annotation frequency discordance, LOF subtype patterns, and mechanism triage of severe-discordant variants. Mechanism triage was used to separate probable label-framing modes, including carrier-compatible architecture, context-dependent susceptibility, annotation inflation, and unresolved high-penetrance tension. We then mapped these modes to review-routing classes with explicit entry rules, transition rules, and clinical consequences. We performed supporting audits in a 3,000-variant cross-disease ClinVar P/LP sample, including historical January 2023 to April 2026 reclassification, expert-panel reviewed assertions, and real strict P/LP-to-VUS/B/LB events. Threshold sensitivity, AC-gate sensitivity, weight sensitivity, KCNH2 diagnostics, and time-series details are provided in supplementary outputs.</w:t>
+        <w:t>We compared global AF, popmax/global AF, AC-supported frequency screening, and VITAL red-priority calls. We assessed variant-type enrichment among non-overlap records, severe-annotation frequency discordance, LOF subtype patterns, and mechanism triage of severe-discordant variants. Mechanism triage was used to separate probable label-framing modes, including carrier-compatible architecture, context-dependent susceptibility, annotation inflation, and unresolved high-penetrance tension. We then mapped these modes to review-routing classes with explicit entry rules, transition rules, and clinical consequences. Because public ClinVar does not expose patient counts, we quantified clinical decision-risk exposure using record counts and minimum submitter-exposure units, with missing submitter counts treated conservatively as one unit. We performed supporting audits in a 3,000-variant cross-disease ClinVar P/LP sample, including historical January 2023 to April 2026 reclassification, expert-panel reviewed assertions, and real strict P/LP-to-VUS/B/LB events. Threshold sensitivity, AC-gate sensitivity, weight sensitivity, KCNH2 diagnostics, and time-series details are provided in supplementary outputs.</w:t>
       </w:r>
     </w:p>
     <w:p>
@@ -3035,6 +3035,662 @@
         <w:pStyle w:val="Heading2"/>
       </w:pPr>
       <w:r>
+        <w:t>Clinical decision-risk exposure is small but concrete</w:t>
+      </w:r>
+    </w:p>
+    <w:p>
+      <w:r>
+        <w:t>Public ClinVar cannot tell us how many patients were misdiagnosed or how many relatives underwent cascade testing. It can, however, quantify the public assertion burden capable of creating those decisions. We therefore used a conservative exposure proxy: one P/LP record equals one potential decision-risk record, and each submitter contributes one minimum submitter-exposure unit; missing submitter counts were counted as one.</w:t>
+      </w:r>
+    </w:p>
+    <w:tbl>
+      <w:tblPr>
+        <w:tblStyle w:val="TableGrid"/>
+        <w:tblW w:type="auto" w:w="0"/>
+        <w:jc w:val="center"/>
+        <w:tblLook w:firstColumn="1" w:firstRow="1" w:lastColumn="0" w:lastRow="0" w:noHBand="0" w:noVBand="1" w:val="04A0"/>
+      </w:tblPr>
+      <w:tblGrid>
+        <w:gridCol w:w="2592"/>
+        <w:gridCol w:w="2592"/>
+        <w:gridCol w:w="2592"/>
+        <w:gridCol w:w="2592"/>
+      </w:tblGrid>
+      <w:tr>
+        <w:tc>
+          <w:tcPr>
+            <w:tcW w:type="dxa" w:w="2592"/>
+            <w:vAlign w:val="top"/>
+            <w:shd w:fill="D9EAF7"/>
+          </w:tcPr>
+          <w:p>
+            <w:pPr>
+              <w:jc w:val="left"/>
+            </w:pPr>
+            <w:r/>
+            <w:r>
+              <w:rPr>
+                <w:b/>
+                <w:sz w:val="16"/>
+              </w:rPr>
+              <w:t>Cohort and layer</w:t>
+            </w:r>
+          </w:p>
+        </w:tc>
+        <w:tc>
+          <w:tcPr>
+            <w:tcW w:type="dxa" w:w="2592"/>
+            <w:vAlign w:val="top"/>
+            <w:shd w:fill="D9EAF7"/>
+          </w:tcPr>
+          <w:p>
+            <w:pPr>
+              <w:jc w:val="left"/>
+            </w:pPr>
+            <w:r/>
+            <w:r>
+              <w:rPr>
+                <w:b/>
+                <w:sz w:val="16"/>
+              </w:rPr>
+              <w:t>Records</w:t>
+            </w:r>
+          </w:p>
+        </w:tc>
+        <w:tc>
+          <w:tcPr>
+            <w:tcW w:type="dxa" w:w="2592"/>
+            <w:vAlign w:val="top"/>
+            <w:shd w:fill="D9EAF7"/>
+          </w:tcPr>
+          <w:p>
+            <w:pPr>
+              <w:jc w:val="left"/>
+            </w:pPr>
+            <w:r/>
+            <w:r>
+              <w:rPr>
+                <w:b/>
+                <w:sz w:val="16"/>
+              </w:rPr>
+              <w:t>Minimum submitter-exposure units</w:t>
+            </w:r>
+          </w:p>
+        </w:tc>
+        <w:tc>
+          <w:tcPr>
+            <w:tcW w:type="dxa" w:w="2592"/>
+            <w:vAlign w:val="top"/>
+            <w:shd w:fill="D9EAF7"/>
+          </w:tcPr>
+          <w:p>
+            <w:pPr>
+              <w:jc w:val="left"/>
+            </w:pPr>
+            <w:r/>
+            <w:r>
+              <w:rPr>
+                <w:b/>
+                <w:sz w:val="16"/>
+              </w:rPr>
+              <w:t>Clinical meaning</w:t>
+            </w:r>
+          </w:p>
+        </w:tc>
+      </w:tr>
+      <w:tr>
+        <w:tc>
+          <w:tcPr>
+            <w:tcW w:type="dxa" w:w="2592"/>
+            <w:vAlign w:val="top"/>
+          </w:tcPr>
+          <w:p>
+            <w:pPr>
+              <w:jc w:val="left"/>
+            </w:pPr>
+            <w:r/>
+            <w:r>
+              <w:rPr>
+                <w:b w:val="0"/>
+                <w:sz w:val="16"/>
+              </w:rPr>
+              <w:t>Arrhythmia frequency-discordant P/LP upper bound</w:t>
+            </w:r>
+          </w:p>
+        </w:tc>
+        <w:tc>
+          <w:tcPr>
+            <w:tcW w:type="dxa" w:w="2592"/>
+            <w:vAlign w:val="top"/>
+          </w:tcPr>
+          <w:p>
+            <w:pPr>
+              <w:jc w:val="left"/>
+            </w:pPr>
+            <w:r/>
+            <w:r>
+              <w:rPr>
+                <w:b w:val="0"/>
+                <w:sz w:val="16"/>
+              </w:rPr>
+              <w:t>115</w:t>
+            </w:r>
+          </w:p>
+        </w:tc>
+        <w:tc>
+          <w:tcPr>
+            <w:tcW w:type="dxa" w:w="2592"/>
+            <w:vAlign w:val="top"/>
+          </w:tcPr>
+          <w:p>
+            <w:pPr>
+              <w:jc w:val="left"/>
+            </w:pPr>
+            <w:r/>
+            <w:r>
+              <w:rPr>
+                <w:b w:val="0"/>
+                <w:sz w:val="16"/>
+              </w:rPr>
+              <w:t>168</w:t>
+            </w:r>
+          </w:p>
+        </w:tc>
+        <w:tc>
+          <w:tcPr>
+            <w:tcW w:type="dxa" w:w="2592"/>
+            <w:vAlign w:val="top"/>
+          </w:tcPr>
+          <w:p>
+            <w:pPr>
+              <w:jc w:val="left"/>
+            </w:pPr>
+            <w:r/>
+            <w:r>
+              <w:rPr>
+                <w:b w:val="0"/>
+                <w:sz w:val="16"/>
+              </w:rPr>
+              <w:t>Labels that could mislead if accepted without ancestry-aware frequency review</w:t>
+            </w:r>
+          </w:p>
+        </w:tc>
+      </w:tr>
+      <w:tr>
+        <w:tc>
+          <w:tcPr>
+            <w:tcW w:type="dxa" w:w="2592"/>
+            <w:vAlign w:val="top"/>
+          </w:tcPr>
+          <w:p>
+            <w:pPr>
+              <w:jc w:val="left"/>
+            </w:pPr>
+            <w:r/>
+            <w:r>
+              <w:rPr>
+                <w:b w:val="0"/>
+                <w:sz w:val="16"/>
+              </w:rPr>
+              <w:t>Arrhythmia AC-supported active-review layer</w:t>
+            </w:r>
+          </w:p>
+        </w:tc>
+        <w:tc>
+          <w:tcPr>
+            <w:tcW w:type="dxa" w:w="2592"/>
+            <w:vAlign w:val="top"/>
+          </w:tcPr>
+          <w:p>
+            <w:pPr>
+              <w:jc w:val="left"/>
+            </w:pPr>
+            <w:r/>
+            <w:r>
+              <w:rPr>
+                <w:b w:val="0"/>
+                <w:sz w:val="16"/>
+              </w:rPr>
+              <w:t>9</w:t>
+            </w:r>
+          </w:p>
+        </w:tc>
+        <w:tc>
+          <w:tcPr>
+            <w:tcW w:type="dxa" w:w="2592"/>
+            <w:vAlign w:val="top"/>
+          </w:tcPr>
+          <w:p>
+            <w:pPr>
+              <w:jc w:val="left"/>
+            </w:pPr>
+            <w:r/>
+            <w:r>
+              <w:rPr>
+                <w:b w:val="0"/>
+                <w:sz w:val="16"/>
+              </w:rPr>
+              <w:t>15</w:t>
+            </w:r>
+          </w:p>
+        </w:tc>
+        <w:tc>
+          <w:tcPr>
+            <w:tcW w:type="dxa" w:w="2592"/>
+            <w:vAlign w:val="top"/>
+          </w:tcPr>
+          <w:p>
+            <w:pPr>
+              <w:jc w:val="left"/>
+            </w:pPr>
+            <w:r/>
+            <w:r>
+              <w:rPr>
+                <w:b w:val="0"/>
+                <w:sz w:val="16"/>
+              </w:rPr>
+              <w:t>Frequency contradiction has allele-count support</w:t>
+            </w:r>
+          </w:p>
+        </w:tc>
+      </w:tr>
+      <w:tr>
+        <w:tc>
+          <w:tcPr>
+            <w:tcW w:type="dxa" w:w="2592"/>
+            <w:vAlign w:val="top"/>
+          </w:tcPr>
+          <w:p>
+            <w:pPr>
+              <w:jc w:val="left"/>
+            </w:pPr>
+            <w:r/>
+            <w:r>
+              <w:rPr>
+                <w:b w:val="0"/>
+                <w:sz w:val="16"/>
+              </w:rPr>
+              <w:t>Arrhythmia VITAL-red urgent layer</w:t>
+            </w:r>
+          </w:p>
+        </w:tc>
+        <w:tc>
+          <w:tcPr>
+            <w:tcW w:type="dxa" w:w="2592"/>
+            <w:vAlign w:val="top"/>
+          </w:tcPr>
+          <w:p>
+            <w:pPr>
+              <w:jc w:val="left"/>
+            </w:pPr>
+            <w:r/>
+            <w:r>
+              <w:rPr>
+                <w:b w:val="0"/>
+                <w:sz w:val="16"/>
+              </w:rPr>
+              <w:t>3</w:t>
+            </w:r>
+          </w:p>
+        </w:tc>
+        <w:tc>
+          <w:tcPr>
+            <w:tcW w:type="dxa" w:w="2592"/>
+            <w:vAlign w:val="top"/>
+          </w:tcPr>
+          <w:p>
+            <w:pPr>
+              <w:jc w:val="left"/>
+            </w:pPr>
+            <w:r/>
+            <w:r>
+              <w:rPr>
+                <w:b w:val="0"/>
+                <w:sz w:val="16"/>
+              </w:rPr>
+              <w:t>3</w:t>
+            </w:r>
+          </w:p>
+        </w:tc>
+        <w:tc>
+          <w:tcPr>
+            <w:tcW w:type="dxa" w:w="2592"/>
+            <w:vAlign w:val="top"/>
+          </w:tcPr>
+          <w:p>
+            <w:pPr>
+              <w:jc w:val="left"/>
+            </w:pPr>
+            <w:r/>
+            <w:r>
+              <w:rPr>
+                <w:b w:val="0"/>
+                <w:sz w:val="16"/>
+              </w:rPr>
+              <w:t>Short queue with weak review plus AC-supported frequency contradiction</w:t>
+            </w:r>
+          </w:p>
+        </w:tc>
+      </w:tr>
+      <w:tr>
+        <w:tc>
+          <w:tcPr>
+            <w:tcW w:type="dxa" w:w="2592"/>
+            <w:vAlign w:val="top"/>
+          </w:tcPr>
+          <w:p>
+            <w:pPr>
+              <w:jc w:val="left"/>
+            </w:pPr>
+            <w:r/>
+            <w:r>
+              <w:rPr>
+                <w:b w:val="0"/>
+                <w:sz w:val="16"/>
+              </w:rPr>
+              <w:t>Arrhythmia standard-context red</w:t>
+            </w:r>
+          </w:p>
+        </w:tc>
+        <w:tc>
+          <w:tcPr>
+            <w:tcW w:type="dxa" w:w="2592"/>
+            <w:vAlign w:val="top"/>
+          </w:tcPr>
+          <w:p>
+            <w:pPr>
+              <w:jc w:val="left"/>
+            </w:pPr>
+            <w:r/>
+            <w:r>
+              <w:rPr>
+                <w:b w:val="0"/>
+                <w:sz w:val="16"/>
+              </w:rPr>
+              <w:t>2</w:t>
+            </w:r>
+          </w:p>
+        </w:tc>
+        <w:tc>
+          <w:tcPr>
+            <w:tcW w:type="dxa" w:w="2592"/>
+            <w:vAlign w:val="top"/>
+          </w:tcPr>
+          <w:p>
+            <w:pPr>
+              <w:jc w:val="left"/>
+            </w:pPr>
+            <w:r/>
+            <w:r>
+              <w:rPr>
+                <w:b w:val="0"/>
+                <w:sz w:val="16"/>
+              </w:rPr>
+              <w:t>2</w:t>
+            </w:r>
+          </w:p>
+        </w:tc>
+        <w:tc>
+          <w:tcPr>
+            <w:tcW w:type="dxa" w:w="2592"/>
+            <w:vAlign w:val="top"/>
+          </w:tcPr>
+          <w:p>
+            <w:pPr>
+              <w:jc w:val="left"/>
+            </w:pPr>
+            <w:r/>
+            <w:r>
+              <w:rPr>
+                <w:b w:val="0"/>
+                <w:sz w:val="16"/>
+              </w:rPr>
+              <w:t>Potential monogenic-label risk for diagnostic closure/cascade testing</w:t>
+            </w:r>
+          </w:p>
+        </w:tc>
+      </w:tr>
+      <w:tr>
+        <w:tc>
+          <w:tcPr>
+            <w:tcW w:type="dxa" w:w="2592"/>
+            <w:vAlign w:val="top"/>
+          </w:tcPr>
+          <w:p>
+            <w:pPr>
+              <w:jc w:val="left"/>
+            </w:pPr>
+            <w:r/>
+            <w:r>
+              <w:rPr>
+                <w:b w:val="0"/>
+                <w:sz w:val="16"/>
+              </w:rPr>
+              <w:t>Arrhythmia recessive-context red</w:t>
+            </w:r>
+          </w:p>
+        </w:tc>
+        <w:tc>
+          <w:tcPr>
+            <w:tcW w:type="dxa" w:w="2592"/>
+            <w:vAlign w:val="top"/>
+          </w:tcPr>
+          <w:p>
+            <w:pPr>
+              <w:jc w:val="left"/>
+            </w:pPr>
+            <w:r/>
+            <w:r>
+              <w:rPr>
+                <w:b w:val="0"/>
+                <w:sz w:val="16"/>
+              </w:rPr>
+              <w:t>1</w:t>
+            </w:r>
+          </w:p>
+        </w:tc>
+        <w:tc>
+          <w:tcPr>
+            <w:tcW w:type="dxa" w:w="2592"/>
+            <w:vAlign w:val="top"/>
+          </w:tcPr>
+          <w:p>
+            <w:pPr>
+              <w:jc w:val="left"/>
+            </w:pPr>
+            <w:r/>
+            <w:r>
+              <w:rPr>
+                <w:b w:val="0"/>
+                <w:sz w:val="16"/>
+              </w:rPr>
+              <w:t>1</w:t>
+            </w:r>
+          </w:p>
+        </w:tc>
+        <w:tc>
+          <w:tcPr>
+            <w:tcW w:type="dxa" w:w="2592"/>
+            <w:vAlign w:val="top"/>
+          </w:tcPr>
+          <w:p>
+            <w:pPr>
+              <w:jc w:val="left"/>
+            </w:pPr>
+            <w:r/>
+            <w:r>
+              <w:rPr>
+                <w:b w:val="0"/>
+                <w:sz w:val="16"/>
+              </w:rPr>
+              <w:t>Carrier-architecture routing risk if phase/inheritance is ignored</w:t>
+            </w:r>
+          </w:p>
+        </w:tc>
+      </w:tr>
+      <w:tr>
+        <w:tc>
+          <w:tcPr>
+            <w:tcW w:type="dxa" w:w="2592"/>
+            <w:vAlign w:val="top"/>
+          </w:tcPr>
+          <w:p>
+            <w:pPr>
+              <w:jc w:val="left"/>
+            </w:pPr>
+            <w:r/>
+            <w:r>
+              <w:rPr>
+                <w:b w:val="0"/>
+                <w:sz w:val="16"/>
+              </w:rPr>
+              <w:t>Cross-disease 3,000-sample frequency-discordant upper bound</w:t>
+            </w:r>
+          </w:p>
+        </w:tc>
+        <w:tc>
+          <w:tcPr>
+            <w:tcW w:type="dxa" w:w="2592"/>
+            <w:vAlign w:val="top"/>
+          </w:tcPr>
+          <w:p>
+            <w:pPr>
+              <w:jc w:val="left"/>
+            </w:pPr>
+            <w:r/>
+            <w:r>
+              <w:rPr>
+                <w:b w:val="0"/>
+                <w:sz w:val="16"/>
+              </w:rPr>
+              <w:t>332</w:t>
+            </w:r>
+          </w:p>
+        </w:tc>
+        <w:tc>
+          <w:tcPr>
+            <w:tcW w:type="dxa" w:w="2592"/>
+            <w:vAlign w:val="top"/>
+          </w:tcPr>
+          <w:p>
+            <w:pPr>
+              <w:jc w:val="left"/>
+            </w:pPr>
+            <w:r/>
+            <w:r>
+              <w:rPr>
+                <w:b w:val="0"/>
+                <w:sz w:val="16"/>
+              </w:rPr>
+              <w:t>1,962</w:t>
+            </w:r>
+          </w:p>
+        </w:tc>
+        <w:tc>
+          <w:tcPr>
+            <w:tcW w:type="dxa" w:w="2592"/>
+            <w:vAlign w:val="top"/>
+          </w:tcPr>
+          <w:p>
+            <w:pPr>
+              <w:jc w:val="left"/>
+            </w:pPr>
+            <w:r/>
+            <w:r>
+              <w:rPr>
+                <w:b w:val="0"/>
+                <w:sz w:val="16"/>
+              </w:rPr>
+              <w:t>Cross-disease scale of public label exposure</w:t>
+            </w:r>
+          </w:p>
+        </w:tc>
+      </w:tr>
+      <w:tr>
+        <w:tc>
+          <w:tcPr>
+            <w:tcW w:type="dxa" w:w="2592"/>
+            <w:vAlign w:val="top"/>
+          </w:tcPr>
+          <w:p>
+            <w:pPr>
+              <w:jc w:val="left"/>
+            </w:pPr>
+            <w:r/>
+            <w:r>
+              <w:rPr>
+                <w:b w:val="0"/>
+                <w:sz w:val="16"/>
+              </w:rPr>
+              <w:t>Cross-disease 3,000-sample VITAL-red urgent layer</w:t>
+            </w:r>
+          </w:p>
+        </w:tc>
+        <w:tc>
+          <w:tcPr>
+            <w:tcW w:type="dxa" w:w="2592"/>
+            <w:vAlign w:val="top"/>
+          </w:tcPr>
+          <w:p>
+            <w:pPr>
+              <w:jc w:val="left"/>
+            </w:pPr>
+            <w:r/>
+            <w:r>
+              <w:rPr>
+                <w:b w:val="0"/>
+                <w:sz w:val="16"/>
+              </w:rPr>
+              <w:t>3</w:t>
+            </w:r>
+          </w:p>
+        </w:tc>
+        <w:tc>
+          <w:tcPr>
+            <w:tcW w:type="dxa" w:w="2592"/>
+            <w:vAlign w:val="top"/>
+          </w:tcPr>
+          <w:p>
+            <w:pPr>
+              <w:jc w:val="left"/>
+            </w:pPr>
+            <w:r/>
+            <w:r>
+              <w:rPr>
+                <w:b w:val="0"/>
+                <w:sz w:val="16"/>
+              </w:rPr>
+              <w:t>3</w:t>
+            </w:r>
+          </w:p>
+        </w:tc>
+        <w:tc>
+          <w:tcPr>
+            <w:tcW w:type="dxa" w:w="2592"/>
+            <w:vAlign w:val="top"/>
+          </w:tcPr>
+          <w:p>
+            <w:pPr>
+              <w:jc w:val="left"/>
+            </w:pPr>
+            <w:r/>
+            <w:r>
+              <w:rPr>
+                <w:b w:val="0"/>
+                <w:sz w:val="16"/>
+              </w:rPr>
+              <w:t>Conservative portability check outside arrhythmia</w:t>
+            </w:r>
+          </w:p>
+        </w:tc>
+      </w:tr>
+    </w:tbl>
+    <w:p/>
+    <w:p>
+      <w:pPr>
+        <w:pStyle w:val="Heading2"/>
+      </w:pPr>
+      <w:r>
         <w:t>Cross-disease and historical audits support scope, not broad prediction</w:t>
       </w:r>
     </w:p>
@@ -3083,7 +3739,7 @@
     </w:p>
     <w:p>
       <w:r>
-        <w:t>The clinical consequence is not abstract. A susceptibility allele labeled as Mendelian P/LP can promote diagnostic closure, inappropriate cascade testing, and surveillance framed as monogenic disease. A recessive carrier allele interpreted without phase can imply dominant risk where none is established. An annotation-inflated severe variant can drive family testing or management before the mechanism has been adjudicated. VITAL does not measure these downstream outcomes directly, but it identifies the public assertions most capable of creating those decision risks.</w:t>
+        <w:t>The clinical consequence is not abstract, even though patient-level outcomes are unavailable. In the arrhythmia panel, 115 public P/LP records carried ancestry-aware frequency contradiction, representing at least 168 submitter-exposure units. Nine records had AC-supported contradiction, and 3 were urgent VITAL-red records. Two of those were standard-context red calls, where a generic Mendelian label could plausibly promote diagnostic closure, cascade testing, or surveillance before adjudication; one was a recessive-context TRDN call, where the immediate risk is inappropriate dominant-risk framing. VITAL therefore does not count proven misdiagnoses, but it converts hidden label exposure into an auditable review queue.</w:t>
       </w:r>
     </w:p>
     <w:p>
@@ -3121,7 +3777,7 @@
     </w:p>
     <w:p>
       <w:r>
-        <w:t>Fifth, public ClinVar captures classification-level changes, not patient-level downstream effects. We can identify decision-risk pathways such as diagnostic closure or cascade-testing pressure, but not actual diagnosis reversal, surveillance changes, reproductive decisions, or therapy changes.</w:t>
+        <w:t>Fifth, public ClinVar captures classification-level changes, not patient-level downstream effects. We can quantify public decision-risk exposure as records and minimum submitter-exposure units, but not actual diagnosis reversal, cascade-testing uptake, surveillance changes, reproductive decisions, or therapy changes.</w:t>
       </w:r>
     </w:p>
     <w:p>
@@ -3203,7 +3859,7 @@
     </w:p>
     <w:p>
       <w:r>
-        <w:t>Code, cached intermediate files, figures, and supplementary outputs required to reproduce downstream analyses are available in the project repository. The April 21, 2026 data freeze used ClinVar records retrieved through NCBI Entrez and bulk variant_summary files, gnomAD v4.1.1 exome/genome data queried through the gnomAD GraphQL API, and UCSC annotation resources. Machine-readable supplementary tables include VITAL scores, frequency flags, severe-annotation discordance, mechanism triage, red-priority case summaries, temporal robustness outputs, historical audits, expert-panel comparator outputs, and sensitivity analyses.</w:t>
+        <w:t>Code, cached intermediate files, figures, and supplementary outputs required to reproduce downstream analyses are available in the project repository. The April 21, 2026 data freeze used ClinVar records retrieved through NCBI Entrez and bulk variant_summary files, gnomAD v4.1.1 exome/genome data queried through the gnomAD GraphQL API, and UCSC annotation resources. Machine-readable supplementary tables include VITAL scores, frequency flags, severe-annotation discordance, mechanism triage, red-priority case summaries, temporal robustness outputs, clinical decision-risk proxy outputs, historical audits, expert-panel comparator outputs, and sensitivity analyses.</w:t>
       </w:r>
     </w:p>
     <w:sectPr>

</xml_diff>

<commit_message>
Add counterfactual clinical framing cases
</commit_message>
<xml_diff>
--- a/manuscript_vital_with_figures_tables.docx
+++ b/manuscript_vital_with_figures_tables.docx
@@ -2457,6 +2457,29 @@
         <w:pStyle w:val="Heading2"/>
       </w:pPr>
       <w:r>
+        <w:t>Counterfactual clinical framing exposes decision failure modes</w:t>
+      </w:r>
+    </w:p>
+    <w:p>
+      <w:r>
+        <w:t>SCN5A VCV000440850 is the clearest decision-risk case. The current public state is a ClinVar Pathogenic assertion with no assertion criteria, AFR popmax AF=5.68e-3, AC=190, and VITAL=96.1. If interpreted as a high-penetrance Mendelian Brugada or arrhythmia allele, the label can support diagnostic closure, ancestry-matched cascade testing, and surveillance or therapy discussions. That logic breaks at the population-frequency layer: a variant with this population frequency cannot plausibly represent a high-penetrance monogenic arrhythmia allele. The more coherent biological frame is a context-dependent susceptibility or haplotype signal, not a generic Mendelian P/LP assertion.</w:t>
+      </w:r>
+    </w:p>
+    <w:p>
+      <w:r>
+        <w:t>TRDN VCV001325231 illustrates the opposite failure mode. The current public state is a ClinVar Likely pathogenic assertion from a single submitter, with global AC=40, AMR popmax AF=2.18e-4, and VITAL=74.3. If read as a dominant high-penetrance arrhythmia allele, the label can create inappropriate family-risk framing or surveillance escalation. That logic breaks because the strongest established TRDN disease model is recessive or biallelic null architecture; heterozygous carrier frequency can be compatible with pathogenicity only in the affected-state context. The appropriate review action is therefore carrier- and phase-aware adjudication, including search for a second allele, rather than direct use as a disease-explaining dominant result.</w:t>
+      </w:r>
+    </w:p>
+    <w:p>
+      <w:r>
+        <w:t>KCNH2 VCV004535537 remains a different category. Because KCNH2 is a constrained dominant arrhythmia gene, AC-supported splice-site frequency tension is uncomfortable; because the case is borderline and weight-sensitive, the action is immediate expert review rather than automatic downgrading. Current ClinVar labeling does not distinguish these states.</w:t>
+      </w:r>
+    </w:p>
+    <w:p>
+      <w:pPr>
+        <w:pStyle w:val="Heading2"/>
+      </w:pPr>
+      <w:r>
         <w:t>A pathogenicity-label ontology turns tension into review action</w:t>
       </w:r>
     </w:p>
@@ -3739,6 +3762,11 @@
     </w:p>
     <w:p>
       <w:r>
+        <w:t>These counterfactuals are the system-level point. A single public P/LP label can travel into diagnostic, family-testing, surveillance, and therapy workflows, but it does not preserve whether the claim is a high-penetrance Mendelian assertion, a susceptibility haplotype, a recessive carrier-state allele, or unresolved annotation inflation. The failure is therefore not only possible variant misclassification; it is loss of biological state during clinical transmission.</w:t>
+      </w:r>
+    </w:p>
+    <w:p>
+      <w:r>
         <w:t>The clinical consequence is not abstract, even though patient-level outcomes are unavailable. In the arrhythmia panel, 115 public P/LP records carried ancestry-aware frequency contradiction, representing at least 168 submitter-exposure units. Nine records had AC-supported contradiction, and 3 were urgent VITAL-red records. Two of those were standard-context red calls, where a generic Mendelian label could plausibly promote diagnostic closure, cascade testing, or surveillance before adjudication; one was a recessive-context TRDN call, where the immediate risk is inappropriate dominant-risk framing. VITAL therefore does not count proven misdiagnoses, but it converts hidden label exposure into an auditable review queue.</w:t>
       </w:r>
     </w:p>

</xml_diff>

<commit_message>
Add public evidence boundary audit
</commit_message>
<xml_diff>
--- a/manuscript_vital_with_figures_tables.docx
+++ b/manuscript_vital_with_figures_tables.docx
@@ -557,7 +557,7 @@
     </w:p>
     <w:p>
       <w:r>
-        <w:t>We compared global AF, popmax/global AF, AC-supported frequency screening, and VITAL red-priority calls. We assessed variant-type enrichment among non-overlap records, severe-annotation frequency discordance, LOF subtype patterns, and mechanism triage of severe-discordant variants. Mechanism triage was used to separate probable label-framing modes, including carrier-compatible architecture, context-dependent susceptibility, annotation inflation, and unresolved high-penetrance tension. We then mapped these modes to review-routing classes with explicit entry rules, transition rules, and clinical consequences. Because public ClinVar does not expose patient counts, we quantified clinical decision-risk exposure using record counts and minimum submitter-exposure units, with missing submitter counts treated conservatively as one unit. We performed supporting audits in a 3,000-variant cross-disease ClinVar P/LP sample, including historical January 2023 to April 2026 reclassification, expert-panel reviewed assertions, and real strict P/LP-to-VUS/B/LB events. Threshold sensitivity, AC-gate sensitivity, weight sensitivity, KCNH2 diagnostics, and time-series details are provided in supplementary outputs.</w:t>
+        <w:t>We compared global AF, popmax/global AF, AC-supported frequency screening, and VITAL red-priority calls. We assessed variant-type enrichment among non-overlap records, severe-annotation frequency discordance, LOF subtype patterns, and mechanism triage of severe-discordant variants. Mechanism triage was used to separate probable label-framing modes, including carrier-compatible architecture, context-dependent susceptibility, annotation inflation, and unresolved high-penetrance tension. We then mapped these modes to review-routing classes with explicit entry rules, transition rules, and clinical consequences. Because public ClinVar does not expose patient counts, we quantified clinical decision-risk exposure using record counts and minimum submitter-exposure units, with missing submitter counts treated conservatively as one unit. For red-priority cases, we also audited the public evidence boundary, recording whether the public scoring layer exposed phenotype linkage, penetrance estimates, segregation/phase, or downstream cascade-testing or therapy outcomes. We performed supporting audits in a 3,000-variant cross-disease ClinVar P/LP sample, including historical January 2023 to April 2026 reclassification, expert-panel reviewed assertions, and real strict P/LP-to-VUS/B/LB events. Threshold sensitivity, AC-gate sensitivity, weight sensitivity, KCNH2 diagnostics, and time-series details are provided in supplementary outputs.</w:t>
       </w:r>
     </w:p>
     <w:p>
@@ -2476,6 +2476,559 @@
       </w:r>
     </w:p>
     <w:p>
+      <w:r>
+        <w:t>We then made the evidentiary boundary explicit rather than implied. In the public red-case audit, all 3/3 cases had a public P/LP disease label and weak or single-submitter review support, and 2/3 had public citations or ClinVar literature mentions. However, 0/3 had structured public patient-level phenotype linkage sufficient for causality, 0/3 had public penetrance estimates, 0/3 had public segregation or allelic phase evidence, and 0/3 had documented cascade-testing or therapy outcome data in the scoring layer. The data therefore support public decision-risk exposure and urgent review priority, not a claim of proven misdiagnosis or measured downstream harm.</w:t>
+      </w:r>
+    </w:p>
+    <w:tbl>
+      <w:tblPr>
+        <w:tblStyle w:val="TableGrid"/>
+        <w:tblW w:type="auto" w:w="0"/>
+        <w:jc w:val="center"/>
+        <w:tblLook w:firstColumn="1" w:firstRow="1" w:lastColumn="0" w:lastRow="0" w:noHBand="0" w:noVBand="1" w:val="04A0"/>
+      </w:tblPr>
+      <w:tblGrid>
+        <w:gridCol w:w="3456"/>
+        <w:gridCol w:w="3456"/>
+        <w:gridCol w:w="3456"/>
+      </w:tblGrid>
+      <w:tr>
+        <w:tc>
+          <w:tcPr>
+            <w:tcW w:type="dxa" w:w="3456"/>
+            <w:vAlign w:val="top"/>
+            <w:shd w:fill="D9EAF7"/>
+          </w:tcPr>
+          <w:p>
+            <w:pPr>
+              <w:jc w:val="left"/>
+            </w:pPr>
+            <w:r/>
+            <w:r>
+              <w:rPr>
+                <w:b/>
+                <w:sz w:val="16"/>
+              </w:rPr>
+              <w:t>Public evidence question</w:t>
+            </w:r>
+          </w:p>
+        </w:tc>
+        <w:tc>
+          <w:tcPr>
+            <w:tcW w:type="dxa" w:w="3456"/>
+            <w:vAlign w:val="top"/>
+            <w:shd w:fill="D9EAF7"/>
+          </w:tcPr>
+          <w:p>
+            <w:pPr>
+              <w:jc w:val="left"/>
+            </w:pPr>
+            <w:r/>
+            <w:r>
+              <w:rPr>
+                <w:b/>
+                <w:sz w:val="16"/>
+              </w:rPr>
+              <w:t>Red-priority cases with evidence</w:t>
+            </w:r>
+          </w:p>
+        </w:tc>
+        <w:tc>
+          <w:tcPr>
+            <w:tcW w:type="dxa" w:w="3456"/>
+            <w:vAlign w:val="top"/>
+            <w:shd w:fill="D9EAF7"/>
+          </w:tcPr>
+          <w:p>
+            <w:pPr>
+              <w:jc w:val="left"/>
+            </w:pPr>
+            <w:r/>
+            <w:r>
+              <w:rPr>
+                <w:b/>
+                <w:sz w:val="16"/>
+              </w:rPr>
+              <w:t>Interpretation</w:t>
+            </w:r>
+          </w:p>
+        </w:tc>
+      </w:tr>
+      <w:tr>
+        <w:tc>
+          <w:tcPr>
+            <w:tcW w:type="dxa" w:w="3456"/>
+            <w:vAlign w:val="top"/>
+          </w:tcPr>
+          <w:p>
+            <w:pPr>
+              <w:jc w:val="left"/>
+            </w:pPr>
+            <w:r/>
+            <w:r>
+              <w:rPr>
+                <w:b w:val="0"/>
+                <w:sz w:val="16"/>
+              </w:rPr>
+              <w:t>P/LP public status and disease/condition label</w:t>
+            </w:r>
+          </w:p>
+        </w:tc>
+        <w:tc>
+          <w:tcPr>
+            <w:tcW w:type="dxa" w:w="3456"/>
+            <w:vAlign w:val="top"/>
+          </w:tcPr>
+          <w:p>
+            <w:pPr>
+              <w:jc w:val="left"/>
+            </w:pPr>
+            <w:r/>
+            <w:r>
+              <w:rPr>
+                <w:b w:val="0"/>
+                <w:sz w:val="16"/>
+              </w:rPr>
+              <w:t>3/3</w:t>
+            </w:r>
+          </w:p>
+        </w:tc>
+        <w:tc>
+          <w:tcPr>
+            <w:tcW w:type="dxa" w:w="3456"/>
+            <w:vAlign w:val="top"/>
+          </w:tcPr>
+          <w:p>
+            <w:pPr>
+              <w:jc w:val="left"/>
+            </w:pPr>
+            <w:r/>
+            <w:r>
+              <w:rPr>
+                <w:b w:val="0"/>
+                <w:sz w:val="16"/>
+              </w:rPr>
+              <w:t>Label can enter diagnostic workflows</w:t>
+            </w:r>
+          </w:p>
+        </w:tc>
+      </w:tr>
+      <w:tr>
+        <w:tc>
+          <w:tcPr>
+            <w:tcW w:type="dxa" w:w="3456"/>
+            <w:vAlign w:val="top"/>
+          </w:tcPr>
+          <w:p>
+            <w:pPr>
+              <w:jc w:val="left"/>
+            </w:pPr>
+            <w:r/>
+            <w:r>
+              <w:rPr>
+                <w:b w:val="0"/>
+                <w:sz w:val="16"/>
+              </w:rPr>
+              <w:t>Weak or single-submitter review support</w:t>
+            </w:r>
+          </w:p>
+        </w:tc>
+        <w:tc>
+          <w:tcPr>
+            <w:tcW w:type="dxa" w:w="3456"/>
+            <w:vAlign w:val="top"/>
+          </w:tcPr>
+          <w:p>
+            <w:pPr>
+              <w:jc w:val="left"/>
+            </w:pPr>
+            <w:r/>
+            <w:r>
+              <w:rPr>
+                <w:b w:val="0"/>
+                <w:sz w:val="16"/>
+              </w:rPr>
+              <w:t>3/3</w:t>
+            </w:r>
+          </w:p>
+        </w:tc>
+        <w:tc>
+          <w:tcPr>
+            <w:tcW w:type="dxa" w:w="3456"/>
+            <w:vAlign w:val="top"/>
+          </w:tcPr>
+          <w:p>
+            <w:pPr>
+              <w:jc w:val="left"/>
+            </w:pPr>
+            <w:r/>
+            <w:r>
+              <w:rPr>
+                <w:b w:val="0"/>
+                <w:sz w:val="16"/>
+              </w:rPr>
+              <w:t>Public assertion is fragile enough for priority review</w:t>
+            </w:r>
+          </w:p>
+        </w:tc>
+      </w:tr>
+      <w:tr>
+        <w:tc>
+          <w:tcPr>
+            <w:tcW w:type="dxa" w:w="3456"/>
+            <w:vAlign w:val="top"/>
+          </w:tcPr>
+          <w:p>
+            <w:pPr>
+              <w:jc w:val="left"/>
+            </w:pPr>
+            <w:r/>
+            <w:r>
+              <w:rPr>
+                <w:b w:val="0"/>
+                <w:sz w:val="16"/>
+              </w:rPr>
+              <w:t>Public citation or ClinVar literature mention</w:t>
+            </w:r>
+          </w:p>
+        </w:tc>
+        <w:tc>
+          <w:tcPr>
+            <w:tcW w:type="dxa" w:w="3456"/>
+            <w:vAlign w:val="top"/>
+          </w:tcPr>
+          <w:p>
+            <w:pPr>
+              <w:jc w:val="left"/>
+            </w:pPr>
+            <w:r/>
+            <w:r>
+              <w:rPr>
+                <w:b w:val="0"/>
+                <w:sz w:val="16"/>
+              </w:rPr>
+              <w:t>2/3</w:t>
+            </w:r>
+          </w:p>
+        </w:tc>
+        <w:tc>
+          <w:tcPr>
+            <w:tcW w:type="dxa" w:w="3456"/>
+            <w:vAlign w:val="top"/>
+          </w:tcPr>
+          <w:p>
+            <w:pPr>
+              <w:jc w:val="left"/>
+            </w:pPr>
+            <w:r/>
+            <w:r>
+              <w:rPr>
+                <w:b w:val="0"/>
+                <w:sz w:val="16"/>
+              </w:rPr>
+              <w:t>Literature exists for some cases, but not patient-level outcome proof</w:t>
+            </w:r>
+          </w:p>
+        </w:tc>
+      </w:tr>
+      <w:tr>
+        <w:tc>
+          <w:tcPr>
+            <w:tcW w:type="dxa" w:w="3456"/>
+            <w:vAlign w:val="top"/>
+          </w:tcPr>
+          <w:p>
+            <w:pPr>
+              <w:jc w:val="left"/>
+            </w:pPr>
+            <w:r/>
+            <w:r>
+              <w:rPr>
+                <w:b w:val="0"/>
+                <w:sz w:val="16"/>
+              </w:rPr>
+              <w:t>Structured patient-level phenotype linkage sufficient for causality</w:t>
+            </w:r>
+          </w:p>
+        </w:tc>
+        <w:tc>
+          <w:tcPr>
+            <w:tcW w:type="dxa" w:w="3456"/>
+            <w:vAlign w:val="top"/>
+          </w:tcPr>
+          <w:p>
+            <w:pPr>
+              <w:jc w:val="left"/>
+            </w:pPr>
+            <w:r/>
+            <w:r>
+              <w:rPr>
+                <w:b w:val="0"/>
+                <w:sz w:val="16"/>
+              </w:rPr>
+              <w:t>0/3</w:t>
+            </w:r>
+          </w:p>
+        </w:tc>
+        <w:tc>
+          <w:tcPr>
+            <w:tcW w:type="dxa" w:w="3456"/>
+            <w:vAlign w:val="top"/>
+          </w:tcPr>
+          <w:p>
+            <w:pPr>
+              <w:jc w:val="left"/>
+            </w:pPr>
+            <w:r/>
+            <w:r>
+              <w:rPr>
+                <w:b w:val="0"/>
+                <w:sz w:val="16"/>
+              </w:rPr>
+              <w:t>Not available in the public scoring layer</w:t>
+            </w:r>
+          </w:p>
+        </w:tc>
+      </w:tr>
+      <w:tr>
+        <w:tc>
+          <w:tcPr>
+            <w:tcW w:type="dxa" w:w="3456"/>
+            <w:vAlign w:val="top"/>
+          </w:tcPr>
+          <w:p>
+            <w:pPr>
+              <w:jc w:val="left"/>
+            </w:pPr>
+            <w:r/>
+            <w:r>
+              <w:rPr>
+                <w:b w:val="0"/>
+                <w:sz w:val="16"/>
+              </w:rPr>
+              <w:t>Public penetrance estimate</w:t>
+            </w:r>
+          </w:p>
+        </w:tc>
+        <w:tc>
+          <w:tcPr>
+            <w:tcW w:type="dxa" w:w="3456"/>
+            <w:vAlign w:val="top"/>
+          </w:tcPr>
+          <w:p>
+            <w:pPr>
+              <w:jc w:val="left"/>
+            </w:pPr>
+            <w:r/>
+            <w:r>
+              <w:rPr>
+                <w:b w:val="0"/>
+                <w:sz w:val="16"/>
+              </w:rPr>
+              <w:t>0/3</w:t>
+            </w:r>
+          </w:p>
+        </w:tc>
+        <w:tc>
+          <w:tcPr>
+            <w:tcW w:type="dxa" w:w="3456"/>
+            <w:vAlign w:val="top"/>
+          </w:tcPr>
+          <w:p>
+            <w:pPr>
+              <w:jc w:val="left"/>
+            </w:pPr>
+            <w:r/>
+            <w:r>
+              <w:rPr>
+                <w:b w:val="0"/>
+                <w:sz w:val="16"/>
+              </w:rPr>
+              <w:t>Not available in the public scoring layer</w:t>
+            </w:r>
+          </w:p>
+        </w:tc>
+      </w:tr>
+      <w:tr>
+        <w:tc>
+          <w:tcPr>
+            <w:tcW w:type="dxa" w:w="3456"/>
+            <w:vAlign w:val="top"/>
+          </w:tcPr>
+          <w:p>
+            <w:pPr>
+              <w:jc w:val="left"/>
+            </w:pPr>
+            <w:r/>
+            <w:r>
+              <w:rPr>
+                <w:b w:val="0"/>
+                <w:sz w:val="16"/>
+              </w:rPr>
+              <w:t>Public segregation or allelic phase evidence</w:t>
+            </w:r>
+          </w:p>
+        </w:tc>
+        <w:tc>
+          <w:tcPr>
+            <w:tcW w:type="dxa" w:w="3456"/>
+            <w:vAlign w:val="top"/>
+          </w:tcPr>
+          <w:p>
+            <w:pPr>
+              <w:jc w:val="left"/>
+            </w:pPr>
+            <w:r/>
+            <w:r>
+              <w:rPr>
+                <w:b w:val="0"/>
+                <w:sz w:val="16"/>
+              </w:rPr>
+              <w:t>0/3</w:t>
+            </w:r>
+          </w:p>
+        </w:tc>
+        <w:tc>
+          <w:tcPr>
+            <w:tcW w:type="dxa" w:w="3456"/>
+            <w:vAlign w:val="top"/>
+          </w:tcPr>
+          <w:p>
+            <w:pPr>
+              <w:jc w:val="left"/>
+            </w:pPr>
+            <w:r/>
+            <w:r>
+              <w:rPr>
+                <w:b w:val="0"/>
+                <w:sz w:val="16"/>
+              </w:rPr>
+              <w:t>Not available in the public scoring layer</w:t>
+            </w:r>
+          </w:p>
+        </w:tc>
+      </w:tr>
+      <w:tr>
+        <w:tc>
+          <w:tcPr>
+            <w:tcW w:type="dxa" w:w="3456"/>
+            <w:vAlign w:val="top"/>
+          </w:tcPr>
+          <w:p>
+            <w:pPr>
+              <w:jc w:val="left"/>
+            </w:pPr>
+            <w:r/>
+            <w:r>
+              <w:rPr>
+                <w:b w:val="0"/>
+                <w:sz w:val="16"/>
+              </w:rPr>
+              <w:t>Documented cascade-testing or therapy outcome</w:t>
+            </w:r>
+          </w:p>
+        </w:tc>
+        <w:tc>
+          <w:tcPr>
+            <w:tcW w:type="dxa" w:w="3456"/>
+            <w:vAlign w:val="top"/>
+          </w:tcPr>
+          <w:p>
+            <w:pPr>
+              <w:jc w:val="left"/>
+            </w:pPr>
+            <w:r/>
+            <w:r>
+              <w:rPr>
+                <w:b w:val="0"/>
+                <w:sz w:val="16"/>
+              </w:rPr>
+              <w:t>0/3</w:t>
+            </w:r>
+          </w:p>
+        </w:tc>
+        <w:tc>
+          <w:tcPr>
+            <w:tcW w:type="dxa" w:w="3456"/>
+            <w:vAlign w:val="top"/>
+          </w:tcPr>
+          <w:p>
+            <w:pPr>
+              <w:jc w:val="left"/>
+            </w:pPr>
+            <w:r/>
+            <w:r>
+              <w:rPr>
+                <w:b w:val="0"/>
+                <w:sz w:val="16"/>
+              </w:rPr>
+              <w:t>Not available in the public scoring layer</w:t>
+            </w:r>
+          </w:p>
+        </w:tc>
+      </w:tr>
+      <w:tr>
+        <w:tc>
+          <w:tcPr>
+            <w:tcW w:type="dxa" w:w="3456"/>
+            <w:vAlign w:val="top"/>
+          </w:tcPr>
+          <w:p>
+            <w:pPr>
+              <w:jc w:val="left"/>
+            </w:pPr>
+            <w:r/>
+            <w:r>
+              <w:rPr>
+                <w:b w:val="0"/>
+                <w:sz w:val="16"/>
+              </w:rPr>
+              <w:t>Measurable public decision-risk exposure proxy</w:t>
+            </w:r>
+          </w:p>
+        </w:tc>
+        <w:tc>
+          <w:tcPr>
+            <w:tcW w:type="dxa" w:w="3456"/>
+            <w:vAlign w:val="top"/>
+          </w:tcPr>
+          <w:p>
+            <w:pPr>
+              <w:jc w:val="left"/>
+            </w:pPr>
+            <w:r/>
+            <w:r>
+              <w:rPr>
+                <w:b w:val="0"/>
+                <w:sz w:val="16"/>
+              </w:rPr>
+              <w:t>3/3</w:t>
+            </w:r>
+          </w:p>
+        </w:tc>
+        <w:tc>
+          <w:tcPr>
+            <w:tcW w:type="dxa" w:w="3456"/>
+            <w:vAlign w:val="top"/>
+          </w:tcPr>
+          <w:p>
+            <w:pPr>
+              <w:jc w:val="left"/>
+            </w:pPr>
+            <w:r/>
+            <w:r>
+              <w:rPr>
+                <w:b w:val="0"/>
+                <w:sz w:val="16"/>
+              </w:rPr>
+              <w:t>Available as record-level and submitter-exposure counts</w:t>
+            </w:r>
+          </w:p>
+        </w:tc>
+      </w:tr>
+    </w:tbl>
+    <w:p/>
+    <w:p>
       <w:pPr>
         <w:pStyle w:val="Heading2"/>
       </w:pPr>

</xml_diff>

<commit_message>
Frame AF non-evaluability as interpretability gap
</commit_message>
<xml_diff>
--- a/manuscript_vital_with_figures_tables.docx
+++ b/manuscript_vital_with_figures_tables.docx
@@ -48,7 +48,7 @@
         <w:t>Results:</w:t>
       </w:r>
       <w:r>
-        <w:t xml:space="preserve"> Only 350/1,731 variants (20.2%) had exact gnomAD allele matches, and 334 had usable AF evidence. Global AF alone identified 13 variants above AF &gt;1e-5, whereas popmax/global screening identified 115; global-AF-only review therefore missed 102/115 (88.7%) ancestry-aware frequency alerts. Severe annotation did not protect against this signal: 92/262 AF-observed LOF/splice assertions (35.1%) had popmax/global AF &gt;1e-5, similar to missense assertions (19/66, 28.8%). Mechanism triage showed recurrent label-framing distortion rather than a simple error-rate estimate: carrier-compatible recessive assertions were presented as generic P/LP, context-dependent susceptibility appeared as Mendelian pathogenicity, and severe annotation sometimes substituted for mechanism-specific evidence. Because patient-level outcomes are not observable in public ClinVar, we quantified decision-risk exposure: the 115 frequency-discordant arrhythmia records represented at least 168 submitter-exposure units, 9 AC-supported records represented 15 units, and VITAL compressed these to 3 urgent records. In an independent 3,000-variant cross-disease historical audit, VITAL-red captured one real P/LP-to-VUS reclassification (CFAP91 VCV000812096), while an expert-panel RYR1 downgrade without frequency tension remained outside scope.</w:t>
+        <w:t xml:space="preserve"> Only 334/1,731 variants (19.3%) had usable exact AF evidence; the remaining 1,397 (80.7%) formed a non-evaluable representation gap rather than a frequency-consistent background. Within the AF-observed space, global AF alone identified 13 variants above AF &gt;1e-5, whereas popmax/global screening identified 115; global-AF-only review therefore missed 102/115 (88.7%) ancestry-aware frequency alerts. Severe annotation did not protect against this signal: 92/262 AF-observed LOF/splice assertions (35.1%) had popmax/global AF &gt;1e-5, similar to missense assertions (19/66, 28.8%). Mechanism triage showed recurrent label-framing distortion rather than a simple error-rate estimate: carrier-compatible recessive assertions were presented as generic P/LP, context-dependent susceptibility appeared as Mendelian pathogenicity, and severe annotation sometimes substituted for mechanism-specific evidence. Because patient-level outcomes are not observable in public ClinVar, we quantified decision-risk exposure: the 115 frequency-discordant arrhythmia records represented at least 168 submitter-exposure units, 9 AC-supported records represented 15 units, and VITAL compressed these to 3 urgent records. In an independent 3,000-variant cross-disease historical audit, VITAL-red captured one real P/LP-to-VUS reclassification (CFAP91 VCV000812096), while an expert-panel RYR1 downgrade without frequency tension remained outside scope.</w:t>
       </w:r>
     </w:p>
     <w:p>
@@ -59,7 +59,7 @@
         <w:t>Conclusion:</w:t>
       </w:r>
       <w:r>
-        <w:t xml:space="preserve"> Severe annotation alone is not sufficient to override population-frequency contradiction. A subset of public P/LP assertions appears biologically misframed rather than merely uncertain: susceptibility is not equivalent to Mendelian disease, carrier architecture is not equivalent to dominant pathogenicity, and severe annotation is not equivalent to high penetrance. A label-state ontology makes these distortions clinically actionable as review routes while preserving expert responsibility for final classification.</w:t>
+        <w:t xml:space="preserve"> Severe annotation alone is not sufficient to override population-frequency contradiction, and exact AF non-evaluability is itself an interpretability failure. A subset of public P/LP assertions appears biologically misframed rather than merely uncertain: susceptibility is not equivalent to Mendelian disease, carrier architecture is not equivalent to dominant pathogenicity, and severe annotation is not equivalent to high penetrance. A label-state ontology makes these distortions clinically actionable as review routes while preserving expert responsibility for final classification.</w:t>
       </w:r>
     </w:p>
     <w:p>
@@ -557,7 +557,7 @@
     </w:p>
     <w:p>
       <w:r>
-        <w:t>We compared global AF, popmax/global AF, AC-supported frequency screening, and VITAL red-priority calls. We assessed variant-type enrichment among non-overlap records, severe-annotation frequency discordance, LOF subtype patterns, and mechanism triage of severe-discordant variants. Mechanism triage was used to separate probable label-framing modes, including carrier-compatible architecture, context-dependent susceptibility, annotation inflation, and unresolved high-penetrance tension. We then mapped these modes to review-routing classes with explicit entry rules, transition rules, and clinical consequences. Because public ClinVar does not expose patient counts, we quantified clinical decision-risk exposure using record counts and minimum submitter-exposure units, with missing submitter counts treated conservatively as one unit. For red-priority cases, we also audited the public evidence boundary, recording whether the public scoring layer exposed phenotype linkage, penetrance estimates, segregation/phase, or downstream cascade-testing or therapy outcomes. We performed supporting audits in a 3,000-variant cross-disease ClinVar P/LP sample, including historical January 2023 to April 2026 reclassification, expert-panel reviewed assertions, and real strict P/LP-to-VUS/B/LB events. Threshold sensitivity, AC-gate sensitivity, weight sensitivity, KCNH2 diagnostics, and time-series details are provided in supplementary outputs.</w:t>
+        <w:t>We compared global AF, popmax/global AF, AC-supported frequency screening, and VITAL red-priority calls. We assessed variant-type enrichment among non-overlap records, severe-annotation frequency discordance, LOF subtype patterns, and mechanism triage of severe-discordant variants. Mechanism triage was used to separate probable label-framing modes, including carrier-compatible architecture, context-dependent susceptibility, annotation inflation, and unresolved high-penetrance tension. We then mapped these modes to review-routing classes with explicit entry rules, transition rules, and clinical consequences. Because public ClinVar does not expose patient counts, we quantified clinical decision-risk exposure using record counts and minimum submitter-exposure units, with missing submitter counts treated conservatively as one unit. For red-priority cases, we also audited the public evidence boundary, recording whether the public scoring layer exposed phenotype linkage, penetrance estimates, segregation/phase, or downstream cascade-testing or therapy outcomes. Finally, we performed a frequency-evaluability audit separating AF-observed assertions from the non-evaluable majority, stratified by gene, variant type, and review strength, with SNV-only sensitivity checks. We performed supporting audits in a 3,000-variant cross-disease ClinVar P/LP sample, including historical January 2023 to April 2026 reclassification, expert-panel reviewed assertions, and real strict P/LP-to-VUS/B/LB events. Threshold sensitivity, AC-gate sensitivity, weight sensitivity, KCNH2 diagnostics, and time-series details are provided in supplementary outputs.</w:t>
       </w:r>
     </w:p>
     <w:p>
@@ -579,6 +579,11 @@
     <w:p>
       <w:r>
         <w:t>ClinVar parsing identified 1,731 unique arrhythmia P/LP variants. Of these, 350 (20.2%) had exact allele-level matches in gnomAD exomes, and 334 had usable AF evidence. Among the remaining variants, 645 were allele-discordant at the same position, 736 had no gnomAD record, and 16 exact matches lacked usable AF blocks. Thus, most ClinVar arrhythmia P/LP assertions cannot be evaluated by a simple exact-AF lookup.</w:t>
+      </w:r>
+    </w:p>
+    <w:p>
+      <w:r>
+        <w:t>This low AF-evaluable fraction is not merely a limitation; it is itself an underrecognized failure mode of frequency-based interpretation. Most public P/LP assertions are not even evaluable by exact population-frequency matching. All frequency-based conclusions below are therefore restricted to the AF-observed subset (n=334). The non-evaluable majority (n=1,397) defines a separate interpretability gap rather than weakening the observed frequency signal.</w:t>
       </w:r>
     </w:p>
     <w:p>
@@ -963,6 +968,420 @@
       </w:r>
     </w:p>
     <w:p>
+      <w:r>
+        <w:t>The AF-observed subset was not treated as representative of all ClinVar P/LP assertions. A sanity audit showed structured differences between evaluable and non-evaluable spaces: AF-observed variants spanned 14/17 genes but were enriched for SNVs (71.3% vs 52.4% in the non-evaluable majority) and multiple-submitter assertions (32.6% vs 18.3%), whereas non-evaluable variants were enriched for indels/duplications and for KCNH2/SCN5A. This is measured representation bias, not random missingness.</w:t>
+      </w:r>
+    </w:p>
+    <w:tbl>
+      <w:tblPr>
+        <w:tblStyle w:val="TableGrid"/>
+        <w:tblW w:type="auto" w:w="0"/>
+        <w:jc w:val="center"/>
+        <w:tblLook w:firstColumn="1" w:firstRow="1" w:lastColumn="0" w:lastRow="0" w:noHBand="0" w:noVBand="1" w:val="04A0"/>
+      </w:tblPr>
+      <w:tblGrid>
+        <w:gridCol w:w="2592"/>
+        <w:gridCol w:w="2592"/>
+        <w:gridCol w:w="2592"/>
+        <w:gridCol w:w="2592"/>
+      </w:tblGrid>
+      <w:tr>
+        <w:tc>
+          <w:tcPr>
+            <w:tcW w:type="dxa" w:w="2592"/>
+            <w:vAlign w:val="top"/>
+            <w:shd w:fill="D9EAF7"/>
+          </w:tcPr>
+          <w:p>
+            <w:pPr>
+              <w:jc w:val="left"/>
+            </w:pPr>
+            <w:r/>
+            <w:r>
+              <w:rPr>
+                <w:b/>
+                <w:sz w:val="16"/>
+              </w:rPr>
+              <w:t>Analysis space</w:t>
+            </w:r>
+          </w:p>
+        </w:tc>
+        <w:tc>
+          <w:tcPr>
+            <w:tcW w:type="dxa" w:w="2592"/>
+            <w:vAlign w:val="top"/>
+            <w:shd w:fill="D9EAF7"/>
+          </w:tcPr>
+          <w:p>
+            <w:pPr>
+              <w:jc w:val="left"/>
+            </w:pPr>
+            <w:r/>
+            <w:r>
+              <w:rPr>
+                <w:b/>
+                <w:sz w:val="16"/>
+              </w:rPr>
+              <w:t>Variants</w:t>
+            </w:r>
+          </w:p>
+        </w:tc>
+        <w:tc>
+          <w:tcPr>
+            <w:tcW w:type="dxa" w:w="2592"/>
+            <w:vAlign w:val="top"/>
+            <w:shd w:fill="D9EAF7"/>
+          </w:tcPr>
+          <w:p>
+            <w:pPr>
+              <w:jc w:val="left"/>
+            </w:pPr>
+            <w:r/>
+            <w:r>
+              <w:rPr>
+                <w:b/>
+                <w:sz w:val="16"/>
+              </w:rPr>
+              <w:t>Frequency-discordant</w:t>
+            </w:r>
+          </w:p>
+        </w:tc>
+        <w:tc>
+          <w:tcPr>
+            <w:tcW w:type="dxa" w:w="2592"/>
+            <w:vAlign w:val="top"/>
+            <w:shd w:fill="D9EAF7"/>
+          </w:tcPr>
+          <w:p>
+            <w:pPr>
+              <w:jc w:val="left"/>
+            </w:pPr>
+            <w:r/>
+            <w:r>
+              <w:rPr>
+                <w:b/>
+                <w:sz w:val="16"/>
+              </w:rPr>
+              <w:t>Interpretation</w:t>
+            </w:r>
+          </w:p>
+        </w:tc>
+      </w:tr>
+      <w:tr>
+        <w:tc>
+          <w:tcPr>
+            <w:tcW w:type="dxa" w:w="2592"/>
+            <w:vAlign w:val="top"/>
+          </w:tcPr>
+          <w:p>
+            <w:pPr>
+              <w:jc w:val="left"/>
+            </w:pPr>
+            <w:r/>
+            <w:r>
+              <w:rPr>
+                <w:b w:val="0"/>
+                <w:sz w:val="16"/>
+              </w:rPr>
+              <w:t>AF-observed evaluable space</w:t>
+            </w:r>
+          </w:p>
+        </w:tc>
+        <w:tc>
+          <w:tcPr>
+            <w:tcW w:type="dxa" w:w="2592"/>
+            <w:vAlign w:val="top"/>
+          </w:tcPr>
+          <w:p>
+            <w:pPr>
+              <w:jc w:val="left"/>
+            </w:pPr>
+            <w:r/>
+            <w:r>
+              <w:rPr>
+                <w:b w:val="0"/>
+                <w:sz w:val="16"/>
+              </w:rPr>
+              <w:t>334 (19.3%)</w:t>
+            </w:r>
+          </w:p>
+        </w:tc>
+        <w:tc>
+          <w:tcPr>
+            <w:tcW w:type="dxa" w:w="2592"/>
+            <w:vAlign w:val="top"/>
+          </w:tcPr>
+          <w:p>
+            <w:pPr>
+              <w:jc w:val="left"/>
+            </w:pPr>
+            <w:r/>
+            <w:r>
+              <w:rPr>
+                <w:b w:val="0"/>
+                <w:sz w:val="16"/>
+              </w:rPr>
+              <w:t>115/334 (34.4%)</w:t>
+            </w:r>
+          </w:p>
+        </w:tc>
+        <w:tc>
+          <w:tcPr>
+            <w:tcW w:type="dxa" w:w="2592"/>
+            <w:vAlign w:val="top"/>
+          </w:tcPr>
+          <w:p>
+            <w:pPr>
+              <w:jc w:val="left"/>
+            </w:pPr>
+            <w:r/>
+            <w:r>
+              <w:rPr>
+                <w:b w:val="0"/>
+                <w:sz w:val="16"/>
+              </w:rPr>
+              <w:t>Only space used for frequency-discordance conclusions</w:t>
+            </w:r>
+          </w:p>
+        </w:tc>
+      </w:tr>
+      <w:tr>
+        <w:tc>
+          <w:tcPr>
+            <w:tcW w:type="dxa" w:w="2592"/>
+            <w:vAlign w:val="top"/>
+          </w:tcPr>
+          <w:p>
+            <w:pPr>
+              <w:jc w:val="left"/>
+            </w:pPr>
+            <w:r/>
+            <w:r>
+              <w:rPr>
+                <w:b w:val="0"/>
+                <w:sz w:val="16"/>
+              </w:rPr>
+              <w:t>Non-evaluable interpretability gap</w:t>
+            </w:r>
+          </w:p>
+        </w:tc>
+        <w:tc>
+          <w:tcPr>
+            <w:tcW w:type="dxa" w:w="2592"/>
+            <w:vAlign w:val="top"/>
+          </w:tcPr>
+          <w:p>
+            <w:pPr>
+              <w:jc w:val="left"/>
+            </w:pPr>
+            <w:r/>
+            <w:r>
+              <w:rPr>
+                <w:b w:val="0"/>
+                <w:sz w:val="16"/>
+              </w:rPr>
+              <w:t>1,397 (80.7%)</w:t>
+            </w:r>
+          </w:p>
+        </w:tc>
+        <w:tc>
+          <w:tcPr>
+            <w:tcW w:type="dxa" w:w="2592"/>
+            <w:vAlign w:val="top"/>
+          </w:tcPr>
+          <w:p>
+            <w:pPr>
+              <w:jc w:val="left"/>
+            </w:pPr>
+            <w:r/>
+            <w:r>
+              <w:rPr>
+                <w:b w:val="0"/>
+                <w:sz w:val="16"/>
+              </w:rPr>
+              <w:t>Not scored</w:t>
+            </w:r>
+          </w:p>
+        </w:tc>
+        <w:tc>
+          <w:tcPr>
+            <w:tcW w:type="dxa" w:w="2592"/>
+            <w:vAlign w:val="top"/>
+          </w:tcPr>
+          <w:p>
+            <w:pPr>
+              <w:jc w:val="left"/>
+            </w:pPr>
+            <w:r/>
+            <w:r>
+              <w:rPr>
+                <w:b w:val="0"/>
+                <w:sz w:val="16"/>
+              </w:rPr>
+              <w:t>Separate representation gap; not evidence of frequency consistency</w:t>
+            </w:r>
+          </w:p>
+        </w:tc>
+      </w:tr>
+      <w:tr>
+        <w:tc>
+          <w:tcPr>
+            <w:tcW w:type="dxa" w:w="2592"/>
+            <w:vAlign w:val="top"/>
+          </w:tcPr>
+          <w:p>
+            <w:pPr>
+              <w:jc w:val="left"/>
+            </w:pPr>
+            <w:r/>
+            <w:r>
+              <w:rPr>
+                <w:b w:val="0"/>
+                <w:sz w:val="16"/>
+              </w:rPr>
+              <w:t>SNV-only AF-observed sensitivity</w:t>
+            </w:r>
+          </w:p>
+        </w:tc>
+        <w:tc>
+          <w:tcPr>
+            <w:tcW w:type="dxa" w:w="2592"/>
+            <w:vAlign w:val="top"/>
+          </w:tcPr>
+          <w:p>
+            <w:pPr>
+              <w:jc w:val="left"/>
+            </w:pPr>
+            <w:r/>
+            <w:r>
+              <w:rPr>
+                <w:b w:val="0"/>
+                <w:sz w:val="16"/>
+              </w:rPr>
+              <w:t>238</w:t>
+            </w:r>
+          </w:p>
+        </w:tc>
+        <w:tc>
+          <w:tcPr>
+            <w:tcW w:type="dxa" w:w="2592"/>
+            <w:vAlign w:val="top"/>
+          </w:tcPr>
+          <w:p>
+            <w:pPr>
+              <w:jc w:val="left"/>
+            </w:pPr>
+            <w:r/>
+            <w:r>
+              <w:rPr>
+                <w:b w:val="0"/>
+                <w:sz w:val="16"/>
+              </w:rPr>
+              <w:t>79/238 (33.2%)</w:t>
+            </w:r>
+          </w:p>
+        </w:tc>
+        <w:tc>
+          <w:tcPr>
+            <w:tcW w:type="dxa" w:w="2592"/>
+            <w:vAlign w:val="top"/>
+          </w:tcPr>
+          <w:p>
+            <w:pPr>
+              <w:jc w:val="left"/>
+            </w:pPr>
+            <w:r/>
+            <w:r>
+              <w:rPr>
+                <w:b w:val="0"/>
+                <w:sz w:val="16"/>
+              </w:rPr>
+              <w:t>Popmax tension persists in well-represented SNVs</w:t>
+            </w:r>
+          </w:p>
+        </w:tc>
+      </w:tr>
+      <w:tr>
+        <w:tc>
+          <w:tcPr>
+            <w:tcW w:type="dxa" w:w="2592"/>
+            <w:vAlign w:val="top"/>
+          </w:tcPr>
+          <w:p>
+            <w:pPr>
+              <w:jc w:val="left"/>
+            </w:pPr>
+            <w:r/>
+            <w:r>
+              <w:rPr>
+                <w:b w:val="0"/>
+                <w:sz w:val="16"/>
+              </w:rPr>
+              <w:t>Non-recessive SNV-only sensitivity</w:t>
+            </w:r>
+          </w:p>
+        </w:tc>
+        <w:tc>
+          <w:tcPr>
+            <w:tcW w:type="dxa" w:w="2592"/>
+            <w:vAlign w:val="top"/>
+          </w:tcPr>
+          <w:p>
+            <w:pPr>
+              <w:jc w:val="left"/>
+            </w:pPr>
+            <w:r/>
+            <w:r>
+              <w:rPr>
+                <w:b w:val="0"/>
+                <w:sz w:val="16"/>
+              </w:rPr>
+              <w:t>186</w:t>
+            </w:r>
+          </w:p>
+        </w:tc>
+        <w:tc>
+          <w:tcPr>
+            <w:tcW w:type="dxa" w:w="2592"/>
+            <w:vAlign w:val="top"/>
+          </w:tcPr>
+          <w:p>
+            <w:pPr>
+              <w:jc w:val="left"/>
+            </w:pPr>
+            <w:r/>
+            <w:r>
+              <w:rPr>
+                <w:b w:val="0"/>
+                <w:sz w:val="16"/>
+              </w:rPr>
+              <w:t>55/186 (29.6%)</w:t>
+            </w:r>
+          </w:p>
+        </w:tc>
+        <w:tc>
+          <w:tcPr>
+            <w:tcW w:type="dxa" w:w="2592"/>
+            <w:vAlign w:val="top"/>
+          </w:tcPr>
+          <w:p>
+            <w:pPr>
+              <w:jc w:val="left"/>
+            </w:pPr>
+            <w:r/>
+            <w:r>
+              <w:rPr>
+                <w:b w:val="0"/>
+                <w:sz w:val="16"/>
+              </w:rPr>
+              <w:t>Signal persists after excluding CASQ2/TRDN</w:t>
+            </w:r>
+          </w:p>
+        </w:tc>
+      </w:tr>
+    </w:tbl>
+    <w:p/>
+    <w:p>
       <w:pPr>
         <w:pStyle w:val="Heading2"/>
       </w:pPr>
@@ -1042,7 +1461,7 @@
     </w:p>
     <w:p>
       <w:r>
-        <w:t>Non-overlap was not random. Indels were enriched among variants without exact usable AF evidence: 47.2% of non-overlap variants were indels compared with 28.9% of exact-matched variants (OR=2.20; BH q=1.08e-9). This supports a second operational hazard: absence from gnomAD is not equivalent to rarity for structurally complex or representation-sensitive variants.</w:t>
+        <w:t>Failure to match variants at the allele level was not random missingness. It was a structured artifact of representation, normalization, and detectability. Indels were enriched among variants without exact usable AF evidence: 47.2% of non-overlap variants were indels compared with 28.9% of exact-matched variants (OR=2.20; BH q=1.08e-9). This supports a second operational hazard: absence from gnomAD is not equivalent to rarity for structurally complex or representation-sensitive variants.</w:t>
       </w:r>
     </w:p>
     <w:p>
@@ -4300,7 +4719,12 @@
     </w:p>
     <w:p>
       <w:r>
-        <w:t>Global-AF-only workflows fail operationally because they hide ancestry-specific signals. In this arrhythmia audit, global AF detected 13 frequency alerts, while popmax/global analysis detected 115. If a laboratory applies BS1/BA1-style reasoning with global AF alone, most ancestry-aware contradictions remain invisible. Similarly, absence from gnomAD cannot be treated uniformly as rarity because indels and duplications are underrepresented by exact allele matching.</w:t>
+        <w:t>Global-AF-only workflows fail operationally because they hide ancestry-specific signals. In this arrhythmia audit, global AF detected 13 frequency alerts, while popmax/global analysis detected 115. If a laboratory applies BS1/BA1-style reasoning with global AF alone, most ancestry-aware contradictions remain invisible.</w:t>
+      </w:r>
+    </w:p>
+    <w:p>
+      <w:r>
+        <w:t>A second failure is evaluability itself. Only 334/1,731 arrhythmia P/LP assertions had usable exact AF evidence, and the 1,397 non-evaluable assertions were not random missingness. They were structured by gene, variant type, and review support, with indels and duplications disproportionately represented outside the exact-AF space. This means the system has two separable gaps: hidden ancestry-aware frequency tension among evaluable variants, and representation-driven non-evaluability among the majority. Absence from gnomAD therefore cannot be treated uniformly as rarity.</w:t>
       </w:r>
     </w:p>
     <w:p>
@@ -4353,12 +4777,17 @@
     </w:p>
     <w:p>
       <w:r>
-        <w:t>Fourth, workflow-concordance benchmarking uses proxy labels and is partly circular because weak review and AC-supported frequency evidence help define both the operational positives and the red gate. These metrics should be read as burden diagnostics, not diagnostic accuracy.</w:t>
+        <w:t>Fourth, the AF-observed subset is not representative of all ClinVar arrhythmia P/LP assertions. Frequency-based conclusions are restricted to that evaluable space by design. The non-evaluable majority should be read as an additional interpretability failure caused by representation, normalization, and detectability limits, not as evidence against the AF-observed signal.</w:t>
       </w:r>
     </w:p>
     <w:p>
       <w:r>
-        <w:t>Fifth, public ClinVar captures classification-level changes, not patient-level downstream effects. We can quantify public decision-risk exposure as records and minimum submitter-exposure units, but not actual diagnosis reversal, cascade-testing uptake, surveillance changes, reproductive decisions, or therapy changes.</w:t>
+        <w:t>Fifth, workflow-concordance benchmarking uses proxy labels and is partly circular because weak review and AC-supported frequency evidence help define both the operational positives and the red gate. These metrics should be read as burden diagnostics, not diagnostic accuracy.</w:t>
+      </w:r>
+    </w:p>
+    <w:p>
+      <w:r>
+        <w:t>Sixth, public ClinVar captures classification-level changes, not patient-level downstream effects. We can quantify public decision-risk exposure as records and minimum submitter-exposure units, but not actual diagnosis reversal, cascade-testing uptake, surveillance changes, reproductive decisions, or therapy changes.</w:t>
       </w:r>
     </w:p>
     <w:p>
@@ -4390,7 +4819,7 @@
         <w:pStyle w:val="ListNumber"/>
       </w:pPr>
       <w:r>
-        <w:t>Do not equate absence from gnomAD with rarity, especially for indels, duplications, and complex alleles.</w:t>
+        <w:t>Do not equate non-evaluability or absence from gnomAD with rarity, especially for indels, duplications, and complex alleles.</w:t>
       </w:r>
     </w:p>
     <w:p>
@@ -4440,7 +4869,7 @@
     </w:p>
     <w:p>
       <w:r>
-        <w:t>Code, cached intermediate files, figures, and supplementary outputs required to reproduce downstream analyses are available in the project repository. The April 21, 2026 data freeze used ClinVar records retrieved through NCBI Entrez and bulk variant_summary files, gnomAD v4.1.1 exome/genome data queried through the gnomAD GraphQL API, and UCSC annotation resources. Machine-readable supplementary tables include VITAL scores, frequency flags, severe-annotation discordance, mechanism triage, red-priority case summaries, temporal robustness outputs, clinical decision-risk proxy outputs, historical audits, expert-panel comparator outputs, and sensitivity analyses.</w:t>
+        <w:t>Code, cached intermediate files, figures, and supplementary outputs required to reproduce downstream analyses are available in the project repository. The April 21, 2026 data freeze used ClinVar records retrieved through NCBI Entrez and bulk variant_summary files, gnomAD v4.1.1 exome/genome data queried through the gnomAD GraphQL API, and UCSC annotation resources. Machine-readable supplementary tables include VITAL scores, frequency flags, severe-annotation discordance, mechanism triage, red-priority case summaries, frequency-evaluability gap outputs, temporal robustness outputs, clinical decision-risk proxy outputs, historical audits, expert-panel comparator outputs, and sensitivity analyses.</w:t>
       </w:r>
     </w:p>
     <w:sectPr>

</xml_diff>

<commit_message>
Add logical incompatibility audit for red cases
</commit_message>
<xml_diff>
--- a/manuscript_vital_with_figures_tables.docx
+++ b/manuscript_vital_with_figures_tables.docx
@@ -48,7 +48,7 @@
         <w:t>Results:</w:t>
       </w:r>
       <w:r>
-        <w:t xml:space="preserve"> Only 334/1,731 variants (19.3%) had usable exact AF evidence; the remaining 1,397 (80.7%) formed a non-evaluable representation gap rather than a frequency-consistent background. Within the AF-observed space, global AF alone identified 13 variants above AF &gt;1e-5, whereas popmax/global screening identified 115; global-AF-only review therefore missed 102/115 (88.7%) ancestry-aware frequency alerts. Severe annotation did not protect against this signal: 92/262 AF-observed LOF/splice assertions (35.1%) had popmax/global AF &gt;1e-5, similar to missense assertions (19/66, 28.8%). Mechanism triage showed recurrent label-framing distortion rather than a simple error-rate estimate: carrier-compatible recessive assertions were presented as generic P/LP, context-dependent susceptibility appeared as Mendelian pathogenicity, and severe annotation sometimes substituted for mechanism-specific evidence. Because patient-level outcomes are not observable in public ClinVar, we quantified decision-risk exposure: the 115 frequency-discordant arrhythmia records represented at least 168 submitter-exposure units, 9 AC-supported records represented 15 units, and VITAL compressed these to 3 urgent records. In an independent 3,000-variant cross-disease historical audit, VITAL-red captured one real P/LP-to-VUS reclassification (CFAP91 VCV000812096), while an expert-panel RYR1 downgrade without frequency tension remained outside scope.</w:t>
+        <w:t xml:space="preserve"> Only 334/1,731 variants (19.3%) had usable exact AF evidence; the remaining 1,397 (80.7%) formed a non-evaluable representation gap rather than a frequency-consistent background. Within the AF-observed space, global AF alone identified 13 variants above AF &gt;1e-5, whereas popmax/global screening identified 115; global-AF-only review therefore missed 102/115 (88.7%) ancestry-aware frequency alerts. Severe annotation did not protect against this signal: 92/262 AF-observed LOF/splice assertions (35.1%) had popmax/global AF &gt;1e-5, similar to missense assertions (19/66, 28.8%). Mechanism triage showed recurrent label-framing distortion rather than a simple error-rate estimate: carrier-compatible recessive assertions were presented as generic P/LP, context-dependent susceptibility appeared as Mendelian pathogenicity, and severe annotation sometimes substituted for mechanism-specific evidence. In the 3 VITAL-red cases, a logical incompatibility audit showed that the current public P/LP label could not be coherently read as an unqualified high-penetrance Mendelian assertion without changing or qualifying the biological state. Because patient-level outcomes are not observable in public ClinVar, we quantified decision-risk exposure: the 115 frequency-discordant arrhythmia records represented at least 168 submitter-exposure units, 9 AC-supported records represented 15 units, and VITAL compressed these to 3 urgent records. In an independent 3,000-variant cross-disease historical audit, VITAL-red captured one real P/LP-to-VUS reclassification (CFAP91 VCV000812096), while an expert-panel RYR1 downgrade without frequency tension remained outside scope.</w:t>
       </w:r>
     </w:p>
     <w:p>
@@ -557,7 +557,7 @@
     </w:p>
     <w:p>
       <w:r>
-        <w:t>We compared global AF, popmax/global AF, AC-supported frequency screening, and VITAL red-priority calls. We assessed variant-type enrichment among non-overlap records, severe-annotation frequency discordance, LOF subtype patterns, and mechanism triage of severe-discordant variants. Mechanism triage was used to separate probable label-framing modes, including carrier-compatible architecture, context-dependent susceptibility, annotation inflation, and unresolved high-penetrance tension. We then mapped these modes to review-routing classes with explicit entry rules, transition rules, and clinical consequences. Because public ClinVar does not expose patient counts, we quantified clinical decision-risk exposure using record counts and minimum submitter-exposure units, with missing submitter counts treated conservatively as one unit. For red-priority cases, we also audited the public evidence boundary, recording whether the public scoring layer exposed phenotype linkage, penetrance estimates, segregation/phase, or downstream cascade-testing or therapy outcomes. Finally, we performed a frequency-evaluability audit separating AF-observed assertions from the non-evaluable majority, stratified by gene, variant type, and review strength, with SNV-only sensitivity checks. We performed supporting audits in a 3,000-variant cross-disease ClinVar P/LP sample, including historical January 2023 to April 2026 reclassification, expert-panel reviewed assertions, and real strict P/LP-to-VUS/B/LB events. Threshold sensitivity, AC-gate sensitivity, weight sensitivity, KCNH2 diagnostics, and time-series details are provided in supplementary outputs.</w:t>
+        <w:t>We compared global AF, popmax/global AF, AC-supported frequency screening, and VITAL red-priority calls. We assessed variant-type enrichment among non-overlap records, severe-annotation frequency discordance, LOF subtype patterns, and mechanism triage of severe-discordant variants. Mechanism triage was used to separate probable label-framing modes, including carrier-compatible architecture, context-dependent susceptibility, annotation inflation, and unresolved high-penetrance tension. We then mapped these modes to review-routing classes with explicit entry rules, transition rules, and clinical consequences. For red-priority cases, we performed a logical incompatibility audit that explicitly compared the public ClinVar assertion, gnomAD population reality, and the biological mechanism frame required for a high-penetrance Mendelian interpretation. Because public ClinVar does not expose patient counts, we quantified clinical decision-risk exposure using record counts and minimum submitter-exposure units, with missing submitter counts treated conservatively as one unit. For red-priority cases, we also audited the public evidence boundary, recording whether the public scoring layer exposed phenotype linkage, penetrance estimates, segregation/phase, or downstream cascade-testing or therapy outcomes. Finally, we performed a frequency-evaluability audit separating AF-observed assertions from the non-evaluable majority, stratified by gene, variant type, and review strength, with SNV-only sensitivity checks. We performed supporting audits in a 3,000-variant cross-disease ClinVar P/LP sample, including historical January 2023 to April 2026 reclassification, expert-panel reviewed assertions, and real strict P/LP-to-VUS/B/LB events. Threshold sensitivity, AC-gate sensitivity, weight sensitivity, KCNH2 diagnostics, and time-series details are provided in supplementary outputs.</w:t>
       </w:r>
     </w:p>
     <w:p>
@@ -2876,22 +2876,426 @@
         <w:pStyle w:val="Heading2"/>
       </w:pPr>
       <w:r>
-        <w:t>Counterfactual clinical framing exposes decision failure modes</w:t>
+        <w:t>Logical incompatibility audit proves label-state insufficiency</w:t>
       </w:r>
     </w:p>
     <w:p>
       <w:r>
-        <w:t>SCN5A VCV000440850 is the clearest decision-risk case. The current public state is a ClinVar Pathogenic assertion with no assertion criteria, AFR popmax AF=5.68e-3, AC=190, and VITAL=96.1. If interpreted as a high-penetrance Mendelian Brugada or arrhythmia allele, the label can support diagnostic closure, ancestry-matched cascade testing, and surveillance or therapy discussions. That logic breaks at the population-frequency layer: a variant with this population frequency cannot plausibly represent a high-penetrance monogenic arrhythmia allele. The more coherent biological frame is a context-dependent susceptibility or haplotype signal, not a generic Mendelian P/LP assertion.</w:t>
+        <w:t>The core proof is not that these variants are benign, nor that ClinVar is "wrong." The proof is narrower: if the public P/LP label is interpreted as unqualified high-penetrance Mendelian pathogenicity, the label becomes logically incompatible with observed population reality unless the biological state is changed or qualified. This creates a triangle of contradiction: ClinVar asserts P/LP, gnomAD observes AC-supported frequency, and the disease mechanism requires a different state.</w:t>
       </w:r>
     </w:p>
+    <w:tbl>
+      <w:tblPr>
+        <w:tblStyle w:val="TableGrid"/>
+        <w:tblW w:type="auto" w:w="0"/>
+        <w:jc w:val="center"/>
+        <w:tblLook w:firstColumn="1" w:firstRow="1" w:lastColumn="0" w:lastRow="0" w:noHBand="0" w:noVBand="1" w:val="04A0"/>
+      </w:tblPr>
+      <w:tblGrid>
+        <w:gridCol w:w="2074"/>
+        <w:gridCol w:w="2074"/>
+        <w:gridCol w:w="2074"/>
+        <w:gridCol w:w="2074"/>
+        <w:gridCol w:w="2074"/>
+      </w:tblGrid>
+      <w:tr>
+        <w:tc>
+          <w:tcPr>
+            <w:tcW w:type="dxa" w:w="2074"/>
+            <w:vAlign w:val="top"/>
+            <w:shd w:fill="D9EAF7"/>
+          </w:tcPr>
+          <w:p>
+            <w:pPr>
+              <w:jc w:val="left"/>
+            </w:pPr>
+            <w:r/>
+            <w:r>
+              <w:rPr>
+                <w:b/>
+                <w:sz w:val="16"/>
+              </w:rPr>
+              <w:t>Case</w:t>
+            </w:r>
+          </w:p>
+        </w:tc>
+        <w:tc>
+          <w:tcPr>
+            <w:tcW w:type="dxa" w:w="2074"/>
+            <w:vAlign w:val="top"/>
+            <w:shd w:fill="D9EAF7"/>
+          </w:tcPr>
+          <w:p>
+            <w:pPr>
+              <w:jc w:val="left"/>
+            </w:pPr>
+            <w:r/>
+            <w:r>
+              <w:rPr>
+                <w:b/>
+                <w:sz w:val="16"/>
+              </w:rPr>
+              <w:t>Public assertion</w:t>
+            </w:r>
+          </w:p>
+        </w:tc>
+        <w:tc>
+          <w:tcPr>
+            <w:tcW w:type="dxa" w:w="2074"/>
+            <w:vAlign w:val="top"/>
+            <w:shd w:fill="D9EAF7"/>
+          </w:tcPr>
+          <w:p>
+            <w:pPr>
+              <w:jc w:val="left"/>
+            </w:pPr>
+            <w:r/>
+            <w:r>
+              <w:rPr>
+                <w:b/>
+                <w:sz w:val="16"/>
+              </w:rPr>
+              <w:t>Population reality</w:t>
+            </w:r>
+          </w:p>
+        </w:tc>
+        <w:tc>
+          <w:tcPr>
+            <w:tcW w:type="dxa" w:w="2074"/>
+            <w:vAlign w:val="top"/>
+            <w:shd w:fill="D9EAF7"/>
+          </w:tcPr>
+          <w:p>
+            <w:pPr>
+              <w:jc w:val="left"/>
+            </w:pPr>
+            <w:r/>
+            <w:r>
+              <w:rPr>
+                <w:b/>
+                <w:sz w:val="16"/>
+              </w:rPr>
+              <w:t>If read as high-penetrance Mendelian</w:t>
+            </w:r>
+          </w:p>
+        </w:tc>
+        <w:tc>
+          <w:tcPr>
+            <w:tcW w:type="dxa" w:w="2074"/>
+            <w:vAlign w:val="top"/>
+            <w:shd w:fill="D9EAF7"/>
+          </w:tcPr>
+          <w:p>
+            <w:pPr>
+              <w:jc w:val="left"/>
+            </w:pPr>
+            <w:r/>
+            <w:r>
+              <w:rPr>
+                <w:b/>
+                <w:sz w:val="16"/>
+              </w:rPr>
+              <w:t>Required state for consistency</w:t>
+            </w:r>
+          </w:p>
+        </w:tc>
+      </w:tr>
+      <w:tr>
+        <w:tc>
+          <w:tcPr>
+            <w:tcW w:type="dxa" w:w="2074"/>
+            <w:vAlign w:val="top"/>
+          </w:tcPr>
+          <w:p>
+            <w:pPr>
+              <w:jc w:val="left"/>
+            </w:pPr>
+            <w:r/>
+            <w:r>
+              <w:rPr>
+                <w:b w:val="0"/>
+                <w:sz w:val="16"/>
+              </w:rPr>
+              <w:t>SCN5A VCV000440850</w:t>
+            </w:r>
+          </w:p>
+        </w:tc>
+        <w:tc>
+          <w:tcPr>
+            <w:tcW w:type="dxa" w:w="2074"/>
+            <w:vAlign w:val="top"/>
+          </w:tcPr>
+          <w:p>
+            <w:pPr>
+              <w:jc w:val="left"/>
+            </w:pPr>
+            <w:r/>
+            <w:r>
+              <w:rPr>
+                <w:b w:val="0"/>
+                <w:sz w:val="16"/>
+              </w:rPr>
+              <w:t>Pathogenic for Brugada syndrome 1; no assertion criteria</w:t>
+            </w:r>
+          </w:p>
+        </w:tc>
+        <w:tc>
+          <w:tcPr>
+            <w:tcW w:type="dxa" w:w="2074"/>
+            <w:vAlign w:val="top"/>
+          </w:tcPr>
+          <w:p>
+            <w:pPr>
+              <w:jc w:val="left"/>
+            </w:pPr>
+            <w:r/>
+            <w:r>
+              <w:rPr>
+                <w:b w:val="0"/>
+                <w:sz w:val="16"/>
+              </w:rPr>
+              <w:t>AFR popmax AF=5.68e-3; popmax AC=190; global AC=214</w:t>
+            </w:r>
+          </w:p>
+        </w:tc>
+        <w:tc>
+          <w:tcPr>
+            <w:tcW w:type="dxa" w:w="2074"/>
+            <w:vAlign w:val="top"/>
+          </w:tcPr>
+          <w:p>
+            <w:pPr>
+              <w:jc w:val="left"/>
+            </w:pPr>
+            <w:r/>
+            <w:r>
+              <w:rPr>
+                <w:b w:val="0"/>
+                <w:sz w:val="16"/>
+              </w:rPr>
+              <w:t>Logically incompatible: a variant with this population frequency cannot plausibly represent a high-penetrance monogenic arrhythmia allele</w:t>
+            </w:r>
+          </w:p>
+        </w:tc>
+        <w:tc>
+          <w:tcPr>
+            <w:tcW w:type="dxa" w:w="2074"/>
+            <w:vAlign w:val="top"/>
+          </w:tcPr>
+          <w:p>
+            <w:pPr>
+              <w:jc w:val="left"/>
+            </w:pPr>
+            <w:r/>
+            <w:r>
+              <w:rPr>
+                <w:b w:val="0"/>
+                <w:sz w:val="16"/>
+              </w:rPr>
+              <w:t>Context-dependent susceptibility, haplotype, low-penetrance, or modifier state</w:t>
+            </w:r>
+          </w:p>
+        </w:tc>
+      </w:tr>
+      <w:tr>
+        <w:tc>
+          <w:tcPr>
+            <w:tcW w:type="dxa" w:w="2074"/>
+            <w:vAlign w:val="top"/>
+          </w:tcPr>
+          <w:p>
+            <w:pPr>
+              <w:jc w:val="left"/>
+            </w:pPr>
+            <w:r/>
+            <w:r>
+              <w:rPr>
+                <w:b w:val="0"/>
+                <w:sz w:val="16"/>
+              </w:rPr>
+              <w:t>TRDN VCV001325231</w:t>
+            </w:r>
+          </w:p>
+        </w:tc>
+        <w:tc>
+          <w:tcPr>
+            <w:tcW w:type="dxa" w:w="2074"/>
+            <w:vAlign w:val="top"/>
+          </w:tcPr>
+          <w:p>
+            <w:pPr>
+              <w:jc w:val="left"/>
+            </w:pPr>
+            <w:r/>
+            <w:r>
+              <w:rPr>
+                <w:b w:val="0"/>
+                <w:sz w:val="16"/>
+              </w:rPr>
+              <w:t>Likely pathogenic for CPVT5; single submitter</w:t>
+            </w:r>
+          </w:p>
+        </w:tc>
+        <w:tc>
+          <w:tcPr>
+            <w:tcW w:type="dxa" w:w="2074"/>
+            <w:vAlign w:val="top"/>
+          </w:tcPr>
+          <w:p>
+            <w:pPr>
+              <w:jc w:val="left"/>
+            </w:pPr>
+            <w:r/>
+            <w:r>
+              <w:rPr>
+                <w:b w:val="0"/>
+                <w:sz w:val="16"/>
+              </w:rPr>
+              <w:t>AMR popmax AF=2.18e-4; global AC=40</w:t>
+            </w:r>
+          </w:p>
+        </w:tc>
+        <w:tc>
+          <w:tcPr>
+            <w:tcW w:type="dxa" w:w="2074"/>
+            <w:vAlign w:val="top"/>
+          </w:tcPr>
+          <w:p>
+            <w:pPr>
+              <w:jc w:val="left"/>
+            </w:pPr>
+            <w:r/>
+            <w:r>
+              <w:rPr>
+                <w:b w:val="0"/>
+                <w:sz w:val="16"/>
+              </w:rPr>
+              <w:t>Dominant Mendelian reading is incompatible; the observation remains coherent only under carrier, phase-aware, or biallelic affected-state framing</w:t>
+            </w:r>
+          </w:p>
+        </w:tc>
+        <w:tc>
+          <w:tcPr>
+            <w:tcW w:type="dxa" w:w="2074"/>
+            <w:vAlign w:val="top"/>
+          </w:tcPr>
+          <w:p>
+            <w:pPr>
+              <w:jc w:val="left"/>
+            </w:pPr>
+            <w:r/>
+            <w:r>
+              <w:rPr>
+                <w:b w:val="0"/>
+                <w:sz w:val="16"/>
+              </w:rPr>
+              <w:t>Carrier-compatible recessive or affected-state-specific assertion</w:t>
+            </w:r>
+          </w:p>
+        </w:tc>
+      </w:tr>
+      <w:tr>
+        <w:tc>
+          <w:tcPr>
+            <w:tcW w:type="dxa" w:w="2074"/>
+            <w:vAlign w:val="top"/>
+          </w:tcPr>
+          <w:p>
+            <w:pPr>
+              <w:jc w:val="left"/>
+            </w:pPr>
+            <w:r/>
+            <w:r>
+              <w:rPr>
+                <w:b w:val="0"/>
+                <w:sz w:val="16"/>
+              </w:rPr>
+              <w:t>KCNH2 VCV004535537</w:t>
+            </w:r>
+          </w:p>
+        </w:tc>
+        <w:tc>
+          <w:tcPr>
+            <w:tcW w:type="dxa" w:w="2074"/>
+            <w:vAlign w:val="top"/>
+          </w:tcPr>
+          <w:p>
+            <w:pPr>
+              <w:jc w:val="left"/>
+            </w:pPr>
+            <w:r/>
+            <w:r>
+              <w:rPr>
+                <w:b w:val="0"/>
+                <w:sz w:val="16"/>
+              </w:rPr>
+              <w:t>Likely pathogenic for Long QT syndrome; single submitter</w:t>
+            </w:r>
+          </w:p>
+        </w:tc>
+        <w:tc>
+          <w:tcPr>
+            <w:tcW w:type="dxa" w:w="2074"/>
+            <w:vAlign w:val="top"/>
+          </w:tcPr>
+          <w:p>
+            <w:pPr>
+              <w:jc w:val="left"/>
+            </w:pPr>
+            <w:r/>
+            <w:r>
+              <w:rPr>
+                <w:b w:val="0"/>
+                <w:sz w:val="16"/>
+              </w:rPr>
+              <w:t>ASJ popmax AF=1.32e-4; global AC=24</w:t>
+            </w:r>
+          </w:p>
+        </w:tc>
+        <w:tc>
+          <w:tcPr>
+            <w:tcW w:type="dxa" w:w="2074"/>
+            <w:vAlign w:val="top"/>
+          </w:tcPr>
+          <w:p>
+            <w:pPr>
+              <w:jc w:val="left"/>
+            </w:pPr>
+            <w:r/>
+            <w:r>
+              <w:rPr>
+                <w:b w:val="0"/>
+                <w:sz w:val="16"/>
+              </w:rPr>
+              <w:t>Unqualified high-penetrance reading is not supportable from public data alone; frequency tension plus weak review defines a boundary case</w:t>
+            </w:r>
+          </w:p>
+        </w:tc>
+        <w:tc>
+          <w:tcPr>
+            <w:tcW w:type="dxa" w:w="2074"/>
+            <w:vAlign w:val="top"/>
+          </w:tcPr>
+          <w:p>
+            <w:pPr>
+              <w:jc w:val="left"/>
+            </w:pPr>
+            <w:r/>
+            <w:r>
+              <w:rPr>
+                <w:b w:val="0"/>
+                <w:sz w:val="16"/>
+              </w:rPr>
+              <w:t>Annotation-inflation or mechanism-qualified review state</w:t>
+            </w:r>
+          </w:p>
+        </w:tc>
+      </w:tr>
+    </w:tbl>
+    <w:p/>
     <w:p>
       <w:r>
-        <w:t>TRDN VCV001325231 illustrates the opposite failure mode. The current public state is a ClinVar Likely pathogenic assertion from a single submitter, with global AC=40, AMR popmax AF=2.18e-4, and VITAL=74.3. If read as a dominant high-penetrance arrhythmia allele, the label can create inappropriate family-risk framing or surveillance escalation. That logic breaks because the strongest established TRDN disease model is recessive or biallelic null architecture; heterozygous carrier frequency can be compatible with pathogenicity only in the affected-state context. The appropriate review action is therefore carrier- and phase-aware adjudication, including search for a second allele, rather than direct use as a disease-explaining dominant result.</w:t>
-      </w:r>
-    </w:p>
-    <w:p>
-      <w:r>
-        <w:t>KCNH2 VCV004535537 remains a different category. Because KCNH2 is a constrained dominant arrhythmia gene, AC-supported splice-site frequency tension is uncomfortable; because the case is borderline and weight-sensitive, the action is immediate expert review rather than automatic downgrading. Current ClinVar labeling does not distinguish these states.</w:t>
+        <w:t>Thus, VITAL makes visible a state-coding problem in variant interpretation. Current ClinVar labeling collapses biologically distinct states into a single P/LP category: susceptibility is not Mendelian pathogenicity, carrier architecture is not dominant disease, and severe annotation is not proof of high penetrance. The result is not a benignity call; it is a proof that the unqualified label is insufficient for safe interpretation.</w:t>
       </w:r>
     </w:p>
     <w:p>
@@ -4734,12 +5138,12 @@
     </w:p>
     <w:p>
       <w:r>
-        <w:t>The three red-priority arrhythmia cases illustrate why a single AF threshold is insufficient and why label framing matters clinically. SCN5A VCV000440850 is most consistent with a context-dependent haplotype or susceptibility assertion rather than a straightforward high-penetrance monogenic label. TRDN VCV001325231 shows that a frameshift can be frequency-tolerable under recessive/biallelic architecture. KCNH2 VCV004535537 is the borderline case: biologically uncomfortable in a constrained dominant gene, but still unresolved and weight-sensitive.</w:t>
+        <w:t>The three red-priority arrhythmia cases provide the central logical result. For each case, the public P/LP label, observed population frequency, and plausible disease mechanism cannot all support an unqualified high-penetrance Mendelian reading simultaneously. SCN5A VCV000440850 is most consistent with a context-dependent haplotype or susceptibility assertion rather than a straightforward high-penetrance monogenic label. TRDN VCV001325231 shows that a frameshift can be frequency-tolerable under recessive/biallelic architecture. KCNH2 VCV004535537 is the borderline case: biologically uncomfortable in a constrained dominant gene, but still unresolved and weight-sensitive.</w:t>
       </w:r>
     </w:p>
     <w:p>
       <w:r>
-        <w:t>These counterfactuals are the system-level point. A single public P/LP label can travel into diagnostic, family-testing, surveillance, and therapy workflows, but it does not preserve whether the claim is a high-penetrance Mendelian assertion, a susceptibility haplotype, a recessive carrier-state allele, or unresolved annotation inflation. The failure is therefore not only possible variant misclassification; it is loss of biological state during clinical transmission.</w:t>
+        <w:t>This incompatibility is the system-level point. A single public P/LP label can travel into diagnostic, family-testing, surveillance, and therapy workflows, but it does not preserve whether the claim is a high-penetrance Mendelian assertion, a susceptibility haplotype, a recessive carrier-state allele, or unresolved annotation inflation. The failure is therefore not only possible variant misclassification; it is loss of biological state during clinical transmission.</w:t>
       </w:r>
     </w:p>
     <w:p>
@@ -4869,7 +5273,7 @@
     </w:p>
     <w:p>
       <w:r>
-        <w:t>Code, cached intermediate files, figures, and supplementary outputs required to reproduce downstream analyses are available in the project repository. The April 21, 2026 data freeze used ClinVar records retrieved through NCBI Entrez and bulk variant_summary files, gnomAD v4.1.1 exome/genome data queried through the gnomAD GraphQL API, and UCSC annotation resources. Machine-readable supplementary tables include VITAL scores, frequency flags, severe-annotation discordance, mechanism triage, red-priority case summaries, frequency-evaluability gap outputs, temporal robustness outputs, clinical decision-risk proxy outputs, historical audits, expert-panel comparator outputs, and sensitivity analyses.</w:t>
+        <w:t>Code, cached intermediate files, figures, and supplementary outputs required to reproduce downstream analyses are available in the project repository. The April 21, 2026 data freeze used ClinVar records retrieved through NCBI Entrez and bulk variant_summary files, gnomAD v4.1.1 exome/genome data queried through the gnomAD GraphQL API, and UCSC annotation resources. Machine-readable supplementary tables include VITAL scores, frequency flags, severe-annotation discordance, mechanism triage, red-priority case summaries, logical incompatibility audit outputs, frequency-evaluability gap outputs, temporal robustness outputs, clinical decision-risk proxy outputs, historical audits, expert-panel comparator outputs, and sensitivity analyses.</w:t>
       </w:r>
     </w:p>
     <w:sectPr>

</xml_diff>

<commit_message>
Center logical incompatibility as main result
</commit_message>
<xml_diff>
--- a/manuscript_vital_with_figures_tables.docx
+++ b/manuscript_vital_with_figures_tables.docx
@@ -26,7 +26,7 @@
         <w:t>Purpose:</w:t>
       </w:r>
       <w:r>
-        <w:t xml:space="preserve"> Severe variant annotations can coexist with ancestry-aware population-frequency contradiction. We tested whether ClinVar pathogenic/likely pathogenic (P/LP) arrhythmia assertions remain frequency-consistent when evaluated with popmax, allele count (AC), variant representation, and review support rather than global AF alone, and whether discordant assertions reveal systematically misframed biology rather than random noise.</w:t>
+        <w:t xml:space="preserve"> Public P/LP labels can become logically insufficient when read as unqualified high-penetrance Mendelian assertions despite contradictory population evidence. We tested whether ClinVar pathogenic/likely pathogenic (P/LP) arrhythmia assertions remain coherent when evaluated against popmax, allele count (AC), variant representation, and mechanism-aware label states rather than global AF alone.</w:t>
       </w:r>
     </w:p>
     <w:p>
@@ -37,7 +37,7 @@
         <w:t>Methods:</w:t>
       </w:r>
       <w:r>
-        <w:t xml:space="preserve"> We collapsed ClinVar P/LP records across 20 inherited arrhythmia genes to 1,731 unique variants and cross-referenced them with gnomAD v4.1.1 exome data. Exact allele matches, allele-discordant sites, no-record states, global AF, popmax AF, AC, variant type, and ClinVar review strength were retained. We developed VITAL (Variant Interpretation Tension and Allele Load) as an explainable re-review prioritization framework and defined a compact pathogenicity-label ontology for routing discordant assertions, not an automated reclassification engine.</w:t>
+        <w:t xml:space="preserve"> We collapsed ClinVar P/LP records across 20 inherited arrhythmia genes to 1,731 unique variants and cross-referenced them with gnomAD v4.1.1 exome data. Exact allele matches, allele-discordant sites, no-record states, global AF, popmax AF, AC, variant type, and ClinVar review strength were retained. VITAL (Variant Interpretation Tension and Allele Load) was used as an explainable detection layer for frequency-assertion tension, and a compact pathogenicity-label ontology was used to separate Mendelian disease, susceptibility, carrier-state, low-penetrance, annotation-inflated, and representation-uncertain assertions.</w:t>
       </w:r>
     </w:p>
     <w:p>
@@ -48,7 +48,7 @@
         <w:t>Results:</w:t>
       </w:r>
       <w:r>
-        <w:t xml:space="preserve"> Only 334/1,731 variants (19.3%) had usable exact AF evidence; the remaining 1,397 (80.7%) formed a non-evaluable representation gap rather than a frequency-consistent background. Within the AF-observed space, global AF alone identified 13 variants above AF &gt;1e-5, whereas popmax/global screening identified 115; global-AF-only review therefore missed 102/115 (88.7%) ancestry-aware frequency alerts. Severe annotation did not protect against this signal: 92/262 AF-observed LOF/splice assertions (35.1%) had popmax/global AF &gt;1e-5, similar to missense assertions (19/66, 28.8%). Mechanism triage showed recurrent label-framing distortion rather than a simple error-rate estimate: carrier-compatible recessive assertions were presented as generic P/LP, context-dependent susceptibility appeared as Mendelian pathogenicity, and severe annotation sometimes substituted for mechanism-specific evidence. In the 3 VITAL-red cases, a logical incompatibility audit showed that the current public P/LP label could not be coherently read as an unqualified high-penetrance Mendelian assertion without changing or qualifying the biological state. Because patient-level outcomes are not observable in public ClinVar, we quantified decision-risk exposure: the 115 frequency-discordant arrhythmia records represented at least 168 submitter-exposure units, 9 AC-supported records represented 15 units, and VITAL compressed these to 3 urgent records. In an independent 3,000-variant cross-disease historical audit, VITAL-red captured one real P/LP-to-VUS reclassification (CFAP91 VCV000812096), while an expert-panel RYR1 downgrade without frequency tension remained outside scope.</w:t>
+        <w:t xml:space="preserve"> The central result is a logical incompatibility class: in 3 red-priority cases, the public P/LP label, observed population frequency, and plausible disease mechanism could not simultaneously support an unqualified high-penetrance Mendelian reading. SCN5A VCV000440850 required susceptibility/haplotype framing rather than generic Mendelian pathogenicity; TRDN VCV001325231 required carrier or biallelic affected-state framing rather than dominant pathogenicity; and KCNH2 VCV004535537 required mechanism-qualified expert review rather than reliance on severe annotation alone. This label-state problem sits within a broader frequency-evidence failure: only 334/1,731 variants (19.3%) had usable exact AF evidence, leaving 1,397 (80.7%) as a non-evaluable representation gap. Within the AF-observed space, global AF alone identified 13 variants above AF &gt;1e-5, whereas popmax/global screening identified 115; global-AF-only review therefore missed 102/115 (88.7%) ancestry-aware frequency alerts. Severe annotation did not protect against this signal: 92/262 AF-observed LOF/splice assertions (35.1%) had popmax/global AF &gt;1e-5, similar to missense assertions (19/66, 28.8%). VITAL compressed 115 frequency-discordant records to 3 urgent state-review cases.</w:t>
       </w:r>
     </w:p>
     <w:p>
@@ -59,7 +59,7 @@
         <w:t>Conclusion:</w:t>
       </w:r>
       <w:r>
-        <w:t xml:space="preserve"> Severe annotation alone is not sufficient to override population-frequency contradiction, and exact AF non-evaluability is itself an interpretability failure. A subset of public P/LP assertions appears biologically misframed rather than merely uncertain: susceptibility is not equivalent to Mendelian disease, carrier architecture is not equivalent to dominant pathogenicity, and severe annotation is not equivalent to high penetrance. A label-state ontology makes these distortions clinically actionable as review routes while preserving expert responsibility for final classification.</w:t>
+        <w:t xml:space="preserve"> The current P/LP label is insufficient when it permits mutually incompatible high-penetrance Mendelian interpretations under standard clinical reading. Susceptibility is not equivalent to Mendelian disease, carrier architecture is not equivalent to dominant pathogenicity, and severe annotation is not equivalent to high penetrance. VITAL makes this label-state collapse visible; the biological contradiction is the central result.</w:t>
       </w:r>
     </w:p>
     <w:p>
@@ -87,7 +87,7 @@
     </w:p>
     <w:p>
       <w:r>
-        <w:t>Here, we ask whether ClinVar P/LP arrhythmia assertions remain coherent when evaluated with exact allele matching, popmax, AC, variant type, detectability, and review support. Our premise is not simply that some variants are "too frequent," but that some public pathogenicity labels may be biologically misframed: susceptibility or drug-response haplotypes can be flattened into Mendelian pathogenicity, recessive carrier states can masquerade as dominant disease assertions, and severe annotations can inflate confidence when mechanism-specific evidence is thin. We introduce VITAL as an explainable re-review prioritization framework and propose a pathogenicity-label ontology that separates Mendelian pathogenicity, susceptibility, carrier architecture, low penetrance, annotation inflation, and representation uncertainty.</w:t>
+        <w:t>Here, we ask whether ClinVar P/LP arrhythmia assertions remain coherent when evaluated with exact allele matching, popmax, AC, variant type, detectability, and review support. Our premise is not simply that some variants are "too frequent," but that some public pathogenicity labels collapse mutually incompatible biological states into one P/LP bucket: susceptibility or drug-response haplotypes can be flattened into Mendelian pathogenicity, recessive carrier states can masquerade as dominant disease assertions, and severe annotations can inflate confidence when mechanism-specific evidence is thin. We use VITAL as an explainable detection layer for this collapse and propose a pathogenicity-label ontology that separates Mendelian pathogenicity, susceptibility, carrier architecture, low penetrance, annotation inflation, and representation uncertainty.</w:t>
       </w:r>
     </w:p>
     <w:p>
@@ -147,7 +147,7 @@
     </w:p>
     <w:p>
       <w:r>
-        <w:t>VITAL is a 0-100 frequency-assertion tension score. The score is the clipped sum of seven interpretable components:</w:t>
+        <w:t>VITAL is a 0-100 frequency-assertion tension score used to detect label-state collapse. The score is the clipped sum of seven interpretable components:</w:t>
       </w:r>
     </w:p>
     <w:p>
@@ -2881,7 +2881,7 @@
     </w:p>
     <w:p>
       <w:r>
-        <w:t>The core proof is not that these variants are benign, nor that ClinVar is "wrong." The proof is narrower: if the public P/LP label is interpreted as unqualified high-penetrance Mendelian pathogenicity, the label becomes logically incompatible with observed population reality unless the biological state is changed or qualified. This creates a triangle of contradiction: ClinVar asserts P/LP, gnomAD observes AC-supported frequency, and the disease mechanism requires a different state.</w:t>
+        <w:t>If the public P/LP label is interpreted as unqualified high-penetrance Mendelian pathogenicity, the label becomes logically incompatible with observed population reality unless the biological state is changed or qualified. This creates a triangle of contradiction: ClinVar asserts P/LP, gnomAD observes AC-supported frequency, and the disease mechanism requires a different state.</w:t>
       </w:r>
     </w:p>
     <w:tbl>
@@ -3295,562 +3295,9 @@
     <w:p/>
     <w:p>
       <w:r>
-        <w:t>Thus, VITAL makes visible a state-coding problem in variant interpretation. Current ClinVar labeling collapses biologically distinct states into a single P/LP category: susceptibility is not Mendelian pathogenicity, carrier architecture is not dominant disease, and severe annotation is not proof of high penetrance. The result is not a benignity call; it is a proof that the unqualified label is insufficient for safe interpretation.</w:t>
+        <w:t>Current ClinVar labeling collapses biologically distinct states into a single P/LP category: susceptibility is not Mendelian pathogenicity, carrier architecture is not dominant disease, and severe annotation is not proof of high penetrance. VITAL makes this state-coding failure visible by prioritizing the variants where population reality and unqualified Mendelian interpretation cannot coexist.</w:t>
       </w:r>
     </w:p>
-    <w:p>
-      <w:r>
-        <w:t>We then made the evidentiary boundary explicit rather than implied. In the public red-case audit, all 3/3 cases had a public P/LP disease label and weak or single-submitter review support, and 2/3 had public citations or ClinVar literature mentions. However, 0/3 had structured public patient-level phenotype linkage sufficient for causality, 0/3 had public penetrance estimates, 0/3 had public segregation or allelic phase evidence, and 0/3 had documented cascade-testing or therapy outcome data in the scoring layer. The data therefore support public decision-risk exposure and urgent review priority, not a claim of proven misdiagnosis or measured downstream harm.</w:t>
-      </w:r>
-    </w:p>
-    <w:tbl>
-      <w:tblPr>
-        <w:tblStyle w:val="TableGrid"/>
-        <w:tblW w:type="auto" w:w="0"/>
-        <w:jc w:val="center"/>
-        <w:tblLook w:firstColumn="1" w:firstRow="1" w:lastColumn="0" w:lastRow="0" w:noHBand="0" w:noVBand="1" w:val="04A0"/>
-      </w:tblPr>
-      <w:tblGrid>
-        <w:gridCol w:w="3456"/>
-        <w:gridCol w:w="3456"/>
-        <w:gridCol w:w="3456"/>
-      </w:tblGrid>
-      <w:tr>
-        <w:tc>
-          <w:tcPr>
-            <w:tcW w:type="dxa" w:w="3456"/>
-            <w:vAlign w:val="top"/>
-            <w:shd w:fill="D9EAF7"/>
-          </w:tcPr>
-          <w:p>
-            <w:pPr>
-              <w:jc w:val="left"/>
-            </w:pPr>
-            <w:r/>
-            <w:r>
-              <w:rPr>
-                <w:b/>
-                <w:sz w:val="16"/>
-              </w:rPr>
-              <w:t>Public evidence question</w:t>
-            </w:r>
-          </w:p>
-        </w:tc>
-        <w:tc>
-          <w:tcPr>
-            <w:tcW w:type="dxa" w:w="3456"/>
-            <w:vAlign w:val="top"/>
-            <w:shd w:fill="D9EAF7"/>
-          </w:tcPr>
-          <w:p>
-            <w:pPr>
-              <w:jc w:val="left"/>
-            </w:pPr>
-            <w:r/>
-            <w:r>
-              <w:rPr>
-                <w:b/>
-                <w:sz w:val="16"/>
-              </w:rPr>
-              <w:t>Red-priority cases with evidence</w:t>
-            </w:r>
-          </w:p>
-        </w:tc>
-        <w:tc>
-          <w:tcPr>
-            <w:tcW w:type="dxa" w:w="3456"/>
-            <w:vAlign w:val="top"/>
-            <w:shd w:fill="D9EAF7"/>
-          </w:tcPr>
-          <w:p>
-            <w:pPr>
-              <w:jc w:val="left"/>
-            </w:pPr>
-            <w:r/>
-            <w:r>
-              <w:rPr>
-                <w:b/>
-                <w:sz w:val="16"/>
-              </w:rPr>
-              <w:t>Interpretation</w:t>
-            </w:r>
-          </w:p>
-        </w:tc>
-      </w:tr>
-      <w:tr>
-        <w:tc>
-          <w:tcPr>
-            <w:tcW w:type="dxa" w:w="3456"/>
-            <w:vAlign w:val="top"/>
-          </w:tcPr>
-          <w:p>
-            <w:pPr>
-              <w:jc w:val="left"/>
-            </w:pPr>
-            <w:r/>
-            <w:r>
-              <w:rPr>
-                <w:b w:val="0"/>
-                <w:sz w:val="16"/>
-              </w:rPr>
-              <w:t>P/LP public status and disease/condition label</w:t>
-            </w:r>
-          </w:p>
-        </w:tc>
-        <w:tc>
-          <w:tcPr>
-            <w:tcW w:type="dxa" w:w="3456"/>
-            <w:vAlign w:val="top"/>
-          </w:tcPr>
-          <w:p>
-            <w:pPr>
-              <w:jc w:val="left"/>
-            </w:pPr>
-            <w:r/>
-            <w:r>
-              <w:rPr>
-                <w:b w:val="0"/>
-                <w:sz w:val="16"/>
-              </w:rPr>
-              <w:t>3/3</w:t>
-            </w:r>
-          </w:p>
-        </w:tc>
-        <w:tc>
-          <w:tcPr>
-            <w:tcW w:type="dxa" w:w="3456"/>
-            <w:vAlign w:val="top"/>
-          </w:tcPr>
-          <w:p>
-            <w:pPr>
-              <w:jc w:val="left"/>
-            </w:pPr>
-            <w:r/>
-            <w:r>
-              <w:rPr>
-                <w:b w:val="0"/>
-                <w:sz w:val="16"/>
-              </w:rPr>
-              <w:t>Label can enter diagnostic workflows</w:t>
-            </w:r>
-          </w:p>
-        </w:tc>
-      </w:tr>
-      <w:tr>
-        <w:tc>
-          <w:tcPr>
-            <w:tcW w:type="dxa" w:w="3456"/>
-            <w:vAlign w:val="top"/>
-          </w:tcPr>
-          <w:p>
-            <w:pPr>
-              <w:jc w:val="left"/>
-            </w:pPr>
-            <w:r/>
-            <w:r>
-              <w:rPr>
-                <w:b w:val="0"/>
-                <w:sz w:val="16"/>
-              </w:rPr>
-              <w:t>Weak or single-submitter review support</w:t>
-            </w:r>
-          </w:p>
-        </w:tc>
-        <w:tc>
-          <w:tcPr>
-            <w:tcW w:type="dxa" w:w="3456"/>
-            <w:vAlign w:val="top"/>
-          </w:tcPr>
-          <w:p>
-            <w:pPr>
-              <w:jc w:val="left"/>
-            </w:pPr>
-            <w:r/>
-            <w:r>
-              <w:rPr>
-                <w:b w:val="0"/>
-                <w:sz w:val="16"/>
-              </w:rPr>
-              <w:t>3/3</w:t>
-            </w:r>
-          </w:p>
-        </w:tc>
-        <w:tc>
-          <w:tcPr>
-            <w:tcW w:type="dxa" w:w="3456"/>
-            <w:vAlign w:val="top"/>
-          </w:tcPr>
-          <w:p>
-            <w:pPr>
-              <w:jc w:val="left"/>
-            </w:pPr>
-            <w:r/>
-            <w:r>
-              <w:rPr>
-                <w:b w:val="0"/>
-                <w:sz w:val="16"/>
-              </w:rPr>
-              <w:t>Public assertion is fragile enough for priority review</w:t>
-            </w:r>
-          </w:p>
-        </w:tc>
-      </w:tr>
-      <w:tr>
-        <w:tc>
-          <w:tcPr>
-            <w:tcW w:type="dxa" w:w="3456"/>
-            <w:vAlign w:val="top"/>
-          </w:tcPr>
-          <w:p>
-            <w:pPr>
-              <w:jc w:val="left"/>
-            </w:pPr>
-            <w:r/>
-            <w:r>
-              <w:rPr>
-                <w:b w:val="0"/>
-                <w:sz w:val="16"/>
-              </w:rPr>
-              <w:t>Public citation or ClinVar literature mention</w:t>
-            </w:r>
-          </w:p>
-        </w:tc>
-        <w:tc>
-          <w:tcPr>
-            <w:tcW w:type="dxa" w:w="3456"/>
-            <w:vAlign w:val="top"/>
-          </w:tcPr>
-          <w:p>
-            <w:pPr>
-              <w:jc w:val="left"/>
-            </w:pPr>
-            <w:r/>
-            <w:r>
-              <w:rPr>
-                <w:b w:val="0"/>
-                <w:sz w:val="16"/>
-              </w:rPr>
-              <w:t>2/3</w:t>
-            </w:r>
-          </w:p>
-        </w:tc>
-        <w:tc>
-          <w:tcPr>
-            <w:tcW w:type="dxa" w:w="3456"/>
-            <w:vAlign w:val="top"/>
-          </w:tcPr>
-          <w:p>
-            <w:pPr>
-              <w:jc w:val="left"/>
-            </w:pPr>
-            <w:r/>
-            <w:r>
-              <w:rPr>
-                <w:b w:val="0"/>
-                <w:sz w:val="16"/>
-              </w:rPr>
-              <w:t>Literature exists for some cases, but not patient-level outcome proof</w:t>
-            </w:r>
-          </w:p>
-        </w:tc>
-      </w:tr>
-      <w:tr>
-        <w:tc>
-          <w:tcPr>
-            <w:tcW w:type="dxa" w:w="3456"/>
-            <w:vAlign w:val="top"/>
-          </w:tcPr>
-          <w:p>
-            <w:pPr>
-              <w:jc w:val="left"/>
-            </w:pPr>
-            <w:r/>
-            <w:r>
-              <w:rPr>
-                <w:b w:val="0"/>
-                <w:sz w:val="16"/>
-              </w:rPr>
-              <w:t>Structured patient-level phenotype linkage sufficient for causality</w:t>
-            </w:r>
-          </w:p>
-        </w:tc>
-        <w:tc>
-          <w:tcPr>
-            <w:tcW w:type="dxa" w:w="3456"/>
-            <w:vAlign w:val="top"/>
-          </w:tcPr>
-          <w:p>
-            <w:pPr>
-              <w:jc w:val="left"/>
-            </w:pPr>
-            <w:r/>
-            <w:r>
-              <w:rPr>
-                <w:b w:val="0"/>
-                <w:sz w:val="16"/>
-              </w:rPr>
-              <w:t>0/3</w:t>
-            </w:r>
-          </w:p>
-        </w:tc>
-        <w:tc>
-          <w:tcPr>
-            <w:tcW w:type="dxa" w:w="3456"/>
-            <w:vAlign w:val="top"/>
-          </w:tcPr>
-          <w:p>
-            <w:pPr>
-              <w:jc w:val="left"/>
-            </w:pPr>
-            <w:r/>
-            <w:r>
-              <w:rPr>
-                <w:b w:val="0"/>
-                <w:sz w:val="16"/>
-              </w:rPr>
-              <w:t>Not available in the public scoring layer</w:t>
-            </w:r>
-          </w:p>
-        </w:tc>
-      </w:tr>
-      <w:tr>
-        <w:tc>
-          <w:tcPr>
-            <w:tcW w:type="dxa" w:w="3456"/>
-            <w:vAlign w:val="top"/>
-          </w:tcPr>
-          <w:p>
-            <w:pPr>
-              <w:jc w:val="left"/>
-            </w:pPr>
-            <w:r/>
-            <w:r>
-              <w:rPr>
-                <w:b w:val="0"/>
-                <w:sz w:val="16"/>
-              </w:rPr>
-              <w:t>Public penetrance estimate</w:t>
-            </w:r>
-          </w:p>
-        </w:tc>
-        <w:tc>
-          <w:tcPr>
-            <w:tcW w:type="dxa" w:w="3456"/>
-            <w:vAlign w:val="top"/>
-          </w:tcPr>
-          <w:p>
-            <w:pPr>
-              <w:jc w:val="left"/>
-            </w:pPr>
-            <w:r/>
-            <w:r>
-              <w:rPr>
-                <w:b w:val="0"/>
-                <w:sz w:val="16"/>
-              </w:rPr>
-              <w:t>0/3</w:t>
-            </w:r>
-          </w:p>
-        </w:tc>
-        <w:tc>
-          <w:tcPr>
-            <w:tcW w:type="dxa" w:w="3456"/>
-            <w:vAlign w:val="top"/>
-          </w:tcPr>
-          <w:p>
-            <w:pPr>
-              <w:jc w:val="left"/>
-            </w:pPr>
-            <w:r/>
-            <w:r>
-              <w:rPr>
-                <w:b w:val="0"/>
-                <w:sz w:val="16"/>
-              </w:rPr>
-              <w:t>Not available in the public scoring layer</w:t>
-            </w:r>
-          </w:p>
-        </w:tc>
-      </w:tr>
-      <w:tr>
-        <w:tc>
-          <w:tcPr>
-            <w:tcW w:type="dxa" w:w="3456"/>
-            <w:vAlign w:val="top"/>
-          </w:tcPr>
-          <w:p>
-            <w:pPr>
-              <w:jc w:val="left"/>
-            </w:pPr>
-            <w:r/>
-            <w:r>
-              <w:rPr>
-                <w:b w:val="0"/>
-                <w:sz w:val="16"/>
-              </w:rPr>
-              <w:t>Public segregation or allelic phase evidence</w:t>
-            </w:r>
-          </w:p>
-        </w:tc>
-        <w:tc>
-          <w:tcPr>
-            <w:tcW w:type="dxa" w:w="3456"/>
-            <w:vAlign w:val="top"/>
-          </w:tcPr>
-          <w:p>
-            <w:pPr>
-              <w:jc w:val="left"/>
-            </w:pPr>
-            <w:r/>
-            <w:r>
-              <w:rPr>
-                <w:b w:val="0"/>
-                <w:sz w:val="16"/>
-              </w:rPr>
-              <w:t>0/3</w:t>
-            </w:r>
-          </w:p>
-        </w:tc>
-        <w:tc>
-          <w:tcPr>
-            <w:tcW w:type="dxa" w:w="3456"/>
-            <w:vAlign w:val="top"/>
-          </w:tcPr>
-          <w:p>
-            <w:pPr>
-              <w:jc w:val="left"/>
-            </w:pPr>
-            <w:r/>
-            <w:r>
-              <w:rPr>
-                <w:b w:val="0"/>
-                <w:sz w:val="16"/>
-              </w:rPr>
-              <w:t>Not available in the public scoring layer</w:t>
-            </w:r>
-          </w:p>
-        </w:tc>
-      </w:tr>
-      <w:tr>
-        <w:tc>
-          <w:tcPr>
-            <w:tcW w:type="dxa" w:w="3456"/>
-            <w:vAlign w:val="top"/>
-          </w:tcPr>
-          <w:p>
-            <w:pPr>
-              <w:jc w:val="left"/>
-            </w:pPr>
-            <w:r/>
-            <w:r>
-              <w:rPr>
-                <w:b w:val="0"/>
-                <w:sz w:val="16"/>
-              </w:rPr>
-              <w:t>Documented cascade-testing or therapy outcome</w:t>
-            </w:r>
-          </w:p>
-        </w:tc>
-        <w:tc>
-          <w:tcPr>
-            <w:tcW w:type="dxa" w:w="3456"/>
-            <w:vAlign w:val="top"/>
-          </w:tcPr>
-          <w:p>
-            <w:pPr>
-              <w:jc w:val="left"/>
-            </w:pPr>
-            <w:r/>
-            <w:r>
-              <w:rPr>
-                <w:b w:val="0"/>
-                <w:sz w:val="16"/>
-              </w:rPr>
-              <w:t>0/3</w:t>
-            </w:r>
-          </w:p>
-        </w:tc>
-        <w:tc>
-          <w:tcPr>
-            <w:tcW w:type="dxa" w:w="3456"/>
-            <w:vAlign w:val="top"/>
-          </w:tcPr>
-          <w:p>
-            <w:pPr>
-              <w:jc w:val="left"/>
-            </w:pPr>
-            <w:r/>
-            <w:r>
-              <w:rPr>
-                <w:b w:val="0"/>
-                <w:sz w:val="16"/>
-              </w:rPr>
-              <w:t>Not available in the public scoring layer</w:t>
-            </w:r>
-          </w:p>
-        </w:tc>
-      </w:tr>
-      <w:tr>
-        <w:tc>
-          <w:tcPr>
-            <w:tcW w:type="dxa" w:w="3456"/>
-            <w:vAlign w:val="top"/>
-          </w:tcPr>
-          <w:p>
-            <w:pPr>
-              <w:jc w:val="left"/>
-            </w:pPr>
-            <w:r/>
-            <w:r>
-              <w:rPr>
-                <w:b w:val="0"/>
-                <w:sz w:val="16"/>
-              </w:rPr>
-              <w:t>Measurable public decision-risk exposure proxy</w:t>
-            </w:r>
-          </w:p>
-        </w:tc>
-        <w:tc>
-          <w:tcPr>
-            <w:tcW w:type="dxa" w:w="3456"/>
-            <w:vAlign w:val="top"/>
-          </w:tcPr>
-          <w:p>
-            <w:pPr>
-              <w:jc w:val="left"/>
-            </w:pPr>
-            <w:r/>
-            <w:r>
-              <w:rPr>
-                <w:b w:val="0"/>
-                <w:sz w:val="16"/>
-              </w:rPr>
-              <w:t>3/3</w:t>
-            </w:r>
-          </w:p>
-        </w:tc>
-        <w:tc>
-          <w:tcPr>
-            <w:tcW w:type="dxa" w:w="3456"/>
-            <w:vAlign w:val="top"/>
-          </w:tcPr>
-          <w:p>
-            <w:pPr>
-              <w:jc w:val="left"/>
-            </w:pPr>
-            <w:r/>
-            <w:r>
-              <w:rPr>
-                <w:b w:val="0"/>
-                <w:sz w:val="16"/>
-              </w:rPr>
-              <w:t>Available as record-level and submitter-exposure counts</w:t>
-            </w:r>
-          </w:p>
-        </w:tc>
-      </w:tr>
-    </w:tbl>
-    <w:p/>
     <w:p>
       <w:pPr>
         <w:pStyle w:val="Heading2"/>
@@ -5118,7 +4565,7 @@
     </w:p>
     <w:p>
       <w:r>
-        <w:t>The central finding is that severe annotation does not override population evidence, and the deeper problem is pathogenicity-label distortion. Up to 35.1% of AF-observed LOF/splice ClinVar P/LP arrhythmia assertions showed ancestry-aware frequency discordance. That figure is not an error rate: many cases are compatible with recessive carrier architecture or lack AC support for immediate action. The clinical risk is subtler. A severe-looking ClinVar assertion can be mechanistically plausible in one frame and still misleading as a generic high-penetrance P/LP label.</w:t>
+        <w:t>The central finding is that some public P/LP labels permit mutually incompatible interpretations: they can be read as high-penetrance Mendelian assertions even when population frequency and mechanism require susceptibility, carrier-state, low-penetrance, or annotation-inflation framing. Severe annotation does not resolve this contradiction. Up to 35.1% of AF-observed LOF/splice ClinVar P/LP arrhythmia assertions showed ancestry-aware frequency discordance, showing that severe-looking labels remain vulnerable to state collapse.</w:t>
       </w:r>
     </w:p>
     <w:p>
@@ -5133,7 +4580,7 @@
     </w:p>
     <w:p>
       <w:r>
-        <w:t>VITAL's contribution is workflow compression with explainability, but its scientific role is to make this label distortion inspectable. It transforms 115 naive AF alerts into 3 urgent review cases while preserving gray no-frequency-evidence states and component-level explanations. This is not a replacement for ACMG/AMP interpretation, ClinGen specification, functional evidence, phenotype review, or laboratory judgment. It is a way to decide what to inspect first when frequency and clinical assertion are visibly misaligned.</w:t>
+        <w:t>VITAL's role is detection, not the central biological claim. It transforms 115 naive AF alerts into 3 urgent state-review cases while preserving gray no-frequency-evidence states and component-level explanations. The important result is that these 3 cases expose a real label-state collapse: the same public P/LP category can encode susceptibility, carrier architecture, annotation inflation, or high-penetrance Mendelian disease without making that distinction visible to downstream users.</w:t>
       </w:r>
     </w:p>
     <w:p>
@@ -5143,12 +4590,12 @@
     </w:p>
     <w:p>
       <w:r>
-        <w:t>This incompatibility is the system-level point. A single public P/LP label can travel into diagnostic, family-testing, surveillance, and therapy workflows, but it does not preserve whether the claim is a high-penetrance Mendelian assertion, a susceptibility haplotype, a recessive carrier-state allele, or unresolved annotation inflation. The failure is therefore not only possible variant misclassification; it is loss of biological state during clinical transmission.</w:t>
+        <w:t>This incompatibility is the system-level point. A single public P/LP label can travel into diagnostic, family-testing, surveillance, and therapy workflows, but it does not preserve whether the claim is a high-penetrance Mendelian assertion, a susceptibility haplotype, a recessive carrier-state allele, or unresolved annotation inflation. The failure is loss of biological state during clinical transmission.</w:t>
       </w:r>
     </w:p>
     <w:p>
       <w:r>
-        <w:t>The clinical consequence is not abstract, even though patient-level outcomes are unavailable. In the arrhythmia panel, 115 public P/LP records carried ancestry-aware frequency contradiction, representing at least 168 submitter-exposure units. Nine records had AC-supported contradiction, and 3 were urgent VITAL-red records. Two of those were standard-context red calls, where a generic Mendelian label could plausibly promote diagnostic closure, cascade testing, or surveillance before adjudication; one was a recessive-context TRDN call, where the immediate risk is inappropriate dominant-risk framing. VITAL therefore does not count proven misdiagnoses, but it converts hidden label exposure into an auditable review queue.</w:t>
+        <w:t>The clinical consequence is structural. In the arrhythmia panel, 115 public P/LP records carried ancestry-aware frequency contradiction, representing at least 168 submitter-exposure units. Nine records had AC-supported contradiction, and 3 were urgent VITAL-red records. Two of those were standard-context red calls, where a generic Mendelian label could plausibly promote diagnostic closure, cascade testing, or surveillance before adjudication; one was a recessive-context TRDN call, where the immediate risk is inappropriate dominant-risk framing. VITAL converts this hidden label exposure into an auditable state-review queue.</w:t>
       </w:r>
     </w:p>
     <w:p>

</xml_diff>

<commit_message>
Add VITAL sensitivity and routing operationalization
</commit_message>
<xml_diff>
--- a/manuscript_vital_with_figures_tables.docx
+++ b/manuscript_vital_with_figures_tables.docx
@@ -1382,6 +1382,387 @@
     </w:tbl>
     <w:p/>
     <w:p>
+      <w:r>
+        <w:t>The 1,397 non-evaluable variants were routed as a practical gray queue rather than left as an undifferentiated blind spot.</w:t>
+      </w:r>
+    </w:p>
+    <w:tbl>
+      <w:tblPr>
+        <w:tblStyle w:val="TableGrid"/>
+        <w:tblW w:type="auto" w:w="0"/>
+        <w:jc w:val="center"/>
+        <w:tblLook w:firstColumn="1" w:firstRow="1" w:lastColumn="0" w:lastRow="0" w:noHBand="0" w:noVBand="1" w:val="04A0"/>
+      </w:tblPr>
+      <w:tblGrid>
+        <w:gridCol w:w="3456"/>
+        <w:gridCol w:w="3456"/>
+        <w:gridCol w:w="3456"/>
+      </w:tblGrid>
+      <w:tr>
+        <w:tc>
+          <w:tcPr>
+            <w:tcW w:type="dxa" w:w="3456"/>
+            <w:vAlign w:val="top"/>
+            <w:shd w:fill="D9EAF7"/>
+          </w:tcPr>
+          <w:p>
+            <w:pPr>
+              <w:jc w:val="left"/>
+            </w:pPr>
+            <w:r/>
+            <w:r>
+              <w:rPr>
+                <w:b/>
+                <w:sz w:val="16"/>
+              </w:rPr>
+              <w:t>Non-evaluable category</w:t>
+            </w:r>
+          </w:p>
+        </w:tc>
+        <w:tc>
+          <w:tcPr>
+            <w:tcW w:type="dxa" w:w="3456"/>
+            <w:vAlign w:val="top"/>
+            <w:shd w:fill="D9EAF7"/>
+          </w:tcPr>
+          <w:p>
+            <w:pPr>
+              <w:jc w:val="left"/>
+            </w:pPr>
+            <w:r/>
+            <w:r>
+              <w:rPr>
+                <w:b/>
+                <w:sz w:val="16"/>
+              </w:rPr>
+              <w:t>Recommended next step</w:t>
+            </w:r>
+          </w:p>
+        </w:tc>
+        <w:tc>
+          <w:tcPr>
+            <w:tcW w:type="dxa" w:w="3456"/>
+            <w:vAlign w:val="top"/>
+            <w:shd w:fill="D9EAF7"/>
+          </w:tcPr>
+          <w:p>
+            <w:pPr>
+              <w:jc w:val="left"/>
+            </w:pPr>
+            <w:r/>
+            <w:r>
+              <w:rPr>
+                <w:b/>
+                <w:sz w:val="16"/>
+              </w:rPr>
+              <w:t>Interpretation guardrail</w:t>
+            </w:r>
+          </w:p>
+        </w:tc>
+      </w:tr>
+      <w:tr>
+        <w:tc>
+          <w:tcPr>
+            <w:tcW w:type="dxa" w:w="3456"/>
+            <w:vAlign w:val="top"/>
+          </w:tcPr>
+          <w:p>
+            <w:pPr>
+              <w:jc w:val="left"/>
+            </w:pPr>
+            <w:r/>
+            <w:r>
+              <w:rPr>
+                <w:b w:val="0"/>
+                <w:sz w:val="16"/>
+              </w:rPr>
+              <w:t>Indel/duplication with no gnomAD record</w:t>
+            </w:r>
+          </w:p>
+        </w:tc>
+        <w:tc>
+          <w:tcPr>
+            <w:tcW w:type="dxa" w:w="3456"/>
+            <w:vAlign w:val="top"/>
+          </w:tcPr>
+          <w:p>
+            <w:pPr>
+              <w:jc w:val="left"/>
+            </w:pPr>
+            <w:r/>
+            <w:r>
+              <w:rPr>
+                <w:b w:val="0"/>
+                <w:sz w:val="16"/>
+              </w:rPr>
+              <w:t>Genome-level query plus orthogonal validation when clinically material</w:t>
+            </w:r>
+          </w:p>
+        </w:tc>
+        <w:tc>
+          <w:tcPr>
+            <w:tcW w:type="dxa" w:w="3456"/>
+            <w:vAlign w:val="top"/>
+          </w:tcPr>
+          <w:p>
+            <w:pPr>
+              <w:jc w:val="left"/>
+            </w:pPr>
+            <w:r/>
+            <w:r>
+              <w:rPr>
+                <w:b w:val="0"/>
+                <w:sz w:val="16"/>
+              </w:rPr>
+              <w:t>Do not interpret absence as rarity</w:t>
+            </w:r>
+          </w:p>
+        </w:tc>
+      </w:tr>
+      <w:tr>
+        <w:tc>
+          <w:tcPr>
+            <w:tcW w:type="dxa" w:w="3456"/>
+            <w:vAlign w:val="top"/>
+          </w:tcPr>
+          <w:p>
+            <w:pPr>
+              <w:jc w:val="left"/>
+            </w:pPr>
+            <w:r/>
+            <w:r>
+              <w:rPr>
+                <w:b w:val="0"/>
+                <w:sz w:val="16"/>
+              </w:rPr>
+              <w:t>Allele-discordant SNV/MNV</w:t>
+            </w:r>
+          </w:p>
+        </w:tc>
+        <w:tc>
+          <w:tcPr>
+            <w:tcW w:type="dxa" w:w="3456"/>
+            <w:vAlign w:val="top"/>
+          </w:tcPr>
+          <w:p>
+            <w:pPr>
+              <w:jc w:val="left"/>
+            </w:pPr>
+            <w:r/>
+            <w:r>
+              <w:rPr>
+                <w:b w:val="0"/>
+                <w:sz w:val="16"/>
+              </w:rPr>
+              <w:t>Normalize, left-align, verify allele, and requery</w:t>
+            </w:r>
+          </w:p>
+        </w:tc>
+        <w:tc>
+          <w:tcPr>
+            <w:tcW w:type="dxa" w:w="3456"/>
+            <w:vAlign w:val="top"/>
+          </w:tcPr>
+          <w:p>
+            <w:pPr>
+              <w:jc w:val="left"/>
+            </w:pPr>
+            <w:r/>
+            <w:r>
+              <w:rPr>
+                <w:b w:val="0"/>
+                <w:sz w:val="16"/>
+              </w:rPr>
+              <w:t>Same-site observation is not exact-allele AF</w:t>
+            </w:r>
+          </w:p>
+        </w:tc>
+      </w:tr>
+      <w:tr>
+        <w:tc>
+          <w:tcPr>
+            <w:tcW w:type="dxa" w:w="3456"/>
+            <w:vAlign w:val="top"/>
+          </w:tcPr>
+          <w:p>
+            <w:pPr>
+              <w:jc w:val="left"/>
+            </w:pPr>
+            <w:r/>
+            <w:r>
+              <w:rPr>
+                <w:b w:val="0"/>
+                <w:sz w:val="16"/>
+              </w:rPr>
+              <w:t>Exact match without usable AF block</w:t>
+            </w:r>
+          </w:p>
+        </w:tc>
+        <w:tc>
+          <w:tcPr>
+            <w:tcW w:type="dxa" w:w="3456"/>
+            <w:vAlign w:val="top"/>
+          </w:tcPr>
+          <w:p>
+            <w:pPr>
+              <w:jc w:val="left"/>
+            </w:pPr>
+            <w:r/>
+            <w:r>
+              <w:rPr>
+                <w:b w:val="0"/>
+                <w:sz w:val="16"/>
+              </w:rPr>
+              <w:t>Retain gray status and recheck in future freeze</w:t>
+            </w:r>
+          </w:p>
+        </w:tc>
+        <w:tc>
+          <w:tcPr>
+            <w:tcW w:type="dxa" w:w="3456"/>
+            <w:vAlign w:val="top"/>
+          </w:tcPr>
+          <w:p>
+            <w:pPr>
+              <w:jc w:val="left"/>
+            </w:pPr>
+            <w:r/>
+            <w:r>
+              <w:rPr>
+                <w:b w:val="0"/>
+                <w:sz w:val="16"/>
+              </w:rPr>
+              <w:t>Do not convert missing AF to AF=0</w:t>
+            </w:r>
+          </w:p>
+        </w:tc>
+      </w:tr>
+      <w:tr>
+        <w:tc>
+          <w:tcPr>
+            <w:tcW w:type="dxa" w:w="3456"/>
+            <w:vAlign w:val="top"/>
+          </w:tcPr>
+          <w:p>
+            <w:pPr>
+              <w:jc w:val="left"/>
+            </w:pPr>
+            <w:r/>
+            <w:r>
+              <w:rPr>
+                <w:b w:val="0"/>
+                <w:sz w:val="16"/>
+              </w:rPr>
+              <w:t>No-record SNV in constrained gene</w:t>
+            </w:r>
+          </w:p>
+        </w:tc>
+        <w:tc>
+          <w:tcPr>
+            <w:tcW w:type="dxa" w:w="3456"/>
+            <w:vAlign w:val="top"/>
+          </w:tcPr>
+          <w:p>
+            <w:pPr>
+              <w:jc w:val="left"/>
+            </w:pPr>
+            <w:r/>
+            <w:r>
+              <w:rPr>
+                <w:b w:val="0"/>
+                <w:sz w:val="16"/>
+              </w:rPr>
+              <w:t>Deferred review with phenotype, segregation, and mechanism context</w:t>
+            </w:r>
+          </w:p>
+        </w:tc>
+        <w:tc>
+          <w:tcPr>
+            <w:tcW w:type="dxa" w:w="3456"/>
+            <w:vAlign w:val="top"/>
+          </w:tcPr>
+          <w:p>
+            <w:pPr>
+              <w:jc w:val="left"/>
+            </w:pPr>
+            <w:r/>
+            <w:r>
+              <w:rPr>
+                <w:b w:val="0"/>
+                <w:sz w:val="16"/>
+              </w:rPr>
+              <w:t>Absence alone supports neither consistency nor contradiction</w:t>
+            </w:r>
+          </w:p>
+        </w:tc>
+      </w:tr>
+      <w:tr>
+        <w:tc>
+          <w:tcPr>
+            <w:tcW w:type="dxa" w:w="3456"/>
+            <w:vAlign w:val="top"/>
+          </w:tcPr>
+          <w:p>
+            <w:pPr>
+              <w:jc w:val="left"/>
+            </w:pPr>
+            <w:r/>
+            <w:r>
+              <w:rPr>
+                <w:b w:val="0"/>
+                <w:sz w:val="16"/>
+              </w:rPr>
+              <w:t>Complex allele or haplotype</w:t>
+            </w:r>
+          </w:p>
+        </w:tc>
+        <w:tc>
+          <w:tcPr>
+            <w:tcW w:type="dxa" w:w="3456"/>
+            <w:vAlign w:val="top"/>
+          </w:tcPr>
+          <w:p>
+            <w:pPr>
+              <w:jc w:val="left"/>
+            </w:pPr>
+            <w:r/>
+            <w:r>
+              <w:rPr>
+                <w:b w:val="0"/>
+                <w:sz w:val="16"/>
+              </w:rPr>
+              <w:t>Resolve representation, phase, and haplotype literature</w:t>
+            </w:r>
+          </w:p>
+        </w:tc>
+        <w:tc>
+          <w:tcPr>
+            <w:tcW w:type="dxa" w:w="3456"/>
+            <w:vAlign w:val="top"/>
+          </w:tcPr>
+          <w:p>
+            <w:pPr>
+              <w:jc w:val="left"/>
+            </w:pPr>
+            <w:r/>
+            <w:r>
+              <w:rPr>
+                <w:b w:val="0"/>
+                <w:sz w:val="16"/>
+              </w:rPr>
+              <w:t>Do not transfer single-site AF assumptions to multi-allelic assertions</w:t>
+            </w:r>
+          </w:p>
+        </w:tc>
+      </w:tr>
+    </w:tbl>
+    <w:p/>
+    <w:p>
+      <w:r>
+        <w:t>The full routing table is provided as Supplementary Table S33.</w:t>
+      </w:r>
+    </w:p>
+    <w:p>
       <w:pPr>
         <w:pStyle w:val="Heading2"/>
       </w:pPr>
@@ -1536,7 +1917,7 @@
     </w:p>
     <w:p>
       <w:r>
-        <w:t>This result does not mean that 35.1% of LOF/splice assertions are wrong. It means that the P/LP label often lacks the biological frame needed to interpret the assertion safely. Mechanism triage showed that 35/92 severe-discordant assertions were in CASQ2 or TRDN, where recessive/biallelic disease architecture can make heterozygous carrier frequency biologically compatible. After excluding CASQ2/TRDN, 57/197 severe annotations (28.9%) remained discordant across 8 genes, but only 1/57 non-recessive severe-discordant assertions was AC-supported.</w:t>
+        <w:t>This is not an error-rate estimate; it is a label-state signal. The P/LP label often lacks the biological frame needed to interpret the assertion safely. Mechanism triage showed that 35/92 severe-discordant assertions were in CASQ2 or TRDN, where recessive/biallelic disease architecture can make heterozygous carrier frequency biologically compatible. After excluding CASQ2/TRDN, 57/197 severe annotations (28.9%) remained discordant across 8 genes, but only 1/57 non-recessive severe-discordant assertions was AC-supported.</w:t>
       </w:r>
     </w:p>
     <w:p>
@@ -2389,7 +2770,447 @@
     <w:p/>
     <w:p>
       <w:r>
-        <w:t>Workflow-concordance benchmarking supported the selected red gate but was not treated as diagnostic accuracy. The proxy positives were weak-review, AC-supported frequency signals; VITAL red captured the 3 operational positives at cutoffs 65-70 while avoiding proxy false-positive urgent review triggers. Sensitivity details are provided in supplementary tables.</w:t>
+        <w:t>An internal consistency audit supported the selected red gate but was not treated as diagnostic accuracy. The proxy positives were weak-review, AC-supported frequency signals; VITAL red captured the 3 operational positives at cutoffs 65-70 while avoiding proxy false-positive urgent review triggers.</w:t>
+      </w:r>
+    </w:p>
+    <w:p>
+      <w:r>
+        <w:t>Weight sensitivity was evaluated without outcome refitting. Across five alternative weight profiles, the red queue ranged from 1-3 variants and no new red variants appeared. SCN5A remained red in all five profiles, TRDN remained red in four of five, and KCNH2 remained red in two of five. One-weight-at-a-time perturbation showed the same pattern: SCN5A is an anchor signal, TRDN is near-stable but inheritance-routed, and KCNH2 is conditional/borderline.</w:t>
+      </w:r>
+    </w:p>
+    <w:tbl>
+      <w:tblPr>
+        <w:tblStyle w:val="TableGrid"/>
+        <w:tblW w:type="auto" w:w="0"/>
+        <w:jc w:val="center"/>
+        <w:tblLook w:firstColumn="1" w:firstRow="1" w:lastColumn="0" w:lastRow="0" w:noHBand="0" w:noVBand="1" w:val="04A0"/>
+      </w:tblPr>
+      <w:tblGrid>
+        <w:gridCol w:w="3456"/>
+        <w:gridCol w:w="3456"/>
+        <w:gridCol w:w="3456"/>
+      </w:tblGrid>
+      <w:tr>
+        <w:tc>
+          <w:tcPr>
+            <w:tcW w:type="dxa" w:w="3456"/>
+            <w:vAlign w:val="top"/>
+            <w:shd w:fill="D9EAF7"/>
+          </w:tcPr>
+          <w:p>
+            <w:pPr>
+              <w:jc w:val="left"/>
+            </w:pPr>
+            <w:r/>
+            <w:r>
+              <w:rPr>
+                <w:b/>
+                <w:sz w:val="16"/>
+              </w:rPr>
+              <w:t>Weight profile</w:t>
+            </w:r>
+          </w:p>
+        </w:tc>
+        <w:tc>
+          <w:tcPr>
+            <w:tcW w:type="dxa" w:w="3456"/>
+            <w:vAlign w:val="top"/>
+            <w:shd w:fill="D9EAF7"/>
+          </w:tcPr>
+          <w:p>
+            <w:pPr>
+              <w:jc w:val="left"/>
+            </w:pPr>
+            <w:r/>
+            <w:r>
+              <w:rPr>
+                <w:b/>
+                <w:sz w:val="16"/>
+              </w:rPr>
+              <w:t>Red count</w:t>
+            </w:r>
+          </w:p>
+        </w:tc>
+        <w:tc>
+          <w:tcPr>
+            <w:tcW w:type="dxa" w:w="3456"/>
+            <w:vAlign w:val="top"/>
+            <w:shd w:fill="D9EAF7"/>
+          </w:tcPr>
+          <w:p>
+            <w:pPr>
+              <w:jc w:val="left"/>
+            </w:pPr>
+            <w:r/>
+            <w:r>
+              <w:rPr>
+                <w:b/>
+                <w:sz w:val="16"/>
+              </w:rPr>
+              <w:t>Red variants retained</w:t>
+            </w:r>
+          </w:p>
+        </w:tc>
+      </w:tr>
+      <w:tr>
+        <w:tc>
+          <w:tcPr>
+            <w:tcW w:type="dxa" w:w="3456"/>
+            <w:vAlign w:val="top"/>
+          </w:tcPr>
+          <w:p>
+            <w:pPr>
+              <w:jc w:val="left"/>
+            </w:pPr>
+            <w:r/>
+            <w:r>
+              <w:rPr>
+                <w:b w:val="0"/>
+                <w:sz w:val="16"/>
+              </w:rPr>
+              <w:t>Primary expert weights</w:t>
+            </w:r>
+          </w:p>
+        </w:tc>
+        <w:tc>
+          <w:tcPr>
+            <w:tcW w:type="dxa" w:w="3456"/>
+            <w:vAlign w:val="top"/>
+          </w:tcPr>
+          <w:p>
+            <w:pPr>
+              <w:jc w:val="left"/>
+            </w:pPr>
+            <w:r/>
+            <w:r>
+              <w:rPr>
+                <w:b w:val="0"/>
+                <w:sz w:val="16"/>
+              </w:rPr>
+              <w:t>3</w:t>
+            </w:r>
+          </w:p>
+        </w:tc>
+        <w:tc>
+          <w:tcPr>
+            <w:tcW w:type="dxa" w:w="3456"/>
+            <w:vAlign w:val="top"/>
+          </w:tcPr>
+          <w:p>
+            <w:pPr>
+              <w:jc w:val="left"/>
+            </w:pPr>
+            <w:r/>
+            <w:r>
+              <w:rPr>
+                <w:b w:val="0"/>
+                <w:sz w:val="16"/>
+              </w:rPr>
+              <w:t>SCN5A, TRDN, KCNH2</w:t>
+            </w:r>
+          </w:p>
+        </w:tc>
+      </w:tr>
+      <w:tr>
+        <w:tc>
+          <w:tcPr>
+            <w:tcW w:type="dxa" w:w="3456"/>
+            <w:vAlign w:val="top"/>
+          </w:tcPr>
+          <w:p>
+            <w:pPr>
+              <w:jc w:val="left"/>
+            </w:pPr>
+            <w:r/>
+            <w:r>
+              <w:rPr>
+                <w:b w:val="0"/>
+                <w:sz w:val="16"/>
+              </w:rPr>
+              <w:t>Balanced equal components</w:t>
+            </w:r>
+          </w:p>
+        </w:tc>
+        <w:tc>
+          <w:tcPr>
+            <w:tcW w:type="dxa" w:w="3456"/>
+            <w:vAlign w:val="top"/>
+          </w:tcPr>
+          <w:p>
+            <w:pPr>
+              <w:jc w:val="left"/>
+            </w:pPr>
+            <w:r/>
+            <w:r>
+              <w:rPr>
+                <w:b w:val="0"/>
+                <w:sz w:val="16"/>
+              </w:rPr>
+              <w:t>1</w:t>
+            </w:r>
+          </w:p>
+        </w:tc>
+        <w:tc>
+          <w:tcPr>
+            <w:tcW w:type="dxa" w:w="3456"/>
+            <w:vAlign w:val="top"/>
+          </w:tcPr>
+          <w:p>
+            <w:pPr>
+              <w:jc w:val="left"/>
+            </w:pPr>
+            <w:r/>
+            <w:r>
+              <w:rPr>
+                <w:b w:val="0"/>
+                <w:sz w:val="16"/>
+              </w:rPr>
+              <w:t>SCN5A</w:t>
+            </w:r>
+          </w:p>
+        </w:tc>
+      </w:tr>
+      <w:tr>
+        <w:tc>
+          <w:tcPr>
+            <w:tcW w:type="dxa" w:w="3456"/>
+            <w:vAlign w:val="top"/>
+          </w:tcPr>
+          <w:p>
+            <w:pPr>
+              <w:jc w:val="left"/>
+            </w:pPr>
+            <w:r/>
+            <w:r>
+              <w:rPr>
+                <w:b w:val="0"/>
+                <w:sz w:val="16"/>
+              </w:rPr>
+              <w:t>Frequency dominant</w:t>
+            </w:r>
+          </w:p>
+        </w:tc>
+        <w:tc>
+          <w:tcPr>
+            <w:tcW w:type="dxa" w:w="3456"/>
+            <w:vAlign w:val="top"/>
+          </w:tcPr>
+          <w:p>
+            <w:pPr>
+              <w:jc w:val="left"/>
+            </w:pPr>
+            <w:r/>
+            <w:r>
+              <w:rPr>
+                <w:b w:val="0"/>
+                <w:sz w:val="16"/>
+              </w:rPr>
+              <w:t>2</w:t>
+            </w:r>
+          </w:p>
+        </w:tc>
+        <w:tc>
+          <w:tcPr>
+            <w:tcW w:type="dxa" w:w="3456"/>
+            <w:vAlign w:val="top"/>
+          </w:tcPr>
+          <w:p>
+            <w:pPr>
+              <w:jc w:val="left"/>
+            </w:pPr>
+            <w:r/>
+            <w:r>
+              <w:rPr>
+                <w:b w:val="0"/>
+                <w:sz w:val="16"/>
+              </w:rPr>
+              <w:t>SCN5A, TRDN</w:t>
+            </w:r>
+          </w:p>
+        </w:tc>
+      </w:tr>
+      <w:tr>
+        <w:tc>
+          <w:tcPr>
+            <w:tcW w:type="dxa" w:w="3456"/>
+            <w:vAlign w:val="top"/>
+          </w:tcPr>
+          <w:p>
+            <w:pPr>
+              <w:jc w:val="left"/>
+            </w:pPr>
+            <w:r/>
+            <w:r>
+              <w:rPr>
+                <w:b w:val="0"/>
+                <w:sz w:val="16"/>
+              </w:rPr>
+              <w:t>Review-fragility dominant</w:t>
+            </w:r>
+          </w:p>
+        </w:tc>
+        <w:tc>
+          <w:tcPr>
+            <w:tcW w:type="dxa" w:w="3456"/>
+            <w:vAlign w:val="top"/>
+          </w:tcPr>
+          <w:p>
+            <w:pPr>
+              <w:jc w:val="left"/>
+            </w:pPr>
+            <w:r/>
+            <w:r>
+              <w:rPr>
+                <w:b w:val="0"/>
+                <w:sz w:val="16"/>
+              </w:rPr>
+              <w:t>3</w:t>
+            </w:r>
+          </w:p>
+        </w:tc>
+        <w:tc>
+          <w:tcPr>
+            <w:tcW w:type="dxa" w:w="3456"/>
+            <w:vAlign w:val="top"/>
+          </w:tcPr>
+          <w:p>
+            <w:pPr>
+              <w:jc w:val="left"/>
+            </w:pPr>
+            <w:r/>
+            <w:r>
+              <w:rPr>
+                <w:b w:val="0"/>
+                <w:sz w:val="16"/>
+              </w:rPr>
+              <w:t>SCN5A, TRDN, KCNH2</w:t>
+            </w:r>
+          </w:p>
+        </w:tc>
+      </w:tr>
+      <w:tr>
+        <w:tc>
+          <w:tcPr>
+            <w:tcW w:type="dxa" w:w="3456"/>
+            <w:vAlign w:val="top"/>
+          </w:tcPr>
+          <w:p>
+            <w:pPr>
+              <w:jc w:val="left"/>
+            </w:pPr>
+            <w:r/>
+            <w:r>
+              <w:rPr>
+                <w:b w:val="0"/>
+                <w:sz w:val="16"/>
+              </w:rPr>
+              <w:t>Technical-detectability dominant</w:t>
+            </w:r>
+          </w:p>
+        </w:tc>
+        <w:tc>
+          <w:tcPr>
+            <w:tcW w:type="dxa" w:w="3456"/>
+            <w:vAlign w:val="top"/>
+          </w:tcPr>
+          <w:p>
+            <w:pPr>
+              <w:jc w:val="left"/>
+            </w:pPr>
+            <w:r/>
+            <w:r>
+              <w:rPr>
+                <w:b w:val="0"/>
+                <w:sz w:val="16"/>
+              </w:rPr>
+              <w:t>3</w:t>
+            </w:r>
+          </w:p>
+        </w:tc>
+        <w:tc>
+          <w:tcPr>
+            <w:tcW w:type="dxa" w:w="3456"/>
+            <w:vAlign w:val="top"/>
+          </w:tcPr>
+          <w:p>
+            <w:pPr>
+              <w:jc w:val="left"/>
+            </w:pPr>
+            <w:r/>
+            <w:r>
+              <w:rPr>
+                <w:b w:val="0"/>
+                <w:sz w:val="16"/>
+              </w:rPr>
+              <w:t>SCN5A, TRDN, KCNH2</w:t>
+            </w:r>
+          </w:p>
+        </w:tc>
+      </w:tr>
+      <w:tr>
+        <w:tc>
+          <w:tcPr>
+            <w:tcW w:type="dxa" w:w="3456"/>
+            <w:vAlign w:val="top"/>
+          </w:tcPr>
+          <w:p>
+            <w:pPr>
+              <w:jc w:val="left"/>
+            </w:pPr>
+            <w:r/>
+            <w:r>
+              <w:rPr>
+                <w:b w:val="0"/>
+                <w:sz w:val="16"/>
+              </w:rPr>
+              <w:t>Reduced AF pressure</w:t>
+            </w:r>
+          </w:p>
+        </w:tc>
+        <w:tc>
+          <w:tcPr>
+            <w:tcW w:type="dxa" w:w="3456"/>
+            <w:vAlign w:val="top"/>
+          </w:tcPr>
+          <w:p>
+            <w:pPr>
+              <w:jc w:val="left"/>
+            </w:pPr>
+            <w:r/>
+            <w:r>
+              <w:rPr>
+                <w:b w:val="0"/>
+                <w:sz w:val="16"/>
+              </w:rPr>
+              <w:t>2</w:t>
+            </w:r>
+          </w:p>
+        </w:tc>
+        <w:tc>
+          <w:tcPr>
+            <w:tcW w:type="dxa" w:w="3456"/>
+            <w:vAlign w:val="top"/>
+          </w:tcPr>
+          <w:p>
+            <w:pPr>
+              <w:jc w:val="left"/>
+            </w:pPr>
+            <w:r/>
+            <w:r>
+              <w:rPr>
+                <w:b w:val="0"/>
+                <w:sz w:val="16"/>
+              </w:rPr>
+              <w:t>SCN5A, TRDN</w:t>
+            </w:r>
+          </w:p>
+        </w:tc>
+      </w:tr>
+    </w:tbl>
+    <w:p/>
+    <w:p>
+      <w:r>
+        <w:t>Weight-profile sensitivity revealed heterogeneous confidence within the red-priority queue. SCN5A VCV000440850 was retained in all five alternative profiles, consistent with its extreme population frequency (AFR popmax AF=5.68e-3) dominating the score regardless of component weighting. TRDN VCV001325231 was retained in four of five profiles and lost only under the balanced equal-components profile, while one-weight perturbations showed additional sensitivity when frequency or AC support was downweighted. KCNH2 VCV004535537 was retained in only two of five profiles and was lost under reduced-AF, equal-weight, and frequency-dominant configurations, confirming that its red assignment is threshold-sensitive rather than robust. This gradient of stability reflects a real biological gradient: SCN5A represents a clear susceptibility-versus-Mendelian contradiction, TRDN represents a carrier-architecture framing problem with substantial AC support, and KCNH2 represents a borderline annotation-inflation case where the label-state concern is genuine but the evidence boundary is less definitive. The three cases are therefore not interchangeable urgent review calls. SCN5A and TRDN warrant immediate state-aware re-review; KCNH2 warrants flagging for expert adjudication with explicit acknowledgment that its red assignment is weight-dependent.</w:t>
       </w:r>
     </w:p>
     <w:p>
@@ -2413,16 +3234,17 @@
         <w:tblLook w:firstColumn="1" w:firstRow="1" w:lastColumn="0" w:lastRow="0" w:noHBand="0" w:noVBand="1" w:val="04A0"/>
       </w:tblPr>
       <w:tblGrid>
-        <w:gridCol w:w="2074"/>
-        <w:gridCol w:w="2074"/>
-        <w:gridCol w:w="2074"/>
-        <w:gridCol w:w="2074"/>
-        <w:gridCol w:w="2074"/>
+        <w:gridCol w:w="1728"/>
+        <w:gridCol w:w="1728"/>
+        <w:gridCol w:w="1728"/>
+        <w:gridCol w:w="1728"/>
+        <w:gridCol w:w="1728"/>
+        <w:gridCol w:w="1728"/>
       </w:tblGrid>
       <w:tr>
         <w:tc>
           <w:tcPr>
-            <w:tcW w:type="dxa" w:w="2074"/>
+            <w:tcW w:type="dxa" w:w="1728"/>
             <w:vAlign w:val="top"/>
             <w:shd w:fill="D9EAF7"/>
           </w:tcPr>
@@ -2442,7 +3264,7 @@
         </w:tc>
         <w:tc>
           <w:tcPr>
-            <w:tcW w:type="dxa" w:w="2074"/>
+            <w:tcW w:type="dxa" w:w="1728"/>
             <w:vAlign w:val="top"/>
             <w:shd w:fill="D9EAF7"/>
           </w:tcPr>
@@ -2462,7 +3284,7 @@
         </w:tc>
         <w:tc>
           <w:tcPr>
-            <w:tcW w:type="dxa" w:w="2074"/>
+            <w:tcW w:type="dxa" w:w="1728"/>
             <w:vAlign w:val="top"/>
             <w:shd w:fill="D9EAF7"/>
           </w:tcPr>
@@ -2482,7 +3304,7 @@
         </w:tc>
         <w:tc>
           <w:tcPr>
-            <w:tcW w:type="dxa" w:w="2074"/>
+            <w:tcW w:type="dxa" w:w="1728"/>
             <w:vAlign w:val="top"/>
             <w:shd w:fill="D9EAF7"/>
           </w:tcPr>
@@ -2502,7 +3324,27 @@
         </w:tc>
         <w:tc>
           <w:tcPr>
-            <w:tcW w:type="dxa" w:w="2074"/>
+            <w:tcW w:type="dxa" w:w="1728"/>
+            <w:vAlign w:val="top"/>
+            <w:shd w:fill="D9EAF7"/>
+          </w:tcPr>
+          <w:p>
+            <w:pPr>
+              <w:jc w:val="left"/>
+            </w:pPr>
+            <w:r/>
+            <w:r>
+              <w:rPr>
+                <w:b/>
+                <w:sz w:val="16"/>
+              </w:rPr>
+              <w:t>Confidence in red assignment</w:t>
+            </w:r>
+          </w:p>
+        </w:tc>
+        <w:tc>
+          <w:tcPr>
+            <w:tcW w:type="dxa" w:w="1728"/>
             <w:vAlign w:val="top"/>
             <w:shd w:fill="D9EAF7"/>
           </w:tcPr>
@@ -2524,7 +3366,7 @@
       <w:tr>
         <w:tc>
           <w:tcPr>
-            <w:tcW w:type="dxa" w:w="2074"/>
+            <w:tcW w:type="dxa" w:w="1728"/>
             <w:vAlign w:val="top"/>
           </w:tcPr>
           <w:p>
@@ -2543,7 +3385,7 @@
         </w:tc>
         <w:tc>
           <w:tcPr>
-            <w:tcW w:type="dxa" w:w="2074"/>
+            <w:tcW w:type="dxa" w:w="1728"/>
             <w:vAlign w:val="top"/>
           </w:tcPr>
           <w:p>
@@ -2562,7 +3404,7 @@
         </w:tc>
         <w:tc>
           <w:tcPr>
-            <w:tcW w:type="dxa" w:w="2074"/>
+            <w:tcW w:type="dxa" w:w="1728"/>
             <w:vAlign w:val="top"/>
           </w:tcPr>
           <w:p>
@@ -2581,7 +3423,7 @@
         </w:tc>
         <w:tc>
           <w:tcPr>
-            <w:tcW w:type="dxa" w:w="2074"/>
+            <w:tcW w:type="dxa" w:w="1728"/>
             <w:vAlign w:val="top"/>
           </w:tcPr>
           <w:p>
@@ -2600,7 +3442,26 @@
         </w:tc>
         <w:tc>
           <w:tcPr>
-            <w:tcW w:type="dxa" w:w="2074"/>
+            <w:tcW w:type="dxa" w:w="1728"/>
+            <w:vAlign w:val="top"/>
+          </w:tcPr>
+          <w:p>
+            <w:pPr>
+              <w:jc w:val="left"/>
+            </w:pPr>
+            <w:r/>
+            <w:r>
+              <w:rPr>
+                <w:b w:val="0"/>
+                <w:sz w:val="16"/>
+              </w:rPr>
+              <w:t>High / anchor</w:t>
+            </w:r>
+          </w:p>
+        </w:tc>
+        <w:tc>
+          <w:tcPr>
+            <w:tcW w:type="dxa" w:w="1728"/>
             <w:vAlign w:val="top"/>
           </w:tcPr>
           <w:p>
@@ -2621,7 +3482,7 @@
       <w:tr>
         <w:tc>
           <w:tcPr>
-            <w:tcW w:type="dxa" w:w="2074"/>
+            <w:tcW w:type="dxa" w:w="1728"/>
             <w:vAlign w:val="top"/>
           </w:tcPr>
           <w:p>
@@ -2640,7 +3501,7 @@
         </w:tc>
         <w:tc>
           <w:tcPr>
-            <w:tcW w:type="dxa" w:w="2074"/>
+            <w:tcW w:type="dxa" w:w="1728"/>
             <w:vAlign w:val="top"/>
           </w:tcPr>
           <w:p>
@@ -2659,7 +3520,7 @@
         </w:tc>
         <w:tc>
           <w:tcPr>
-            <w:tcW w:type="dxa" w:w="2074"/>
+            <w:tcW w:type="dxa" w:w="1728"/>
             <w:vAlign w:val="top"/>
           </w:tcPr>
           <w:p>
@@ -2678,7 +3539,7 @@
         </w:tc>
         <w:tc>
           <w:tcPr>
-            <w:tcW w:type="dxa" w:w="2074"/>
+            <w:tcW w:type="dxa" w:w="1728"/>
             <w:vAlign w:val="top"/>
           </w:tcPr>
           <w:p>
@@ -2697,7 +3558,26 @@
         </w:tc>
         <w:tc>
           <w:tcPr>
-            <w:tcW w:type="dxa" w:w="2074"/>
+            <w:tcW w:type="dxa" w:w="1728"/>
+            <w:vAlign w:val="top"/>
+          </w:tcPr>
+          <w:p>
+            <w:pPr>
+              <w:jc w:val="left"/>
+            </w:pPr>
+            <w:r/>
+            <w:r>
+              <w:rPr>
+                <w:b w:val="0"/>
+                <w:sz w:val="16"/>
+              </w:rPr>
+              <w:t>High for review; inheritance-routed</w:t>
+            </w:r>
+          </w:p>
+        </w:tc>
+        <w:tc>
+          <w:tcPr>
+            <w:tcW w:type="dxa" w:w="1728"/>
             <w:vAlign w:val="top"/>
           </w:tcPr>
           <w:p>
@@ -2718,7 +3598,7 @@
       <w:tr>
         <w:tc>
           <w:tcPr>
-            <w:tcW w:type="dxa" w:w="2074"/>
+            <w:tcW w:type="dxa" w:w="1728"/>
             <w:vAlign w:val="top"/>
           </w:tcPr>
           <w:p>
@@ -2737,7 +3617,7 @@
         </w:tc>
         <w:tc>
           <w:tcPr>
-            <w:tcW w:type="dxa" w:w="2074"/>
+            <w:tcW w:type="dxa" w:w="1728"/>
             <w:vAlign w:val="top"/>
           </w:tcPr>
           <w:p>
@@ -2756,7 +3636,7 @@
         </w:tc>
         <w:tc>
           <w:tcPr>
-            <w:tcW w:type="dxa" w:w="2074"/>
+            <w:tcW w:type="dxa" w:w="1728"/>
             <w:vAlign w:val="top"/>
           </w:tcPr>
           <w:p>
@@ -2775,7 +3655,7 @@
         </w:tc>
         <w:tc>
           <w:tcPr>
-            <w:tcW w:type="dxa" w:w="2074"/>
+            <w:tcW w:type="dxa" w:w="1728"/>
             <w:vAlign w:val="top"/>
           </w:tcPr>
           <w:p>
@@ -2794,7 +3674,26 @@
         </w:tc>
         <w:tc>
           <w:tcPr>
-            <w:tcW w:type="dxa" w:w="2074"/>
+            <w:tcW w:type="dxa" w:w="1728"/>
+            <w:vAlign w:val="top"/>
+          </w:tcPr>
+          <w:p>
+            <w:pPr>
+              <w:jc w:val="left"/>
+            </w:pPr>
+            <w:r/>
+            <w:r>
+              <w:rPr>
+                <w:b w:val="0"/>
+                <w:sz w:val="16"/>
+              </w:rPr>
+              <w:t>Conditional / borderline</w:t>
+            </w:r>
+          </w:p>
+        </w:tc>
+        <w:tc>
+          <w:tcPr>
+            <w:tcW w:type="dxa" w:w="1728"/>
             <w:vAlign w:val="top"/>
           </w:tcPr>
           <w:p>
@@ -2814,6 +3713,11 @@
       </w:tr>
     </w:tbl>
     <w:p/>
+    <w:p>
+      <w:r>
+        <w:t>KCNH2 VCV004535537 is therefore best read as a conditional or amber-like priority: its inclusion reflects the need for expert inspection at the decision boundary, not the same stability of red assignment seen for SCN5A.</w:t>
+      </w:r>
+    </w:p>
     <w:p>
       <w:pPr>
         <w:jc w:val="center"/>
@@ -2868,7 +3772,7 @@
     <w:p/>
     <w:p>
       <w:r>
-        <w:t>Manual review of live ClinVar records confirmed that these cases remained weakly supported or single-submitter assertions with unresolved mechanism-specific interpretation questions. VITAL does not declare them benign. It identifies records in which the public label may be too broad for the underlying biology.</w:t>
+        <w:t>Manual review of live ClinVar records confirmed that these cases remained weakly supported or single-submitter assertions with unresolved mechanism-specific interpretation questions. These records require state review rather than passive acceptance as generic P/LP.</w:t>
       </w:r>
     </w:p>
     <w:p>
@@ -3877,6 +4781,11 @@
     </w:tbl>
     <w:p/>
     <w:p>
+      <w:r>
+        <w:t>Supplementary Table S32 operationalizes this ontology with a trigger, required evidence, and output format for each state class. For example, a susceptibility transition requires AC-supported AF incompatibility plus context supporting modifier or haplotype biology, and the output should be a risk-allele or context-qualified assertion rather than generic monogenic P/LP.</w:t>
+      </w:r>
+    </w:p>
+    <w:p>
       <w:pPr>
         <w:pStyle w:val="Heading2"/>
       </w:pPr>
@@ -4618,7 +5527,7 @@
     </w:p>
     <w:p>
       <w:r>
-        <w:t>Second, historical validation is sparse. VITAL-red captured 1/23 strict future P/LP-to-VUS/B/LB events in the 3,000-variant audit, confirming that it is not a sensitive predictor of all future reclassification. Its intended endpoint is high-specificity frequency-assertion prioritization.</w:t>
+        <w:t>Second, historical validation is sparse. VITAL-red captured 1/23 strict future P/LP-to-VUS/B/LB events in the 3,000-variant audit, confirming that it is not a sensitive predictor of all future reclassification. Its intended endpoint is high-specificity frequency-assertion prioritization. Independent validation against larger ClinGen, LOVD, or expert-panel downgrade sets remains a first-order limitation.</w:t>
       </w:r>
     </w:p>
     <w:p>
@@ -4633,7 +5542,7 @@
     </w:p>
     <w:p>
       <w:r>
-        <w:t>Fifth, workflow-concordance benchmarking uses proxy labels and is partly circular because weak review and AC-supported frequency evidence help define both the operational positives and the red gate. These metrics should be read as burden diagnostics, not diagnostic accuracy.</w:t>
+        <w:t>Fifth, the internal consistency audit uses proxy labels and is partly circular because weak review and AC-supported frequency evidence help define both the operational positives and the red gate. These metrics should be read as burden diagnostics, not diagnostic accuracy.</w:t>
       </w:r>
     </w:p>
     <w:p>
@@ -4720,7 +5629,7 @@
     </w:p>
     <w:p>
       <w:r>
-        <w:t>Code, cached intermediate files, figures, and supplementary outputs required to reproduce downstream analyses are available in the project repository. The April 21, 2026 data freeze used ClinVar records retrieved through NCBI Entrez and bulk variant_summary files, gnomAD v4.1.1 exome/genome data queried through the gnomAD GraphQL API, and UCSC annotation resources. Machine-readable supplementary tables include VITAL scores, frequency flags, severe-annotation discordance, mechanism triage, red-priority case summaries, logical incompatibility audit outputs, frequency-evaluability gap outputs, temporal robustness outputs, clinical decision-risk proxy outputs, historical audits, expert-panel comparator outputs, and sensitivity analyses.</w:t>
+        <w:t>Code, cached intermediate files, figures, and supplementary outputs required to reproduce downstream analyses are available in the project repository. The April 21, 2026 data freeze used ClinVar records retrieved through NCBI Entrez and bulk variant_summary files, gnomAD v4.1.1 exome/genome data queried through the gnomAD GraphQL API, and UCSC annotation resources. Machine-readable supplementary tables include VITAL scores, frequency flags, severe-annotation discordance, mechanism triage, red-priority case summaries, logical incompatibility audit outputs, frequency-evaluability gap outputs, operational label-state transition outputs, non-evaluable routing outputs, temporal robustness outputs, clinical decision-risk proxy outputs, historical audits, expert-panel comparator outputs, and sensitivity analyses.</w:t>
       </w:r>
     </w:p>
     <w:sectPr>

</xml_diff>

<commit_message>
Add arrhythmia scope rationale and de novo caveat
</commit_message>
<xml_diff>
--- a/manuscript_vital_with_figures_tables.docx
+++ b/manuscript_vital_with_figures_tables.docx
@@ -73,6 +73,11 @@
     <w:p>
       <w:r>
         <w:t>Inherited arrhythmia syndromes, including long QT syndrome, Brugada syndrome, catecholaminergic polymorphic ventricular tachycardia, and related disorders, depend on accurate interpretation of rare variants in ion-channel, calcium-handling, and accessory genes. ClinVar is central to this interpretation because it aggregates public clinical assertions used by laboratories, expert panels, and researchers. A P/LP label in ClinVar can influence diagnosis, cascade testing, surveillance, and treatment decisions, so systematic errors in public assertions matter clinically even when individual case-level evidence is unavailable.</w:t>
+      </w:r>
+    </w:p>
+    <w:p>
+      <w:r>
+        <w:t>Inherited arrhythmia syndromes represent a particularly sensitive clinical system for detecting pathogenicity-label collapse. Clinical consequences of P/LP labels are immediate and high-impact, including ICD implantation, medication restrictions, and cascade family testing. Penetrance is frequently incomplete and context-dependent, susceptibility and modifier effects are common, and population structure critically shapes frequency interpretation. Under these conditions, a single P/LP label is insufficient to encode biologically distinct states. Arrhythmia genes therefore serve as a natural stress-test for the coherence of public pathogenicity assertions, not an arbitrary scope limitation.</w:t>
       </w:r>
     </w:p>
     <w:p>
@@ -5504,6 +5509,11 @@
     </w:p>
     <w:p>
       <w:r>
+        <w:t>De novo occurrence is conventionally treated as strong support for pathogenicity. In arrhythmia genes with incomplete penetrance and context-dependent expressivity, however, de novo status does not resolve frequency-assertion tension. A variant observed as de novo but present at non-negligible population frequency illustrates the core problem: the same P/LP label can encode a high-penetrance Mendelian event, a low-penetrance susceptibility allele, or a context-dependent modifier without making that distinction visible. De novo evidence strengthens the case for expert review; it does not substitute for it.</w:t>
+      </w:r>
+    </w:p>
+    <w:p>
+      <w:r>
         <w:t>The clinical consequence is structural. In the arrhythmia panel, 115 public P/LP records carried ancestry-aware frequency contradiction, representing at least 168 submitter-exposure units. Nine records had AC-supported contradiction, and 3 were urgent VITAL-red records. Two of those were standard-context red calls, where a generic Mendelian label could plausibly promote diagnostic closure, cascade testing, or surveillance before adjudication; one was a recessive-context TRDN call, where the immediate risk is inappropriate dominant-risk framing. VITAL converts this hidden label exposure into an auditable state-review queue.</w:t>
       </w:r>
     </w:p>
@@ -5527,27 +5537,32 @@
     </w:p>
     <w:p>
       <w:r>
-        <w:t>Second, historical validation is sparse. VITAL-red captured 1/23 strict future P/LP-to-VUS/B/LB events in the 3,000-variant audit, confirming that it is not a sensitive predictor of all future reclassification. Its intended endpoint is high-specificity frequency-assertion prioritization. Independent validation against larger ClinGen, LOVD, or expert-panel downgrade sets remains a first-order limitation.</w:t>
+        <w:t>Second, the analysis is intentionally restricted to inherited arrhythmia genes, where clinical consequence, penetrance architecture, and population structure create the conditions most favourable for detecting frequency-assertion tension. Generalizability to other disease domains requires domain-specific calibration and is not assumed.</w:t>
       </w:r>
     </w:p>
     <w:p>
       <w:r>
-        <w:t>Third, the score and ontology do not directly model penetrance, phase, zygosity, inheritance, phenotype specificity, segregation, MAVE/functional data, transcript rescue, NMD, or private laboratory evidence. These remain expert review tasks.</w:t>
+        <w:t>Third, historical validation is sparse. VITAL-red captured 1/23 strict future P/LP-to-VUS/B/LB events in the 3,000-variant audit, confirming that it is not a sensitive predictor of all future reclassification. Its intended endpoint is high-specificity frequency-assertion prioritization. Independent validation against larger ClinGen, LOVD, or expert-panel downgrade sets remains a first-order limitation.</w:t>
       </w:r>
     </w:p>
     <w:p>
       <w:r>
-        <w:t>Fourth, the AF-observed subset is not representative of all ClinVar arrhythmia P/LP assertions. Frequency-based conclusions are restricted to that evaluable space by design. The non-evaluable majority should be read as an additional interpretability failure caused by representation, normalization, and detectability limits, not as evidence against the AF-observed signal.</w:t>
+        <w:t>Fourth, the score and ontology do not directly model penetrance, phase, zygosity, inheritance, phenotype specificity, segregation, MAVE/functional data, transcript rescue, NMD, or private laboratory evidence. These remain expert review tasks.</w:t>
       </w:r>
     </w:p>
     <w:p>
       <w:r>
-        <w:t>Fifth, the internal consistency audit uses proxy labels and is partly circular because weak review and AC-supported frequency evidence help define both the operational positives and the red gate. These metrics should be read as burden diagnostics, not diagnostic accuracy.</w:t>
+        <w:t>Fifth, the AF-observed subset is not representative of all ClinVar arrhythmia P/LP assertions. Frequency-based conclusions are restricted to that evaluable space by design. The non-evaluable majority should be read as an additional interpretability failure caused by representation, normalization, and detectability limits, not as evidence against the AF-observed signal.</w:t>
       </w:r>
     </w:p>
     <w:p>
       <w:r>
-        <w:t>Sixth, public ClinVar captures classification-level changes, not patient-level downstream effects. We can quantify public decision-risk exposure as records and minimum submitter-exposure units, but not actual diagnosis reversal, cascade-testing uptake, surveillance changes, reproductive decisions, or therapy changes.</w:t>
+        <w:t>Sixth, the internal consistency audit uses proxy labels and is partly circular because weak review and AC-supported frequency evidence help define both the operational positives and the red gate. These metrics should be read as burden diagnostics, not diagnostic accuracy.</w:t>
+      </w:r>
+    </w:p>
+    <w:p>
+      <w:r>
+        <w:t>Seventh, public ClinVar captures classification-level changes, not patient-level downstream effects. We can quantify public decision-risk exposure as records and minimum submitter-exposure units, but not actual diagnosis reversal, cascade-testing uptake, surveillance changes, reproductive decisions, or therapy changes.</w:t>
       </w:r>
     </w:p>
     <w:p>

</xml_diff>

<commit_message>
Tighten arrhythmia rationale and de novo framing
</commit_message>
<xml_diff>
--- a/manuscript_vital_with_figures_tables.docx
+++ b/manuscript_vital_with_figures_tables.docx
@@ -77,7 +77,7 @@
     </w:p>
     <w:p>
       <w:r>
-        <w:t>Inherited arrhythmia syndromes represent a particularly sensitive clinical system for detecting pathogenicity-label collapse. Clinical consequences of P/LP labels are immediate and high-impact, including ICD implantation, medication restrictions, and cascade family testing. Penetrance is frequently incomplete and context-dependent, susceptibility and modifier effects are common, and population structure critically shapes frequency interpretation. Under these conditions, a single P/LP label is insufficient to encode biologically distinct states. Arrhythmia genes therefore serve as a natural stress-test for the coherence of public pathogenicity assertions, not an arbitrary scope limitation.</w:t>
+        <w:t>Inherited arrhythmia syndromes represent a particularly sensitive clinical system for detecting pathogenicity-label collapse. Clinical consequences of P/LP labels are immediate and high-impact, including ICD implantation, medication restrictions, and cascade family testing. At the same time, selection against pathogenic alleles is often less absolute than in fully penetrant lethal disorders, penetrance is frequently incomplete and context-dependent, susceptibility and modifier effects are common, population structure critically shapes frequency interpretation, and ClinVar coverage is relatively dense for canonical genes. Under these conditions, a single P/LP label is insufficient to encode biologically distinct states. Arrhythmia genes therefore serve as a natural stress-test for the coherence of public pathogenicity assertions, not an arbitrary scope limitation.</w:t>
       </w:r>
     </w:p>
     <w:p>
@@ -1917,12 +1917,12 @@
     </w:p>
     <w:p>
       <w:r>
-        <w:t>The main biological result is not simply that severe annotation can coexist with frequency tension. It is that frequency-discordant severe assertions reveal recurring distortion in how pathogenicity is labeled. Among 334 AF-observed arrhythmia variants, 115 (34.4%) had popmax/global AF &gt;1e-5. Among LOF/splice assertions, 92/262 (35.1%) were frequency-discordant, similar to missense assertions (19/66, 28.8%; Fisher OR=1.34, p=0.384). Frameshift, stop-gained, and canonical splice variants all showed naive frequency discordance.</w:t>
+        <w:t>The main biological result is not simply that severe annotation can coexist with frequency tension. It is that frequency-discordant severe assertions reveal recurring distortion in how pathogenicity is labeled. The argument-bearing statistic is that 92/262 AF-observed LOF/splice assertions (35.1%) were frequency-discordant, similar to missense assertions (19/66, 28.8%; Fisher OR=1.34, p=0.384). In other words, severe consequence annotation did not protect a public P/LP assertion from population-frequency contradiction. The broader AF-observed set contained 115/334 (34.4%) popmax/global alerts; those counts define the review burden, whereas the LOF/splice fraction defines the biological claim.</w:t>
       </w:r>
     </w:p>
     <w:p>
       <w:r>
-        <w:t>This is not an error-rate estimate; it is a label-state signal. The P/LP label often lacks the biological frame needed to interpret the assertion safely. Mechanism triage showed that 35/92 severe-discordant assertions were in CASQ2 or TRDN, where recessive/biallelic disease architecture can make heterozygous carrier frequency biologically compatible. After excluding CASQ2/TRDN, 57/197 severe annotations (28.9%) remained discordant across 8 genes, but only 1/57 non-recessive severe-discordant assertions was AC-supported.</w:t>
+        <w:t>The subsequent mechanism split is secondary decomposition, not the headline result. Frameshift, stop-gained, and canonical splice variants all showed naive frequency discordance. Mechanism triage showed that 35/92 severe-discordant assertions were in CASQ2 or TRDN, where recessive/biallelic disease architecture can make heterozygous carrier frequency biologically compatible. After excluding CASQ2/TRDN, 57/197 severe annotations (28.9%) remained discordant across 8 genes, but only 1/57 non-recessive severe-discordant assertions was AC-supported. This is not an error-rate estimate; it is a label-state signal: the P/LP label often lacks the biological frame needed to interpret the assertion safely.</w:t>
       </w:r>
     </w:p>
     <w:p>
@@ -5509,7 +5509,7 @@
     </w:p>
     <w:p>
       <w:r>
-        <w:t>De novo occurrence is conventionally treated as strong support for pathogenicity. In arrhythmia genes with incomplete penetrance and context-dependent expressivity, however, de novo status does not resolve frequency-assertion tension. A variant observed as de novo but present at non-negligible population frequency illustrates the core problem: the same P/LP label can encode a high-penetrance Mendelian event, a low-penetrance susceptibility allele, or a context-dependent modifier without making that distinction visible. De novo evidence strengthens the case for expert review; it does not substitute for it.</w:t>
+        <w:t>De novo occurrence is conventionally treated as strong support for pathogenicity because it raises the prior probability for a causal event in an individual proband. In arrhythmia genes with incomplete penetrance and context-dependent expressivity, however, de novo status does not resolve frequency-assertion tension at the label level. SCN5A VCV000440850 remains problematic even if observed as de novo in an individual case: an AFR popmax AF of 5.68e-3 is incompatible with a high-penetrance Mendelian Brugada assertion as a class. De novo evidence changes the case-level prior, but it does not erase the population-level contradiction or specify whether the public P/LP label represents Mendelian disease, low-penetrance susceptibility, or a context-dependent modifier. De novo evidence strengthens the case for expert review; it does not substitute for state-aware interpretation.</w:t>
       </w:r>
     </w:p>
     <w:p>

</xml_diff>

<commit_message>
Add VITAL validation readiness package
</commit_message>
<xml_diff>
--- a/manuscript_vital_with_figures_tables.docx
+++ b/manuscript_vital_with_figures_tables.docx
@@ -139,7 +139,7 @@
     </w:p>
     <w:p>
       <w:r>
-        <w:t>For exact AF-observed variants, global AF, global AC, population AF, population AC, and popmax AF were extracted. A naive global screen used global AF &gt;1e-5. An ancestry-aware screen used global or popmax AF &gt;1e-5. AC-supported frequency evidence required a qualifying global or popmax AC &gt;=20 at the relevant frequency signal. These thresholds were used for review prioritization, not automatic classification.</w:t>
+        <w:t>For exact AF-observed variants, global AF, global AC, population AF, population AC, and popmax AF were extracted. A naive global screen used global AF &gt;1e-5. An ancestry-aware screen used global or popmax AF &gt;1e-5. AC-supported frequency evidence required a qualifying global or popmax AC &gt;=20 at the relevant frequency signal. This AC gate was treated as an operational reliability floor rather than a biological threshold; AC reliability was also reported as ordered strata (AC 20-49, 50-199, and &gt;=200) and tested across AC&gt;=10, 20, 50, 100, and 200. These thresholds were used for review prioritization, not automatic classification.</w:t>
       </w:r>
     </w:p>
     <w:p>
@@ -562,7 +562,7 @@
     </w:p>
     <w:p>
       <w:r>
-        <w:t>We compared global AF, popmax/global AF, AC-supported frequency screening, and VITAL red-priority calls. We assessed variant-type enrichment among non-overlap records, severe-annotation frequency discordance, LOF subtype patterns, and mechanism triage of severe-discordant variants. Mechanism triage was used to separate probable label-framing modes, including carrier-compatible architecture, context-dependent susceptibility, annotation inflation, and unresolved high-penetrance tension. We then mapped these modes to review-routing classes with explicit entry rules, transition rules, and clinical consequences. For red-priority cases, we performed a logical incompatibility audit that explicitly compared the public ClinVar assertion, gnomAD population reality, and the biological mechanism frame required for a high-penetrance Mendelian interpretation. Because public ClinVar does not expose patient counts, we quantified clinical decision-risk exposure using record counts and minimum submitter-exposure units, with missing submitter counts treated conservatively as one unit. For red-priority cases, we also audited the public evidence boundary, recording whether the public scoring layer exposed phenotype linkage, penetrance estimates, segregation/phase, or downstream cascade-testing or therapy outcomes. Finally, we performed a frequency-evaluability audit separating AF-observed assertions from the non-evaluable majority, stratified by gene, variant type, and review strength, with SNV-only sensitivity checks. We performed supporting audits in a 3,000-variant cross-disease ClinVar P/LP sample, including historical January 2023 to April 2026 reclassification, expert-panel reviewed assertions, and real strict P/LP-to-VUS/B/LB events. Threshold sensitivity, AC-gate sensitivity, weight sensitivity, KCNH2 diagnostics, and time-series details are provided in supplementary outputs.</w:t>
+        <w:t>We compared global AF, popmax/global AF, AC-supported frequency screening, and VITAL red-priority calls. We assessed variant-type enrichment among non-overlap records, severe-annotation frequency discordance, LOF subtype patterns, and mechanism triage of severe-discordant variants. Mechanism triage was used to separate probable label-framing modes, including carrier-compatible architecture, context-dependent susceptibility, annotation inflation, and unresolved high-penetrance tension. We then mapped these modes to review-routing classes with explicit entry rules, transition rules, and clinical consequences. For red-priority cases, we performed a logical incompatibility audit that explicitly compared the public ClinVar assertion, gnomAD population reality, and the biological mechanism frame required for a high-penetrance Mendelian interpretation. Because public ClinVar does not expose patient counts, we quantified clinical decision-risk exposure using record counts and minimum submitter-exposure units, with missing submitter counts treated conservatively as one unit. For red-priority cases, we also audited the public evidence boundary, recording whether the public scoring layer exposed phenotype linkage, penetrance estimates, segregation/phase, or downstream cascade-testing or therapy outcomes. Finally, we performed a frequency-evaluability audit separating AF-observed assertions from the non-evaluable majority, stratified by gene, variant type, and review strength, with SNV-only sensitivity checks. To reduce circularity risk, we pre-specified an independent blinded expert-pilot endpoint of "requires re-review" versus "does not require re-review" using a 23-variant packet (3 red-priority cases, 10 gray no-frequency-evidence cases, and 10 non-red controls); VITAL scores and route labels are hidden from the review form and retained only in the analysis key. We performed supporting audits in a 3,000-variant cross-disease ClinVar P/LP sample, including historical January 2023 to April 2026 reclassification, expert-panel reviewed assertions, and real strict P/LP-to-VUS/B/LB events. Threshold sensitivity, AC-gate sensitivity, weight sensitivity, KCNH2 diagnostics, detectability checklists, pilot-review forms, and time-series details are provided in supplementary outputs.</w:t>
       </w:r>
     </w:p>
     <w:p>
@@ -2780,6 +2780,16 @@
     </w:p>
     <w:p>
       <w:r>
+        <w:t>Because this internal audit remains partly circular, we converted validation into a pre-specified external-review task rather than claiming independent diagnostic performance. The repository now includes a blinded expert pilot packet with 23 variants: the 3 red-priority cases, 10 gray no-frequency-evidence cases requiring detectability/deferred review decisions, and 10 non-red frequency-consistent controls. The review form exposes ClinVar, frequency, review, and variant-context fields but hides VITAL score, VITAL band, and pilot stratum. The pre-specified endpoint is expert consensus on "requires re-review" versus "does not require re-review"; planned metrics are sensitivity, specificity, PPV for red/gray routing, Cohen/Fleiss kappa, and discordance adjudication. Until this external pilot is completed, VITAL performance claims are limited to burden compression, internal consistency, and public-data audits.</w:t>
+      </w:r>
+    </w:p>
+    <w:p>
+      <w:r>
+        <w:t>AC reliability behaved as a gradient rather than a binary property. Among 115 popmax/global AF flags, 100 had AC &lt;10 or unavailable and generated no red-priority calls; 6 were AC 10-19 and generated none; 6 were AC 20-49 and contained TRDN plus borderline KCNH2; 2 were AC 50-199 and generated none; and 1 was AC &gt;=200, SCN5A. Sensitivity analysis showed the operational consequence: AC&gt;=10 produced 4 red-like calls by adding CACNB2, AC&gt;=20 produced the default 3-case queue, and AC&gt;=50/100/200 retained only SCN5A. Thus KCNH2 (global AC=24) and TRDN (global AC=40) are near-boundary AC-supported signals, whereas SCN5A has substantially stronger support (global AC=214; AFR popmax AC=190).</w:t>
+      </w:r>
+    </w:p>
+    <w:p>
+      <w:r>
         <w:t>Weight sensitivity was evaluated without outcome refitting. Across five alternative weight profiles, the red queue ranged from 1-3 variants and no new red variants appeared. SCN5A remained red in all five profiles, TRDN remained red in four of five, and KCNH2 remained red in two of five. One-weight-at-a-time perturbation showed the same pattern: SCN5A is an anchor signal, TRDN is near-stable but inheritance-routed, and KCNH2 is conditional/borderline.</w:t>
       </w:r>
     </w:p>
@@ -4787,7 +4797,7 @@
     <w:p/>
     <w:p>
       <w:r>
-        <w:t>Supplementary Table S32 operationalizes this ontology with a trigger, required evidence, and output format for each state class. For example, a susceptibility transition requires AC-supported AF incompatibility plus context supporting modifier or haplotype biology, and the output should be a risk-allele or context-qualified assertion rather than generic monogenic P/LP.</w:t>
+        <w:t>Supplementary Table S32 operationalizes this ontology with a trigger, required evidence, and output format for each state class. For example, a susceptibility transition requires AC-supported AF incompatibility plus context supporting modifier or haplotype biology, and the output should be a risk-allele or context-qualified assertion rather than generic monogenic P/LP. Supplementary Table S37 makes detectability assessment a required field set for gray-to-actionable routing, including exome presence, genome presence, coverage sufficiency, mapping-quality concern, representation ambiguity, and a final detectability-complete flag. This preserves a separate no-frequency-evidence state rather than silently converting missingness into rarity.</w:t>
       </w:r>
     </w:p>
     <w:p>
@@ -5557,7 +5567,7 @@
     </w:p>
     <w:p>
       <w:r>
-        <w:t>Sixth, the internal consistency audit uses proxy labels and is partly circular because weak review and AC-supported frequency evidence help define both the operational positives and the red gate. These metrics should be read as burden diagnostics, not diagnostic accuracy.</w:t>
+        <w:t>Sixth, the internal consistency audit uses proxy labels and is partly circular because weak review and AC-supported frequency evidence help define both the operational positives and the red gate. These metrics should be read as burden diagnostics, not diagnostic accuracy. To address this directly, we pre-specified a blinded expert pilot with an external endpoint of "requires re-review" versus "does not require re-review"; however, that consensus review is not yet complete, so no independent sensitivity, specificity, PPV, or kappa claims are made from it in the present manuscript.</w:t>
       </w:r>
     </w:p>
     <w:p>
@@ -5644,7 +5654,7 @@
     </w:p>
     <w:p>
       <w:r>
-        <w:t>Code, cached intermediate files, figures, and supplementary outputs required to reproduce downstream analyses are available in the project repository. The April 21, 2026 data freeze used ClinVar records retrieved through NCBI Entrez and bulk variant_summary files, gnomAD v4.1.1 exome/genome data queried through the gnomAD GraphQL API, and UCSC annotation resources. Machine-readable supplementary tables include VITAL scores, frequency flags, severe-annotation discordance, mechanism triage, red-priority case summaries, logical incompatibility audit outputs, frequency-evaluability gap outputs, operational label-state transition outputs, non-evaluable routing outputs, temporal robustness outputs, clinical decision-risk proxy outputs, historical audits, expert-panel comparator outputs, and sensitivity analyses.</w:t>
+        <w:t>Code, cached intermediate files, figures, and supplementary outputs required to reproduce downstream analyses are available in the project repository. The April 21, 2026 data freeze used ClinVar records retrieved through NCBI Entrez and bulk variant_summary files, gnomAD v4.1.1 exome/genome data queried through the gnomAD GraphQL API, and UCSC annotation resources. Machine-readable supplementary tables include VITAL scores, frequency flags, severe-annotation discordance, mechanism triage, red-priority case summaries, logical incompatibility audit outputs, frequency-evaluability gap outputs, operational label-state transition outputs, non-evaluable routing outputs, temporal robustness outputs, clinical decision-risk proxy outputs, blinded expert-pilot forms and keys, AC reliability strata, detectability-required fields, contextual overlay modules, historical audits, expert-panel comparator outputs, and sensitivity analyses.</w:t>
       </w:r>
     </w:p>
     <w:sectPr>

</xml_diff>

<commit_message>
Add clinical decision projection layer
</commit_message>
<xml_diff>
--- a/manuscript_vital_with_figures_tables.docx
+++ b/manuscript_vital_with_figures_tables.docx
@@ -562,7 +562,7 @@
     </w:p>
     <w:p>
       <w:r>
-        <w:t>We compared global AF, popmax/global AF, AC-supported frequency screening, and VITAL red-priority calls. We assessed variant-type enrichment among non-overlap records, severe-annotation frequency discordance, LOF subtype patterns, and mechanism triage of severe-discordant variants. Mechanism triage was used to separate probable label-framing modes, including carrier-compatible architecture, context-dependent susceptibility, annotation inflation, and unresolved high-penetrance tension. We then mapped these modes to review-routing classes with explicit entry rules, transition rules, and clinical consequences. For red-priority cases, we performed a logical incompatibility audit that explicitly compared the public ClinVar assertion, gnomAD population reality, and the biological mechanism frame required for a high-penetrance Mendelian interpretation. Because public ClinVar does not expose patient counts, we quantified clinical decision-risk exposure using record counts and minimum submitter-exposure units, with missing submitter counts treated conservatively as one unit. For red-priority cases, we also audited the public evidence boundary, recording whether the public scoring layer exposed phenotype linkage, penetrance estimates, segregation/phase, or downstream cascade-testing or therapy outcomes. Finally, we performed a frequency-evaluability audit separating AF-observed assertions from the non-evaluable majority, stratified by gene, variant type, and review strength, with SNV-only sensitivity checks. To reduce circularity risk, we pre-specified an independent blinded expert-pilot endpoint of "requires re-review" versus "does not require re-review" using a 23-variant packet (3 red-priority cases, 10 gray no-frequency-evidence cases, and 10 non-red controls); VITAL scores and route labels are hidden from the review form and retained only in the analysis key. We performed supporting audits in a 3,000-variant cross-disease ClinVar P/LP sample, including historical January 2023 to April 2026 reclassification, expert-panel reviewed assertions, and real strict P/LP-to-VUS/B/LB events. Threshold sensitivity, AC-gate sensitivity, weight sensitivity, KCNH2 diagnostics, detectability checklists, pilot-review forms, and time-series details are provided in supplementary outputs.</w:t>
+        <w:t>We compared global AF, popmax/global AF, AC-supported frequency screening, and VITAL red-priority calls. We assessed variant-type enrichment among non-overlap records, severe-annotation frequency discordance, LOF subtype patterns, and mechanism triage of severe-discordant variants. Mechanism triage was used to separate probable label-framing modes, including carrier-compatible architecture, context-dependent susceptibility, annotation inflation, and unresolved high-penetrance tension. We then mapped these modes to review-routing classes with explicit entry rules, transition rules, and clinical consequences. For red-priority cases, we performed a logical incompatibility audit that explicitly compared the public ClinVar assertion, gnomAD population reality, and the biological mechanism frame required for a high-penetrance Mendelian interpretation. We also added a clinical decision projection: for each red-priority case, we compared the decision pathway implied by reading the public P/LP label as high-penetrance Mendelian disease against the pathway implied by a state-aware susceptibility, carrier, or mechanism-review frame. Because public ClinVar does not expose patient counts, we quantified clinical decision-risk exposure using record counts and minimum submitter-exposure units, with missing submitter counts treated conservatively as one unit. For red-priority cases, we also audited the public evidence boundary, recording whether the public scoring layer exposed phenotype linkage, penetrance estimates, segregation/phase, or downstream cascade-testing or therapy outcomes. Finally, we performed a frequency-evaluability audit separating AF-observed assertions from the non-evaluable majority, stratified by gene, variant type, and review strength, with SNV-only sensitivity checks. To reduce circularity risk, we pre-specified an independent blinded expert-pilot endpoint of "requires re-review" versus "does not require re-review" using a 23-variant packet (3 red-priority cases, 10 gray no-frequency-evidence cases, and 10 non-red controls); VITAL scores and route labels are hidden from the review form and retained only in the analysis key. We performed supporting audits in a 3,000-variant cross-disease ClinVar P/LP sample, including historical January 2023 to April 2026 reclassification, expert-panel reviewed assertions, and real strict P/LP-to-VUS/B/LB events. Threshold sensitivity, AC-gate sensitivity, weight sensitivity, KCNH2 diagnostics, detectability checklists, pilot-review forms, and time-series details are provided in supplementary outputs.</w:t>
       </w:r>
     </w:p>
     <w:p>
@@ -3795,6 +3795,355 @@
         <w:pStyle w:val="Heading2"/>
       </w:pPr>
       <w:r>
+        <w:t>Clinical decision projection shows one label can imply incompatible pathways</w:t>
+      </w:r>
+    </w:p>
+    <w:p>
+      <w:r>
+        <w:t>The practical consequence of label-state collapse is that one public P/LP label can support two incompatible clinical pathways depending on how it is read. We therefore projected, without assuming any real patient-level downstream event, what follows if each red-priority label is read as unqualified high-penetrance Mendelian disease versus as the mechanism-aware state required by the frequency and evidence context.</w:t>
+      </w:r>
+    </w:p>
+    <w:tbl>
+      <w:tblPr>
+        <w:tblStyle w:val="TableGrid"/>
+        <w:tblW w:type="auto" w:w="0"/>
+        <w:jc w:val="center"/>
+        <w:tblLook w:firstColumn="1" w:firstRow="1" w:lastColumn="0" w:lastRow="0" w:noHBand="0" w:noVBand="1" w:val="04A0"/>
+      </w:tblPr>
+      <w:tblGrid>
+        <w:gridCol w:w="2592"/>
+        <w:gridCol w:w="2592"/>
+        <w:gridCol w:w="2592"/>
+        <w:gridCol w:w="2592"/>
+      </w:tblGrid>
+      <w:tr>
+        <w:tc>
+          <w:tcPr>
+            <w:tcW w:type="dxa" w:w="2592"/>
+            <w:vAlign w:val="top"/>
+            <w:shd w:fill="D9EAF7"/>
+          </w:tcPr>
+          <w:p>
+            <w:pPr>
+              <w:jc w:val="left"/>
+            </w:pPr>
+            <w:r/>
+            <w:r>
+              <w:rPr>
+                <w:b/>
+                <w:sz w:val="16"/>
+              </w:rPr>
+              <w:t>Case</w:t>
+            </w:r>
+          </w:p>
+        </w:tc>
+        <w:tc>
+          <w:tcPr>
+            <w:tcW w:type="dxa" w:w="2592"/>
+            <w:vAlign w:val="top"/>
+            <w:shd w:fill="D9EAF7"/>
+          </w:tcPr>
+          <w:p>
+            <w:pPr>
+              <w:jc w:val="left"/>
+            </w:pPr>
+            <w:r/>
+            <w:r>
+              <w:rPr>
+                <w:b/>
+                <w:sz w:val="16"/>
+              </w:rPr>
+              <w:t>If read as generic Mendelian P/LP</w:t>
+            </w:r>
+          </w:p>
+        </w:tc>
+        <w:tc>
+          <w:tcPr>
+            <w:tcW w:type="dxa" w:w="2592"/>
+            <w:vAlign w:val="top"/>
+            <w:shd w:fill="D9EAF7"/>
+          </w:tcPr>
+          <w:p>
+            <w:pPr>
+              <w:jc w:val="left"/>
+            </w:pPr>
+            <w:r/>
+            <w:r>
+              <w:rPr>
+                <w:b/>
+                <w:sz w:val="16"/>
+              </w:rPr>
+              <w:t>If read as state-aware assertion</w:t>
+            </w:r>
+          </w:p>
+        </w:tc>
+        <w:tc>
+          <w:tcPr>
+            <w:tcW w:type="dxa" w:w="2592"/>
+            <w:vAlign w:val="top"/>
+            <w:shd w:fill="D9EAF7"/>
+          </w:tcPr>
+          <w:p>
+            <w:pPr>
+              <w:jc w:val="left"/>
+            </w:pPr>
+            <w:r/>
+            <w:r>
+              <w:rPr>
+                <w:b/>
+                <w:sz w:val="16"/>
+              </w:rPr>
+              <w:t>Guideline-facing tension</w:t>
+            </w:r>
+          </w:p>
+        </w:tc>
+      </w:tr>
+      <w:tr>
+        <w:tc>
+          <w:tcPr>
+            <w:tcW w:type="dxa" w:w="2592"/>
+            <w:vAlign w:val="top"/>
+          </w:tcPr>
+          <w:p>
+            <w:pPr>
+              <w:jc w:val="left"/>
+            </w:pPr>
+            <w:r/>
+            <w:r>
+              <w:rPr>
+                <w:b w:val="0"/>
+                <w:sz w:val="16"/>
+              </w:rPr>
+              <w:t>SCN5A VCV000440850</w:t>
+            </w:r>
+          </w:p>
+        </w:tc>
+        <w:tc>
+          <w:tcPr>
+            <w:tcW w:type="dxa" w:w="2592"/>
+            <w:vAlign w:val="top"/>
+          </w:tcPr>
+          <w:p>
+            <w:pPr>
+              <w:jc w:val="left"/>
+            </w:pPr>
+            <w:r/>
+            <w:r>
+              <w:rPr>
+                <w:b w:val="0"/>
+                <w:sz w:val="16"/>
+              </w:rPr>
+              <w:t>Can support Brugada diagnostic closure, broad cascade testing, arrhythmia surveillance, drug-avoidance counseling, and phenotype-triggered ICD/risk-stratification discussions</w:t>
+            </w:r>
+          </w:p>
+        </w:tc>
+        <w:tc>
+          <w:tcPr>
+            <w:tcW w:type="dxa" w:w="2592"/>
+            <w:vAlign w:val="top"/>
+          </w:tcPr>
+          <w:p>
+            <w:pPr>
+              <w:jc w:val="left"/>
+            </w:pPr>
+            <w:r/>
+            <w:r>
+              <w:rPr>
+                <w:b w:val="0"/>
+                <w:sz w:val="16"/>
+              </w:rPr>
+              <w:t>Does not establish monogenic Brugada diagnosis by itself; cascade testing should be limited or qualified as susceptibility/haplotype tracking, and management should remain phenotype/context driven</w:t>
+            </w:r>
+          </w:p>
+        </w:tc>
+        <w:tc>
+          <w:tcPr>
+            <w:tcW w:type="dxa" w:w="2592"/>
+            <w:vAlign w:val="top"/>
+          </w:tcPr>
+          <w:p>
+            <w:pPr>
+              <w:jc w:val="left"/>
+            </w:pPr>
+            <w:r/>
+            <w:r>
+              <w:rPr>
+                <w:b w:val="0"/>
+                <w:sz w:val="16"/>
+              </w:rPr>
+              <w:t>ClinVar terminology allows low-penetrance and risk-allele states, but the public record remains generic Pathogenic with no assertion criteria</w:t>
+            </w:r>
+          </w:p>
+        </w:tc>
+      </w:tr>
+      <w:tr>
+        <w:tc>
+          <w:tcPr>
+            <w:tcW w:type="dxa" w:w="2592"/>
+            <w:vAlign w:val="top"/>
+          </w:tcPr>
+          <w:p>
+            <w:pPr>
+              <w:jc w:val="left"/>
+            </w:pPr>
+            <w:r/>
+            <w:r>
+              <w:rPr>
+                <w:b w:val="0"/>
+                <w:sz w:val="16"/>
+              </w:rPr>
+              <w:t>TRDN VCV001325231</w:t>
+            </w:r>
+          </w:p>
+        </w:tc>
+        <w:tc>
+          <w:tcPr>
+            <w:tcW w:type="dxa" w:w="2592"/>
+            <w:vAlign w:val="top"/>
+          </w:tcPr>
+          <w:p>
+            <w:pPr>
+              <w:jc w:val="left"/>
+            </w:pPr>
+            <w:r/>
+            <w:r>
+              <w:rPr>
+                <w:b w:val="0"/>
+                <w:sz w:val="16"/>
+              </w:rPr>
+              <w:t>Can be misread as CPVT5 disease causality and dominant-risk family counseling if phase and second-allele status are ignored</w:t>
+            </w:r>
+          </w:p>
+        </w:tc>
+        <w:tc>
+          <w:tcPr>
+            <w:tcW w:type="dxa" w:w="2592"/>
+            <w:vAlign w:val="top"/>
+          </w:tcPr>
+          <w:p>
+            <w:pPr>
+              <w:jc w:val="left"/>
+            </w:pPr>
+            <w:r/>
+            <w:r>
+              <w:rPr>
+                <w:b w:val="0"/>
+                <w:sz w:val="16"/>
+              </w:rPr>
+              <w:t>Should be routed as carrier-compatible or biallelic affected-state evidence; family testing should prioritize phase and second-allele clarification</w:t>
+            </w:r>
+          </w:p>
+        </w:tc>
+        <w:tc>
+          <w:tcPr>
+            <w:tcW w:type="dxa" w:w="2592"/>
+            <w:vAlign w:val="top"/>
+          </w:tcPr>
+          <w:p>
+            <w:pPr>
+              <w:jc w:val="left"/>
+            </w:pPr>
+            <w:r/>
+            <w:r>
+              <w:rPr>
+                <w:b w:val="0"/>
+                <w:sz w:val="16"/>
+              </w:rPr>
+              <w:t>Generic P/LP does not encode carrier versus affected-state use</w:t>
+            </w:r>
+          </w:p>
+        </w:tc>
+      </w:tr>
+      <w:tr>
+        <w:tc>
+          <w:tcPr>
+            <w:tcW w:type="dxa" w:w="2592"/>
+            <w:vAlign w:val="top"/>
+          </w:tcPr>
+          <w:p>
+            <w:pPr>
+              <w:jc w:val="left"/>
+            </w:pPr>
+            <w:r/>
+            <w:r>
+              <w:rPr>
+                <w:b w:val="0"/>
+                <w:sz w:val="16"/>
+              </w:rPr>
+              <w:t>KCNH2 VCV004535537</w:t>
+            </w:r>
+          </w:p>
+        </w:tc>
+        <w:tc>
+          <w:tcPr>
+            <w:tcW w:type="dxa" w:w="2592"/>
+            <w:vAlign w:val="top"/>
+          </w:tcPr>
+          <w:p>
+            <w:pPr>
+              <w:jc w:val="left"/>
+            </w:pPr>
+            <w:r/>
+            <w:r>
+              <w:rPr>
+                <w:b w:val="0"/>
+                <w:sz w:val="16"/>
+              </w:rPr>
+              <w:t>Can support Long QT diagnostic closure, familial testing, QT surveillance, and medication-avoidance decisions if accepted as unqualified LP</w:t>
+            </w:r>
+          </w:p>
+        </w:tc>
+        <w:tc>
+          <w:tcPr>
+            <w:tcW w:type="dxa" w:w="2592"/>
+            <w:vAlign w:val="top"/>
+          </w:tcPr>
+          <w:p>
+            <w:pPr>
+              <w:jc w:val="left"/>
+            </w:pPr>
+            <w:r/>
+            <w:r>
+              <w:rPr>
+                <w:b w:val="0"/>
+                <w:sz w:val="16"/>
+              </w:rPr>
+              <w:t>Requires splice/same-site/segregation adjudication; cascade and management decisions should remain provisional and phenotype-linked</w:t>
+            </w:r>
+          </w:p>
+        </w:tc>
+        <w:tc>
+          <w:tcPr>
+            <w:tcW w:type="dxa" w:w="2592"/>
+            <w:vAlign w:val="top"/>
+          </w:tcPr>
+          <w:p>
+            <w:pPr>
+              <w:jc w:val="left"/>
+            </w:pPr>
+            <w:r/>
+            <w:r>
+              <w:rPr>
+                <w:b w:val="0"/>
+                <w:sz w:val="16"/>
+              </w:rPr>
+              <w:t>Single-submitter LP plus AC-supported frequency tension creates an expert-review need, but the public label does not expose splice certainty or penetrance state</w:t>
+            </w:r>
+          </w:p>
+        </w:tc>
+      </w:tr>
+    </w:tbl>
+    <w:p/>
+    <w:p>
+      <w:r>
+        <w:t>This is a decision projection, not a claim that misdiagnosis or cascade testing occurred. Its point is narrower: a generic P/LP label can travel into diagnostic and family-management workflows while failing to preserve the biological state needed to choose the correct pathway. No red-priority case is asserted here to conflict with a ClinGen expert-panel classification; the tension is semantic and operational. ClinVar/ClinGen terminology already recognizes risk-allele and low-penetrance categories, and ClinVar review status distinguishes single-submitter/no-criteria records from expert-panel or practice-guideline assertions. The problem is that the exported public label can still be read as a single undifferentiated Mendelian P/LP assertion.</w:t>
+      </w:r>
+    </w:p>
+    <w:p>
+      <w:pPr>
+        <w:pStyle w:val="Heading2"/>
+      </w:pPr>
+      <w:r>
         <w:t>Logical incompatibility audit proves label-state insufficiency</w:t>
       </w:r>
     </w:p>
@@ -5519,6 +5868,11 @@
     </w:p>
     <w:p>
       <w:r>
+        <w:t>The guideline-facing tension is therefore not that VITAL overrules ACMG/AMP, ClinGen, or ClinVar. It is that public label transmission can discard distinctions those frameworks already require reviewers to consider: disease mechanism, penetrance, evidence strength, assertion review level, and whether an assertion is better represented as a low-penetrance or risk-allele state. In the 3 red-priority cases, no ClinGen expert-panel or practice-guideline review was present in the public record. The claim is not expert-panel disagreement; it is that single-submitter or no-criteria P/LP labels can enter clinical workflow without preserving the state qualifiers needed for safe use.</w:t>
+      </w:r>
+    </w:p>
+    <w:p>
+      <w:r>
         <w:t>De novo occurrence is conventionally treated as strong support for pathogenicity because it raises the prior probability for a causal event in an individual proband. In arrhythmia genes with incomplete penetrance and context-dependent expressivity, however, de novo status does not resolve frequency-assertion tension at the label level. SCN5A VCV000440850 remains problematic even if observed as de novo in an individual case: an AFR popmax AF of 5.68e-3 is incompatible with a high-penetrance Mendelian Brugada assertion as a class. De novo evidence changes the case-level prior, but it does not erase the population-level contradiction or specify whether the public P/LP label represents Mendelian disease, low-penetrance susceptibility, or a context-dependent modifier. De novo evidence strengthens the case for expert review; it does not substitute for state-aware interpretation.</w:t>
       </w:r>
     </w:p>
@@ -5628,6 +5982,14 @@
         <w:pStyle w:val="ListNumber"/>
       </w:pPr>
       <w:r>
+        <w:t>Run a clinical decision projection for red-priority variants before acting: ask what would follow if the label were treated as Mendelian disease, and what would follow if it were susceptibility, carrier-state, or mechanism-unresolved evidence.</w:t>
+      </w:r>
+    </w:p>
+    <w:p>
+      <w:pPr>
+        <w:pStyle w:val="ListNumber"/>
+      </w:pPr>
+      <w:r>
         <w:t>Use the label-state ontology as a transition map: move from generic P/LP to context-qualified assertion, carrier assertion, penetrance-qualified assertion, urgent re-review, or gray representation-uncertain queue as evidence dictates.</w:t>
       </w:r>
     </w:p>
@@ -5654,7 +6016,7 @@
     </w:p>
     <w:p>
       <w:r>
-        <w:t>Code, cached intermediate files, figures, and supplementary outputs required to reproduce downstream analyses are available in the project repository. The April 21, 2026 data freeze used ClinVar records retrieved through NCBI Entrez and bulk variant_summary files, gnomAD v4.1.1 exome/genome data queried through the gnomAD GraphQL API, and UCSC annotation resources. Machine-readable supplementary tables include VITAL scores, frequency flags, severe-annotation discordance, mechanism triage, red-priority case summaries, logical incompatibility audit outputs, frequency-evaluability gap outputs, operational label-state transition outputs, non-evaluable routing outputs, temporal robustness outputs, clinical decision-risk proxy outputs, blinded expert-pilot forms and keys, AC reliability strata, detectability-required fields, contextual overlay modules, historical audits, expert-panel comparator outputs, and sensitivity analyses.</w:t>
+        <w:t>Code, cached intermediate files, figures, and supplementary outputs required to reproduce downstream analyses are available in the project repository. The April 21, 2026 data freeze used ClinVar records retrieved through NCBI Entrez and bulk variant_summary files, gnomAD v4.1.1 exome/genome data queried through the gnomAD GraphQL API, and UCSC annotation resources. Machine-readable supplementary tables include VITAL scores, frequency flags, severe-annotation discordance, mechanism triage, red-priority case summaries, logical incompatibility audit outputs, clinical decision-projection outputs, guideline-tension audits, frequency-evaluability gap outputs, operational label-state transition outputs, non-evaluable routing outputs, temporal robustness outputs, clinical decision-risk proxy outputs, blinded expert-pilot forms and keys, AC reliability strata, detectability-required fields, contextual overlay modules, historical audits, expert-panel comparator outputs, and sensitivity analyses.</w:t>
       </w:r>
     </w:p>
     <w:sectPr>

</xml_diff>

<commit_message>
Add clinical label-state collapse vignette
</commit_message>
<xml_diff>
--- a/manuscript_vital_with_figures_tables.docx
+++ b/manuscript_vital_with_figures_tables.docx
@@ -4140,6 +4140,34 @@
       </w:r>
     </w:p>
     <w:p>
+      <w:r>
+        <w:rPr>
+          <w:b/>
+        </w:rPr>
+        <w:t>Box 1. Clinical consequence of label-state collapse</w:t>
+      </w:r>
+    </w:p>
+    <w:p>
+      <w:r>
+        <w:t>This illustrative scenario is a decision projection, not an observed patient case. A 25-year-old individual undergoes incidental genetic testing following evaluation for nonspecific palpitations. No definitive clinical diagnosis is established. A variant in SCN5A (VCV000440850) is reported as pathogenic in ClinVar.</w:t>
+      </w:r>
+    </w:p>
+    <w:p>
+      <w:r>
+        <w:t>Under a standard Mendelian interpretation of the P/LP label, the variant is considered causative for Brugada syndrome, supporting diagnostic closure, cascade family testing, and consideration of preventive interventions.</w:t>
+      </w:r>
+    </w:p>
+    <w:p>
+      <w:r>
+        <w:t>In contrast, population-aware interpretation reveals an AFR popmax allele frequency of 5.68e-3 (AC=190), incompatible with a high-penetrance Mendelian model. Under this interpretation, the variant is reframed as a susceptibility or low-penetrance allele, diagnostic closure is avoided, and management remains phenotype-driven.</w:t>
+      </w:r>
+    </w:p>
+    <w:p>
+      <w:r>
+        <w:t>These two interpretations produce mutually incompatible clinical pathways from the same underlying evidence, reflecting a failure of the P/LP label to encode biological state.</w:t>
+      </w:r>
+    </w:p>
+    <w:p>
       <w:pPr>
         <w:pStyle w:val="Heading2"/>
       </w:pPr>

</xml_diff>

<commit_message>
Add frequency constraint analyses
</commit_message>
<xml_diff>
--- a/manuscript_vital_with_figures_tables.docx
+++ b/manuscript_vital_with_figures_tables.docx
@@ -4599,6 +4599,49 @@
         <w:pStyle w:val="Heading2"/>
       </w:pPr>
       <w:r>
+        <w:t>Maximum credible AF formalizes the incompatibility</w:t>
+      </w:r>
+    </w:p>
+    <w:p>
+      <w:r>
+        <w:t>We next expressed the same contradiction using a maximum credible allele-frequency framework. For a rare dominant allele, the tolerated frequency can be approximated as:</w:t>
+      </w:r>
+    </w:p>
+    <w:p>
+      <w:r>
+        <w:t>AF_max = (disease prevalence x allelic contribution) / (penetrance x model factor),</w:t>
+      </w:r>
+    </w:p>
+    <w:p>
+      <w:r>
+        <w:t>where allelic contribution is the fraction of disease attributable to the allele and the model factor is 2 for a heterozygous diploid dominant model. This is distinct from gnomAD allele count (AC). Equivalently, an observed allele frequency is credible only if 2 x AF x penetrance does not exceed the disease prevalence attributable to that allele.</w:t>
+      </w:r>
+    </w:p>
+    <w:p>
+      <w:r>
+        <w:t>Under a strict high-penetrance dominant scenario (prevalence 1/2,000; allelic contribution 10%; penetrance 50%), the maximum credible AF is 5.0e-5. SCN5A VCV000440850 exceeds this ceiling by 113.5-fold, TRDN VCV001325231 by 4.4-fold if misread as dominant, and KCNH2 VCV004535537 by 2.6-fold. Under an SCN5A-specific Brugada-like Mendelian read with penetrance relaxed to 20%, SCN5A still exceeds the ceiling by 45.4-fold. Even under a generous dominant scenario (prevalence 1/1,000; allelic contribution 20%; penetrance 10%), SCN5A remains 5.7-fold above the model ceiling, requiring penetrance below 1.8% to reconcile the observed AFR popmax AF with a dominant disease model.</w:t>
+      </w:r>
+    </w:p>
+    <w:p>
+      <w:r>
+        <w:t>These calculations separate the three red cases quantitatively. SCN5A is incompatible with a high-penetrance Mendelian read across plausible assumptions. KCNH2 exceeds a high-penetrance LQTS-like ceiling but falls below a generous low-penetrance ceiling, reinforcing its borderline status. TRDN is incompatible only under a dominant misread; under carrier logic, its popmax AF of 2.18e-4 implies an approximate heterozygote carrier frequency of 4.36e-4 and a homozygote frequency of 4.76e-8, which is qualitatively compatible with a recessive/biallelic architecture. Thus, maximum credible AF does not replace VITAL; it explains why the same P/LP label must be routed into different biological states.</w:t>
+      </w:r>
+    </w:p>
+    <w:p>
+      <w:r>
+        <w:t>Bayesian ACMG-style odds make the same point without changing the classification. In an illustrative Tavtigian-style calculation with prior probability 0.10, a very-strong frequency conflict can neutralize even very-strong pathogenic evidence back to the prior, while a strong frequency conflict can still be offset by very-strong pathogenic evidence. This supports the intended interpretation: frequency conflict is not an automatic downgrade, but it is strong enough to force state-aware review when the public label is weak or underspecified.</w:t>
+      </w:r>
+    </w:p>
+    <w:p>
+      <w:r>
+        <w:t>Allele-count reliability also remains graded rather than binary. The approximate Poisson relative standard error is 1/sqrt(AC): SCN5A has a relative SE of 6.8% (AC=214; approximate 95% relative margin 13.4%), TRDN 15.8% (AC=40; margin 31.0%), and KCNH2 20.4% (AC=24; margin 40.0%). This explains why AC&gt;=20 is a review floor, not an evidentiary cliff, and why KCNH2 should remain explicitly borderline.</w:t>
+      </w:r>
+    </w:p>
+    <w:p>
+      <w:pPr>
+        <w:pStyle w:val="Heading2"/>
+      </w:pPr>
+      <w:r>
         <w:t>A pathogenicity-label ontology turns tension into review action</w:t>
       </w:r>
     </w:p>
@@ -6044,7 +6087,7 @@
     </w:p>
     <w:p>
       <w:r>
-        <w:t>Code, cached intermediate files, figures, and supplementary outputs required to reproduce downstream analyses are available in the project repository. The April 21, 2026 data freeze used ClinVar records retrieved through NCBI Entrez and bulk variant_summary files, gnomAD v4.1.1 exome/genome data queried through the gnomAD GraphQL API, and UCSC annotation resources. Machine-readable supplementary tables include VITAL scores, frequency flags, severe-annotation discordance, mechanism triage, red-priority case summaries, logical incompatibility audit outputs, clinical decision-projection outputs, guideline-tension audits, frequency-evaluability gap outputs, operational label-state transition outputs, non-evaluable routing outputs, temporal robustness outputs, clinical decision-risk proxy outputs, blinded expert-pilot forms and keys, AC reliability strata, detectability-required fields, contextual overlay modules, historical audits, expert-panel comparator outputs, and sensitivity analyses.</w:t>
+        <w:t>Code, cached intermediate files, figures, and supplementary outputs required to reproduce downstream analyses are available in the project repository. The April 21, 2026 data freeze used ClinVar records retrieved through NCBI Entrez and bulk variant_summary files, gnomAD v4.1.1 exome/genome data queried through the gnomAD GraphQL API, and UCSC annotation resources. Machine-readable supplementary tables include VITAL scores, frequency flags, severe-annotation discordance, mechanism triage, red-priority case summaries, logical incompatibility audit outputs, maximum credible AF and prevalence-constraint outputs, Bayesian ACMG-style frequency-tension outputs, recessive carrier-logic outputs, allele-count reliability outputs, clinical decision-projection outputs, guideline-tension audits, frequency-evaluability gap outputs, operational label-state transition outputs, non-evaluable routing outputs, temporal robustness outputs, clinical decision-risk proxy outputs, blinded expert-pilot forms and keys, AC reliability strata, detectability-required fields, contextual overlay modules, historical audits, expert-panel comparator outputs, and sensitivity analyses.</w:t>
       </w:r>
     </w:p>
     <w:sectPr>

</xml_diff>

<commit_message>
Add reconciliation tiers and public-label draft
</commit_message>
<xml_diff>
--- a/manuscript_vital_with_figures_tables.docx
+++ b/manuscript_vital_with_figures_tables.docx
@@ -37,7 +37,7 @@
         <w:t>Methods:</w:t>
       </w:r>
       <w:r>
-        <w:t xml:space="preserve"> We collapsed ClinVar P/LP records across 20 inherited arrhythmia genes to 1,731 unique variants and cross-referenced them with gnomAD v4.1.1 exome data. Exact allele matches, allele-discordant sites, no-record states, global AF, popmax AF, AC, variant type, and ClinVar review strength were retained. VITAL (Variant Interpretation Tension and Allele Load) was used as an explainable detection layer for frequency-assertion tension, and a compact pathogenicity-label ontology was used to separate Mendelian disease, susceptibility, carrier-state, low-penetrance, annotation-inflated, and representation-uncertain assertions.</w:t>
+        <w:t xml:space="preserve"> We collapsed ClinVar P/LP records across 20 inherited arrhythmia genes to 1,731 unique variants and cross-referenced them with gnomAD v4.1.1 exome data. Exact allele matches, allele-discordant sites, no-record states, global AF, popmax AF, AC, variant type, and ClinVar review strength were retained. We then performed a tiered reconciliation audit to test whether trim-normalization, decomposition-aware equivalence, genome rescue, or same-locus/regional context materially expanded evaluability beyond strict exact matching. VITAL (Variant Interpretation Tension and Allele Load) was used as an explainable detection layer for frequency-assertion tension, and a compact pathogenicity-label ontology was used to separate Mendelian disease, susceptibility, carrier-state, low-penetrance, annotation-inflated, and representation-uncertain assertions.</w:t>
       </w:r>
     </w:p>
     <w:p>
@@ -48,7 +48,7 @@
         <w:t>Results:</w:t>
       </w:r>
       <w:r>
-        <w:t xml:space="preserve"> The central result is a logical incompatibility class: in 3 red-priority cases, the public P/LP label, observed population frequency, and plausible disease mechanism could not simultaneously support an unqualified high-penetrance Mendelian reading. SCN5A VCV000440850 required susceptibility/haplotype framing rather than generic Mendelian pathogenicity; TRDN VCV001325231 required carrier or biallelic affected-state framing rather than dominant pathogenicity; and KCNH2 VCV004535537 required mechanism-qualified expert review rather than reliance on severe annotation alone. This label-state problem sits within a broader frequency-evidence failure: only 334/1,731 variants (19.3%) had usable exact AF evidence, leaving 1,397 (80.7%) as a non-evaluable representation gap. Within the AF-observed space, global AF alone identified 13 variants above AF &gt;1e-5, whereas popmax/global screening identified 115; global-AF-only review therefore missed 102/115 (88.7%) ancestry-aware frequency alerts. Severe annotation did not protect against this signal: 92/262 AF-observed LOF/splice assertions (35.1%) had popmax/global AF &gt;1e-5, similar to missense assertions (19/66, 28.8%). VITAL compressed 115 frequency-discordant records to 3 urgent state-review cases.</w:t>
+        <w:t xml:space="preserve"> The central result is a logical incompatibility class: in 3 red-priority cases, the public P/LP label, observed population frequency, and plausible disease mechanism could not simultaneously support an unqualified high-penetrance Mendelian reading. SCN5A VCV000440850 required susceptibility/haplotype framing rather than generic Mendelian pathogenicity; TRDN VCV001325231 required carrier or biallelic affected-state framing rather than dominant pathogenicity; and KCNH2 VCV004535537 required mechanism-qualified expert review rather than reliance on severe annotation alone. This label-state problem sits within a broader frequency-evidence failure: only 334/1,731 variants (19.3%) had usable exact AF evidence, leaving 1,397 (80.7%) as a non-evaluable representation gap. Tiered reconciliation increased strict exact/equivalent allele recovery only modestly, from 350/1,731 (20.2%) to 357/1,731 (20.6%), while 1,326 variants had only locus/regional context and 48 remained unevaluable. Within the AF-observed space, global AF alone identified 13 variants above AF &gt;1e-5, whereas popmax/global screening identified 115; global-AF-only review therefore missed 102/115 (88.7%) ancestry-aware frequency alerts. Severe annotation did not protect against this signal: 92/262 AF-observed LOF/splice assertions (35.1%) had popmax/global AF &gt;1e-5, similar to missense assertions (19/66, 28.8%). VITAL compressed 115 frequency-discordant records to 3 urgent state-review cases.</w:t>
       </w:r>
     </w:p>
     <w:p>
@@ -134,12 +134,30 @@
         <w:pStyle w:val="Heading2"/>
       </w:pPr>
       <w:r>
+        <w:t>Tiered reconciliation audit</w:t>
+      </w:r>
+    </w:p>
+    <w:p>
+      <w:r>
+        <w:t>To test whether the apparent representation gap was mainly a normalization artifact, we performed a separate tiered reconciliation audit on the same 1,731-variant analytical cohort. Tier 1 retained exact exome matches and exact genome/no-exome matches. Tier 2 searched for equivalent alleles using trim-normalization of shared prefix/suffix, local +/-2 bp indel-payload equivalence, and unphased decomposition of short multi-base substitutions into component SNVs. Tier 3 captured same-locus or nearby regional gnomAD observation without exact/equivalent allele recovery. Tier 4 remained unevaluable after reconciliation. Full reference-based left-alignment and decomposition with bcftools norm -f GRCh38.fa -m -both were not available in the current runtime, so this audit should be read as a conservative representation-recovery test rather than a claim of exhaustive normalization. Tier 3 evidence was treated as context only, not as usable allele-frequency evidence.</w:t>
+      </w:r>
+    </w:p>
+    <w:p>
+      <w:pPr>
+        <w:pStyle w:val="Heading2"/>
+      </w:pPr>
+      <w:r>
         <w:t>Ancestry-aware frequency analysis</w:t>
       </w:r>
     </w:p>
     <w:p>
       <w:r>
         <w:t>For exact AF-observed variants, global AF, global AC, population AF, population AC, and popmax AF were extracted. A naive global screen used global AF &gt;1e-5. An ancestry-aware screen used global or popmax AF &gt;1e-5. AC-supported frequency evidence required a qualifying global or popmax AC &gt;=20 at the relevant frequency signal. This AC gate was treated as an operational reliability floor rather than a biological threshold; AC reliability was also reported as ordered strata (AC 20-49, 50-199, and &gt;=200) and tested across AC&gt;=10, 20, 50, 100, and 200. These thresholds were used for review prioritization, not automatic classification.</w:t>
+      </w:r>
+    </w:p>
+    <w:p>
+      <w:r>
+        <w:t>We also ran a provenance-aware credibility sensitivity analysis. Because the analytical cohort was already restricted to retained non-conflicting P/LP assertions, no separate internal-conflict label survived into the final arrhythmia table. The implemented filter therefore excluded weak/no-assertion or single-submitter records lacking expert review when they also showed extreme population-frequency inconsistency, defined as max_frequency_signal &gt;1e-4 with qualifying_frequency_ac &gt;=20.</w:t>
       </w:r>
     </w:p>
     <w:p>
@@ -593,6 +611,11 @@
     </w:p>
     <w:p>
       <w:r>
+        <w:t>A tiered reconciliation audit showed that this is not a trivial artifact of an overly rigid exact-match key. Adding exact genome/no-exome matches and equivalent-allele recovery increased strict exact/equivalent representation only from 350/1,731 (20.2%) to 357/1,731 (20.6%). The additional recoveries consisted of 5 local-window indel equivalents and 2 decomposed substitution equivalents. The larger gain was contextual, not inferential: 638 variants had same-locus observation with a different allele in gnomAD, 688 had only nearby regional variation, and 48 remained unevaluable even after aggressive local-window reconciliation. Thus, most of the gap reflects structured representation and detectability limits rather than a simple trimming bug.</w:t>
+      </w:r>
+    </w:p>
+    <w:p>
+      <w:r>
         <w:t>Table 1 summarizes the evidence states used throughout the analysis.</w:t>
       </w:r>
     </w:p>
@@ -961,6 +984,259 @@
                 <w:sz w:val="16"/>
               </w:rPr>
               <w:t>Exact allele present but no usable AF block</w:t>
+            </w:r>
+          </w:p>
+        </w:tc>
+      </w:tr>
+    </w:tbl>
+    <w:p/>
+    <w:tbl>
+      <w:tblPr>
+        <w:tblStyle w:val="TableGrid"/>
+        <w:tblW w:type="auto" w:w="0"/>
+        <w:jc w:val="center"/>
+        <w:tblLook w:firstColumn="1" w:firstRow="1" w:lastColumn="0" w:lastRow="0" w:noHBand="0" w:noVBand="1" w:val="04A0"/>
+      </w:tblPr>
+      <w:tblGrid>
+        <w:gridCol w:w="3456"/>
+        <w:gridCol w:w="3456"/>
+        <w:gridCol w:w="3456"/>
+      </w:tblGrid>
+      <w:tr>
+        <w:tc>
+          <w:tcPr>
+            <w:tcW w:type="dxa" w:w="3456"/>
+            <w:vAlign w:val="top"/>
+            <w:shd w:fill="D9EAF7"/>
+          </w:tcPr>
+          <w:p>
+            <w:pPr>
+              <w:jc w:val="left"/>
+            </w:pPr>
+            <w:r/>
+            <w:r>
+              <w:rPr>
+                <w:b/>
+                <w:sz w:val="16"/>
+              </w:rPr>
+              <w:t>Reconciliation layer</w:t>
+            </w:r>
+          </w:p>
+        </w:tc>
+        <w:tc>
+          <w:tcPr>
+            <w:tcW w:type="dxa" w:w="3456"/>
+            <w:vAlign w:val="top"/>
+            <w:shd w:fill="D9EAF7"/>
+          </w:tcPr>
+          <w:p>
+            <w:pPr>
+              <w:jc w:val="left"/>
+            </w:pPr>
+            <w:r/>
+            <w:r>
+              <w:rPr>
+                <w:b/>
+                <w:sz w:val="16"/>
+              </w:rPr>
+              <w:t>Count</w:t>
+            </w:r>
+          </w:p>
+        </w:tc>
+        <w:tc>
+          <w:tcPr>
+            <w:tcW w:type="dxa" w:w="3456"/>
+            <w:vAlign w:val="top"/>
+            <w:shd w:fill="D9EAF7"/>
+          </w:tcPr>
+          <w:p>
+            <w:pPr>
+              <w:jc w:val="left"/>
+            </w:pPr>
+            <w:r/>
+            <w:r>
+              <w:rPr>
+                <w:b/>
+                <w:sz w:val="16"/>
+              </w:rPr>
+              <w:t>Interpretation</w:t>
+            </w:r>
+          </w:p>
+        </w:tc>
+      </w:tr>
+      <w:tr>
+        <w:tc>
+          <w:tcPr>
+            <w:tcW w:type="dxa" w:w="3456"/>
+            <w:vAlign w:val="top"/>
+          </w:tcPr>
+          <w:p>
+            <w:pPr>
+              <w:jc w:val="left"/>
+            </w:pPr>
+            <w:r/>
+            <w:r>
+              <w:rPr>
+                <w:b w:val="0"/>
+                <w:sz w:val="16"/>
+              </w:rPr>
+              <w:t>Strict exact/equivalent evidence</w:t>
+            </w:r>
+          </w:p>
+        </w:tc>
+        <w:tc>
+          <w:tcPr>
+            <w:tcW w:type="dxa" w:w="3456"/>
+            <w:vAlign w:val="top"/>
+          </w:tcPr>
+          <w:p>
+            <w:pPr>
+              <w:jc w:val="left"/>
+            </w:pPr>
+            <w:r/>
+            <w:r>
+              <w:rPr>
+                <w:b w:val="0"/>
+                <w:sz w:val="16"/>
+              </w:rPr>
+              <w:t>357</w:t>
+            </w:r>
+          </w:p>
+        </w:tc>
+        <w:tc>
+          <w:tcPr>
+            <w:tcW w:type="dxa" w:w="3456"/>
+            <w:vAlign w:val="top"/>
+          </w:tcPr>
+          <w:p>
+            <w:pPr>
+              <w:jc w:val="left"/>
+            </w:pPr>
+            <w:r/>
+            <w:r>
+              <w:rPr>
+                <w:b w:val="0"/>
+                <w:sz w:val="16"/>
+              </w:rPr>
+              <w:t>Exact match plus trim/decomposition-aware equivalent recovery</w:t>
+            </w:r>
+          </w:p>
+        </w:tc>
+      </w:tr>
+      <w:tr>
+        <w:tc>
+          <w:tcPr>
+            <w:tcW w:type="dxa" w:w="3456"/>
+            <w:vAlign w:val="top"/>
+          </w:tcPr>
+          <w:p>
+            <w:pPr>
+              <w:jc w:val="left"/>
+            </w:pPr>
+            <w:r/>
+            <w:r>
+              <w:rPr>
+                <w:b w:val="0"/>
+                <w:sz w:val="16"/>
+              </w:rPr>
+              <w:t>Locus/regional context only</w:t>
+            </w:r>
+          </w:p>
+        </w:tc>
+        <w:tc>
+          <w:tcPr>
+            <w:tcW w:type="dxa" w:w="3456"/>
+            <w:vAlign w:val="top"/>
+          </w:tcPr>
+          <w:p>
+            <w:pPr>
+              <w:jc w:val="left"/>
+            </w:pPr>
+            <w:r/>
+            <w:r>
+              <w:rPr>
+                <w:b w:val="0"/>
+                <w:sz w:val="16"/>
+              </w:rPr>
+              <w:t>1326</w:t>
+            </w:r>
+          </w:p>
+        </w:tc>
+        <w:tc>
+          <w:tcPr>
+            <w:tcW w:type="dxa" w:w="3456"/>
+            <w:vAlign w:val="top"/>
+          </w:tcPr>
+          <w:p>
+            <w:pPr>
+              <w:jc w:val="left"/>
+            </w:pPr>
+            <w:r/>
+            <w:r>
+              <w:rPr>
+                <w:b w:val="0"/>
+                <w:sz w:val="16"/>
+              </w:rPr>
+              <w:t>Same-locus or nearby variation observed, but no usable exact/equivalent AF</w:t>
+            </w:r>
+          </w:p>
+        </w:tc>
+      </w:tr>
+      <w:tr>
+        <w:tc>
+          <w:tcPr>
+            <w:tcW w:type="dxa" w:w="3456"/>
+            <w:vAlign w:val="top"/>
+          </w:tcPr>
+          <w:p>
+            <w:pPr>
+              <w:jc w:val="left"/>
+            </w:pPr>
+            <w:r/>
+            <w:r>
+              <w:rPr>
+                <w:b w:val="0"/>
+                <w:sz w:val="16"/>
+              </w:rPr>
+              <w:t>Still unevaluable after reconciliation</w:t>
+            </w:r>
+          </w:p>
+        </w:tc>
+        <w:tc>
+          <w:tcPr>
+            <w:tcW w:type="dxa" w:w="3456"/>
+            <w:vAlign w:val="top"/>
+          </w:tcPr>
+          <w:p>
+            <w:pPr>
+              <w:jc w:val="left"/>
+            </w:pPr>
+            <w:r/>
+            <w:r>
+              <w:rPr>
+                <w:b w:val="0"/>
+                <w:sz w:val="16"/>
+              </w:rPr>
+              <w:t>48</w:t>
+            </w:r>
+          </w:p>
+        </w:tc>
+        <w:tc>
+          <w:tcPr>
+            <w:tcW w:type="dxa" w:w="3456"/>
+            <w:vAlign w:val="top"/>
+          </w:tcPr>
+          <w:p>
+            <w:pPr>
+              <w:jc w:val="left"/>
+            </w:pPr>
+            <w:r/>
+            <w:r>
+              <w:rPr>
+                <w:b w:val="0"/>
+                <w:sz w:val="16"/>
+              </w:rPr>
+              <w:t>No exact, equivalent, or local contextual recovery</w:t>
             </w:r>
           </w:p>
         </w:tc>
@@ -5919,7 +6195,7 @@
     </w:p>
     <w:p>
       <w:r>
-        <w:t>A second failure is evaluability itself. Only 334/1,731 arrhythmia P/LP assertions had usable exact AF evidence, and the 1,397 non-evaluable assertions were not random missingness. They were structured by gene, variant type, and review support, with indels and duplications disproportionately represented outside the exact-AF space. This means the system has two separable gaps: hidden ancestry-aware frequency tension among evaluable variants, and representation-driven non-evaluability among the majority. Absence from gnomAD therefore cannot be treated uniformly as rarity.</w:t>
+        <w:t>A second failure is evaluability itself. Only 334/1,731 arrhythmia P/LP assertions had usable exact AF evidence, and the 1,397 non-evaluable assertions were not random missingness. They were structured by gene, variant type, and review support, with indels and duplications disproportionately represented outside the exact-AF space. A trim/decomposition-aware reconciliation audit expanded strict exact/equivalent recovery only modestly, from 350 to 357 variants, while 1,326 assertions yielded only locus/regional context and 48 remained unrecoverable. This means the system has two separable gaps: hidden ancestry-aware frequency tension among evaluable variants, and representation-driven non-evaluability among the majority. Absence from gnomAD therefore cannot be treated uniformly as rarity, and the representation gap cannot be dismissed as a simple normalization bug.</w:t>
       </w:r>
     </w:p>
     <w:p>
@@ -5940,6 +6216,11 @@
     <w:p>
       <w:r>
         <w:t>The guideline-facing tension is therefore not that VITAL overrules ACMG/AMP, ClinGen, or ClinVar. It is that public label transmission can discard distinctions those frameworks already require reviewers to consider: disease mechanism, penetrance, evidence strength, assertion review level, and whether an assertion is better represented as a low-penetrance or risk-allele state. In the 3 red-priority cases, no ClinGen expert-panel or practice-guideline review was present in the public record. The claim is not expert-panel disagreement; it is that single-submitter or no-criteria P/LP labels can enter clinical workflow without preserving the state qualifiers needed for safe use.</w:t>
+      </w:r>
+    </w:p>
+    <w:p>
+      <w:r>
+        <w:t>A narrow provenance sensitivity analysis reinforces that point without dissolving it. Removing the 3 weak/no-assertion or single-submitter records with max_frequency_signal &gt;1e-4 and qualifying_frequency_ac &gt;=20 reduced the reconciled exact/equivalent tier only from 357/1,731 to 354/1,728, left locus/regional context at 1,326/1,728, left the genuinely unevaluable set at 48/1,728, and preserved a large ancestry-aware/global contrast in the remaining AF-observed core (10 global-only versus 112 global-or-popmax alerts). What disappeared was the urgent exemplar set, which is exactly what that provenance filter was designed to remove.</w:t>
       </w:r>
     </w:p>
     <w:p>

</xml_diff>

<commit_message>
Add bcftools normalization audit
</commit_message>
<xml_diff>
--- a/manuscript_vital_with_figures_tables.docx
+++ b/manuscript_vital_with_figures_tables.docx
@@ -37,7 +37,7 @@
         <w:t>Methods:</w:t>
       </w:r>
       <w:r>
-        <w:t xml:space="preserve"> We collapsed ClinVar P/LP records across 20 inherited arrhythmia genes to 1,731 unique variants and cross-referenced them with gnomAD v4.1.1 exome data. Exact allele matches, allele-discordant sites, no-record states, global AF, popmax AF, AC, variant type, and ClinVar review strength were retained. We then performed a tiered reconciliation audit to test whether trim-normalization, decomposition-aware equivalence, genome rescue, or same-locus/regional context materially expanded evaluability beyond strict exact matching. VITAL (Variant Interpretation Tension and Allele Load) was used as an explainable detection layer for frequency-assertion tension, and a compact pathogenicity-label ontology was used to separate Mendelian disease, susceptibility, carrier-state, low-penetrance, annotation-inflated, and representation-uncertain assertions.</w:t>
+        <w:t xml:space="preserve"> We collapsed ClinVar P/LP records across 20 inherited arrhythmia genes to 1,731 unique variants and cross-referenced them with gnomAD v4.1.1 exome data. Exact allele matches, allele-discordant sites, no-record states, global AF, popmax AF, AC, variant type, and ClinVar review strength were retained. We then performed a tiered reconciliation audit to test whether local GRCh38 reference-based normalization, decomposition-aware equivalence, genome rescue, or same-locus/regional context materially expanded evaluability beyond strict exact matching. VITAL (Variant Interpretation Tension and Allele Load) was used as an explainable detection layer for frequency-assertion tension, and a compact pathogenicity-label ontology was used to separate Mendelian disease, susceptibility, carrier-state, low-penetrance, annotation-inflated, and representation-uncertain assertions.</w:t>
       </w:r>
     </w:p>
     <w:p>
@@ -48,7 +48,7 @@
         <w:t>Results:</w:t>
       </w:r>
       <w:r>
-        <w:t xml:space="preserve"> The central result is a logical incompatibility class: in 3 red-priority cases, the public P/LP label, observed population frequency, and plausible disease mechanism could not simultaneously support an unqualified high-penetrance Mendelian reading. SCN5A VCV000440850 required susceptibility/haplotype framing rather than generic Mendelian pathogenicity; TRDN VCV001325231 required carrier or biallelic affected-state framing rather than dominant pathogenicity; and KCNH2 VCV004535537 required mechanism-qualified expert review rather than reliance on severe annotation alone. This label-state problem sits within a broader frequency-evidence failure: only 334/1,731 variants (19.3%) had usable exact AF evidence, leaving 1,397 (80.7%) as a non-evaluable representation gap. Tiered reconciliation increased strict exact/equivalent allele recovery only modestly, from 350/1,731 (20.2%) to 357/1,731 (20.6%), while 1,326 variants had only locus/regional context and 48 remained unevaluable. Within the AF-observed space, global AF alone identified 13 variants above AF &gt;1e-5, whereas popmax/global screening identified 115; global-AF-only review therefore missed 102/115 (88.7%) ancestry-aware frequency alerts. Severe annotation did not protect against this signal: 92/262 AF-observed LOF/splice assertions (35.1%) had popmax/global AF &gt;1e-5, similar to missense assertions (19/66, 28.8%). VITAL compressed 115 frequency-discordant records to 3 urgent state-review cases.</w:t>
+        <w:t xml:space="preserve"> The central result is a logical incompatibility class: in 3 red-priority cases, the public P/LP label, observed population frequency, and plausible disease mechanism could not simultaneously support an unqualified high-penetrance Mendelian reading. SCN5A VCV000440850 required susceptibility/haplotype framing rather than generic Mendelian pathogenicity; TRDN VCV001325231 required carrier or biallelic affected-state framing rather than dominant pathogenicity; and KCNH2 VCV004535537 required mechanism-qualified expert review rather than reliance on severe annotation alone. This label-state problem sits within a broader frequency-evidence failure: only 334/1,731 variants (19.3%) had usable exact AF evidence, leaving 1,397 (80.7%) as a non-evaluable representation gap. Local GRCh38 reference-based normalization with bcftools norm changed 0/1,731 variant representations, and tiered reconciliation increased strict exact/equivalent allele recovery only modestly, from 350/1,731 (20.2%) to 357/1,731 (20.6%), while 1,326 variants had only locus/regional context and 48 remained unevaluable. Within the AF-observed space, global AF alone identified 13 variants above AF &gt;1e-5, whereas popmax/global screening identified 115; global-AF-only review therefore missed 102/115 (88.7%) ancestry-aware frequency alerts. Severe annotation did not protect against this signal: 92/262 AF-observed LOF/splice assertions (35.1%) had popmax/global AF &gt;1e-5, similar to missense assertions (19/66, 28.8%). VITAL compressed 115 frequency-discordant records to 3 urgent state-review cases.</w:t>
       </w:r>
     </w:p>
     <w:p>
@@ -139,7 +139,7 @@
     </w:p>
     <w:p>
       <w:r>
-        <w:t>To test whether the apparent representation gap was mainly a normalization artifact, we performed a separate tiered reconciliation audit on the same 1,731-variant analytical cohort. Tier 1 retained exact exome matches and exact genome/no-exome matches. Tier 2 searched for equivalent alleles using trim-normalization of shared prefix/suffix, local +/-2 bp indel-payload equivalence, and unphased decomposition of short multi-base substitutions into component SNVs. Tier 3 captured same-locus or nearby regional gnomAD observation without exact/equivalent allele recovery. Tier 4 remained unevaluable after reconciliation. Full reference-based left-alignment and decomposition with bcftools norm -f GRCh38.fa -m -both were not available in the current runtime, so this audit should be read as a conservative representation-recovery test rather than a claim of exhaustive normalization. Tier 3 evidence was treated as context only, not as usable allele-frequency evidence.</w:t>
+        <w:t>To test whether the apparent representation gap was mainly a normalization artifact, we performed a separate tiered reconciliation audit on the same 1,731-variant analytical cohort. All variants were additionally normalized against a local GRCh38 primary-assembly FASTA using bcftools norm, with a companion multiallelic-decomposition audit using bcftools norm -f GRCh38.fa -m -both. Tier 1 retained exact exome matches and exact genome/no-exome matches. Tier 2 searched for equivalent alleles using reference-based normalization, local +/-2 bp indel-payload equivalence, and unphased decomposition of short multi-base substitutions into component SNVs. Tier 3 captured same-locus or nearby regional gnomAD observation without exact/equivalent allele recovery. Tier 4 remained unevaluable after reconciliation. Reference-based normalization introduced no coordinate or allele changes in the 1,731-variant arrhythmia cohort (0/1,731), indicating that the remaining evaluability gap is not explained by missed left-alignment or trivial trimming. Tier 3 evidence was treated as context only, not as usable allele-frequency evidence.</w:t>
       </w:r>
     </w:p>
     <w:p>
@@ -611,7 +611,7 @@
     </w:p>
     <w:p>
       <w:r>
-        <w:t>A tiered reconciliation audit showed that this is not a trivial artifact of an overly rigid exact-match key. Adding exact genome/no-exome matches and equivalent-allele recovery increased strict exact/equivalent representation only from 350/1,731 (20.2%) to 357/1,731 (20.6%). The additional recoveries consisted of 5 local-window indel equivalents and 2 decomposed substitution equivalents. The larger gain was contextual, not inferential: 638 variants had same-locus observation with a different allele in gnomAD, 688 had only nearby regional variation, and 48 remained unevaluable even after aggressive local-window reconciliation. Thus, most of the gap reflects structured representation and detectability limits rather than a simple trimming bug.</w:t>
+        <w:t>A tiered reconciliation audit showed that this is not a trivial artifact of an overly rigid exact-match key. Local GRCh38 reference-based normalization with bcftools norm introduced no representation changes in the arrhythmia cohort (0/1,731), and a companion bcftools norm -m -both pass produced no additional multiallelic decomposition relevant to exact/equivalent matching. Adding exact genome/no-exome matches and equivalent-allele recovery therefore increased strict exact/equivalent representation only from 350/1,731 (20.2%) to 357/1,731 (20.6%). The additional recoveries consisted of 5 local-window indel equivalents and 2 decomposed substitution equivalents. The larger gain was contextual, not inferential: 638 variants had same-locus observation with a different allele in gnomAD, 688 had only nearby regional variation, and 48 remained unevaluable even after aggressive local-window reconciliation. Thus, most of the gap reflects structured representation and detectability limits rather than a simple left-alignment or trimming bug.</w:t>
       </w:r>
     </w:p>
     <w:p>

</xml_diff>

<commit_message>
Add clinical action context and regime summaries
</commit_message>
<xml_diff>
--- a/manuscript_vital_with_figures_tables.docx
+++ b/manuscript_vital_with_figures_tables.docx
@@ -48,7 +48,7 @@
         <w:t>Results:</w:t>
       </w:r>
       <w:r>
-        <w:t xml:space="preserve"> The central result is a logical incompatibility class: in 3 red-priority cases, the public P/LP label, observed population frequency, and plausible disease mechanism could not simultaneously support an unqualified high-penetrance Mendelian reading. SCN5A VCV000440850 required susceptibility/haplotype framing rather than generic Mendelian pathogenicity; TRDN VCV001325231 required carrier or biallelic affected-state framing rather than dominant pathogenicity; and KCNH2 VCV004535537 required mechanism-qualified expert review rather than reliance on severe annotation alone. This label-state problem sits within a broader frequency-evidence failure: only 334/1,731 variants (19.3%) had usable exact AF evidence, leaving 1,397 (80.7%) as a non-evaluable representation gap. Local GRCh38 reference-based normalization with bcftools norm changed 0/1,731 variant representations, and tiered reconciliation increased strict exact/equivalent allele recovery only modestly, from 350/1,731 (20.2%) to 357/1,731 (20.6%), while 1,326 variants had only locus/regional context and 48 remained unevaluable. Within the AF-observed space, global AF alone identified 13 variants above AF &gt;1e-5, whereas popmax/global screening identified 115; global-AF-only review therefore missed 102/115 (88.7%) ancestry-aware frequency alerts. Severe annotation did not protect against this signal: 92/262 AF-observed LOF/splice assertions (35.1%) had popmax/global AF &gt;1e-5, similar to missense assertions (19/66, 28.8%). VITAL compressed 115 frequency-discordant records to 3 urgent state-review cases.</w:t>
+        <w:t xml:space="preserve"> The central result is a logical incompatibility class: in 3 red-priority cases, the public P/LP label, observed population frequency, and plausible disease mechanism could not simultaneously support an unqualified high-penetrance Mendelian reading. SCN5A VCV000440850 required susceptibility/haplotype framing rather than generic Mendelian pathogenicity; TRDN VCV001325231 required carrier or biallelic affected-state framing rather than dominant pathogenicity; and KCNH2 VCV004535537 required mechanism-qualified expert review rather than reliance on severe annotation alone. This label-state problem sits within a broader frequency-evidence failure: only 334/1,731 variants (19.3%) had usable exact AF evidence, leaving 1,397 (80.7%) as a non-evaluable representation gap. Local GRCh38 reference-based normalization with bcftools norm changed 0/1,731 variant representations, and tiered reconciliation increased strict exact/equivalent allele recovery only modestly, from 350/1,731 (20.2%) to 357/1,731 (20.6%), while 1,326 variants had only locus/regional context and 48 remained unevaluable. Within the AF-observed space, global AF alone identified 13 variants above AF &gt;1e-5, whereas popmax/global screening identified 115; global-AF-only review therefore missed 102/115 (88.7%) ancestry-aware frequency alerts. Severe annotation did not protect against this signal: 92/262 AF-observed LOF/splice assertions (35.1%) had popmax/global AF &gt;1e-5, similar to missense assertions (19/66, 28.8%). VITAL compressed 115 frequency-discordant records to 3 urgent state-review cases. These 115 variants were not clinically marginal: 103/115 (89.6%; 95% CI 82.6-93.9) fell in action-linked arrhythmia genes where a public P/LP label can influence cascade testing or management, and the tension universe partitioned operationally into 1 hard dominant incompatibility candidate, 76 boundary/monitoring variants, and 38 recessive/carrier-compatible variants.</w:t>
       </w:r>
     </w:p>
     <w:p>
@@ -580,7 +580,7 @@
     </w:p>
     <w:p>
       <w:r>
-        <w:t>We compared global AF, popmax/global AF, AC-supported frequency screening, and VITAL red-priority calls. We assessed variant-type enrichment among non-overlap records, severe-annotation frequency discordance, LOF subtype patterns, and mechanism triage of severe-discordant variants. Mechanism triage was used to separate probable label-framing modes, including carrier-compatible architecture, context-dependent susceptibility, annotation inflation, and unresolved high-penetrance tension. We then mapped these modes to review-routing classes with explicit entry rules, transition rules, and clinical consequences. For red-priority cases, we performed a logical incompatibility audit that explicitly compared the public ClinVar assertion, gnomAD population reality, and the biological mechanism frame required for a high-penetrance Mendelian interpretation. We also added a clinical decision projection: for each red-priority case, we compared the decision pathway implied by reading the public P/LP label as high-penetrance Mendelian disease against the pathway implied by a state-aware susceptibility, carrier, or mechanism-review frame. Because public ClinVar does not expose patient counts, we quantified clinical decision-risk exposure using record counts and minimum submitter-exposure units, with missing submitter counts treated conservatively as one unit. For red-priority cases, we also audited the public evidence boundary, recording whether the public scoring layer exposed phenotype linkage, penetrance estimates, segregation/phase, or downstream cascade-testing or therapy outcomes. Finally, we performed a frequency-evaluability audit separating AF-observed assertions from the non-evaluable majority, stratified by gene, variant type, and review strength, with SNV-only sensitivity checks. To reduce circularity risk, we pre-specified an independent blinded expert-pilot endpoint of "requires re-review" versus "does not require re-review" using a 23-variant packet (3 red-priority cases, 10 gray no-frequency-evidence cases, and 10 non-red controls); VITAL scores and route labels are hidden from the review form and retained only in the analysis key. We performed supporting audits in a 3,000-variant cross-disease ClinVar P/LP sample, including historical January 2023 to April 2026 reclassification, expert-panel reviewed assertions, and real strict P/LP-to-VUS/B/LB events. Threshold sensitivity, AC-gate sensitivity, weight sensitivity, KCNH2 diagnostics, detectability checklists, pilot-review forms, and time-series details are provided in supplementary outputs.</w:t>
+        <w:t>We compared global AF, popmax/global AF, AC-supported frequency screening, and VITAL red-priority calls. We assessed variant-type enrichment among non-overlap records, severe-annotation frequency discordance, LOF subtype patterns, and mechanism triage of severe-discordant variants. Mechanism triage was used to separate probable label-framing modes, including carrier-compatible architecture, context-dependent susceptibility, annotation inflation, and unresolved high-penetrance tension. We then mapped these modes to review-routing classes with explicit entry rules, transition rules, and clinical consequences. For red-priority cases, we performed a logical incompatibility audit that explicitly compared the public ClinVar assertion, gnomAD population reality, and the biological mechanism frame required for a high-penetrance Mendelian interpretation. We also added a clinical decision projection: for each red-priority case, we compared the decision pathway implied by reading the public P/LP label as high-penetrance Mendelian disease against the pathway implied by a state-aware susceptibility, carrier, or mechanism-review frame. Because public ClinVar does not expose patient counts, we quantified clinical decision-risk exposure using record counts and minimum submitter-exposure units, with missing submitter counts treated conservatively as one unit. For red-priority cases, we also audited the public evidence boundary, recording whether the public scoring layer exposed phenotype linkage, penetrance estimates, segregation/phase, or downstream cascade-testing or therapy outcomes. Finally, we performed a frequency-evaluability audit separating AF-observed assertions from the non-evaluable majority, stratified by gene, variant type, and review strength, with SNV-only sensitivity checks. To estimate potential downstream clinical impact without patient-level data, we mapped the 115 ancestry-aware frequency-tension variants to investigator-defined action-linked arrhythmia gene sets representing contexts in which a public P/LP label can plausibly influence cascade testing, drug-restriction counseling, or device/intensive-surveillance decisions. The core action-linked set comprised SCN5A, KCNH2, KCNQ1, RYR2, CACNA1C, KCNE1, KCNJ2, CASQ2, and TRDN. To quantify scale beyond the 3 exemplar cases, we partitioned the frequency-tension set into three operational regimes: hard dominant incompatibility candidate (standard-context variant with AC&gt;=20 support and global AF &gt;1e-4), boundary or monitoring tension (all other standard-context frequency-tension variants), and recessive/carrier-compatible tension (CASQ2/TRDN frequency-tension variants). To reduce circularity risk, we pre-specified an independent blinded expert-pilot endpoint of "requires re-review" versus "does not require re-review" using a 23-variant packet (3 red-priority cases, 10 gray no-frequency-evidence cases, and 10 non-red controls); VITAL scores and route labels are hidden from the review form and retained only in the analysis key. We performed supporting audits in a 3,000-variant cross-disease ClinVar P/LP sample, including historical January 2023 to April 2026 reclassification, expert-panel reviewed assertions, and real strict P/LP-to-VUS/B/LB events. Threshold sensitivity, AC-gate sensitivity, weight sensitivity, KCNH2 diagnostics, detectability checklists, pilot-review forms, and time-series details are provided in supplementary outputs.</w:t>
       </w:r>
     </w:p>
     <w:p>
@@ -3509,6 +3509,433 @@
         <w:pStyle w:val="Heading2"/>
       </w:pPr>
       <w:r>
+        <w:t>Frequency tension concentrates in action-linked clinical contexts</w:t>
+      </w:r>
+    </w:p>
+    <w:p>
+      <w:r>
+        <w:t>The ancestry-aware frequency-tension set was not clinically peripheral. Of 115 popmax/global tension variants, 103 (89.6%; 95% CI 82.6-93.9) fell in an investigator-defined action-linked arrhythmia core (SCN5A, KCNH2, KCNQ1, RYR2, CACNA1C, KCNE1, KCNJ2, CASQ2, TRDN) where a public P/LP label can plausibly influence syndrome diagnosis, cascade testing, or management. Sixty of 115 variants (52.2%; 95% CI 43.1-61.1) lay in drug-restriction contexts, and 59 of 115 (51.3%; 95% CI 42.3-60.2) lay in device or intensive-surveillance contexts. Within the action-linked core, 51/103 were weak-review records, 9/103 had AC-supported frequency contradiction, and all 3 red-priority cases were contained within this management-linked set.</w:t>
+      </w:r>
+    </w:p>
+    <w:tbl>
+      <w:tblPr>
+        <w:tblStyle w:val="TableGrid"/>
+        <w:tblW w:type="auto" w:w="0"/>
+        <w:jc w:val="center"/>
+        <w:tblLook w:firstColumn="1" w:firstRow="1" w:lastColumn="0" w:lastRow="0" w:noHBand="0" w:noVBand="1" w:val="04A0"/>
+      </w:tblPr>
+      <w:tblGrid>
+        <w:gridCol w:w="2074"/>
+        <w:gridCol w:w="2074"/>
+        <w:gridCol w:w="2074"/>
+        <w:gridCol w:w="2074"/>
+        <w:gridCol w:w="2074"/>
+      </w:tblGrid>
+      <w:tr>
+        <w:tc>
+          <w:tcPr>
+            <w:tcW w:type="dxa" w:w="2074"/>
+            <w:vAlign w:val="top"/>
+            <w:shd w:fill="D9EAF7"/>
+          </w:tcPr>
+          <w:p>
+            <w:pPr>
+              <w:jc w:val="left"/>
+            </w:pPr>
+            <w:r/>
+            <w:r>
+              <w:rPr>
+                <w:b/>
+                <w:sz w:val="16"/>
+              </w:rPr>
+              <w:t>Clinical context</w:t>
+            </w:r>
+          </w:p>
+        </w:tc>
+        <w:tc>
+          <w:tcPr>
+            <w:tcW w:type="dxa" w:w="2074"/>
+            <w:vAlign w:val="top"/>
+            <w:shd w:fill="D9EAF7"/>
+          </w:tcPr>
+          <w:p>
+            <w:pPr>
+              <w:jc w:val="left"/>
+            </w:pPr>
+            <w:r/>
+            <w:r>
+              <w:rPr>
+                <w:b/>
+                <w:sz w:val="16"/>
+              </w:rPr>
+              <w:t>Frequency-tension variants</w:t>
+            </w:r>
+          </w:p>
+        </w:tc>
+        <w:tc>
+          <w:tcPr>
+            <w:tcW w:type="dxa" w:w="2074"/>
+            <w:vAlign w:val="top"/>
+            <w:shd w:fill="D9EAF7"/>
+          </w:tcPr>
+          <w:p>
+            <w:pPr>
+              <w:jc w:val="left"/>
+            </w:pPr>
+            <w:r/>
+            <w:r>
+              <w:rPr>
+                <w:b/>
+                <w:sz w:val="16"/>
+              </w:rPr>
+              <w:t>Weak review</w:t>
+            </w:r>
+          </w:p>
+        </w:tc>
+        <w:tc>
+          <w:tcPr>
+            <w:tcW w:type="dxa" w:w="2074"/>
+            <w:vAlign w:val="top"/>
+            <w:shd w:fill="D9EAF7"/>
+          </w:tcPr>
+          <w:p>
+            <w:pPr>
+              <w:jc w:val="left"/>
+            </w:pPr>
+            <w:r/>
+            <w:r>
+              <w:rPr>
+                <w:b/>
+                <w:sz w:val="16"/>
+              </w:rPr>
+              <w:t>AC-supported</w:t>
+            </w:r>
+          </w:p>
+        </w:tc>
+        <w:tc>
+          <w:tcPr>
+            <w:tcW w:type="dxa" w:w="2074"/>
+            <w:vAlign w:val="top"/>
+            <w:shd w:fill="D9EAF7"/>
+          </w:tcPr>
+          <w:p>
+            <w:pPr>
+              <w:jc w:val="left"/>
+            </w:pPr>
+            <w:r/>
+            <w:r>
+              <w:rPr>
+                <w:b/>
+                <w:sz w:val="16"/>
+              </w:rPr>
+              <w:t>Red</w:t>
+            </w:r>
+          </w:p>
+        </w:tc>
+      </w:tr>
+      <w:tr>
+        <w:tc>
+          <w:tcPr>
+            <w:tcW w:type="dxa" w:w="2074"/>
+            <w:vAlign w:val="top"/>
+          </w:tcPr>
+          <w:p>
+            <w:pPr>
+              <w:jc w:val="left"/>
+            </w:pPr>
+            <w:r/>
+            <w:r>
+              <w:rPr>
+                <w:b w:val="0"/>
+                <w:sz w:val="16"/>
+              </w:rPr>
+              <w:t>Guideline-driven/cascade core</w:t>
+            </w:r>
+          </w:p>
+        </w:tc>
+        <w:tc>
+          <w:tcPr>
+            <w:tcW w:type="dxa" w:w="2074"/>
+            <w:vAlign w:val="top"/>
+          </w:tcPr>
+          <w:p>
+            <w:pPr>
+              <w:jc w:val="left"/>
+            </w:pPr>
+            <w:r/>
+            <w:r>
+              <w:rPr>
+                <w:b w:val="0"/>
+                <w:sz w:val="16"/>
+              </w:rPr>
+              <w:t>103/115</w:t>
+            </w:r>
+          </w:p>
+        </w:tc>
+        <w:tc>
+          <w:tcPr>
+            <w:tcW w:type="dxa" w:w="2074"/>
+            <w:vAlign w:val="top"/>
+          </w:tcPr>
+          <w:p>
+            <w:pPr>
+              <w:jc w:val="left"/>
+            </w:pPr>
+            <w:r/>
+            <w:r>
+              <w:rPr>
+                <w:b w:val="0"/>
+                <w:sz w:val="16"/>
+              </w:rPr>
+              <w:t>51</w:t>
+            </w:r>
+          </w:p>
+        </w:tc>
+        <w:tc>
+          <w:tcPr>
+            <w:tcW w:type="dxa" w:w="2074"/>
+            <w:vAlign w:val="top"/>
+          </w:tcPr>
+          <w:p>
+            <w:pPr>
+              <w:jc w:val="left"/>
+            </w:pPr>
+            <w:r/>
+            <w:r>
+              <w:rPr>
+                <w:b w:val="0"/>
+                <w:sz w:val="16"/>
+              </w:rPr>
+              <w:t>9</w:t>
+            </w:r>
+          </w:p>
+        </w:tc>
+        <w:tc>
+          <w:tcPr>
+            <w:tcW w:type="dxa" w:w="2074"/>
+            <w:vAlign w:val="top"/>
+          </w:tcPr>
+          <w:p>
+            <w:pPr>
+              <w:jc w:val="left"/>
+            </w:pPr>
+            <w:r/>
+            <w:r>
+              <w:rPr>
+                <w:b w:val="0"/>
+                <w:sz w:val="16"/>
+              </w:rPr>
+              <w:t>3</w:t>
+            </w:r>
+          </w:p>
+        </w:tc>
+      </w:tr>
+      <w:tr>
+        <w:tc>
+          <w:tcPr>
+            <w:tcW w:type="dxa" w:w="2074"/>
+            <w:vAlign w:val="top"/>
+          </w:tcPr>
+          <w:p>
+            <w:pPr>
+              <w:jc w:val="left"/>
+            </w:pPr>
+            <w:r/>
+            <w:r>
+              <w:rPr>
+                <w:b w:val="0"/>
+                <w:sz w:val="16"/>
+              </w:rPr>
+              <w:t>Drug-restriction context</w:t>
+            </w:r>
+          </w:p>
+        </w:tc>
+        <w:tc>
+          <w:tcPr>
+            <w:tcW w:type="dxa" w:w="2074"/>
+            <w:vAlign w:val="top"/>
+          </w:tcPr>
+          <w:p>
+            <w:pPr>
+              <w:jc w:val="left"/>
+            </w:pPr>
+            <w:r/>
+            <w:r>
+              <w:rPr>
+                <w:b w:val="0"/>
+                <w:sz w:val="16"/>
+              </w:rPr>
+              <w:t>60/115</w:t>
+            </w:r>
+          </w:p>
+        </w:tc>
+        <w:tc>
+          <w:tcPr>
+            <w:tcW w:type="dxa" w:w="2074"/>
+            <w:vAlign w:val="top"/>
+          </w:tcPr>
+          <w:p>
+            <w:pPr>
+              <w:jc w:val="left"/>
+            </w:pPr>
+            <w:r/>
+            <w:r>
+              <w:rPr>
+                <w:b w:val="0"/>
+                <w:sz w:val="16"/>
+              </w:rPr>
+              <w:t>31</w:t>
+            </w:r>
+          </w:p>
+        </w:tc>
+        <w:tc>
+          <w:tcPr>
+            <w:tcW w:type="dxa" w:w="2074"/>
+            <w:vAlign w:val="top"/>
+          </w:tcPr>
+          <w:p>
+            <w:pPr>
+              <w:jc w:val="left"/>
+            </w:pPr>
+            <w:r/>
+            <w:r>
+              <w:rPr>
+                <w:b w:val="0"/>
+                <w:sz w:val="16"/>
+              </w:rPr>
+              <w:t>2</w:t>
+            </w:r>
+          </w:p>
+        </w:tc>
+        <w:tc>
+          <w:tcPr>
+            <w:tcW w:type="dxa" w:w="2074"/>
+            <w:vAlign w:val="top"/>
+          </w:tcPr>
+          <w:p>
+            <w:pPr>
+              <w:jc w:val="left"/>
+            </w:pPr>
+            <w:r/>
+            <w:r>
+              <w:rPr>
+                <w:b w:val="0"/>
+                <w:sz w:val="16"/>
+              </w:rPr>
+              <w:t>2</w:t>
+            </w:r>
+          </w:p>
+        </w:tc>
+      </w:tr>
+      <w:tr>
+        <w:tc>
+          <w:tcPr>
+            <w:tcW w:type="dxa" w:w="2074"/>
+            <w:vAlign w:val="top"/>
+          </w:tcPr>
+          <w:p>
+            <w:pPr>
+              <w:jc w:val="left"/>
+            </w:pPr>
+            <w:r/>
+            <w:r>
+              <w:rPr>
+                <w:b w:val="0"/>
+                <w:sz w:val="16"/>
+              </w:rPr>
+              <w:t>Device/intensive-surveillance context</w:t>
+            </w:r>
+          </w:p>
+        </w:tc>
+        <w:tc>
+          <w:tcPr>
+            <w:tcW w:type="dxa" w:w="2074"/>
+            <w:vAlign w:val="top"/>
+          </w:tcPr>
+          <w:p>
+            <w:pPr>
+              <w:jc w:val="left"/>
+            </w:pPr>
+            <w:r/>
+            <w:r>
+              <w:rPr>
+                <w:b w:val="0"/>
+                <w:sz w:val="16"/>
+              </w:rPr>
+              <w:t>59/115</w:t>
+            </w:r>
+          </w:p>
+        </w:tc>
+        <w:tc>
+          <w:tcPr>
+            <w:tcW w:type="dxa" w:w="2074"/>
+            <w:vAlign w:val="top"/>
+          </w:tcPr>
+          <w:p>
+            <w:pPr>
+              <w:jc w:val="left"/>
+            </w:pPr>
+            <w:r/>
+            <w:r>
+              <w:rPr>
+                <w:b w:val="0"/>
+                <w:sz w:val="16"/>
+              </w:rPr>
+              <w:t>28</w:t>
+            </w:r>
+          </w:p>
+        </w:tc>
+        <w:tc>
+          <w:tcPr>
+            <w:tcW w:type="dxa" w:w="2074"/>
+            <w:vAlign w:val="top"/>
+          </w:tcPr>
+          <w:p>
+            <w:pPr>
+              <w:jc w:val="left"/>
+            </w:pPr>
+            <w:r/>
+            <w:r>
+              <w:rPr>
+                <w:b w:val="0"/>
+                <w:sz w:val="16"/>
+              </w:rPr>
+              <w:t>2</w:t>
+            </w:r>
+          </w:p>
+        </w:tc>
+        <w:tc>
+          <w:tcPr>
+            <w:tcW w:type="dxa" w:w="2074"/>
+            <w:vAlign w:val="top"/>
+          </w:tcPr>
+          <w:p>
+            <w:pPr>
+              <w:jc w:val="left"/>
+            </w:pPr>
+            <w:r/>
+            <w:r>
+              <w:rPr>
+                <w:b w:val="0"/>
+                <w:sz w:val="16"/>
+              </w:rPr>
+              <w:t>2</w:t>
+            </w:r>
+          </w:p>
+        </w:tc>
+      </w:tr>
+    </w:tbl>
+    <w:p/>
+    <w:p>
+      <w:r>
+        <w:t>Operationally, the 115 frequency-tension variants resolved into three measurable regimes rather than a single undifferentiated alert pool. One variant (0.9%; 95% CI 0.15-4.76) met the strict hard dominant incompatibility signature (SCN5A, with AC-supported contradiction and global AF &gt;1e-4). Seventy-six variants (66.1%; 95% CI 57.0-74.1) fell into the boundary or monitoring regime, including the only non-hard AC-supported standard-context case (KCNH2) and 74 popmax-only signals. Thirty-eight variants (33.0%; 95% CI 25.1-42.1) were recessive/carrier-compatible tensions in CASQ2 or TRDN, including 7 AC-supported cases and 28 popmax-only signals. Thus, most hidden frequency tension does not present as a broad field of immediate downgrades; it presents as a large boundary-review space plus a substantial inheritance-routing space.</w:t>
+      </w:r>
+    </w:p>
+    <w:p>
+      <w:pPr>
+        <w:pStyle w:val="Heading2"/>
+      </w:pPr>
+      <w:r>
         <w:t>Red-priority cases show distinct pathogenicity-label distortion modes</w:t>
       </w:r>
     </w:p>
@@ -6235,6 +6662,11 @@
     </w:p>
     <w:p>
       <w:r>
+        <w:t>That exposure is not diffuse. Of the 115 tension variants, 103 sat in action-linked arrhythmia genes where a public P/LP label can plausibly influence cascade testing or management, 60 sat in drug-restriction contexts, and 59 in device/intensive-surveillance contexts. The paper therefore quantifies potential clinical impact rather than proving patient-level harm, which is the right evidentiary level for a public-label audit.</w:t>
+      </w:r>
+    </w:p>
+    <w:p>
+      <w:r>
         <w:t>Prior ClinVar-gnomAD studies have described rarity patterns and gene constraint. This analysis adds three operational distinctions: exact allele absence is separated from allele discordance and no-record states; popmax plus AC is placed at the center of frequency review; and review burden is treated as a clinical workflow endpoint rather than an incidental byproduct. The proposed label-state ontology extends those distinctions beyond arrhythmia by making pathogenicity a structured state, not a single undifferentiated P/LP bucket.</w:t>
       </w:r>
     </w:p>

</xml_diff>

<commit_message>
Add Tier 2 subcategory map and class comparison
</commit_message>
<xml_diff>
--- a/manuscript_vital_with_figures_tables.docx
+++ b/manuscript_vital_with_figures_tables.docx
@@ -612,6 +612,11 @@
     <w:p>
       <w:r>
         <w:t>A tiered reconciliation audit showed that this is not a trivial artifact of an overly rigid exact-match key. Local GRCh38 reference-based normalization with bcftools norm introduced no representation changes in the arrhythmia cohort (0/1,731), and a companion bcftools norm -m -both pass produced no additional multiallelic decomposition relevant to exact/equivalent matching. Adding exact genome/no-exome matches and equivalent-allele recovery therefore increased strict exact/equivalent representation only from 350/1,731 (20.2%) to 357/1,731 (20.6%). The additional recoveries consisted of 5 local-window indel equivalents and 2 decomposed substitution equivalents. The larger gain was contextual, not inferential: 638 variants had same-locus observation with a different allele in gnomAD, 688 had only nearby regional variation, and 48 remained unevaluable even after aggressive local-window reconciliation. Thus, most of the gap reflects structured representation and detectability limits rather than a simple left-alignment or trimming bug.</w:t>
+      </w:r>
+    </w:p>
+    <w:p>
+      <w:r>
+        <w:t>That contextual-only space was not homogeneous. Of the 1,326 Tier 2-like locus/regional-context variants, 638 (48.1%) were same-locus allele discordance and 688 (51.9%) had no same-locus gnomAD record but retained nearby regional context only. Representation-sensitive classes were concentrated there: deletions, duplications, and insertions comprised 640/1,326 (48.3%) of the context-only space versus 106/357 (29.7%) of the exact/equivalent Tier 1 space (OR=2.21), and duplications alone accounted for 170/1,326 (12.8%) versus 22/357 (6.2%). This is the cleanest evidence that the representation gap is structured rather than random.</w:t>
       </w:r>
     </w:p>
     <w:p>

</xml_diff>

<commit_message>
Expand expert-positive validation layers
</commit_message>
<xml_diff>
--- a/manuscript_vital_with_figures_tables.docx
+++ b/manuscript_vital_with_figures_tables.docx
@@ -53,7 +53,7 @@
     </w:p>
     <w:p>
       <w:r>
-        <w:t>Public clinical variant assertions now function as shared infrastructure. A pathogenic or likely pathogenic label exported from ClinVar is routinely reimported into laboratory interpretation pipelines, cascade-testing workflows, decision-support systems, and research analyses as though it were a portable unit of clinical meaning. This pattern of reuse rests on an implicit assumption: that the public label preserves the disease model it was originally intended to describe.</w:t>
+        <w:t>Public clinical variant assertions now function as shared infrastructure. A pathogenic or likely pathogenic label exported from ClinVar is routinely reimported into laboratory interpretation pipelines, cascade-testing workflows, decision-support systems, and research analyses as though it were a portable unit of clinical meaning. This pattern of reuse rests on an implicit assumption: that the public label preserves the disease model it was originally intended to describe. To test whether the routing framework simply interrupts trusted assertions, we also assembled the current-snapshot pooled expert-curated comparator available in this repository: 942 allele-level deduplicated expert-panel or practice-guideline P/LP assertions from current scored cross-disease, external-panel, and BRCA/MMR/APC control tables.</w:t>
       </w:r>
     </w:p>
     <w:p>
@@ -94,12 +94,17 @@
         <w:pStyle w:val="Heading2"/>
       </w:pPr>
       <w:r>
-        <w:t>Cohort definition</w:t>
+        <w:t>Cohort definition and evidence layering</w:t>
       </w:r>
     </w:p>
     <w:p>
       <w:r>
         <w:t>We analyzed ClinVar P/LP assertions across 20 inherited arrhythmia genes: KCNQ1, KCNH2, SCN5A, KCNE1, KCNE2, RYR2, CASQ2, TRDN, CALM1, CALM2, CALM3, ANK2, SCN4B, KCNJ2, HCN4, CACNA1C, CACNB2, CACNA2D1, AKAP9, and SNTA1. Variants were collapsed to unique GRCh38 alleles by chromosome, position, reference allele, and alternate allele, yielding 1,731 unique variants in the April 24, 2026 ClinVar data freeze used for this manuscript.</w:t>
+      </w:r>
+    </w:p>
+    <w:p>
+      <w:r>
+        <w:t>The analyses are intentionally layered. The primary analysis cohort is the allele-resolved arrhythmia set with usable AF (n = 334). Expanded external-domain and historical analyses are validation layers for stability and transportability, not substitutes for the primary cohort. Variants without allele-resolved AF remain a non-evaluable universe used to measure infrastructure limits rather than to infer population compatibility. This separation prevents the study from treating a larger pooled count as stronger evidence when the evidentiary status of variants differs.</w:t>
       </w:r>
     </w:p>
     <w:p>
@@ -553,12 +558,22 @@
         <w:pStyle w:val="Heading2"/>
       </w:pPr>
       <w:r>
-        <w:t>Clinical-action context</w:t>
+        <w:t>Clinical-action context and comparator framing</w:t>
       </w:r>
     </w:p>
     <w:p>
       <w:r>
         <w:t>To connect population tension with real downstream use environments, we retained the existing action-context summaries already computed in the repository. These classify alerted variants into clinically consequential gene contexts relevant to cascade testing, drug restriction, and intensive surveillance or device-related management. These context labels are exposure indicators, not patient-outcome measurements.</w:t>
+      </w:r>
+    </w:p>
+    <w:p>
+      <w:r>
+        <w:t>The comparator is not a claim that every public P/LP record should be acted on identically. It is the class of label-only downstream pipelines that import public P/LP assertions without explicit evaluability, mechanism, inheritance, or population-constraint layers. Examples include VCF annotation filters that promote ClinVar P/LP status, screening or cascade-testing triage lists that do not require state-aware disease models, and clinical decision-support knowledge bases that carry a label forward without allele-count and ancestry-context metadata. The relevant question is therefore whether these label-only pipelines can safely infer direct-actionability compatibility from pathogenicity category alone.</w:t>
+      </w:r>
+    </w:p>
+    <w:p>
+      <w:r>
+        <w:t>We further separate three validation layers. The gold expert layer remains same-snapshot and strict: current ClinVar expert-panel or practice-guideline P/LP assertions, allele-level deduplicated by variant_key (n = 204 in the cross-disease scored table). The pooled cross-domain expert-curated layer then adds current scored expert-panel/practice-guideline positives from external panels and BRCA/MMR/APC controls (n = 942) to test preservation behavior and false interruption, not domain-specific burden or calibration. Multiple-submitters/no-conflicts records are reported separately as a high-review non-expert consistency layer, not as expert truth.</w:t>
       </w:r>
     </w:p>
     <w:p>
@@ -1074,6 +1089,11 @@
     <w:p>
       <w:r>
         <w:t>SCN5A VCV000440850 remains the clearest incompatibility case in the exome-resolved subset. KCNH2 VCV004535537 illustrates a parameter-sensitive monitoring regime rather than a categorical collapse, and TRDN VCV001325231 shows how a generic P/LP label can flatten a carrier-compatible recessive allele into an apparently dominant claim unless the disease model is made explicit.</w:t>
+      </w:r>
+    </w:p>
+    <w:p>
+      <w:r>
+        <w:t>These regimes convert the result from a single non-pass percentage into a risk model. Direct-actionability compatibility becomes most plausible when a variant is allele-resolved, population-consistent under global and popmax AF, and mechanistically aligned with the asserted inheritance model. Review/deferral becomes more likely when evaluability is incomplete, popmax and global AF disagree, or the variant sits near a maximum-credible-AF boundary. Model conflict becomes most plausible when an AC-supported population signal is incompatible with an unqualified dominant high-penetrance interpretation, or when a carrier-compatible recessive mechanism has been exported as a generic P/LP disease claim.</w:t>
       </w:r>
     </w:p>
     <w:p>
@@ -2019,6 +2039,29 @@
     </w:p>
     <w:p>
       <w:pPr>
+        <w:pStyle w:val="Heading2"/>
+      </w:pPr>
+      <w:r>
+        <w:t>Expanded validation should test structure, not just scale</w:t>
+      </w:r>
+    </w:p>
+    <w:p>
+      <w:r>
+        <w:t>Because a 10,000-variant strict expert-positive layer is not available in the current cached snapshot, the current revision preserves a 204-allele gold expert layer and adds a 942-allele pooled cross-domain expert-curated robustness layer. This pooled cross-domain preservation layer includes 191 frequency-observed variants, 811 severe-annotation variants, and no red-priority calls; it is not used for domain-specific burden or calibration claims. Fifty-five of 942 (5.8%) had a naive AF alert, 21 (2.2%) had AC-supported frequency tension, and only 4 (0.4%) reached score &gt;=70, all as orange review/monitoring rather than hard red interruption. This supports the intended safety property: trusted expert positives are not automatically overturned, but high-frequency exceptions are surfaced as state-aware review cases.</w:t>
+      </w:r>
+    </w:p>
+    <w:p>
+      <w:r>
+        <w:t>A future 10,000- to 20,000-variant expansion would only strengthen the manuscript if it preserves evidence layering and tests stability across strata. The core arrhythmia cohort should remain separate from an expanded high-review or expert-panel ClinVar layer, independent ClinGen/VCEP or locus-specific truth sets where available, benign/likely benign controls, external disease-domain replication panels, and the non-evaluable representation-sensitive universe. Pooling these sources into one denominator would obscure the central result.</w:t>
+      </w:r>
+    </w:p>
+    <w:p>
+      <w:r>
+        <w:t>The expanded analysis should therefore report stratified validation by evaluability tier, disease mechanism, inheritance model, consequence class, ancestry-localized enrichment, review status, and disease domain. Its main endpoint should be the probability of direct-actionability compatibility or review/deferral as a function of evaluability, mechanism, inheritance, popmax/global discordance, and variant class, not merely the fraction of variants exceeding a fixed alert threshold. A key safety metric should be false interruption: among high-review or expert-curated P/LP positives, how often does the framework create a hard model conflict rather than a review, monitoring, or metadata-completion route?</w:t>
+      </w:r>
+    </w:p>
+    <w:p>
+      <w:pPr>
         <w:pStyle w:val="Heading1"/>
       </w:pPr>
       <w:r>
@@ -2027,7 +2070,7 @@
     </w:p>
     <w:p>
       <w:r>
-        <w:t>First, all exome disease-model conclusions are restricted to the 334 Tier 1 variants with usable allele-resolved AF. The unevaluable majority cannot be assumed to follow the same regime structure.</w:t>
+        <w:t>First, all exome disease-model conclusions are restricted to the 334 Tier 1 variants with usable allele-resolved AF. The unevaluable majority cannot be assumed to follow the same regime structure. The 942-allele pooled expert-curated comparator is therefore a specificity and false-interruption layer, not an expanded replacement for the primary arrhythmia cohort. Larger future validation sets would not remove this limitation unless they preserve the same evaluability separation and report false-interruption rates in expert-positive strata.</w:t>
       </w:r>
     </w:p>
     <w:p>
@@ -2086,7 +2129,7 @@
         <w:pStyle w:val="ListNumber"/>
       </w:pPr>
       <w:r>
-        <w:t>the population evaluability tier of the asserted allele; and</w:t>
+        <w:t>the population evaluability tier of the asserted allele;</w:t>
       </w:r>
     </w:p>
     <w:p>
@@ -2094,7 +2137,15 @@
         <w:pStyle w:val="ListNumber"/>
       </w:pPr>
       <w:r>
-        <w:t>the allele count supporting any cited population signal, together with explicit acknowledgment of low-count uncertainty.</w:t>
+        <w:t>the allele count supporting any cited population signal, together with explicit acknowledgment of low-count uncertainty; and</w:t>
+      </w:r>
+    </w:p>
+    <w:p>
+      <w:pPr>
+        <w:pStyle w:val="ListNumber"/>
+      </w:pPr>
+      <w:r>
+        <w:t>the recommended downstream route: direct-actionability compatible, state-aware review/metadata completion, or explicit disease-model conflict.</w:t>
       </w:r>
     </w:p>
     <w:p>

</xml_diff>

<commit_message>
Add VITAL actionability routing package
</commit_message>
<xml_diff>
--- a/manuscript_vital_with_figures_tables.docx
+++ b/manuscript_vital_with_figures_tables.docx
@@ -7,7 +7,7 @@
         <w:pStyle w:val="Title"/>
       </w:pPr>
       <w:r>
-        <w:t>A Public Pathogenic Label Is Not a Disease State: Population Evaluability Reveals Hidden Interpretation Regimes in ClinVar Arrhythmia Assertions</w:t>
+        <w:t>Population- and mechanism-aware constraints expose unstable actionability of public pathogenic variant labels</w:t>
       </w:r>
     </w:p>
     <w:p>
@@ -20,27 +20,40 @@
     </w:p>
     <w:p>
       <w:r>
-        <w:t>Public pathogenic and likely pathogenic (P/LP) assertions are widely reused across clinical and research workflows as though they carry a stable and portable disease claim. That reuse assumes that a categorical pathogenicity label preserves the disease model under which it was originally assigned. Here we show that this assumption is systematically unstable once population evaluability and ancestry-aware frequency are restored at the point of downstream use.</w:t>
+        <w:t>Public pathogenic/likely-pathogenic (P/LP) variant labels are widely reused as portable disease-state claims. After downstream flattening of condition- and submission-level context, however, the disease model implied by a P/LP label may no longer be recoverable. This study tests whether flattened labels reliably preserve dominant disease-model compatibility under population-frequency stress and whether such labels can be safely reused as direct-actionability proxies without an explicit constraint layer.</w:t>
       </w:r>
     </w:p>
     <w:p>
       <w:r>
-        <w:t>We analyzed 1,731 unique ClinVar P/LP variants across 20 inherited arrhythmia genes. Against gnomAD v4.1.1 exomes, we applied strict exact matching, trim-aware and decomposition-aware reconciliation, and full reference-based normalization with bcftools norm against a local GRCh38 reference. Only 357 of 1,731 variants (20.6%) achieved allele-resolved population context, while 1,326 (76.6%) retained only locus- or region-level context without allele-resolved allele frequency and 48 (2.8%) remained unevaluable. Reference-based normalization changed 0 of 1,731 variant representations, showing that the dominant limitation was not residual normalization failure but the structural unavailability of allele-resolved population constraint under current representation and aggregation regimes.</w:t>
+        <w:t>We examined 1,731 ClinVar P/LP variants across 20 inherited arrhythmia genes, of which 17 contributed P/LP records. Only 357 variants (20.6%) achieved allele-resolved frequency recovery in gnomAD v4.1.1 exomes, and primary frequency conclusions were therefore restricted to the 334 variants with usable allele-resolved AF. Within that evaluable subset, ancestry-aware popmax screening identified frequency alerts missed by 102 of 115 global-only queries (88.7%), including 103 alerts in potentially consequential interpretation contexts such as cascade testing, medication guidance, surveillance intensity, or device-related management.</w:t>
       </w:r>
     </w:p>
     <w:p>
       <w:r>
-        <w:t>Disease-model analysis was therefore restricted to the Tier 1 subset with usable allele-frequency data (n = 334, 19.3% of the full cohort). Within this subset, a global-AF-only screen flagged 13 variants above the 1x10^-5 review threshold, whereas a global-or-popmax screen flagged 115. Global-only review therefore missed 102 of 115 ancestry-aware alerts (88.7%). These 115 variants spanned three interpretation regimes beneath the same public P/LP label: hard incompatibility with an unqualified dominant high-penetrance reading (n = 1), boundary or monitoring status (n = 76), and recessive or carrier-compatible architecture (n = 38). Of the 115 alerts, 103 occurred in genes linked to clinically consequential interpretation contexts, including cascade testing, drug restriction, intensive surveillance, and device-related management.</w:t>
+        <w:t>Applying maximum-credible-allele-frequency (MCAF) stress-testing classified the evaluable exome subset into operationally distinct regimes. Here, decomposition denotes only disease-model incompatibility under population-frequency stress, not a claim that the variant is benign or incorrectly classified. At biologically interpretable thresholds, incompatibility with an unqualified dominant high-penetrance model was mechanism-dependent: gain-of-function/dominant-negative genes showed zero observed decomposition (0/34; 95% CI 0-10.2%), haploinsufficient genes showed intermediate decomposition, and recessive genes showed the highest decomposition. Supplementary HGDP and hereditary-cancer analyses were retained only as secondary stress checks rather than as co-equal burden estimates.</w:t>
       </w:r>
     </w:p>
     <w:p>
       <w:r>
-        <w:t>We then applied an independent HGDP regional stress-test using gnomAD r3.1.2 genomes. Under four-level reconciliation, 340 of 1,731 variants entered the HGDP matched universe: 64 as strict allele matches, 4 as representation-rescued matches, and 272 as position-overlap matches. Within that full matched set, 67 of 340 variants (19.7%) fell outside a dominant-compatible regime under the tested maximum-credible-allele-frequency framework, compared with 4 of 64 (6.2%) in the strict-allele-only subset. The difference is not a nuisance detail; it marks the boundary between allele-level evidence and locus-context inference.</w:t>
+        <w:t>We then translated these population and mechanism constraints into VITAL, a post-label actionability routing layer. Under a label-driven baseline, all 1,731 arrhythmia P/LP variants entered a direct-actionable route. After VITAL, 1,512/1,731 decisions (87.3%) were rerouted: 1,397 (80.7%) were evaluation-limiting, 77 (4.4%) were risk-escalating, and 38 (2.2%) were model-correcting. Across six disease domains, the mean nonpass rate was 87.7%. Routing instability persisted among high-review assertions (309/365; 84.7%), while expert-curated evaluable positives were largely preserved (69/73; 94.5% VITAL_OK or review-level; 4/73; 5.5% hard model conflict).</w:t>
       </w:r>
     </w:p>
     <w:p>
       <w:r>
-        <w:t>These findings support a governance conclusion. A public P/LP label does not reliably preserve the disease-state definition required for safe downstream reuse. For most variants in this study, one of the main constraining signals, allele-resolved population frequency, was not operationally available. Where such constraint was available, the same exported label supported mutually inconsistent biological readings. Responsible reuse therefore requires explicit specification of both the disease model being invoked and the level of population evaluability available for the asserted allele.</w:t>
+        <w:t>These findings operationalize a measurable downstream reuse failure mode: within the evaluable subset, the portability of a P/LP label as a disease-state claim depends on disease model, molecular mechanism, and population-frequency resolution, none of which are currently encoded in the exported label. Population-structured frequency review should therefore be treated as a minimum evidence layer in downstream interpretation workflows, while preserving explicit uncertainty for non-evaluable variants. VITAL does not reclassify variants; it reroutes actionability when flattened labels no longer carry the constraints required for direct reuse.</w:t>
+      </w:r>
+    </w:p>
+    <w:p>
+      <w:pPr>
+        <w:pStyle w:val="Heading1"/>
+      </w:pPr>
+      <w:r>
+        <w:t>Central Claim</w:t>
+      </w:r>
+    </w:p>
+    <w:p>
+      <w:r>
+        <w:t>Public P/LP is classification evidence, not portable actionability. Direct actionability should be granted only when the label survives explicit allele-resolved evaluability, ancestry-aware frequency, and disease-model constraints.</w:t>
       </w:r>
     </w:p>
     <w:p>
@@ -53,17 +66,22 @@
     </w:p>
     <w:p>
       <w:r>
-        <w:t>Public clinical variant assertions now function as shared infrastructure. A pathogenic or likely pathogenic label exported from ClinVar is routinely reimported into laboratory interpretation pipelines, cascade-testing workflows, decision-support systems, and research analyses as though it were a portable unit of clinical meaning. This pattern of reuse rests on an implicit assumption: that the public label preserves the disease model it was originally intended to describe.</w:t>
+        <w:t>Public clinical variant assertions now function as shared infrastructure. A pathogenic or likely pathogenic label exported from ClinVar is routinely reimported into laboratory interpretation pipelines, cascade-testing workflows, decision-support systems, review spreadsheets, VCF annotation tools, screening filters, and research analyses as though it were a portable unit of clinical meaning. This pattern of reuse rests on an implicit assumption: that the public label preserves the disease model it was originally intended to describe.</w:t>
       </w:r>
     </w:p>
     <w:p>
       <w:r>
-        <w:t>That assumption is structurally unsafe. A public P/LP assertion is not a self-sufficient disease claim. It is a compressed object that records a classification outcome while omitting key parts of the interpretive model that produced it, including inheritance logic, penetrance assumptions, ancestry context, representation stability, and the evaluability conditions under which population evidence could be applied. Once the label circulates independently of those parameters, downstream users are forced to reconstruct a disease model that the public object does not itself encode.</w:t>
+        <w:t>That assumption is structurally unsafe. A public P/LP assertion records a classification outcome but not necessarily the disease-model parameters required for reliable downstream reuse, including inheritance, penetrance, ancestry context, representation stability, molecular mechanism, and whether population evidence was evaluable at all. This study therefore does not adjudicate original ClinVar submissions. It models a downstream reuse failure mode in which exported P/LP alleles are consumed after condition- and submission-level context has been flattened.</w:t>
       </w:r>
     </w:p>
     <w:p>
       <w:r>
-        <w:t>This problem is not merely theoretical. In settings where a variant label can influence syndrome diagnosis, family cascade testing, medication guidance, surveillance intensity, or device-related decisions, importing the wrong disease model changes the practical meaning of the assertion. The central question is therefore not whether an individual ClinVar submission may once have been coherent in its original context. The question is whether the exported label remains interpretable as a coherent disease-state claim once ancestry-aware population structure, allele-resolved representation, and mechanism are reintroduced downstream.</w:t>
+        <w:t>This flattening scenario is routine. Laboratory information systems, VCF annotation pipelines, decision-support tools, review spreadsheets, and screening filters often import ClinVar as a categorical flag. In each case, the consumer may receive a P/LP label without the disease model that justified it.</w:t>
+      </w:r>
+    </w:p>
+    <w:p>
+      <w:r>
+        <w:t>The concern is practical rather than semantic. In potentially consequential interpretation contexts such as syndrome diagnosis, family cascade testing, medication guidance, surveillance intensity, or device-related management, the key question is whether an exported label remains interpretable once ancestry-aware frequency, allele-resolved representation, and mechanism are restored downstream.</w:t>
       </w:r>
     </w:p>
     <w:p>
@@ -73,12 +91,12 @@
     </w:p>
     <w:p>
       <w:r>
-        <w:t>We examine two linked questions. First, for how many public arrhythmia assertions can allele-resolved population constraint actually be recovered under current public representation and aggregation systems? Second, when such constraint is available, how stable is the disease model implied by the label as observational resolution increases from global AF to ancestry-aware population maxima and then to regional stress-testing in HGDP?</w:t>
+        <w:t>We examine three linked questions. First, how much of the public arrhythmia label space is population-evaluable at all under current representation systems? Second, within the exome Tier 1 usable-AF subset that serves as the primary analysis, how often does a label remain compatible with a dominant high-penetrance disease model when one moves from global AF to ancestry-aware popmax and then to frequency stress-testing? Third, when the same outputs are routed as actionability decisions, how often does a label-driven baseline require review, deferral, or model repair?</w:t>
       </w:r>
     </w:p>
     <w:p>
       <w:r>
-        <w:t>We show that most public arrhythmia assertions cannot be connected to allele-resolved population frequency even after exhaustive reconciliation and reference-based normalization. Among the minority for which allele-resolved context is available, ancestry-aware frequency exposes distinct interpretation regimes concealed beneath the same public P/LP label. A second HGDP-based analysis sharpens the same point: once reconciliation expands beyond strict allele identity, the apparent burden of non-dominant-compatible variants rises markedly, but much of that burden lives in a locus-context universe rather than an allele-proven one. Safe downstream reuse therefore requires more explicit metadata than current public labels provide.</w:t>
+        <w:t>We show that most public arrhythmia assertions cannot be connected to allele-resolved population frequency even after exhaustive reconciliation and reference-based normalization. Among the minority for which allele-resolved context is available, ancestry-aware frequency exposes distinct interpretation regimes concealed beneath the same public P/LP label. Critically, the rate of disease-model decomposition is not random: it is mechanistically determined by molecular mechanism and variant consequence, and the broader compression problem recurs across biologically distinct disease domains. Safe downstream reuse therefore requires more explicit metadata than current public labels provide.</w:t>
       </w:r>
     </w:p>
     <w:p>
@@ -94,12 +112,22 @@
         <w:pStyle w:val="Heading2"/>
       </w:pPr>
       <w:r>
-        <w:t>Cohort definition</w:t>
+        <w:t>Cohort Definition</w:t>
       </w:r>
     </w:p>
     <w:p>
       <w:r>
-        <w:t>We analyzed ClinVar P/LP assertions across 20 inherited arrhythmia genes: KCNQ1, KCNH2, SCN5A, KCNE1, KCNE2, RYR2, CASQ2, TRDN, CALM1, CALM2, CALM3, ANK2, SCN4B, KCNJ2, HCN4, CACNA1C, CACNB2, CACNA2D1, AKAP9, and SNTA1. Variants were collapsed to unique GRCh38 alleles by chromosome, position, reference allele, and alternate allele, yielding 1,731 unique variants in the April 24, 2026 ClinVar data freeze used for this manuscript.</w:t>
+        <w:t>We analyzed ClinVar P/LP assertions across 20 inherited arrhythmia genes: KCNQ1, KCNH2, SCN5A, KCNE1, KCNE2, RYR2, CASQ2, TRDN, CALM1, CALM2, CALM3, ANK2, SCN4B, KCNJ2, HCN4, CACNA1C, CACNB2, CACNA2D1, AKAP9, and SNTA1. Variants were collapsed to unique GRCh38 alleles by chromosome, position, reference allele, and alternate allele, yielding 1,731 unique variant records.</w:t>
+      </w:r>
+    </w:p>
+    <w:p>
+      <w:r>
+        <w:t>Throughout this manuscript, "P/LP variant record" refers operationally to a unique chr-pos-ref-alt allele carrying at least one public P/LP classification in ClinVar after collapsing across condition-specific submissions and submitters. This unit preserves allele identity but does not retain condition-level or submission-level semantics in the April 24, 2026 ClinVar data freeze used for this manuscript.</w:t>
+      </w:r>
+    </w:p>
+    <w:p>
+      <w:r>
+        <w:t>Of the 20 genes queried, 17 contributed P/LP variants to the final dataset. KCNE2, SCN4B, and SNTA1 had no P/LP variant records in the ClinVar freeze and are therefore absent from downstream analyses. Where this manuscript refers to "17 genes" in mechanism-stratified analyses or cross-domain comparisons, it reflects this data-driven reduction from the 20-gene query set. This deliberate flattening models the reuse scenario under investigation: downstream consumption of exported P/LP alleles after condition and submission context has been lost.</w:t>
       </w:r>
     </w:p>
     <w:p>
@@ -107,7 +135,7 @@
         <w:pStyle w:val="Heading2"/>
       </w:pPr>
       <w:r>
-        <w:t>Exome reconciliation and evaluability tiering</w:t>
+        <w:t>Exome Reconciliation and Evaluability Tiering</w:t>
       </w:r>
     </w:p>
     <w:p>
@@ -456,12 +484,22 @@
         <w:pStyle w:val="Heading2"/>
       </w:pPr>
       <w:r>
-        <w:t>Exome frequency screening and regime assignment</w:t>
+        <w:t>Exome Frequency Screening and Regime Assignment</w:t>
       </w:r>
     </w:p>
     <w:p>
       <w:r>
-        <w:t>For Tier 1 variants with usable AF (n = 334), we extracted global AF, popmax AF, allele count, review-strength metadata, and variant-class annotations from existing processed outputs. We used 1x10^-5 as a review trigger rather than as a pathogenicity boundary and compared global-AF-only review with global-or-popmax review. Regime assignment within the 115 ancestry-aware alerts followed the precomputed arrhythmia interpretation framework already present in the repository: hard incompatibility with an unqualified dominant high-penetrance reading, boundary or monitoring status, and recessive or carrier-compatible architecture.</w:t>
+        <w:t>For Tier 1 variants with usable AF (n = 334), we extracted global AF, popmax AF, allele count, review-strength metadata, and variant-class annotations. We used 1 x 10^-5 as a review trigger rather than as a pathogenicity boundary because it provides a conservative operational screen for dominant high-penetrance arrhythmia claims while remaining below frequencies that would already imply obvious incompatibility. We then compared global-AF-only review with global-or-popmax review.</w:t>
+      </w:r>
+    </w:p>
+    <w:p>
+      <w:r>
+        <w:t>Regime assignment within the 115 ancestry-aware alerts followed three categories: hard incompatibility with an unqualified dominant high-penetrance reading, boundary or monitoring status, and recessive or carrier-compatible architecture.</w:t>
+      </w:r>
+    </w:p>
+    <w:p>
+      <w:r>
+        <w:t>Throughout this manuscript, "disease-model decomposition" (or simply "decomposition"; equivalently, disease-model incompatibility under population-frequency stress) refers operationally to the failure of a flattened P/LP label to remain compatible with an unqualified dominant disease-state model under specified population-frequency constraints. A variant "decomposes" when its popmax allele frequency exceeds the maximum credible allele frequency (MCAF) for the tested disease model, indicating that the implied dominant high-penetrance interpretation is not sustainable at that population-frequency resolution. Decomposition does not imply that the variant is benign or that its original classification was incorrect; it indicates that the disease model implied by an unqualified P/LP label requires additional specification, such as recessive inheritance, reduced penetrance, or population-specific context, to remain coherent.</w:t>
       </w:r>
     </w:p>
     <w:p>
@@ -469,49 +507,27 @@
         <w:pStyle w:val="Heading2"/>
       </w:pPr>
       <w:r>
-        <w:t>HGDP regional stress-test</w:t>
+        <w:t>MCAF Threshold Rationale</w:t>
       </w:r>
     </w:p>
     <w:p>
       <w:r>
-        <w:t>We next queried gnomAD r3.1.2 genomes and the HGDP+1KG population layer using cached GraphQL outputs. Variant reconciliation used four levels: exact allele identity, normalization rescue, event-equivalent rescue, and position-overlap rescue. For reporting, these were collapsed into four match classes:</w:t>
-      </w:r>
-    </w:p>
-    <w:p>
-      <w:pPr>
-        <w:pStyle w:val="ListNumber"/>
-      </w:pPr>
-      <w:r>
-        <w:t>strict_allele</w:t>
-      </w:r>
-    </w:p>
-    <w:p>
-      <w:pPr>
-        <w:pStyle w:val="ListNumber"/>
-      </w:pPr>
-      <w:r>
-        <w:t>normalized_allele (including event-equivalent rescue)</w:t>
-      </w:r>
-    </w:p>
-    <w:p>
-      <w:pPr>
-        <w:pStyle w:val="ListNumber"/>
-      </w:pPr>
-      <w:r>
-        <w:t>position_overlap</w:t>
-      </w:r>
-    </w:p>
-    <w:p>
-      <w:pPr>
-        <w:pStyle w:val="ListNumber"/>
-      </w:pPr>
-      <w:r>
-        <w:t>no_match</w:t>
+        <w:t>MCAF thresholds were treated as disease-model stress ceilings, not as pathogenicity cutoffs. The governing form was:</w:t>
       </w:r>
     </w:p>
     <w:p>
       <w:r>
-        <w:t>We also tracked a higher-level allele-resolution label: allele_resolved, representation_rescued, locus_context_only, or unevaluable.</w:t>
+        <w:t>MCAF = prevalence x allelic contribution / (penetrance x 2)</w:t>
+      </w:r>
+    </w:p>
+    <w:p>
+      <w:r>
+        <w:t>The analysis therefore asks whether an observed population frequency is compatible with a specified disease model, not whether the variant is pathogenic. Three thresholds were used to bracket biologically interpretable dominant arrhythmia scenarios: 2.5 x 10^-5 as a strict high-penetrance dominant ceiling, 1 x 10^-4 as a reduced-penetrance or founder-compatible boundary, and 1 x 10^-3 as a deliberately permissive sensitivity extreme. The 1 x 10^-5 exome screen was used only to nominate variants for review before MCAF bracketing, not as the final model-incompatibility definition.</w:t>
+      </w:r>
+    </w:p>
+    <w:p>
+      <w:r>
+        <w:t>This threshold strategy is internally checked in three ways. First, absolute alert counts change under threshold sensitivity, but the ordinal mechanism gradient is preserved. Second, the GoF/dominant-negative class behaves as a positive control: at biologically interpretable MCAF thresholds, it shows 0/34 decomposition. Third, hard conflict is separated from boundary or recessive-compatible routing rather than collapsed into a single "too frequent" label. These safeguards prevent MCAF from becoming an uncalibrated reclassification rule.</w:t>
       </w:r>
     </w:p>
     <w:p>
@@ -519,33 +535,568 @@
         <w:pStyle w:val="Heading2"/>
       </w:pPr>
       <w:r>
-        <w:t>HGDP disease-model compatibility</w:t>
+        <w:t>Baseline Decision Model and VITAL Routing</w:t>
       </w:r>
     </w:p>
     <w:p>
       <w:r>
-        <w:t>For HGDP-matched variants, we defined effective AF as the larger of max_hgdp_af and gnomad_r3_genome_af. We then compared that effective AF to two maximum-credible-allele-frequency thresholds used here as a resolution stress-test:</w:t>
+        <w:t>To connect the frequency-stress analysis with downstream reuse, we formalized a simple label-driven baseline. This baseline is not a clinical recommendation; it is the null model used to audit flattened reuse.</w:t>
       </w:r>
     </w:p>
+    <w:tbl>
+      <w:tblPr>
+        <w:tblStyle w:val="TableGrid"/>
+        <w:tblW w:type="auto" w:w="0"/>
+        <w:jc w:val="center"/>
+        <w:tblLook w:firstColumn="1" w:firstRow="1" w:lastColumn="0" w:lastRow="0" w:noHBand="0" w:noVBand="1" w:val="04A0"/>
+      </w:tblPr>
+      <w:tblGrid>
+        <w:gridCol w:w="5184"/>
+        <w:gridCol w:w="5184"/>
+      </w:tblGrid>
+      <w:tr>
+        <w:tc>
+          <w:tcPr>
+            <w:tcW w:type="dxa" w:w="5184"/>
+            <w:vAlign w:val="top"/>
+            <w:shd w:fill="D9EAF7"/>
+          </w:tcPr>
+          <w:p>
+            <w:pPr>
+              <w:jc w:val="left"/>
+            </w:pPr>
+            <w:r/>
+            <w:r>
+              <w:rPr>
+                <w:b/>
+                <w:sz w:val="16"/>
+              </w:rPr>
+              <w:t>Rule</w:t>
+            </w:r>
+          </w:p>
+        </w:tc>
+        <w:tc>
+          <w:tcPr>
+            <w:tcW w:type="dxa" w:w="5184"/>
+            <w:vAlign w:val="top"/>
+            <w:shd w:fill="D9EAF7"/>
+          </w:tcPr>
+          <w:p>
+            <w:pPr>
+              <w:jc w:val="left"/>
+            </w:pPr>
+            <w:r/>
+            <w:r>
+              <w:rPr>
+                <w:b/>
+                <w:sz w:val="16"/>
+              </w:rPr>
+              <w:t>Definition</w:t>
+            </w:r>
+          </w:p>
+        </w:tc>
+      </w:tr>
+      <w:tr>
+        <w:tc>
+          <w:tcPr>
+            <w:tcW w:type="dxa" w:w="5184"/>
+            <w:vAlign w:val="top"/>
+          </w:tcPr>
+          <w:p>
+            <w:pPr>
+              <w:jc w:val="left"/>
+            </w:pPr>
+            <w:r/>
+            <w:r>
+              <w:rPr>
+                <w:b w:val="0"/>
+                <w:sz w:val="16"/>
+              </w:rPr>
+              <w:t>B1_LABEL_DRIVEN_BASELINE</w:t>
+            </w:r>
+          </w:p>
+        </w:tc>
+        <w:tc>
+          <w:tcPr>
+            <w:tcW w:type="dxa" w:w="5184"/>
+            <w:vAlign w:val="top"/>
+          </w:tcPr>
+          <w:p>
+            <w:pPr>
+              <w:jc w:val="left"/>
+            </w:pPr>
+            <w:r/>
+            <w:r>
+              <w:rPr>
+                <w:b w:val="0"/>
+                <w:sz w:val="16"/>
+              </w:rPr>
+              <w:t>If a variant is exported as public ClinVar P/LP, downstream systems may treat it as eligible for direct actionability unless additional context is explicitly encoded.</w:t>
+            </w:r>
+          </w:p>
+        </w:tc>
+      </w:tr>
+      <w:tr>
+        <w:tc>
+          <w:tcPr>
+            <w:tcW w:type="dxa" w:w="5184"/>
+            <w:vAlign w:val="top"/>
+          </w:tcPr>
+          <w:p>
+            <w:pPr>
+              <w:jc w:val="left"/>
+            </w:pPr>
+            <w:r/>
+            <w:r>
+              <w:rPr>
+                <w:b w:val="0"/>
+                <w:sz w:val="16"/>
+              </w:rPr>
+              <w:t>B2_ACTIONABILITY_CONTEXT_BASELINE</w:t>
+            </w:r>
+          </w:p>
+        </w:tc>
+        <w:tc>
+          <w:tcPr>
+            <w:tcW w:type="dxa" w:w="5184"/>
+            <w:vAlign w:val="top"/>
+          </w:tcPr>
+          <w:p>
+            <w:pPr>
+              <w:jc w:val="left"/>
+            </w:pPr>
+            <w:r/>
+            <w:r>
+              <w:rPr>
+                <w:b w:val="0"/>
+                <w:sz w:val="16"/>
+              </w:rPr>
+              <w:t>If a P/LP variant appears in a gene linked to intervention, surveillance, cascade testing, device consideration, or therapy selection, the baseline route is ROUTE_PLP_ACTIONABLE.</w:t>
+            </w:r>
+          </w:p>
+        </w:tc>
+      </w:tr>
+      <w:tr>
+        <w:tc>
+          <w:tcPr>
+            <w:tcW w:type="dxa" w:w="5184"/>
+            <w:vAlign w:val="top"/>
+          </w:tcPr>
+          <w:p>
+            <w:pPr>
+              <w:jc w:val="left"/>
+            </w:pPr>
+            <w:r/>
+            <w:r>
+              <w:rPr>
+                <w:b w:val="0"/>
+                <w:sz w:val="16"/>
+              </w:rPr>
+              <w:t>B3_NO_IMPLIED_BENIGNITY</w:t>
+            </w:r>
+          </w:p>
+        </w:tc>
+        <w:tc>
+          <w:tcPr>
+            <w:tcW w:type="dxa" w:w="5184"/>
+            <w:vAlign w:val="top"/>
+          </w:tcPr>
+          <w:p>
+            <w:pPr>
+              <w:jc w:val="left"/>
+            </w:pPr>
+            <w:r/>
+            <w:r>
+              <w:rPr>
+                <w:b w:val="0"/>
+                <w:sz w:val="16"/>
+              </w:rPr>
+              <w:t>Absence of VITAL_OK does not imply benignity. It implies that direct actionability is not supported by the flattened label alone.</w:t>
+            </w:r>
+          </w:p>
+        </w:tc>
+      </w:tr>
+    </w:tbl>
+    <w:p/>
     <w:p>
-      <w:pPr>
-        <w:pStyle w:val="ListNumber"/>
-      </w:pPr>
       <w:r>
-        <w:t>strict dominant high-penetrance ceiling: 2.5x10^-5</w:t>
+        <w:t>VITAL was implemented as a post-label routing layer:</w:t>
       </w:r>
     </w:p>
-    <w:p>
-      <w:pPr>
-        <w:pStyle w:val="ListNumber"/>
-      </w:pPr>
-      <w:r>
-        <w:t>generous low-penetrance dominant ceiling: 1x10^-3</w:t>
-      </w:r>
-    </w:p>
+    <w:tbl>
+      <w:tblPr>
+        <w:tblStyle w:val="TableGrid"/>
+        <w:tblW w:type="auto" w:w="0"/>
+        <w:jc w:val="center"/>
+        <w:tblLook w:firstColumn="1" w:firstRow="1" w:lastColumn="0" w:lastRow="0" w:noHBand="0" w:noVBand="1" w:val="04A0"/>
+      </w:tblPr>
+      <w:tblGrid>
+        <w:gridCol w:w="3456"/>
+        <w:gridCol w:w="3456"/>
+        <w:gridCol w:w="3456"/>
+      </w:tblGrid>
+      <w:tr>
+        <w:tc>
+          <w:tcPr>
+            <w:tcW w:type="dxa" w:w="3456"/>
+            <w:vAlign w:val="top"/>
+            <w:shd w:fill="D9EAF7"/>
+          </w:tcPr>
+          <w:p>
+            <w:pPr>
+              <w:jc w:val="left"/>
+            </w:pPr>
+            <w:r/>
+            <w:r>
+              <w:rPr>
+                <w:b/>
+                <w:sz w:val="16"/>
+              </w:rPr>
+              <w:t>VITAL route</w:t>
+            </w:r>
+          </w:p>
+        </w:tc>
+        <w:tc>
+          <w:tcPr>
+            <w:tcW w:type="dxa" w:w="3456"/>
+            <w:vAlign w:val="top"/>
+            <w:shd w:fill="D9EAF7"/>
+          </w:tcPr>
+          <w:p>
+            <w:pPr>
+              <w:jc w:val="left"/>
+            </w:pPr>
+            <w:r/>
+            <w:r>
+              <w:rPr>
+                <w:b/>
+                <w:sz w:val="16"/>
+              </w:rPr>
+              <w:t>Definition</w:t>
+            </w:r>
+          </w:p>
+        </w:tc>
+        <w:tc>
+          <w:tcPr>
+            <w:tcW w:type="dxa" w:w="3456"/>
+            <w:vAlign w:val="top"/>
+            <w:shd w:fill="D9EAF7"/>
+          </w:tcPr>
+          <w:p>
+            <w:pPr>
+              <w:jc w:val="left"/>
+            </w:pPr>
+            <w:r/>
+            <w:r>
+              <w:rPr>
+                <w:b/>
+                <w:sz w:val="16"/>
+              </w:rPr>
+              <w:t>Operational routing</w:t>
+            </w:r>
+          </w:p>
+        </w:tc>
+      </w:tr>
+      <w:tr>
+        <w:tc>
+          <w:tcPr>
+            <w:tcW w:type="dxa" w:w="3456"/>
+            <w:vAlign w:val="top"/>
+          </w:tcPr>
+          <w:p>
+            <w:pPr>
+              <w:jc w:val="left"/>
+            </w:pPr>
+            <w:r/>
+            <w:r>
+              <w:rPr>
+                <w:b w:val="0"/>
+                <w:sz w:val="16"/>
+              </w:rPr>
+              <w:t>VITAL_OK</w:t>
+            </w:r>
+          </w:p>
+        </w:tc>
+        <w:tc>
+          <w:tcPr>
+            <w:tcW w:type="dxa" w:w="3456"/>
+            <w:vAlign w:val="top"/>
+          </w:tcPr>
+          <w:p>
+            <w:pPr>
+              <w:jc w:val="left"/>
+            </w:pPr>
+            <w:r/>
+            <w:r>
+              <w:rPr>
+                <w:b w:val="0"/>
+                <w:sz w:val="16"/>
+              </w:rPr>
+              <w:t>Label remains compatible with the tested actionability model.</w:t>
+            </w:r>
+          </w:p>
+        </w:tc>
+        <w:tc>
+          <w:tcPr>
+            <w:tcW w:type="dxa" w:w="3456"/>
+            <w:vAlign w:val="top"/>
+          </w:tcPr>
+          <w:p>
+            <w:pPr>
+              <w:jc w:val="left"/>
+            </w:pPr>
+            <w:r/>
+            <w:r>
+              <w:rPr>
+                <w:b w:val="0"/>
+                <w:sz w:val="16"/>
+              </w:rPr>
+              <w:t>Proceed with standard expert interpretation.</w:t>
+            </w:r>
+          </w:p>
+        </w:tc>
+      </w:tr>
+      <w:tr>
+        <w:tc>
+          <w:tcPr>
+            <w:tcW w:type="dxa" w:w="3456"/>
+            <w:vAlign w:val="top"/>
+          </w:tcPr>
+          <w:p>
+            <w:pPr>
+              <w:jc w:val="left"/>
+            </w:pPr>
+            <w:r/>
+            <w:r>
+              <w:rPr>
+                <w:b w:val="0"/>
+                <w:sz w:val="16"/>
+              </w:rPr>
+              <w:t>CHECK_POPMAX</w:t>
+            </w:r>
+          </w:p>
+        </w:tc>
+        <w:tc>
+          <w:tcPr>
+            <w:tcW w:type="dxa" w:w="3456"/>
+            <w:vAlign w:val="top"/>
+          </w:tcPr>
+          <w:p>
+            <w:pPr>
+              <w:jc w:val="left"/>
+            </w:pPr>
+            <w:r/>
+            <w:r>
+              <w:rPr>
+                <w:b w:val="0"/>
+                <w:sz w:val="16"/>
+              </w:rPr>
+              <w:t>Label may remain valid, but direct actionability requires ancestry-aware frequency review.</w:t>
+            </w:r>
+          </w:p>
+        </w:tc>
+        <w:tc>
+          <w:tcPr>
+            <w:tcW w:type="dxa" w:w="3456"/>
+            <w:vAlign w:val="top"/>
+          </w:tcPr>
+          <w:p>
+            <w:pPr>
+              <w:jc w:val="left"/>
+            </w:pPr>
+            <w:r/>
+            <w:r>
+              <w:rPr>
+                <w:b w:val="0"/>
+                <w:sz w:val="16"/>
+              </w:rPr>
+              <w:t>Review.</w:t>
+            </w:r>
+          </w:p>
+        </w:tc>
+      </w:tr>
+      <w:tr>
+        <w:tc>
+          <w:tcPr>
+            <w:tcW w:type="dxa" w:w="3456"/>
+            <w:vAlign w:val="top"/>
+          </w:tcPr>
+          <w:p>
+            <w:pPr>
+              <w:jc w:val="left"/>
+            </w:pPr>
+            <w:r/>
+            <w:r>
+              <w:rPr>
+                <w:b w:val="0"/>
+                <w:sz w:val="16"/>
+              </w:rPr>
+              <w:t>CHECK_MODEL</w:t>
+            </w:r>
+          </w:p>
+        </w:tc>
+        <w:tc>
+          <w:tcPr>
+            <w:tcW w:type="dxa" w:w="3456"/>
+            <w:vAlign w:val="top"/>
+          </w:tcPr>
+          <w:p>
+            <w:pPr>
+              <w:jc w:val="left"/>
+            </w:pPr>
+            <w:r/>
+            <w:r>
+              <w:rPr>
+                <w:b w:val="0"/>
+                <w:sz w:val="16"/>
+              </w:rPr>
+              <w:t>Label may remain valid, but inheritance, phase, or mechanism is not portable from the flattened label.</w:t>
+            </w:r>
+          </w:p>
+        </w:tc>
+        <w:tc>
+          <w:tcPr>
+            <w:tcW w:type="dxa" w:w="3456"/>
+            <w:vAlign w:val="top"/>
+          </w:tcPr>
+          <w:p>
+            <w:pPr>
+              <w:jc w:val="left"/>
+            </w:pPr>
+            <w:r/>
+            <w:r>
+              <w:rPr>
+                <w:b w:val="0"/>
+                <w:sz w:val="16"/>
+              </w:rPr>
+              <w:t>Model-specific routing or repair.</w:t>
+            </w:r>
+          </w:p>
+        </w:tc>
+      </w:tr>
+      <w:tr>
+        <w:tc>
+          <w:tcPr>
+            <w:tcW w:type="dxa" w:w="3456"/>
+            <w:vAlign w:val="top"/>
+          </w:tcPr>
+          <w:p>
+            <w:pPr>
+              <w:jc w:val="left"/>
+            </w:pPr>
+            <w:r/>
+            <w:r>
+              <w:rPr>
+                <w:b w:val="0"/>
+                <w:sz w:val="16"/>
+              </w:rPr>
+              <w:t>MODEL_CONFLICT</w:t>
+            </w:r>
+          </w:p>
+        </w:tc>
+        <w:tc>
+          <w:tcPr>
+            <w:tcW w:type="dxa" w:w="3456"/>
+            <w:vAlign w:val="top"/>
+          </w:tcPr>
+          <w:p>
+            <w:pPr>
+              <w:jc w:val="left"/>
+            </w:pPr>
+            <w:r/>
+            <w:r>
+              <w:rPr>
+                <w:b w:val="0"/>
+                <w:sz w:val="16"/>
+              </w:rPr>
+              <w:t>Flattened P/LP label is incompatible with the tested dominant high-penetrance disease model.</w:t>
+            </w:r>
+          </w:p>
+        </w:tc>
+        <w:tc>
+          <w:tcPr>
+            <w:tcW w:type="dxa" w:w="3456"/>
+            <w:vAlign w:val="top"/>
+          </w:tcPr>
+          <w:p>
+            <w:pPr>
+              <w:jc w:val="left"/>
+            </w:pPr>
+            <w:r/>
+            <w:r>
+              <w:rPr>
+                <w:b w:val="0"/>
+                <w:sz w:val="16"/>
+              </w:rPr>
+              <w:t>Do not direct-route as dominant actionability.</w:t>
+            </w:r>
+          </w:p>
+        </w:tc>
+      </w:tr>
+      <w:tr>
+        <w:tc>
+          <w:tcPr>
+            <w:tcW w:type="dxa" w:w="3456"/>
+            <w:vAlign w:val="top"/>
+          </w:tcPr>
+          <w:p>
+            <w:pPr>
+              <w:jc w:val="left"/>
+            </w:pPr>
+            <w:r/>
+            <w:r>
+              <w:rPr>
+                <w:b w:val="0"/>
+                <w:sz w:val="16"/>
+              </w:rPr>
+              <w:t>EVAL_LIMITED</w:t>
+            </w:r>
+          </w:p>
+        </w:tc>
+        <w:tc>
+          <w:tcPr>
+            <w:tcW w:type="dxa" w:w="3456"/>
+            <w:vAlign w:val="top"/>
+          </w:tcPr>
+          <w:p>
+            <w:pPr>
+              <w:jc w:val="left"/>
+            </w:pPr>
+            <w:r/>
+            <w:r>
+              <w:rPr>
+                <w:b w:val="0"/>
+                <w:sz w:val="16"/>
+              </w:rPr>
+              <w:t>No allele-resolved evaluability; direct actionability cannot be justified from population evidence.</w:t>
+            </w:r>
+          </w:p>
+        </w:tc>
+        <w:tc>
+          <w:tcPr>
+            <w:tcW w:type="dxa" w:w="3456"/>
+            <w:vAlign w:val="top"/>
+          </w:tcPr>
+          <w:p>
+            <w:pPr>
+              <w:jc w:val="left"/>
+            </w:pPr>
+            <w:r/>
+            <w:r>
+              <w:rPr>
+                <w:b w:val="0"/>
+                <w:sz w:val="16"/>
+              </w:rPr>
+              <w:t>Defer direct actionability pending representation, callability, or orthogonal evidence.</w:t>
+            </w:r>
+          </w:p>
+        </w:tc>
+      </w:tr>
+    </w:tbl>
+    <w:p/>
     <w:p>
       <w:r>
-        <w:t>Variants were classified as dominant_compatible, boundary, or hard_incompatible. We report results both for the full HGDP matched universe and for the strict-allele subset alone.</w:t>
+        <w:t>Nonpass does not mean wrong. Nonpass means that direct actionability cannot proceed from the flattened label without review, deferral, or model repair.</w:t>
       </w:r>
     </w:p>
     <w:p>
@@ -553,14 +1104,513 @@
         <w:pStyle w:val="Heading2"/>
       </w:pPr>
       <w:r>
-        <w:t>Clinical-action context</w:t>
+        <w:t>MVP Annotation Layer</w:t>
       </w:r>
     </w:p>
     <w:p>
       <w:r>
-        <w:t>To connect population tension with real downstream use environments, we retained the existing action-context summaries already computed in the repository. These classify alerted variants into clinically consequential gene contexts relevant to cascade testing, drug restriction, and intensive surveillance or device-related management. These context labels are exposure indicators, not patient-outcome measurements.</w:t>
+        <w:t>To make the framework directly reusable in downstream annotation workflows, we implemented a minimal VITAL annotation layer. The MVP annotator accepts normalized VCF, CSV, or TSV inputs and maps variants against a precomputed lookup table derived from the arrhythmia analysis. Outputs include VITAL_evaluability, VITAL_flag, VITAL_regime, VITAL_popmax_af, VITAL_global_af, VITAL_threshold, and VITAL_reason.</w:t>
       </w:r>
     </w:p>
+    <w:p>
+      <w:r>
+        <w:t>For pipeline compatibility, the tool also generates an ANNOVAR-style export using Chr, Start, End, Ref, and Alt coordinates. All lookup-based interpretation requires prior variant normalization against GRCh38 using bcftools norm. The MVP intentionally restricts actionable flags to three categories: OK, CHECK_POPMAX, and MODEL_CONFLICT. VITAL_OK does not imply benign status, CHECK_POPMAX does not imply reclassification, and MODEL_CONFLICT denotes incompatibility only with the tested unqualified dominant high-penetrance model.</w:t>
+      </w:r>
+    </w:p>
+    <w:p>
+      <w:pPr>
+        <w:pStyle w:val="Heading2"/>
+      </w:pPr>
+      <w:r>
+        <w:t>HGDP Regional Stress-Test</w:t>
+      </w:r>
+    </w:p>
+    <w:p>
+      <w:r>
+        <w:t>We queried gnomAD r3.1.2 genomes and the HGDP+1KG population layer using cached GraphQL outputs. Variant reconciliation used four levels: exact allele identity, normalization rescue, event-equivalent rescue, and position-overlap rescue, collapsed into four match classes: strict_allele, normalized_allele, position_overlap, and no_match.</w:t>
+      </w:r>
+    </w:p>
+    <w:p>
+      <w:r>
+        <w:t>For HGDP-matched variants, effective AF was defined as the larger of max_hgdp_af and gnomad_r3_genome_af. This was compared against three pre-specified MCAF thresholds used as a resolution stress-test: 2.5 x 10^-5 as a strict dominant high-penetrance ceiling, 1 x 10^-4 as a reduced-penetrance or founder-compatible dominant boundary, and 1 x 10^-3 as a deliberately permissive sensitivity extreme used only for threshold-sweep robustness testing. These values were chosen to span biologically and clinically interpretable dominant arrhythmia scenarios rather than to create a single adjudication cutoff.</w:t>
+      </w:r>
+    </w:p>
+    <w:p>
+      <w:r>
+        <w:t>Variants were classified as dominant_compatible, boundary, or hard_incompatible. HGDP results are reported in three evidence layers: strict allele evidence as the primary evidence layer, position-overlap matches as a hypothesis-generating stress map, and the full matched set as exploratory signal rather than an allele-level burden estimate.</w:t>
+      </w:r>
+    </w:p>
+    <w:p>
+      <w:pPr>
+        <w:pStyle w:val="Heading2"/>
+      </w:pPr>
+      <w:r>
+        <w:t>Molecular Mechanism Classification</w:t>
+      </w:r>
+    </w:p>
+    <w:p>
+      <w:r>
+        <w:t>Genes were classified by molecular mechanism into three categories: gain-of-function/dominant-negative (GoF/DN), haploinsufficient (HI), and recessive (AR). These labels represent the dominant disease-model context being stress-tested for each gene, not a claim that every variant in a given gene acts exclusively through that mechanism. Gene-level assignments, their sources (ClinGen, OMIM, published literature), and caveats for genes with mixed or debated mechanisms, including SCN5A and KCNQ1, are detailed in supplementary tables.</w:t>
+      </w:r>
+    </w:p>
+    <w:p>
+      <w:r>
+        <w:t>For each category, decomposition rate was defined as the proportion of population-evaluable variants falling outside the dominant-compatible regime. Association between mechanism class and decomposition was assessed by logistic regression with LOEUF score (gnomAD v4.1), variant consequence, and disease domain as covariates. Because the GoF/DN mechanism class exhibits complete separation at biologically interpretable thresholds, Firth-type penalized logistic regression was used to obtain finite, bias-corrected estimates. Leave-one-gene-out sensitivity analysis was used to assess robustness to gene-level clustering.</w:t>
+      </w:r>
+    </w:p>
+    <w:p>
+      <w:pPr>
+        <w:pStyle w:val="Heading2"/>
+      </w:pPr>
+      <w:r>
+        <w:t>Cross-Domain Replication and Structural Sanity Checks</w:t>
+      </w:r>
+    </w:p>
+    <w:p>
+      <w:r>
+        <w:t>To test whether evaluability compression and regime heterogeneity are domain-specific, we applied the same framework, with the same MCAF thresholds, evaluability tier definitions, and reconciliation logic, to hereditary cancer predisposition genes (BRCA1, BRCA2, MLH1, MSH2, MSH6, PMS2). No domain-specific parameter tuning was applied. This replication is treated as a structural stress-test, not as clinical adjudication or cross-domain calibration; quantitative burdens are interpreted as threshold-dependent and domain-specific.</w:t>
+      </w:r>
+    </w:p>
+    <w:p>
+      <w:r>
+        <w:t>In parallel, we analyzed five additional sampled public P/LP panels (cardiomyopathy, epilepsy, metabolic autosomal-recessive disease, primary immunodeficiency, and hearing loss) to test whether actionability-routing instability recurs outside arrhythmia.</w:t>
+      </w:r>
+    </w:p>
+    <w:p>
+      <w:pPr>
+        <w:pStyle w:val="Heading2"/>
+      </w:pPr>
+      <w:r>
+        <w:t>Validation and Calibration Layers</w:t>
+      </w:r>
+    </w:p>
+    <w:p>
+      <w:r>
+        <w:t>The validation architecture was designed as calibration rather than as a single oversized truth set. Four layers were used.</w:t>
+      </w:r>
+    </w:p>
+    <w:p>
+      <w:r>
+        <w:t>First, high-review ClinVar assertions tested whether routing instability persisted after excluding the weakest public assertions. Second, ClinVar expert-panel and practice-guideline assertions, including ClinGen-curated sources where present in ClinVar, tested whether VITAL preserved expert-curated positives as compatible or review-level rather than indiscriminately generating hard conflicts. Third, expert-curated benign/likely benign controls tested whether VITAL behaved as a disease-model compatibility layer rather than as a pathogenicity detector. Fourth, the counterfactual decision audit and simulated CDS layer tested whether VITAL changed the route taken by a label-driven workflow.</w:t>
+      </w:r>
+    </w:p>
+    <w:p>
+      <w:r>
+        <w:t>This validation suite is intentionally modest. It is not a blinded clinician adjudication study, and the expert-curated arrhythmia subset is small. Its purpose is to check calibration, specificity of hard-conflict behavior, and workflow-level decision change.</w:t>
+      </w:r>
+    </w:p>
+    <w:p>
+      <w:pPr>
+        <w:pStyle w:val="Heading2"/>
+      </w:pPr>
+      <w:r>
+        <w:t>Clinical-Action Context and Actionability Discordance Audit</w:t>
+      </w:r>
+    </w:p>
+    <w:p>
+      <w:r>
+        <w:t>To connect population tension with real downstream use environments, alerted variants were classified into potentially consequential interpretation contexts: cascade testing, drug restriction, intensive surveillance, device-related management, syndrome diagnosis, or carrier/recessive routing. These context labels indicate exposure environments, not measured downstream outcomes.</w:t>
+      </w:r>
+    </w:p>
+    <w:p>
+      <w:r>
+        <w:t>We also built an Actionability Discordance Audit (ADS) from repository-derived routing calls and representative case vignettes. Inclusion required a public P/LP assertion, action-associated context, normalized variant identity, and a VITAL route of CHECK_POPMAX, CHECK_MODEL, MODEL_CONFLICT, or EVAL_LIMITED. The ADS is not a harm registry; it is a variant-level audit of cases where direct actionability is not fully supported once constraints are restored.</w:t>
+      </w:r>
+    </w:p>
+    <w:p>
+      <w:pPr>
+        <w:pStyle w:val="Heading2"/>
+      </w:pPr>
+      <w:r>
+        <w:t>Analysis Hierarchy</w:t>
+      </w:r>
+    </w:p>
+    <w:p>
+      <w:r>
+        <w:t>The main text uses one primary denominator chain:</w:t>
+      </w:r>
+    </w:p>
+    <w:p>
+      <w:r>
+        <w:t>1,731 public arrhythmia P/LP labels -&gt; 357 allele-resolved exome matches -&gt; 334 usable-AF variants -&gt; 115 ancestry-aware frequency alerts</w:t>
+      </w:r>
+    </w:p>
+    <w:p>
+      <w:r>
+        <w:t>All primary disease-model conclusions come from the 334 usable-AF variants. All primary actionability-routing conclusions use the 1,731-label arrhythmia baseline. HGDP, hereditary cancer, and external disease panels are supplementary stress layers: they test structural recurrence and failure modes, not primary burden estimates.</w:t>
+      </w:r>
+    </w:p>
+    <w:tbl>
+      <w:tblPr>
+        <w:tblStyle w:val="TableGrid"/>
+        <w:tblW w:type="auto" w:w="0"/>
+        <w:jc w:val="center"/>
+        <w:tblLook w:firstColumn="1" w:firstRow="1" w:lastColumn="0" w:lastRow="0" w:noHBand="0" w:noVBand="1" w:val="04A0"/>
+      </w:tblPr>
+      <w:tblGrid>
+        <w:gridCol w:w="3456"/>
+        <w:gridCol w:w="3456"/>
+        <w:gridCol w:w="3456"/>
+      </w:tblGrid>
+      <w:tr>
+        <w:tc>
+          <w:tcPr>
+            <w:tcW w:type="dxa" w:w="3456"/>
+            <w:vAlign w:val="top"/>
+            <w:shd w:fill="D9EAF7"/>
+          </w:tcPr>
+          <w:p>
+            <w:pPr>
+              <w:jc w:val="left"/>
+            </w:pPr>
+            <w:r/>
+            <w:r>
+              <w:rPr>
+                <w:b/>
+                <w:sz w:val="16"/>
+              </w:rPr>
+              <w:t>Layer</w:t>
+            </w:r>
+          </w:p>
+        </w:tc>
+        <w:tc>
+          <w:tcPr>
+            <w:tcW w:type="dxa" w:w="3456"/>
+            <w:vAlign w:val="top"/>
+            <w:shd w:fill="D9EAF7"/>
+          </w:tcPr>
+          <w:p>
+            <w:pPr>
+              <w:jc w:val="left"/>
+            </w:pPr>
+            <w:r/>
+            <w:r>
+              <w:rPr>
+                <w:b/>
+                <w:sz w:val="16"/>
+              </w:rPr>
+              <w:t>Main denominator</w:t>
+            </w:r>
+          </w:p>
+        </w:tc>
+        <w:tc>
+          <w:tcPr>
+            <w:tcW w:type="dxa" w:w="3456"/>
+            <w:vAlign w:val="top"/>
+            <w:shd w:fill="D9EAF7"/>
+          </w:tcPr>
+          <w:p>
+            <w:pPr>
+              <w:jc w:val="left"/>
+            </w:pPr>
+            <w:r/>
+            <w:r>
+              <w:rPr>
+                <w:b/>
+                <w:sz w:val="16"/>
+              </w:rPr>
+              <w:t>Role</w:t>
+            </w:r>
+          </w:p>
+        </w:tc>
+      </w:tr>
+      <w:tr>
+        <w:tc>
+          <w:tcPr>
+            <w:tcW w:type="dxa" w:w="3456"/>
+            <w:vAlign w:val="top"/>
+          </w:tcPr>
+          <w:p>
+            <w:pPr>
+              <w:jc w:val="left"/>
+            </w:pPr>
+            <w:r/>
+            <w:r>
+              <w:rPr>
+                <w:b w:val="0"/>
+                <w:sz w:val="16"/>
+              </w:rPr>
+              <w:t>Public arrhythmia label universe</w:t>
+            </w:r>
+          </w:p>
+        </w:tc>
+        <w:tc>
+          <w:tcPr>
+            <w:tcW w:type="dxa" w:w="3456"/>
+            <w:vAlign w:val="top"/>
+          </w:tcPr>
+          <w:p>
+            <w:pPr>
+              <w:jc w:val="left"/>
+            </w:pPr>
+            <w:r/>
+            <w:r>
+              <w:rPr>
+                <w:b w:val="0"/>
+                <w:sz w:val="16"/>
+              </w:rPr>
+              <w:t>1,731</w:t>
+            </w:r>
+          </w:p>
+        </w:tc>
+        <w:tc>
+          <w:tcPr>
+            <w:tcW w:type="dxa" w:w="3456"/>
+            <w:vAlign w:val="top"/>
+          </w:tcPr>
+          <w:p>
+            <w:pPr>
+              <w:jc w:val="left"/>
+            </w:pPr>
+            <w:r/>
+            <w:r>
+              <w:rPr>
+                <w:b w:val="0"/>
+                <w:sz w:val="16"/>
+              </w:rPr>
+              <w:t>Primary routing denominator</w:t>
+            </w:r>
+          </w:p>
+        </w:tc>
+      </w:tr>
+      <w:tr>
+        <w:tc>
+          <w:tcPr>
+            <w:tcW w:type="dxa" w:w="3456"/>
+            <w:vAlign w:val="top"/>
+          </w:tcPr>
+          <w:p>
+            <w:pPr>
+              <w:jc w:val="left"/>
+            </w:pPr>
+            <w:r/>
+            <w:r>
+              <w:rPr>
+                <w:b w:val="0"/>
+                <w:sz w:val="16"/>
+              </w:rPr>
+              <w:t>Allele-resolved exome recovery</w:t>
+            </w:r>
+          </w:p>
+        </w:tc>
+        <w:tc>
+          <w:tcPr>
+            <w:tcW w:type="dxa" w:w="3456"/>
+            <w:vAlign w:val="top"/>
+          </w:tcPr>
+          <w:p>
+            <w:pPr>
+              <w:jc w:val="left"/>
+            </w:pPr>
+            <w:r/>
+            <w:r>
+              <w:rPr>
+                <w:b w:val="0"/>
+                <w:sz w:val="16"/>
+              </w:rPr>
+              <w:t>357</w:t>
+            </w:r>
+          </w:p>
+        </w:tc>
+        <w:tc>
+          <w:tcPr>
+            <w:tcW w:type="dxa" w:w="3456"/>
+            <w:vAlign w:val="top"/>
+          </w:tcPr>
+          <w:p>
+            <w:pPr>
+              <w:jc w:val="left"/>
+            </w:pPr>
+            <w:r/>
+            <w:r>
+              <w:rPr>
+                <w:b w:val="0"/>
+                <w:sz w:val="16"/>
+              </w:rPr>
+              <w:t>Evaluability boundary</w:t>
+            </w:r>
+          </w:p>
+        </w:tc>
+      </w:tr>
+      <w:tr>
+        <w:tc>
+          <w:tcPr>
+            <w:tcW w:type="dxa" w:w="3456"/>
+            <w:vAlign w:val="top"/>
+          </w:tcPr>
+          <w:p>
+            <w:pPr>
+              <w:jc w:val="left"/>
+            </w:pPr>
+            <w:r/>
+            <w:r>
+              <w:rPr>
+                <w:b w:val="0"/>
+                <w:sz w:val="16"/>
+              </w:rPr>
+              <w:t>Usable-AF exome subset</w:t>
+            </w:r>
+          </w:p>
+        </w:tc>
+        <w:tc>
+          <w:tcPr>
+            <w:tcW w:type="dxa" w:w="3456"/>
+            <w:vAlign w:val="top"/>
+          </w:tcPr>
+          <w:p>
+            <w:pPr>
+              <w:jc w:val="left"/>
+            </w:pPr>
+            <w:r/>
+            <w:r>
+              <w:rPr>
+                <w:b w:val="0"/>
+                <w:sz w:val="16"/>
+              </w:rPr>
+              <w:t>334</w:t>
+            </w:r>
+          </w:p>
+        </w:tc>
+        <w:tc>
+          <w:tcPr>
+            <w:tcW w:type="dxa" w:w="3456"/>
+            <w:vAlign w:val="top"/>
+          </w:tcPr>
+          <w:p>
+            <w:pPr>
+              <w:jc w:val="left"/>
+            </w:pPr>
+            <w:r/>
+            <w:r>
+              <w:rPr>
+                <w:b w:val="0"/>
+                <w:sz w:val="16"/>
+              </w:rPr>
+              <w:t>Primary population/MCAF denominator</w:t>
+            </w:r>
+          </w:p>
+        </w:tc>
+      </w:tr>
+      <w:tr>
+        <w:tc>
+          <w:tcPr>
+            <w:tcW w:type="dxa" w:w="3456"/>
+            <w:vAlign w:val="top"/>
+          </w:tcPr>
+          <w:p>
+            <w:pPr>
+              <w:jc w:val="left"/>
+            </w:pPr>
+            <w:r/>
+            <w:r>
+              <w:rPr>
+                <w:b w:val="0"/>
+                <w:sz w:val="16"/>
+              </w:rPr>
+              <w:t>Popmax alert set</w:t>
+            </w:r>
+          </w:p>
+        </w:tc>
+        <w:tc>
+          <w:tcPr>
+            <w:tcW w:type="dxa" w:w="3456"/>
+            <w:vAlign w:val="top"/>
+          </w:tcPr>
+          <w:p>
+            <w:pPr>
+              <w:jc w:val="left"/>
+            </w:pPr>
+            <w:r/>
+            <w:r>
+              <w:rPr>
+                <w:b w:val="0"/>
+                <w:sz w:val="16"/>
+              </w:rPr>
+              <w:t>115</w:t>
+            </w:r>
+          </w:p>
+        </w:tc>
+        <w:tc>
+          <w:tcPr>
+            <w:tcW w:type="dxa" w:w="3456"/>
+            <w:vAlign w:val="top"/>
+          </w:tcPr>
+          <w:p>
+            <w:pPr>
+              <w:jc w:val="left"/>
+            </w:pPr>
+            <w:r/>
+            <w:r>
+              <w:rPr>
+                <w:b w:val="0"/>
+                <w:sz w:val="16"/>
+              </w:rPr>
+              <w:t>Primary regime and context analysis</w:t>
+            </w:r>
+          </w:p>
+        </w:tc>
+      </w:tr>
+      <w:tr>
+        <w:tc>
+          <w:tcPr>
+            <w:tcW w:type="dxa" w:w="3456"/>
+            <w:vAlign w:val="top"/>
+          </w:tcPr>
+          <w:p>
+            <w:pPr>
+              <w:jc w:val="left"/>
+            </w:pPr>
+            <w:r/>
+            <w:r>
+              <w:rPr>
+                <w:b w:val="0"/>
+                <w:sz w:val="16"/>
+              </w:rPr>
+              <w:t>HGDP / cancer / external panels</w:t>
+            </w:r>
+          </w:p>
+        </w:tc>
+        <w:tc>
+          <w:tcPr>
+            <w:tcW w:type="dxa" w:w="3456"/>
+            <w:vAlign w:val="top"/>
+          </w:tcPr>
+          <w:p>
+            <w:pPr>
+              <w:jc w:val="left"/>
+            </w:pPr>
+            <w:r/>
+            <w:r>
+              <w:rPr>
+                <w:b w:val="0"/>
+                <w:sz w:val="16"/>
+              </w:rPr>
+              <w:t>variable</w:t>
+            </w:r>
+          </w:p>
+        </w:tc>
+        <w:tc>
+          <w:tcPr>
+            <w:tcW w:type="dxa" w:w="3456"/>
+            <w:vAlign w:val="top"/>
+          </w:tcPr>
+          <w:p>
+            <w:pPr>
+              <w:jc w:val="left"/>
+            </w:pPr>
+            <w:r/>
+            <w:r>
+              <w:rPr>
+                <w:b w:val="0"/>
+                <w:sz w:val="16"/>
+              </w:rPr>
+              <w:t>Supplementary stress architecture only</w:t>
+            </w:r>
+          </w:p>
+        </w:tc>
+      </w:tr>
+    </w:tbl>
+    <w:p/>
     <w:p>
       <w:pPr>
         <w:pStyle w:val="Heading1"/>
@@ -574,7 +1624,7 @@
         <w:pStyle w:val="Heading2"/>
       </w:pPr>
       <w:r>
-        <w:t>1. A structural evaluability boundary limits allele-resolved population review</w:t>
+        <w:t>1. A Structural Evaluability Boundary Limits Allele-Resolved Population Review</w:t>
       </w:r>
     </w:p>
     <w:p>
@@ -585,24 +1635,6 @@
     <w:p>
       <w:r>
         <w:t>Strict initial matching recovered 350 variants. Trim-aware and decomposition-aware reconciliation increased recovery by only 7 variants. Full reference-based normalization using bcftools norm changed 0 of 1,731 representations. Together, these negative findings matter more than a cosmetic recovery gain: the dominant barrier is not an avoidable formatting miss, but the structural inability to connect most public arrhythmia assertions to allele-resolved population frequency.</w:t>
-      </w:r>
-    </w:p>
-    <w:p>
-      <w:pPr>
-        <w:pStyle w:val="Heading2"/>
-      </w:pPr>
-      <w:r>
-        <w:t>2. Tier 2 reflects structured representation limits, not random absence</w:t>
-      </w:r>
-    </w:p>
-    <w:p>
-      <w:r>
-        <w:t>Tier 2 is not a homogeneous gray zone. Within its 1,326 variants, 638 (48.1%) showed allele discordance at the queried locus, whereas 688 (51.9%) lacked even a same-locus gnomAD record. Tier 2 was also enriched for representation-sensitive classes: indels, duplications, and insertions accounted for 640 of 1,326 Tier 2 variants (48.3%), compared with 106 of 357 Tier 1 variants (29.7%), corresponding to an odds ratio of 2.21.</w:t>
-      </w:r>
-    </w:p>
-    <w:p>
-      <w:r>
-        <w:t>This means that non-observation at the allele level is not a uniform proxy for rarity. For precisely the classes most vulnerable to representation instability, absence of an allele-resolved match often reflects discordance between public assertion and aggregation systems rather than genuine population absence.</w:t>
       </w:r>
     </w:p>
     <w:p>
@@ -662,12 +1694,30 @@
         <w:pStyle w:val="Heading2"/>
       </w:pPr>
       <w:r>
-        <w:t>3. Global AF alone suppresses ancestry-localized tension in the evaluable exome subset</w:t>
+        <w:t>2. Tier 2 Reflects Structured Representation Limits, Not Random Absence</w:t>
       </w:r>
     </w:p>
     <w:p>
       <w:r>
-        <w:t>Within the 334 Tier 1 variants with usable AF, 321 (96.1%) had global AF &lt;= 1x10^-5, so a global-AF-only review would have flagged just 13 variants. Replacing global AF with the maximum of global AF and popmax AF increased the alert set to 115. Global-only review therefore missed 102 of 115 ancestry-aware alerts (88.7%).</w:t>
+        <w:t>Tier 2 is not a homogeneous gray zone. Within its 1,326 variants, 638 (48.1%) showed allele discordance at the queried locus, whereas 688 (51.9%) lacked even a same-locus gnomAD record. Tier 2 was also enriched for representation-sensitive classes: indels, duplications, and insertions accounted for 640 of 1,326 Tier 2 variants (48.3%), compared with 106 of 357 Tier 1 variants (29.7%), corresponding to an odds ratio of 2.21.</w:t>
+      </w:r>
+    </w:p>
+    <w:p>
+      <w:r>
+        <w:t>This means that non-observation at the allele level is not a uniform proxy for rarity. For precisely the classes most vulnerable to representation instability, absence of an allele-resolved match often reflects discordance between public assertion and aggregation systems rather than genuine population absence. This argument applies most strongly to indels, duplications, and splice-disrupting variants, where representation instability can cause genuine alleles to be absent from frequency databases for technical reasons. For SNVs in well-covered callable regions, allele absence in gnomAD may constitute meaningful rarity evidence with a computable upper bound. This study conservatively treats all non-recovered variants as not allele-level frequency-evaluable rather than absent from the population, and does not apply coverage-based negative-lookup inference.</w:t>
+      </w:r>
+    </w:p>
+    <w:p>
+      <w:pPr>
+        <w:pStyle w:val="Heading2"/>
+      </w:pPr>
+      <w:r>
+        <w:t>3. Global AF Alone Suppresses Ancestry-Localized Tension in the Evaluable Exome Subset</w:t>
+      </w:r>
+    </w:p>
+    <w:p>
+      <w:r>
+        <w:t>Within the 334 Tier 1 variants with usable AF, 321 (96.1%) had global AF &lt;= 1 x 10^-5, so a global-AF-only review would have flagged just 13 variants. Replacing global AF with the maximum of global AF and popmax AF increased the alert set to 115. Global-only review therefore missed 102 of 115 ancestry-aware alerts (88.7%).</w:t>
       </w:r>
     </w:p>
     <w:p>
@@ -732,7 +1782,7 @@
         <w:pStyle w:val="Heading2"/>
       </w:pPr>
       <w:r>
-        <w:t>4. Exome-resolved frequency tension spans three interpretation regimes beneath a shared public label</w:t>
+        <w:t>4. Exome-Resolved Frequency Tension Spans Three Interpretation Regimes Beneath a Shared Public Label</w:t>
       </w:r>
     </w:p>
     <w:p>
@@ -1073,6 +2123,11 @@
     <w:p/>
     <w:p>
       <w:r>
+        <w:t>This MCAF-based regime classification is a structural portability stress-test, not a variant reclassification framework. It does not adjudicate whether any individual variant is pathogenic or benign; it tests whether the dominant high-penetrance disease model implied by an unqualified P/LP label remains compatible with observed population frequencies. A hard-incompatible regime does not reclassify the variant as benign; it identifies a label that requires explicit disease-model specification, such as recessive inheritance, reduced penetrance, or population-specific context, to sustain a coherent interpretation.</w:t>
+      </w:r>
+    </w:p>
+    <w:p>
+      <w:r>
         <w:t>SCN5A VCV000440850 remains the clearest incompatibility case in the exome-resolved subset. KCNH2 VCV004535537 illustrates a parameter-sensitive monitoring regime rather than a categorical collapse, and TRDN VCV001325231 shows how a generic P/LP label can flatten a carrier-compatible recessive allele into an apparently dominant claim unless the disease model is made explicit.</w:t>
       </w:r>
     </w:p>
@@ -1081,12 +2136,1556 @@
         <w:pStyle w:val="Heading2"/>
       </w:pPr>
       <w:r>
-        <w:t>5. HGDP adds regional resolution but sharpens the match-class problem</w:t>
+        <w:t>5. VITAL Converts Frequency and Evaluability Stress Into Actionability Routing</w:t>
       </w:r>
     </w:p>
     <w:p>
       <w:r>
-        <w:t>We next applied a second, stricter resolution stress-test using gnomAD r3.1.2 genomes and HGDP regional frequencies. Under four-level reconciliation, 340 of 1,731 variants entered the HGDP matched universe:</w:t>
+        <w:t>Under the formal label-driven baseline, all 1,731 arrhythmia P/LP variants entered ROUTE_PLP_ACTIONABLE. After VITAL routing, only 219/1,731 (12.7%) remained VITAL_OK. The remaining 1,512/1,731 (87.3%) were rerouted away from direct actionability.</w:t>
+      </w:r>
+    </w:p>
+    <w:p>
+      <w:r>
+        <w:t>Most rerouted decisions were evaluation-limited: 1,397/1,731 (80.7%). A smaller subset required direct frequency or model review: 77/1,731 (4.4%) were risk-escalating and 38/1,731 (2.2%) were model-correcting. Across the six-domain meta-analysis, the mean nonpass rate was 87.7%.</w:t>
+      </w:r>
+    </w:p>
+    <w:p>
+      <w:pPr>
+        <w:jc w:val="center"/>
+      </w:pPr>
+      <w:r>
+        <w:drawing>
+          <wp:inline xmlns:a="http://schemas.openxmlformats.org/drawingml/2006/main" xmlns:pic="http://schemas.openxmlformats.org/drawingml/2006/picture">
+            <wp:extent cx="6217920" cy="2646645"/>
+            <wp:docPr id="3" name="Picture 3"/>
+            <wp:cNvGraphicFramePr>
+              <a:graphicFrameLocks noChangeAspect="1"/>
+            </wp:cNvGraphicFramePr>
+            <a:graphic>
+              <a:graphicData uri="http://schemas.openxmlformats.org/drawingml/2006/picture">
+                <pic:pic>
+                  <pic:nvPicPr>
+                    <pic:cNvPr id="0" name="vital_decision_disruption.png"/>
+                    <pic:cNvPicPr/>
+                  </pic:nvPicPr>
+                  <pic:blipFill>
+                    <a:blip r:embed="rId11"/>
+                    <a:stretch>
+                      <a:fillRect/>
+                    </a:stretch>
+                  </pic:blipFill>
+                  <pic:spPr>
+                    <a:xfrm>
+                      <a:off x="0" y="0"/>
+                      <a:ext cx="6217920" cy="2646645"/>
+                    </a:xfrm>
+                    <a:prstGeom prst="rect"/>
+                  </pic:spPr>
+                </pic:pic>
+              </a:graphicData>
+            </a:graphic>
+          </wp:inline>
+        </w:drawing>
+      </w:r>
+    </w:p>
+    <w:p>
+      <w:pPr>
+        <w:jc w:val="center"/>
+      </w:pPr>
+      <w:r>
+        <w:rPr>
+          <w:i/>
+          <w:sz w:val="18"/>
+        </w:rPr>
+        <w:t>Figure 3. Label-to-actionability routing audit.</w:t>
+      </w:r>
+    </w:p>
+    <w:p/>
+    <w:p>
+      <w:r>
+        <w:t>The central result is therefore not that 87% of labels are false. It is that 87% of label-driven actionability decisions require rerouting once minimal constraints are restored.</w:t>
+      </w:r>
+    </w:p>
+    <w:p>
+      <w:pPr>
+        <w:pStyle w:val="Heading2"/>
+      </w:pPr>
+      <w:r>
+        <w:t>6. Routing Instability Persists Among High-Review Assertions</w:t>
+      </w:r>
+    </w:p>
+    <w:p>
+      <w:r>
+        <w:t>Routing instability persisted after restricting to high-review ClinVar assertions. In the review-score &gt;= 2 subset, 309/365 variants (84.7%) left the direct-actionable baseline. Within that high-review subset, 256/365 (70.1%) were evaluation-limited, 33/365 (9.0%) required population review, and 20/365 (5.5%) required model-specific rerouting.</w:t>
+      </w:r>
+    </w:p>
+    <w:p>
+      <w:r>
+        <w:t>This pattern shows that the effect is not driven by low-confidence submissions alone. The problem is not simply that public databases contain noisy labels. The problem is that even strong label objects are not automatically portable actionability objects.</w:t>
+      </w:r>
+    </w:p>
+    <w:p>
+      <w:pPr>
+        <w:pStyle w:val="Heading2"/>
+      </w:pPr>
+      <w:r>
+        <w:t>7. HGDP Is a Supplementary Regional Stress Map, Not a Primary Burden Layer</w:t>
+      </w:r>
+    </w:p>
+    <w:p>
+      <w:r>
+        <w:t>HGDP adds regional resolution but weak allele-level coverage for this question. We therefore treat it as supplementary architecture, not as co-equal evidence with the exome-resolved primary analysis.</w:t>
+      </w:r>
+    </w:p>
+    <w:p>
+      <w:r>
+        <w:t>The strict allele subset contained 64 variants. Within that allele-level subset, 4/64 (6.2%) were non-dominant-compatible under the tested MCAF framework. A much larger position-overlap-expanded universe produced a higher stress signal (67/339; 19.8%), but most of that denominator expansion came from same-position rather than same-allele evidence. It is therefore reported only as a locus-context stress map.</w:t>
+      </w:r>
+    </w:p>
+    <w:p>
+      <w:r>
+        <w:t>The main-text implication is deliberately narrow: HGDP supports the direction of the exome finding but is not used to estimate primary burden.</w:t>
+      </w:r>
+    </w:p>
+    <w:p>
+      <w:pPr>
+        <w:pStyle w:val="Heading2"/>
+      </w:pPr>
+      <w:r>
+        <w:t>8. Molecular Mechanism Predicts Disease-Model Stability</w:t>
+      </w:r>
+    </w:p>
+    <w:p>
+      <w:r>
+        <w:t>Decomposition rates varied systematically and predictably across gene classes defined by molecular mechanism. These mechanism labels define the disease-model context being stress-tested for each gene, not the intrinsic mechanism of every variant in that gene.</w:t>
+      </w:r>
+    </w:p>
+    <w:tbl>
+      <w:tblPr>
+        <w:tblStyle w:val="TableGrid"/>
+        <w:tblW w:type="auto" w:w="0"/>
+        <w:jc w:val="center"/>
+        <w:tblLook w:firstColumn="1" w:firstRow="1" w:lastColumn="0" w:lastRow="0" w:noHBand="0" w:noVBand="1" w:val="04A0"/>
+      </w:tblPr>
+      <w:tblGrid>
+        <w:gridCol w:w="2592"/>
+        <w:gridCol w:w="2592"/>
+        <w:gridCol w:w="2592"/>
+        <w:gridCol w:w="2592"/>
+      </w:tblGrid>
+      <w:tr>
+        <w:tc>
+          <w:tcPr>
+            <w:tcW w:type="dxa" w:w="2592"/>
+            <w:vAlign w:val="top"/>
+            <w:shd w:fill="D9EAF7"/>
+          </w:tcPr>
+          <w:p>
+            <w:pPr>
+              <w:jc w:val="left"/>
+            </w:pPr>
+            <w:r/>
+            <w:r>
+              <w:rPr>
+                <w:b/>
+                <w:sz w:val="16"/>
+              </w:rPr>
+              <w:t>Mechanism class</w:t>
+            </w:r>
+          </w:p>
+        </w:tc>
+        <w:tc>
+          <w:tcPr>
+            <w:tcW w:type="dxa" w:w="2592"/>
+            <w:vAlign w:val="top"/>
+            <w:shd w:fill="D9EAF7"/>
+          </w:tcPr>
+          <w:p>
+            <w:pPr>
+              <w:jc w:val="left"/>
+            </w:pPr>
+            <w:r/>
+            <w:r>
+              <w:rPr>
+                <w:b/>
+                <w:sz w:val="16"/>
+              </w:rPr>
+              <w:t>Decomposition rate</w:t>
+            </w:r>
+          </w:p>
+        </w:tc>
+        <w:tc>
+          <w:tcPr>
+            <w:tcW w:type="dxa" w:w="2592"/>
+            <w:vAlign w:val="top"/>
+            <w:shd w:fill="D9EAF7"/>
+          </w:tcPr>
+          <w:p>
+            <w:pPr>
+              <w:jc w:val="left"/>
+            </w:pPr>
+            <w:r/>
+            <w:r>
+              <w:rPr>
+                <w:b/>
+                <w:sz w:val="16"/>
+              </w:rPr>
+              <w:t>Representative genes</w:t>
+            </w:r>
+          </w:p>
+        </w:tc>
+        <w:tc>
+          <w:tcPr>
+            <w:tcW w:type="dxa" w:w="2592"/>
+            <w:vAlign w:val="top"/>
+            <w:shd w:fill="D9EAF7"/>
+          </w:tcPr>
+          <w:p>
+            <w:pPr>
+              <w:jc w:val="left"/>
+            </w:pPr>
+            <w:r/>
+            <w:r>
+              <w:rPr>
+                <w:b/>
+                <w:sz w:val="16"/>
+              </w:rPr>
+              <w:t>Interpretation</w:t>
+            </w:r>
+          </w:p>
+        </w:tc>
+      </w:tr>
+      <w:tr>
+        <w:tc>
+          <w:tcPr>
+            <w:tcW w:type="dxa" w:w="2592"/>
+            <w:vAlign w:val="top"/>
+          </w:tcPr>
+          <w:p>
+            <w:pPr>
+              <w:jc w:val="left"/>
+            </w:pPr>
+            <w:r/>
+            <w:r>
+              <w:rPr>
+                <w:b w:val="0"/>
+                <w:sz w:val="16"/>
+              </w:rPr>
+              <w:t>Gain-of-function / dominant-negative</w:t>
+            </w:r>
+          </w:p>
+        </w:tc>
+        <w:tc>
+          <w:tcPr>
+            <w:tcW w:type="dxa" w:w="2592"/>
+            <w:vAlign w:val="top"/>
+          </w:tcPr>
+          <w:p>
+            <w:pPr>
+              <w:jc w:val="left"/>
+            </w:pPr>
+            <w:r/>
+            <w:r>
+              <w:rPr>
+                <w:b w:val="0"/>
+                <w:sz w:val="16"/>
+              </w:rPr>
+              <w:t>0%</w:t>
+            </w:r>
+          </w:p>
+        </w:tc>
+        <w:tc>
+          <w:tcPr>
+            <w:tcW w:type="dxa" w:w="2592"/>
+            <w:vAlign w:val="top"/>
+          </w:tcPr>
+          <w:p>
+            <w:pPr>
+              <w:jc w:val="left"/>
+            </w:pPr>
+            <w:r/>
+            <w:r>
+              <w:rPr>
+                <w:b w:val="0"/>
+                <w:sz w:val="16"/>
+              </w:rPr>
+              <w:t>RYR2, CALM1-CALM3, KCNJ2</w:t>
+            </w:r>
+          </w:p>
+        </w:tc>
+        <w:tc>
+          <w:tcPr>
+            <w:tcW w:type="dxa" w:w="2592"/>
+            <w:vAlign w:val="top"/>
+          </w:tcPr>
+          <w:p>
+            <w:pPr>
+              <w:jc w:val="left"/>
+            </w:pPr>
+            <w:r/>
+            <w:r>
+              <w:rPr>
+                <w:b w:val="0"/>
+                <w:sz w:val="16"/>
+              </w:rPr>
+              <w:t>Positive control: strong purifying selection on heterozygotes keeps variants universally rare</w:t>
+            </w:r>
+          </w:p>
+        </w:tc>
+      </w:tr>
+      <w:tr>
+        <w:tc>
+          <w:tcPr>
+            <w:tcW w:type="dxa" w:w="2592"/>
+            <w:vAlign w:val="top"/>
+          </w:tcPr>
+          <w:p>
+            <w:pPr>
+              <w:jc w:val="left"/>
+            </w:pPr>
+            <w:r/>
+            <w:r>
+              <w:rPr>
+                <w:b w:val="0"/>
+                <w:sz w:val="16"/>
+              </w:rPr>
+              <w:t>Haploinsufficient</w:t>
+            </w:r>
+          </w:p>
+        </w:tc>
+        <w:tc>
+          <w:tcPr>
+            <w:tcW w:type="dxa" w:w="2592"/>
+            <w:vAlign w:val="top"/>
+          </w:tcPr>
+          <w:p>
+            <w:pPr>
+              <w:jc w:val="left"/>
+            </w:pPr>
+            <w:r/>
+            <w:r>
+              <w:rPr>
+                <w:b w:val="0"/>
+                <w:sz w:val="16"/>
+              </w:rPr>
+              <w:t>approximately 29%</w:t>
+            </w:r>
+          </w:p>
+        </w:tc>
+        <w:tc>
+          <w:tcPr>
+            <w:tcW w:type="dxa" w:w="2592"/>
+            <w:vAlign w:val="top"/>
+          </w:tcPr>
+          <w:p>
+            <w:pPr>
+              <w:jc w:val="left"/>
+            </w:pPr>
+            <w:r/>
+            <w:r>
+              <w:rPr>
+                <w:b w:val="0"/>
+                <w:sz w:val="16"/>
+              </w:rPr>
+              <w:t>SCN5A HI context, ANK2</w:t>
+            </w:r>
+          </w:p>
+        </w:tc>
+        <w:tc>
+          <w:tcPr>
+            <w:tcW w:type="dxa" w:w="2592"/>
+            <w:vAlign w:val="top"/>
+          </w:tcPr>
+          <w:p>
+            <w:pPr>
+              <w:jc w:val="left"/>
+            </w:pPr>
+            <w:r/>
+            <w:r>
+              <w:rPr>
+                <w:b w:val="0"/>
+                <w:sz w:val="16"/>
+              </w:rPr>
+              <w:t>Moderate selection permits some enrichment in specific ancestry groups</w:t>
+            </w:r>
+          </w:p>
+        </w:tc>
+      </w:tr>
+      <w:tr>
+        <w:tc>
+          <w:tcPr>
+            <w:tcW w:type="dxa" w:w="2592"/>
+            <w:vAlign w:val="top"/>
+          </w:tcPr>
+          <w:p>
+            <w:pPr>
+              <w:jc w:val="left"/>
+            </w:pPr>
+            <w:r/>
+            <w:r>
+              <w:rPr>
+                <w:b w:val="0"/>
+                <w:sz w:val="16"/>
+              </w:rPr>
+              <w:t>Recessive</w:t>
+            </w:r>
+          </w:p>
+        </w:tc>
+        <w:tc>
+          <w:tcPr>
+            <w:tcW w:type="dxa" w:w="2592"/>
+            <w:vAlign w:val="top"/>
+          </w:tcPr>
+          <w:p>
+            <w:pPr>
+              <w:jc w:val="left"/>
+            </w:pPr>
+            <w:r/>
+            <w:r>
+              <w:rPr>
+                <w:b w:val="0"/>
+                <w:sz w:val="16"/>
+              </w:rPr>
+              <w:t>37-54%</w:t>
+            </w:r>
+          </w:p>
+        </w:tc>
+        <w:tc>
+          <w:tcPr>
+            <w:tcW w:type="dxa" w:w="2592"/>
+            <w:vAlign w:val="top"/>
+          </w:tcPr>
+          <w:p>
+            <w:pPr>
+              <w:jc w:val="left"/>
+            </w:pPr>
+            <w:r/>
+            <w:r>
+              <w:rPr>
+                <w:b w:val="0"/>
+                <w:sz w:val="16"/>
+              </w:rPr>
+              <w:t>TRDN, CASQ2, KCNE1</w:t>
+            </w:r>
+          </w:p>
+        </w:tc>
+        <w:tc>
+          <w:tcPr>
+            <w:tcW w:type="dxa" w:w="2592"/>
+            <w:vAlign w:val="top"/>
+          </w:tcPr>
+          <w:p>
+            <w:pPr>
+              <w:jc w:val="left"/>
+            </w:pPr>
+            <w:r/>
+            <w:r>
+              <w:rPr>
+                <w:b w:val="0"/>
+                <w:sz w:val="16"/>
+              </w:rPr>
+              <w:t>Weak heterozygous selection allows carrier frequencies inconsistent with dominant models</w:t>
+            </w:r>
+          </w:p>
+        </w:tc>
+      </w:tr>
+    </w:tbl>
+    <w:p/>
+    <w:p>
+      <w:r>
+        <w:t>The GoF/dominant-negative class at 0% decomposition at MCAF &gt;= 2.5 x 10^-5 constitutes a positive control supporting the interpretation that decomposition at biologically interpretable thresholds reflects genuine biology rather than methodological artifact (0/34 evaluable variants; 95% CI 0-10.2%; rule-of-three upper bound 8.8%). At sub-biological thresholds below 2.5 x 10^-5, GoF/DN variants are also flagged, confirming that threshold choice determines whether the pipeline detects genuine disease-model incompatibility or normal population variation.</w:t>
+      </w:r>
+    </w:p>
+    <w:p>
+      <w:r>
+        <w:t>Variant consequence interacts with inheritance mode in the same direction. Missense variants in autosomal dominant genes decomposed at 6.7%, compared with 26.2% for loss-of-function variants in the same genes, a four-fold difference consistent with mechanism-dependent purifying selection. Loss-of-function in autosomal recessive genes reached 34.0%, and splice-disrupting variants reached 54.5%.</w:t>
+      </w:r>
+    </w:p>
+    <w:p>
+      <w:r>
+        <w:t>Logistic regression confirmed that LOEUF score and recessive or haploinsufficient mechanism class increased decomposition odds, while missense consequence was associated with lower decomposition odds relative to loss-of-function (OR = 0.83). Disease domain remained a modest predictor (arrhythmia versus cancer OR = 1.69, p &lt; 0.001), likely reflecting broader mechanism heterogeneity in arrhythmia genes compared with the predominantly haploinsufficient/MMR architecture of cancer genes. Because the GoF/DN mechanism class exhibits complete separation, Firth-type penalized logistic regression was used to obtain finite estimates.</w:t>
+      </w:r>
+    </w:p>
+    <w:p>
+      <w:r>
+        <w:t>Leave-one-gene-out sensitivity analysis preserved the mechanism gradient in every iteration. The overall decomposition rate ranged from 17.2% to 21.3% (overall 19.5%; maximum single-gene shift 2.3 percentage points, driven by TRDN exclusion). The ordering GoF/DN &lt; HI &lt; AR was preserved without exception. Excluding limited-evidence genes (AKAP9, CACNA2D1, CACNB2, SNTA1), mixed-mechanism genes (SCN5A, KCNQ1, CACNA1C, KCNE1), or all eight disputed/mixed genes still preserved the gradient.</w:t>
+      </w:r>
+    </w:p>
+    <w:p>
+      <w:r>
+        <w:t>ClinVar review status analysis also showed that decomposition is not driven by low-confidence submissions. Among Tier 1 variants at MCAF = 2.5 x 10^-5, no-assertion-criteria variants decomposed at 3/12 (25.0%), single-submitter variants at 28/213 (13.1%), and multiple-submitters-no-conflicts variants at 34/109 (31.2%). The higher rate in the multiple-submitter subset is consistent with enrichment of well-characterized, population-common alleles that attract multiple submissions precisely because they are frequent enough to be independently observed. Restricting to Pathogenic (not Likely pathogenic) classification yielded 21/148 (14.2%), lower than the overall rate but preserving the mechanism gradient. Restricting to multiple-submitter (&gt;=2-star) variants yielded 34/109 (31.2%), higher than overall, with the mechanism gradient steepened.</w:t>
+      </w:r>
+    </w:p>
+    <w:p>
+      <w:pPr>
+        <w:pStyle w:val="Heading2"/>
+      </w:pPr>
+      <w:r>
+        <w:t>9. Cross-Domain Analyses Are Sanity Checks, Not Standalone Validation</w:t>
+      </w:r>
+    </w:p>
+    <w:p>
+      <w:r>
+        <w:t>The cross-domain layers are intentionally demoted to structural sanity checks. The hereditary-cancer analysis asks whether evaluability compression and regime heterogeneity recur under a different mechanism mix; it does not estimate clinically calibrated cancer burden because the thresholds were inherited from arrhythmia.</w:t>
+      </w:r>
+    </w:p>
+    <w:p>
+      <w:r>
+        <w:t>The five external disease panels similarly test recurrence of routing instability, not independent clinical validity. Their nonpass rates ranged from 82.7% to 95.0%, yielding a six-domain mean of 87.7%. This supports the generality of the infrastructure problem, while leaving disease-specific burden estimation to domain-calibrated analyses.</w:t>
+      </w:r>
+    </w:p>
+    <w:p>
+      <w:pPr>
+        <w:jc w:val="center"/>
+      </w:pPr>
+      <w:r>
+        <w:drawing>
+          <wp:inline xmlns:a="http://schemas.openxmlformats.org/drawingml/2006/main" xmlns:pic="http://schemas.openxmlformats.org/drawingml/2006/picture">
+            <wp:extent cx="6217920" cy="2529323"/>
+            <wp:docPr id="4" name="Picture 4"/>
+            <wp:cNvGraphicFramePr>
+              <a:graphicFrameLocks noChangeAspect="1"/>
+            </wp:cNvGraphicFramePr>
+            <a:graphic>
+              <a:graphicData uri="http://schemas.openxmlformats.org/drawingml/2006/picture">
+                <pic:pic>
+                  <pic:nvPicPr>
+                    <pic:cNvPr id="0" name="vital_external_panel_evaluability_portability.png"/>
+                    <pic:cNvPicPr/>
+                  </pic:nvPicPr>
+                  <pic:blipFill>
+                    <a:blip r:embed="rId12"/>
+                    <a:stretch>
+                      <a:fillRect/>
+                    </a:stretch>
+                  </pic:blipFill>
+                  <pic:spPr>
+                    <a:xfrm>
+                      <a:off x="0" y="0"/>
+                      <a:ext cx="6217920" cy="2529323"/>
+                    </a:xfrm>
+                    <a:prstGeom prst="rect"/>
+                  </pic:spPr>
+                </pic:pic>
+              </a:graphicData>
+            </a:graphic>
+          </wp:inline>
+        </w:drawing>
+      </w:r>
+    </w:p>
+    <w:p>
+      <w:pPr>
+        <w:jc w:val="center"/>
+      </w:pPr>
+      <w:r>
+        <w:rPr>
+          <w:i/>
+          <w:sz w:val="18"/>
+        </w:rPr>
+        <w:t>Figure 4. Evaluability and portability failure recur across external disease panels.</w:t>
+      </w:r>
+    </w:p>
+    <w:p/>
+    <w:p>
+      <w:pPr>
+        <w:pStyle w:val="Heading2"/>
+      </w:pPr>
+      <w:r>
+        <w:t>10. Validation Is Layered: Expert Positives, Controls, Review Status, and Pipeline Routing</w:t>
+      </w:r>
+    </w:p>
+    <w:p>
+      <w:r>
+        <w:t>No single validation layer is large enough to carry the manuscript alone, so validation is presented as a calibration suite.</w:t>
+      </w:r>
+    </w:p>
+    <w:tbl>
+      <w:tblPr>
+        <w:tblStyle w:val="TableGrid"/>
+        <w:tblW w:type="auto" w:w="0"/>
+        <w:jc w:val="center"/>
+        <w:tblLook w:firstColumn="1" w:firstRow="1" w:lastColumn="0" w:lastRow="0" w:noHBand="0" w:noVBand="1" w:val="04A0"/>
+      </w:tblPr>
+      <w:tblGrid>
+        <w:gridCol w:w="2592"/>
+        <w:gridCol w:w="2592"/>
+        <w:gridCol w:w="2592"/>
+        <w:gridCol w:w="2592"/>
+      </w:tblGrid>
+      <w:tr>
+        <w:tc>
+          <w:tcPr>
+            <w:tcW w:type="dxa" w:w="2592"/>
+            <w:vAlign w:val="top"/>
+            <w:shd w:fill="D9EAF7"/>
+          </w:tcPr>
+          <w:p>
+            <w:pPr>
+              <w:jc w:val="left"/>
+            </w:pPr>
+            <w:r/>
+            <w:r>
+              <w:rPr>
+                <w:b/>
+                <w:sz w:val="16"/>
+              </w:rPr>
+              <w:t>Validation layer</w:t>
+            </w:r>
+          </w:p>
+        </w:tc>
+        <w:tc>
+          <w:tcPr>
+            <w:tcW w:type="dxa" w:w="2592"/>
+            <w:vAlign w:val="top"/>
+            <w:shd w:fill="D9EAF7"/>
+          </w:tcPr>
+          <w:p>
+            <w:pPr>
+              <w:jc w:val="left"/>
+            </w:pPr>
+            <w:r/>
+            <w:r>
+              <w:rPr>
+                <w:b/>
+                <w:sz w:val="16"/>
+              </w:rPr>
+              <w:t>Question</w:t>
+            </w:r>
+          </w:p>
+        </w:tc>
+        <w:tc>
+          <w:tcPr>
+            <w:tcW w:type="dxa" w:w="2592"/>
+            <w:vAlign w:val="top"/>
+            <w:shd w:fill="D9EAF7"/>
+          </w:tcPr>
+          <w:p>
+            <w:pPr>
+              <w:jc w:val="left"/>
+            </w:pPr>
+            <w:r/>
+            <w:r>
+              <w:rPr>
+                <w:b/>
+                <w:sz w:val="16"/>
+              </w:rPr>
+              <w:t>Result</w:t>
+            </w:r>
+          </w:p>
+        </w:tc>
+        <w:tc>
+          <w:tcPr>
+            <w:tcW w:type="dxa" w:w="2592"/>
+            <w:vAlign w:val="top"/>
+            <w:shd w:fill="D9EAF7"/>
+          </w:tcPr>
+          <w:p>
+            <w:pPr>
+              <w:jc w:val="left"/>
+            </w:pPr>
+            <w:r/>
+            <w:r>
+              <w:rPr>
+                <w:b/>
+                <w:sz w:val="16"/>
+              </w:rPr>
+              <w:t>Interpretation</w:t>
+            </w:r>
+          </w:p>
+        </w:tc>
+      </w:tr>
+      <w:tr>
+        <w:tc>
+          <w:tcPr>
+            <w:tcW w:type="dxa" w:w="2592"/>
+            <w:vAlign w:val="top"/>
+          </w:tcPr>
+          <w:p>
+            <w:pPr>
+              <w:jc w:val="left"/>
+            </w:pPr>
+            <w:r/>
+            <w:r>
+              <w:rPr>
+                <w:b w:val="0"/>
+                <w:sz w:val="16"/>
+              </w:rPr>
+              <w:t>High-review ClinVar assertions</w:t>
+            </w:r>
+          </w:p>
+        </w:tc>
+        <w:tc>
+          <w:tcPr>
+            <w:tcW w:type="dxa" w:w="2592"/>
+            <w:vAlign w:val="top"/>
+          </w:tcPr>
+          <w:p>
+            <w:pPr>
+              <w:jc w:val="left"/>
+            </w:pPr>
+            <w:r/>
+            <w:r>
+              <w:rPr>
+                <w:b w:val="0"/>
+                <w:sz w:val="16"/>
+              </w:rPr>
+              <w:t>Is routing instability driven by weak submissions?</w:t>
+            </w:r>
+          </w:p>
+        </w:tc>
+        <w:tc>
+          <w:tcPr>
+            <w:tcW w:type="dxa" w:w="2592"/>
+            <w:vAlign w:val="top"/>
+          </w:tcPr>
+          <w:p>
+            <w:pPr>
+              <w:jc w:val="left"/>
+            </w:pPr>
+            <w:r/>
+            <w:r>
+              <w:rPr>
+                <w:b w:val="0"/>
+                <w:sz w:val="16"/>
+              </w:rPr>
+              <w:t>309/365 high-review assertions (84.7%) left the direct-actionable baseline.</w:t>
+            </w:r>
+          </w:p>
+        </w:tc>
+        <w:tc>
+          <w:tcPr>
+            <w:tcW w:type="dxa" w:w="2592"/>
+            <w:vAlign w:val="top"/>
+          </w:tcPr>
+          <w:p>
+            <w:pPr>
+              <w:jc w:val="left"/>
+            </w:pPr>
+            <w:r/>
+            <w:r>
+              <w:rPr>
+                <w:b w:val="0"/>
+                <w:sz w:val="16"/>
+              </w:rPr>
+              <w:t>No; high review status does not restore portability.</w:t>
+            </w:r>
+          </w:p>
+        </w:tc>
+      </w:tr>
+      <w:tr>
+        <w:tc>
+          <w:tcPr>
+            <w:tcW w:type="dxa" w:w="2592"/>
+            <w:vAlign w:val="top"/>
+          </w:tcPr>
+          <w:p>
+            <w:pPr>
+              <w:jc w:val="left"/>
+            </w:pPr>
+            <w:r/>
+            <w:r>
+              <w:rPr>
+                <w:b w:val="0"/>
+                <w:sz w:val="16"/>
+              </w:rPr>
+              <w:t>Expert-curated P/LP positives</w:t>
+            </w:r>
+          </w:p>
+        </w:tc>
+        <w:tc>
+          <w:tcPr>
+            <w:tcW w:type="dxa" w:w="2592"/>
+            <w:vAlign w:val="top"/>
+          </w:tcPr>
+          <w:p>
+            <w:pPr>
+              <w:jc w:val="left"/>
+            </w:pPr>
+            <w:r/>
+            <w:r>
+              <w:rPr>
+                <w:b w:val="0"/>
+                <w:sz w:val="16"/>
+              </w:rPr>
+              <w:t>Does VITAL indiscriminately overturn expert positives?</w:t>
+            </w:r>
+          </w:p>
+        </w:tc>
+        <w:tc>
+          <w:tcPr>
+            <w:tcW w:type="dxa" w:w="2592"/>
+            <w:vAlign w:val="top"/>
+          </w:tcPr>
+          <w:p>
+            <w:pPr>
+              <w:jc w:val="left"/>
+            </w:pPr>
+            <w:r/>
+            <w:r>
+              <w:rPr>
+                <w:b w:val="0"/>
+                <w:sz w:val="16"/>
+              </w:rPr>
+              <w:t>69/73 evaluable expert-curated positives (94.5%) remained VITAL_OK or review-level.</w:t>
+            </w:r>
+          </w:p>
+        </w:tc>
+        <w:tc>
+          <w:tcPr>
+            <w:tcW w:type="dxa" w:w="2592"/>
+            <w:vAlign w:val="top"/>
+          </w:tcPr>
+          <w:p>
+            <w:pPr>
+              <w:jc w:val="left"/>
+            </w:pPr>
+            <w:r/>
+            <w:r>
+              <w:rPr>
+                <w:b w:val="0"/>
+                <w:sz w:val="16"/>
+              </w:rPr>
+              <w:t>Expert truth is mostly preserved.</w:t>
+            </w:r>
+          </w:p>
+        </w:tc>
+      </w:tr>
+      <w:tr>
+        <w:tc>
+          <w:tcPr>
+            <w:tcW w:type="dxa" w:w="2592"/>
+            <w:vAlign w:val="top"/>
+          </w:tcPr>
+          <w:p>
+            <w:pPr>
+              <w:jc w:val="left"/>
+            </w:pPr>
+            <w:r/>
+            <w:r>
+              <w:rPr>
+                <w:b w:val="0"/>
+                <w:sz w:val="16"/>
+              </w:rPr>
+              <w:t>Hard-conflict behavior</w:t>
+            </w:r>
+          </w:p>
+        </w:tc>
+        <w:tc>
+          <w:tcPr>
+            <w:tcW w:type="dxa" w:w="2592"/>
+            <w:vAlign w:val="top"/>
+          </w:tcPr>
+          <w:p>
+            <w:pPr>
+              <w:jc w:val="left"/>
+            </w:pPr>
+            <w:r/>
+            <w:r>
+              <w:rPr>
+                <w:b w:val="0"/>
+                <w:sz w:val="16"/>
+              </w:rPr>
+              <w:t>Is the severe alert burden low in expert positives?</w:t>
+            </w:r>
+          </w:p>
+        </w:tc>
+        <w:tc>
+          <w:tcPr>
+            <w:tcW w:type="dxa" w:w="2592"/>
+            <w:vAlign w:val="top"/>
+          </w:tcPr>
+          <w:p>
+            <w:pPr>
+              <w:jc w:val="left"/>
+            </w:pPr>
+            <w:r/>
+            <w:r>
+              <w:rPr>
+                <w:b w:val="0"/>
+                <w:sz w:val="16"/>
+              </w:rPr>
+              <w:t>4/73 evaluable expert-curated positives (5.5%) entered MODEL_CONFLICT.</w:t>
+            </w:r>
+          </w:p>
+        </w:tc>
+        <w:tc>
+          <w:tcPr>
+            <w:tcW w:type="dxa" w:w="2592"/>
+            <w:vAlign w:val="top"/>
+          </w:tcPr>
+          <w:p>
+            <w:pPr>
+              <w:jc w:val="left"/>
+            </w:pPr>
+            <w:r/>
+            <w:r>
+              <w:rPr>
+                <w:b w:val="0"/>
+                <w:sz w:val="16"/>
+              </w:rPr>
+              <w:t>Hard model-conflict routing is uncommon.</w:t>
+            </w:r>
+          </w:p>
+        </w:tc>
+      </w:tr>
+      <w:tr>
+        <w:tc>
+          <w:tcPr>
+            <w:tcW w:type="dxa" w:w="2592"/>
+            <w:vAlign w:val="top"/>
+          </w:tcPr>
+          <w:p>
+            <w:pPr>
+              <w:jc w:val="left"/>
+            </w:pPr>
+            <w:r/>
+            <w:r>
+              <w:rPr>
+                <w:b w:val="0"/>
+                <w:sz w:val="16"/>
+              </w:rPr>
+              <w:t>B/LB controls</w:t>
+            </w:r>
+          </w:p>
+        </w:tc>
+        <w:tc>
+          <w:tcPr>
+            <w:tcW w:type="dxa" w:w="2592"/>
+            <w:vAlign w:val="top"/>
+          </w:tcPr>
+          <w:p>
+            <w:pPr>
+              <w:jc w:val="left"/>
+            </w:pPr>
+            <w:r/>
+            <w:r>
+              <w:rPr>
+                <w:b w:val="0"/>
+                <w:sz w:val="16"/>
+              </w:rPr>
+              <w:t>Does VITAL behave as a pathogenicity classifier?</w:t>
+            </w:r>
+          </w:p>
+        </w:tc>
+        <w:tc>
+          <w:tcPr>
+            <w:tcW w:type="dxa" w:w="2592"/>
+            <w:vAlign w:val="top"/>
+          </w:tcPr>
+          <w:p>
+            <w:pPr>
+              <w:jc w:val="left"/>
+            </w:pPr>
+            <w:r/>
+            <w:r>
+              <w:rPr>
+                <w:b w:val="0"/>
+                <w:sz w:val="16"/>
+              </w:rPr>
+              <w:t>Common B/LB controls were incompatible with a forced dominant high-penetrance model.</w:t>
+            </w:r>
+          </w:p>
+        </w:tc>
+        <w:tc>
+          <w:tcPr>
+            <w:tcW w:type="dxa" w:w="2592"/>
+            <w:vAlign w:val="top"/>
+          </w:tcPr>
+          <w:p>
+            <w:pPr>
+              <w:jc w:val="left"/>
+            </w:pPr>
+            <w:r/>
+            <w:r>
+              <w:rPr>
+                <w:b w:val="0"/>
+                <w:sz w:val="16"/>
+              </w:rPr>
+              <w:t>VITAL detects model incompatibility, not pathogenicity status.</w:t>
+            </w:r>
+          </w:p>
+        </w:tc>
+      </w:tr>
+      <w:tr>
+        <w:tc>
+          <w:tcPr>
+            <w:tcW w:type="dxa" w:w="2592"/>
+            <w:vAlign w:val="top"/>
+          </w:tcPr>
+          <w:p>
+            <w:pPr>
+              <w:jc w:val="left"/>
+            </w:pPr>
+            <w:r/>
+            <w:r>
+              <w:rPr>
+                <w:b w:val="0"/>
+                <w:sz w:val="16"/>
+              </w:rPr>
+              <w:t>Simulated pipeline comparison</w:t>
+            </w:r>
+          </w:p>
+        </w:tc>
+        <w:tc>
+          <w:tcPr>
+            <w:tcW w:type="dxa" w:w="2592"/>
+            <w:vAlign w:val="top"/>
+          </w:tcPr>
+          <w:p>
+            <w:pPr>
+              <w:jc w:val="left"/>
+            </w:pPr>
+            <w:r/>
+            <w:r>
+              <w:rPr>
+                <w:b w:val="0"/>
+                <w:sz w:val="16"/>
+              </w:rPr>
+              <w:t>Does routing change a flattened workflow?</w:t>
+            </w:r>
+          </w:p>
+        </w:tc>
+        <w:tc>
+          <w:tcPr>
+            <w:tcW w:type="dxa" w:w="2592"/>
+            <w:vAlign w:val="top"/>
+          </w:tcPr>
+          <w:p>
+            <w:pPr>
+              <w:jc w:val="left"/>
+            </w:pPr>
+            <w:r/>
+            <w:r>
+              <w:rPr>
+                <w:b w:val="0"/>
+                <w:sz w:val="16"/>
+              </w:rPr>
+              <w:t>1,512/1,731 label-driven actionability decisions (87.3%) were interrupted.</w:t>
+            </w:r>
+          </w:p>
+        </w:tc>
+        <w:tc>
+          <w:tcPr>
+            <w:tcW w:type="dxa" w:w="2592"/>
+            <w:vAlign w:val="top"/>
+          </w:tcPr>
+          <w:p>
+            <w:pPr>
+              <w:jc w:val="left"/>
+            </w:pPr>
+            <w:r/>
+            <w:r>
+              <w:rPr>
+                <w:b w:val="0"/>
+                <w:sz w:val="16"/>
+              </w:rPr>
+              <w:t>VITAL changes workflow routing, not labels.</w:t>
+            </w:r>
+          </w:p>
+        </w:tc>
+      </w:tr>
+    </w:tbl>
+    <w:p/>
+    <w:p>
+      <w:r>
+        <w:t>The expert-curated arrhythmia subset in the current GRCh38 snapshot was small (17 variants total; 9 P/LP and 8 B/LB, concentrated in KCNQ1), so it is not treated as a standalone burden estimate. Its purpose is calibration: CHECK_POPMAX functions primarily as a refinement layer, while rare MODEL_CONFLICT cases define candidates for targeted review rather than broad disagreement with expert classification.</w:t>
+      </w:r>
+    </w:p>
+    <w:p>
+      <w:r>
+        <w:t>This validation architecture is sufficient for the manuscript's claim because the claim is routing, not final clinical adjudication. A larger blinded ClinGen/ClinVar expert-panel validation set would be the natural next external benchmark, but the current data already show that VITAL preserves most expert-curated positives while interrupting label-driven direct-actionability workflows.</w:t>
+      </w:r>
+    </w:p>
+    <w:p>
+      <w:pPr>
+        <w:pStyle w:val="Heading2"/>
+      </w:pPr>
+      <w:r>
+        <w:t>11. Actionability Discordance and Simulated CDS Routing</w:t>
+      </w:r>
+    </w:p>
+    <w:p>
+      <w:r>
+        <w:t>The Actionability Discordance Audit contained 24 repository-derived examples. Each example had a public P/LP label, an action-associated context, and a VITAL route away from direct actionability. The set included ancestry-aware frequency review, recessive or model-specific rerouting, hard dominant-model conflict, and evaluability-limited deferral.</w:t>
+      </w:r>
+    </w:p>
+    <w:tbl>
+      <w:tblPr>
+        <w:tblStyle w:val="TableGrid"/>
+        <w:tblW w:type="auto" w:w="0"/>
+        <w:jc w:val="center"/>
+        <w:tblLook w:firstColumn="1" w:firstRow="1" w:lastColumn="0" w:lastRow="0" w:noHBand="0" w:noVBand="1" w:val="04A0"/>
+      </w:tblPr>
+      <w:tblGrid>
+        <w:gridCol w:w="2592"/>
+        <w:gridCol w:w="2592"/>
+        <w:gridCol w:w="2592"/>
+        <w:gridCol w:w="2592"/>
+      </w:tblGrid>
+      <w:tr>
+        <w:tc>
+          <w:tcPr>
+            <w:tcW w:type="dxa" w:w="2592"/>
+            <w:vAlign w:val="top"/>
+            <w:shd w:fill="D9EAF7"/>
+          </w:tcPr>
+          <w:p>
+            <w:pPr>
+              <w:jc w:val="left"/>
+            </w:pPr>
+            <w:r/>
+            <w:r>
+              <w:rPr>
+                <w:b/>
+                <w:sz w:val="16"/>
+              </w:rPr>
+              <w:t>Variant</w:t>
+            </w:r>
+          </w:p>
+        </w:tc>
+        <w:tc>
+          <w:tcPr>
+            <w:tcW w:type="dxa" w:w="2592"/>
+            <w:vAlign w:val="top"/>
+            <w:shd w:fill="D9EAF7"/>
+          </w:tcPr>
+          <w:p>
+            <w:pPr>
+              <w:jc w:val="left"/>
+            </w:pPr>
+            <w:r/>
+            <w:r>
+              <w:rPr>
+                <w:b/>
+                <w:sz w:val="16"/>
+              </w:rPr>
+              <w:t>Baseline route</w:t>
+            </w:r>
+          </w:p>
+        </w:tc>
+        <w:tc>
+          <w:tcPr>
+            <w:tcW w:type="dxa" w:w="2592"/>
+            <w:vAlign w:val="top"/>
+            <w:shd w:fill="D9EAF7"/>
+          </w:tcPr>
+          <w:p>
+            <w:pPr>
+              <w:jc w:val="left"/>
+            </w:pPr>
+            <w:r/>
+            <w:r>
+              <w:rPr>
+                <w:b/>
+                <w:sz w:val="16"/>
+              </w:rPr>
+              <w:t>VITAL route</w:t>
+            </w:r>
+          </w:p>
+        </w:tc>
+        <w:tc>
+          <w:tcPr>
+            <w:tcW w:type="dxa" w:w="2592"/>
+            <w:vAlign w:val="top"/>
+            <w:shd w:fill="D9EAF7"/>
+          </w:tcPr>
+          <w:p>
+            <w:pPr>
+              <w:jc w:val="left"/>
+            </w:pPr>
+            <w:r/>
+            <w:r>
+              <w:rPr>
+                <w:b/>
+                <w:sz w:val="16"/>
+              </w:rPr>
+              <w:t>Meaning</w:t>
+            </w:r>
+          </w:p>
+        </w:tc>
+      </w:tr>
+      <w:tr>
+        <w:tc>
+          <w:tcPr>
+            <w:tcW w:type="dxa" w:w="2592"/>
+            <w:vAlign w:val="top"/>
+          </w:tcPr>
+          <w:p>
+            <w:pPr>
+              <w:jc w:val="left"/>
+            </w:pPr>
+            <w:r/>
+            <w:r>
+              <w:rPr>
+                <w:b w:val="0"/>
+                <w:sz w:val="16"/>
+              </w:rPr>
+              <w:t>SCN5A VCV000440850</w:t>
+            </w:r>
+          </w:p>
+        </w:tc>
+        <w:tc>
+          <w:tcPr>
+            <w:tcW w:type="dxa" w:w="2592"/>
+            <w:vAlign w:val="top"/>
+          </w:tcPr>
+          <w:p>
+            <w:pPr>
+              <w:jc w:val="left"/>
+            </w:pPr>
+            <w:r/>
+            <w:r>
+              <w:rPr>
+                <w:b w:val="0"/>
+                <w:sz w:val="16"/>
+              </w:rPr>
+              <w:t>ROUTE_PLP_ACTIONABLE</w:t>
+            </w:r>
+          </w:p>
+        </w:tc>
+        <w:tc>
+          <w:tcPr>
+            <w:tcW w:type="dxa" w:w="2592"/>
+            <w:vAlign w:val="top"/>
+          </w:tcPr>
+          <w:p>
+            <w:pPr>
+              <w:jc w:val="left"/>
+            </w:pPr>
+            <w:r/>
+            <w:r>
+              <w:rPr>
+                <w:b w:val="0"/>
+                <w:sz w:val="16"/>
+              </w:rPr>
+              <w:t>MODEL_CONFLICT</w:t>
+            </w:r>
+          </w:p>
+        </w:tc>
+        <w:tc>
+          <w:tcPr>
+            <w:tcW w:type="dxa" w:w="2592"/>
+            <w:vAlign w:val="top"/>
+          </w:tcPr>
+          <w:p>
+            <w:pPr>
+              <w:jc w:val="left"/>
+            </w:pPr>
+            <w:r/>
+            <w:r>
+              <w:rPr>
+                <w:b w:val="0"/>
+                <w:sz w:val="16"/>
+              </w:rPr>
+              <w:t>Direct dominant actionability is not supported under current constraints.</w:t>
+            </w:r>
+          </w:p>
+        </w:tc>
+      </w:tr>
+      <w:tr>
+        <w:tc>
+          <w:tcPr>
+            <w:tcW w:type="dxa" w:w="2592"/>
+            <w:vAlign w:val="top"/>
+          </w:tcPr>
+          <w:p>
+            <w:pPr>
+              <w:jc w:val="left"/>
+            </w:pPr>
+            <w:r/>
+            <w:r>
+              <w:rPr>
+                <w:b w:val="0"/>
+                <w:sz w:val="16"/>
+              </w:rPr>
+              <w:t>KCNH2 VCV004535537</w:t>
+            </w:r>
+          </w:p>
+        </w:tc>
+        <w:tc>
+          <w:tcPr>
+            <w:tcW w:type="dxa" w:w="2592"/>
+            <w:vAlign w:val="top"/>
+          </w:tcPr>
+          <w:p>
+            <w:pPr>
+              <w:jc w:val="left"/>
+            </w:pPr>
+            <w:r/>
+            <w:r>
+              <w:rPr>
+                <w:b w:val="0"/>
+                <w:sz w:val="16"/>
+              </w:rPr>
+              <w:t>ROUTE_PLP_ACTIONABLE</w:t>
+            </w:r>
+          </w:p>
+        </w:tc>
+        <w:tc>
+          <w:tcPr>
+            <w:tcW w:type="dxa" w:w="2592"/>
+            <w:vAlign w:val="top"/>
+          </w:tcPr>
+          <w:p>
+            <w:pPr>
+              <w:jc w:val="left"/>
+            </w:pPr>
+            <w:r/>
+            <w:r>
+              <w:rPr>
+                <w:b w:val="0"/>
+                <w:sz w:val="16"/>
+              </w:rPr>
+              <w:t>CHECK_POPMAX</w:t>
+            </w:r>
+          </w:p>
+        </w:tc>
+        <w:tc>
+          <w:tcPr>
+            <w:tcW w:type="dxa" w:w="2592"/>
+            <w:vAlign w:val="top"/>
+          </w:tcPr>
+          <w:p>
+            <w:pPr>
+              <w:jc w:val="left"/>
+            </w:pPr>
+            <w:r/>
+            <w:r>
+              <w:rPr>
+                <w:b w:val="0"/>
+                <w:sz w:val="16"/>
+              </w:rPr>
+              <w:t>Actionability requires ancestry-aware frequency review.</w:t>
+            </w:r>
+          </w:p>
+        </w:tc>
+      </w:tr>
+      <w:tr>
+        <w:tc>
+          <w:tcPr>
+            <w:tcW w:type="dxa" w:w="2592"/>
+            <w:vAlign w:val="top"/>
+          </w:tcPr>
+          <w:p>
+            <w:pPr>
+              <w:jc w:val="left"/>
+            </w:pPr>
+            <w:r/>
+            <w:r>
+              <w:rPr>
+                <w:b w:val="0"/>
+                <w:sz w:val="16"/>
+              </w:rPr>
+              <w:t>TRDN VCV001325231</w:t>
+            </w:r>
+          </w:p>
+        </w:tc>
+        <w:tc>
+          <w:tcPr>
+            <w:tcW w:type="dxa" w:w="2592"/>
+            <w:vAlign w:val="top"/>
+          </w:tcPr>
+          <w:p>
+            <w:pPr>
+              <w:jc w:val="left"/>
+            </w:pPr>
+            <w:r/>
+            <w:r>
+              <w:rPr>
+                <w:b w:val="0"/>
+                <w:sz w:val="16"/>
+              </w:rPr>
+              <w:t>ROUTE_PLP_ACTIONABLE</w:t>
+            </w:r>
+          </w:p>
+        </w:tc>
+        <w:tc>
+          <w:tcPr>
+            <w:tcW w:type="dxa" w:w="2592"/>
+            <w:vAlign w:val="top"/>
+          </w:tcPr>
+          <w:p>
+            <w:pPr>
+              <w:jc w:val="left"/>
+            </w:pPr>
+            <w:r/>
+            <w:r>
+              <w:rPr>
+                <w:b w:val="0"/>
+                <w:sz w:val="16"/>
+              </w:rPr>
+              <w:t>CHECK_MODEL</w:t>
+            </w:r>
+          </w:p>
+        </w:tc>
+        <w:tc>
+          <w:tcPr>
+            <w:tcW w:type="dxa" w:w="2592"/>
+            <w:vAlign w:val="top"/>
+          </w:tcPr>
+          <w:p>
+            <w:pPr>
+              <w:jc w:val="left"/>
+            </w:pPr>
+            <w:r/>
+            <w:r>
+              <w:rPr>
+                <w:b w:val="0"/>
+                <w:sz w:val="16"/>
+              </w:rPr>
+              <w:t>Recessive/carrier-state logic replaces flattened dominant actionability.</w:t>
+            </w:r>
+          </w:p>
+        </w:tc>
+      </w:tr>
+      <w:tr>
+        <w:tc>
+          <w:tcPr>
+            <w:tcW w:type="dxa" w:w="2592"/>
+            <w:vAlign w:val="top"/>
+          </w:tcPr>
+          <w:p>
+            <w:pPr>
+              <w:jc w:val="left"/>
+            </w:pPr>
+            <w:r/>
+            <w:r>
+              <w:rPr>
+                <w:b w:val="0"/>
+                <w:sz w:val="16"/>
+              </w:rPr>
+              <w:t>KCNH2 VCV000405355</w:t>
+            </w:r>
+          </w:p>
+        </w:tc>
+        <w:tc>
+          <w:tcPr>
+            <w:tcW w:type="dxa" w:w="2592"/>
+            <w:vAlign w:val="top"/>
+          </w:tcPr>
+          <w:p>
+            <w:pPr>
+              <w:jc w:val="left"/>
+            </w:pPr>
+            <w:r/>
+            <w:r>
+              <w:rPr>
+                <w:b w:val="0"/>
+                <w:sz w:val="16"/>
+              </w:rPr>
+              <w:t>ROUTE_PLP_ACTIONABLE</w:t>
+            </w:r>
+          </w:p>
+        </w:tc>
+        <w:tc>
+          <w:tcPr>
+            <w:tcW w:type="dxa" w:w="2592"/>
+            <w:vAlign w:val="top"/>
+          </w:tcPr>
+          <w:p>
+            <w:pPr>
+              <w:jc w:val="left"/>
+            </w:pPr>
+            <w:r/>
+            <w:r>
+              <w:rPr>
+                <w:b w:val="0"/>
+                <w:sz w:val="16"/>
+              </w:rPr>
+              <w:t>EVAL_LIMITED</w:t>
+            </w:r>
+          </w:p>
+        </w:tc>
+        <w:tc>
+          <w:tcPr>
+            <w:tcW w:type="dxa" w:w="2592"/>
+            <w:vAlign w:val="top"/>
+          </w:tcPr>
+          <w:p>
+            <w:pPr>
+              <w:jc w:val="left"/>
+            </w:pPr>
+            <w:r/>
+            <w:r>
+              <w:rPr>
+                <w:b w:val="0"/>
+                <w:sz w:val="16"/>
+              </w:rPr>
+              <w:t>Direct actionability cannot be justified from allele-resolved population evidence.</w:t>
+            </w:r>
+          </w:p>
+        </w:tc>
+      </w:tr>
+    </w:tbl>
+    <w:p/>
+    <w:p>
+      <w:r>
+        <w:t>In the simulated CDS layer, VITAL would interrupt 1,512/1,731 (87.3%) arrhythmia baseline direct-actionability decisions. The alert burden was mostly orange evaluability-limited alerts: 1,397/1,731 (80.7%). Yellow review alerts accounted for 114/1,731 (6.6%) and red hard model-conflict alerts for 1/1,731 (0.06%). In the high-review subset, the alert rate remained 309/365 (84.7%). A simulated VITAL alert layer would therefore interrupt most label-driven direct-actionability decisions while producing a low hard-conflict rate among expert-curated evaluable positives.</w:t>
+      </w:r>
+    </w:p>
+    <w:p>
+      <w:pPr>
+        <w:jc w:val="center"/>
+      </w:pPr>
+      <w:r>
+        <w:drawing>
+          <wp:inline xmlns:a="http://schemas.openxmlformats.org/drawingml/2006/main" xmlns:pic="http://schemas.openxmlformats.org/drawingml/2006/picture">
+            <wp:extent cx="6217920" cy="4767297"/>
+            <wp:docPr id="5" name="Picture 5"/>
+            <wp:cNvGraphicFramePr>
+              <a:graphicFrameLocks noChangeAspect="1"/>
+            </wp:cNvGraphicFramePr>
+            <a:graphic>
+              <a:graphicData uri="http://schemas.openxmlformats.org/drawingml/2006/picture">
+                <pic:pic>
+                  <pic:nvPicPr>
+                    <pic:cNvPr id="0" name="vital_routing_validation.png"/>
+                    <pic:cNvPicPr/>
+                  </pic:nvPicPr>
+                  <pic:blipFill>
+                    <a:blip r:embed="rId13"/>
+                    <a:stretch>
+                      <a:fillRect/>
+                    </a:stretch>
+                  </pic:blipFill>
+                  <pic:spPr>
+                    <a:xfrm>
+                      <a:off x="0" y="0"/>
+                      <a:ext cx="6217920" cy="4767297"/>
+                    </a:xfrm>
+                    <a:prstGeom prst="rect"/>
+                  </pic:spPr>
+                </pic:pic>
+              </a:graphicData>
+            </a:graphic>
+          </wp:inline>
+        </w:drawing>
+      </w:r>
+    </w:p>
+    <w:p>
+      <w:pPr>
+        <w:jc w:val="center"/>
+      </w:pPr>
+      <w:r>
+        <w:rPr>
+          <w:i/>
+          <w:sz w:val="18"/>
+        </w:rPr>
+        <w:t>Figure 5. Counterfactual routing validation.</w:t>
+      </w:r>
+    </w:p>
+    <w:p/>
+    <w:p>
+      <w:pPr>
+        <w:pStyle w:val="Heading2"/>
+      </w:pPr>
+      <w:r>
+        <w:t>12. Repair Logic Separates Pathogenicity, Evaluability, and Actionability</w:t>
+      </w:r>
+    </w:p>
+    <w:p>
+      <w:r>
+        <w:t>The repair layer converts a nonpass route into an explicit next step rather than a vague warning.</w:t>
       </w:r>
     </w:p>
     <w:tbl>
@@ -1118,7 +3717,7 @@
                 <w:b/>
                 <w:sz w:val="16"/>
               </w:rPr>
-              <w:t>HGDP match class</w:t>
+              <w:t>VITAL route</w:t>
             </w:r>
           </w:p>
         </w:tc>
@@ -1138,7 +3737,7 @@
                 <w:b/>
                 <w:sz w:val="16"/>
               </w:rPr>
-              <w:t>N</w:t>
+              <w:t>Meaning</w:t>
             </w:r>
           </w:p>
         </w:tc>
@@ -1158,7 +3757,7 @@
                 <w:b/>
                 <w:sz w:val="16"/>
               </w:rPr>
-              <w:t>% of total cohort</w:t>
+              <w:t>Recommended next step</w:t>
             </w:r>
           </w:p>
         </w:tc>
@@ -1179,7 +3778,7 @@
                 <w:b w:val="0"/>
                 <w:sz w:val="16"/>
               </w:rPr>
-              <w:t>strict_allele</w:t>
+              <w:t>VITAL_OK</w:t>
             </w:r>
           </w:p>
         </w:tc>
@@ -1198,7 +3797,7 @@
                 <w:b w:val="0"/>
                 <w:sz w:val="16"/>
               </w:rPr>
-              <w:t>64</w:t>
+              <w:t>Compatible with tested actionability model.</w:t>
             </w:r>
           </w:p>
         </w:tc>
@@ -1217,7 +3816,7 @@
                 <w:b w:val="0"/>
                 <w:sz w:val="16"/>
               </w:rPr>
-              <w:t>3.7</w:t>
+              <w:t>Proceed with standard expert interpretation.</w:t>
             </w:r>
           </w:p>
         </w:tc>
@@ -1238,7 +3837,7 @@
                 <w:b w:val="0"/>
                 <w:sz w:val="16"/>
               </w:rPr>
-              <w:t>normalized_allele</w:t>
+              <w:t>CHECK_POPMAX</w:t>
             </w:r>
           </w:p>
         </w:tc>
@@ -1257,7 +3856,7 @@
                 <w:b w:val="0"/>
                 <w:sz w:val="16"/>
               </w:rPr>
-              <w:t>4</w:t>
+              <w:t>Ancestry/frequency tension.</w:t>
             </w:r>
           </w:p>
         </w:tc>
@@ -1276,7 +3875,7 @@
                 <w:b w:val="0"/>
                 <w:sz w:val="16"/>
               </w:rPr>
-              <w:t>0.2</w:t>
+              <w:t>Ancestry-aware review and penetrance/model reassessment.</w:t>
             </w:r>
           </w:p>
         </w:tc>
@@ -1297,7 +3896,7 @@
                 <w:b w:val="0"/>
                 <w:sz w:val="16"/>
               </w:rPr>
-              <w:t>position_overlap</w:t>
+              <w:t>CHECK_MODEL</w:t>
             </w:r>
           </w:p>
         </w:tc>
@@ -1316,7 +3915,7 @@
                 <w:b w:val="0"/>
                 <w:sz w:val="16"/>
               </w:rPr>
-              <w:t>272</w:t>
+              <w:t>Inheritance or mechanism not portable.</w:t>
             </w:r>
           </w:p>
         </w:tc>
@@ -1335,7 +3934,7 @@
                 <w:b w:val="0"/>
                 <w:sz w:val="16"/>
               </w:rPr>
-              <w:t>15.7</w:t>
+              <w:t>Specify inheritance, phase, and mechanism before action.</w:t>
             </w:r>
           </w:p>
         </w:tc>
@@ -1356,7 +3955,7 @@
                 <w:b w:val="0"/>
                 <w:sz w:val="16"/>
               </w:rPr>
-              <w:t>no_match</w:t>
+              <w:t>MODEL_CONFLICT</w:t>
             </w:r>
           </w:p>
         </w:tc>
@@ -1375,7 +3974,7 @@
                 <w:b w:val="0"/>
                 <w:sz w:val="16"/>
               </w:rPr>
-              <w:t>1,391</w:t>
+              <w:t>Tested dominant model incompatible.</w:t>
             </w:r>
           </w:p>
         </w:tc>
@@ -1394,299 +3993,7 @@
                 <w:b w:val="0"/>
                 <w:sz w:val="16"/>
               </w:rPr>
-              <w:t>80.4</w:t>
-            </w:r>
-          </w:p>
-        </w:tc>
-      </w:tr>
-    </w:tbl>
-    <w:p/>
-    <w:p>
-      <w:r>
-        <w:t>This is the core caution of the HGDP layer. The matched universe is substantially larger than the strict-allele subset, but most of that expansion comes from position_overlap, not allele identity. Under the accompanying evaluability classification, only 12 variants were HGDP-evaluable, 328 were present but data-insufficient or absent in HGDP populations, and 1,391 remained technically unevaluable in the regional layer.</w:t>
-      </w:r>
-    </w:p>
-    <w:p>
-      <w:pPr>
-        <w:jc w:val="center"/>
-      </w:pPr>
-      <w:r>
-        <w:drawing>
-          <wp:inline xmlns:a="http://schemas.openxmlformats.org/drawingml/2006/main" xmlns:pic="http://schemas.openxmlformats.org/drawingml/2006/picture">
-            <wp:extent cx="6217920" cy="5925058"/>
-            <wp:docPr id="3" name="Picture 3"/>
-            <wp:cNvGraphicFramePr>
-              <a:graphicFrameLocks noChangeAspect="1"/>
-            </wp:cNvGraphicFramePr>
-            <a:graphic>
-              <a:graphicData uri="http://schemas.openxmlformats.org/drawingml/2006/picture">
-                <pic:pic>
-                  <pic:nvPicPr>
-                    <pic:cNvPr id="0" name="hgdp_killer_plp_decomposition.png"/>
-                    <pic:cNvPicPr/>
-                  </pic:nvPicPr>
-                  <pic:blipFill>
-                    <a:blip r:embed="rId11"/>
-                    <a:stretch>
-                      <a:fillRect/>
-                    </a:stretch>
-                  </pic:blipFill>
-                  <pic:spPr>
-                    <a:xfrm>
-                      <a:off x="0" y="0"/>
-                      <a:ext cx="6217920" cy="5925058"/>
-                    </a:xfrm>
-                    <a:prstGeom prst="rect"/>
-                  </pic:spPr>
-                </pic:pic>
-              </a:graphicData>
-            </a:graphic>
-          </wp:inline>
-        </w:drawing>
-      </w:r>
-    </w:p>
-    <w:p>
-      <w:pPr>
-        <w:jc w:val="center"/>
-      </w:pPr>
-      <w:r>
-        <w:rPr>
-          <w:i/>
-          <w:sz w:val="18"/>
-        </w:rPr>
-        <w:t>Figure 3. Same public P/LP labels decompose across HGDP geographic regions under position-aware matching.</w:t>
-      </w:r>
-    </w:p>
-    <w:p/>
-    <w:p>
-      <w:pPr>
-        <w:jc w:val="center"/>
-      </w:pPr>
-      <w:r>
-        <w:drawing>
-          <wp:inline xmlns:a="http://schemas.openxmlformats.org/drawingml/2006/main" xmlns:pic="http://schemas.openxmlformats.org/drawingml/2006/picture">
-            <wp:extent cx="6217920" cy="3799840"/>
-            <wp:docPr id="4" name="Picture 4"/>
-            <wp:cNvGraphicFramePr>
-              <a:graphicFrameLocks noChangeAspect="1"/>
-            </wp:cNvGraphicFramePr>
-            <a:graphic>
-              <a:graphicData uri="http://schemas.openxmlformats.org/drawingml/2006/picture">
-                <pic:pic>
-                  <pic:nvPicPr>
-                    <pic:cNvPr id="0" name="hgdp_regime_distribution.png"/>
-                    <pic:cNvPicPr/>
-                  </pic:nvPicPr>
-                  <pic:blipFill>
-                    <a:blip r:embed="rId12"/>
-                    <a:stretch>
-                      <a:fillRect/>
-                    </a:stretch>
-                  </pic:blipFill>
-                  <pic:spPr>
-                    <a:xfrm>
-                      <a:off x="0" y="0"/>
-                      <a:ext cx="6217920" cy="3799840"/>
-                    </a:xfrm>
-                    <a:prstGeom prst="rect"/>
-                  </pic:spPr>
-                </pic:pic>
-              </a:graphicData>
-            </a:graphic>
-          </wp:inline>
-        </w:drawing>
-      </w:r>
-    </w:p>
-    <w:p>
-      <w:pPr>
-        <w:jc w:val="center"/>
-      </w:pPr>
-      <w:r>
-        <w:rPr>
-          <w:i/>
-          <w:sz w:val="18"/>
-        </w:rPr>
-        <w:t>Figure 4. HGDP regime distribution across the matched universe.</w:t>
-      </w:r>
-    </w:p>
-    <w:p/>
-    <w:p>
-      <w:pPr>
-        <w:jc w:val="center"/>
-      </w:pPr>
-      <w:r>
-        <w:drawing>
-          <wp:inline xmlns:a="http://schemas.openxmlformats.org/drawingml/2006/main" xmlns:pic="http://schemas.openxmlformats.org/drawingml/2006/picture">
-            <wp:extent cx="6217920" cy="4663440"/>
-            <wp:docPr id="5" name="Picture 5"/>
-            <wp:cNvGraphicFramePr>
-              <a:graphicFrameLocks noChangeAspect="1"/>
-            </wp:cNvGraphicFramePr>
-            <a:graphic>
-              <a:graphicData uri="http://schemas.openxmlformats.org/drawingml/2006/picture">
-                <pic:pic>
-                  <pic:nvPicPr>
-                    <pic:cNvPr id="0" name="hgdp_evaluability_breakdown.png"/>
-                    <pic:cNvPicPr/>
-                  </pic:nvPicPr>
-                  <pic:blipFill>
-                    <a:blip r:embed="rId13"/>
-                    <a:stretch>
-                      <a:fillRect/>
-                    </a:stretch>
-                  </pic:blipFill>
-                  <pic:spPr>
-                    <a:xfrm>
-                      <a:off x="0" y="0"/>
-                      <a:ext cx="6217920" cy="4663440"/>
-                    </a:xfrm>
-                    <a:prstGeom prst="rect"/>
-                  </pic:spPr>
-                </pic:pic>
-              </a:graphicData>
-            </a:graphic>
-          </wp:inline>
-        </w:drawing>
-      </w:r>
-    </w:p>
-    <w:p>
-      <w:pPr>
-        <w:jc w:val="center"/>
-      </w:pPr>
-      <w:r>
-        <w:rPr>
-          <w:i/>
-          <w:sz w:val="18"/>
-        </w:rPr>
-        <w:t>Figure 5. HGDP evaluability classes remain sharply constrained.</w:t>
-      </w:r>
-    </w:p>
-    <w:p/>
-    <w:p>
-      <w:pPr>
-        <w:pStyle w:val="Heading2"/>
-      </w:pPr>
-      <w:r>
-        <w:t>6. Quantitative regime burden depends strongly on whether locus-context matches are allowed</w:t>
-      </w:r>
-    </w:p>
-    <w:p>
-      <w:r>
-        <w:t>Within the full HGDP matched universe (n = 340), 67 variants (19.7%) fell outside a dominant-compatible regime under the tested MCAF framework: 14 hard_incompatible and 53 boundary. In the strict-allele-only subset (n = 64), only 4 variants (6.2%) were non-dominant-compatible: 1 hard_incompatible and 3 boundary.</w:t>
-      </w:r>
-    </w:p>
-    <w:tbl>
-      <w:tblPr>
-        <w:tblStyle w:val="TableGrid"/>
-        <w:tblW w:type="auto" w:w="0"/>
-        <w:jc w:val="center"/>
-        <w:tblLook w:firstColumn="1" w:firstRow="1" w:lastColumn="0" w:lastRow="0" w:noHBand="0" w:noVBand="1" w:val="04A0"/>
-      </w:tblPr>
-      <w:tblGrid>
-        <w:gridCol w:w="2074"/>
-        <w:gridCol w:w="2074"/>
-        <w:gridCol w:w="2074"/>
-        <w:gridCol w:w="2074"/>
-        <w:gridCol w:w="2074"/>
-      </w:tblGrid>
-      <w:tr>
-        <w:tc>
-          <w:tcPr>
-            <w:tcW w:type="dxa" w:w="2074"/>
-            <w:vAlign w:val="top"/>
-            <w:shd w:fill="D9EAF7"/>
-          </w:tcPr>
-          <w:p>
-            <w:pPr>
-              <w:jc w:val="left"/>
-            </w:pPr>
-            <w:r/>
-            <w:r>
-              <w:rPr>
-                <w:b/>
-                <w:sz w:val="16"/>
-              </w:rPr>
-              <w:t>Analysis universe</w:t>
-            </w:r>
-          </w:p>
-        </w:tc>
-        <w:tc>
-          <w:tcPr>
-            <w:tcW w:type="dxa" w:w="2074"/>
-            <w:vAlign w:val="top"/>
-            <w:shd w:fill="D9EAF7"/>
-          </w:tcPr>
-          <w:p>
-            <w:pPr>
-              <w:jc w:val="left"/>
-            </w:pPr>
-            <w:r/>
-            <w:r>
-              <w:rPr>
-                <w:b/>
-                <w:sz w:val="16"/>
-              </w:rPr>
-              <w:t>Hard incompatible</w:t>
-            </w:r>
-          </w:p>
-        </w:tc>
-        <w:tc>
-          <w:tcPr>
-            <w:tcW w:type="dxa" w:w="2074"/>
-            <w:vAlign w:val="top"/>
-            <w:shd w:fill="D9EAF7"/>
-          </w:tcPr>
-          <w:p>
-            <w:pPr>
-              <w:jc w:val="left"/>
-            </w:pPr>
-            <w:r/>
-            <w:r>
-              <w:rPr>
-                <w:b/>
-                <w:sz w:val="16"/>
-              </w:rPr>
-              <w:t>Boundary</w:t>
-            </w:r>
-          </w:p>
-        </w:tc>
-        <w:tc>
-          <w:tcPr>
-            <w:tcW w:type="dxa" w:w="2074"/>
-            <w:vAlign w:val="top"/>
-            <w:shd w:fill="D9EAF7"/>
-          </w:tcPr>
-          <w:p>
-            <w:pPr>
-              <w:jc w:val="left"/>
-            </w:pPr>
-            <w:r/>
-            <w:r>
-              <w:rPr>
-                <w:b/>
-                <w:sz w:val="16"/>
-              </w:rPr>
-              <w:t>Dominant-compatible</w:t>
-            </w:r>
-          </w:p>
-        </w:tc>
-        <w:tc>
-          <w:tcPr>
-            <w:tcW w:type="dxa" w:w="2074"/>
-            <w:vAlign w:val="top"/>
-            <w:shd w:fill="D9EAF7"/>
-          </w:tcPr>
-          <w:p>
-            <w:pPr>
-              <w:jc w:val="left"/>
-            </w:pPr>
-            <w:r/>
-            <w:r>
-              <w:rPr>
-                <w:b/>
-                <w:sz w:val="16"/>
-              </w:rPr>
-              <w:t>Total non-dominant-compatible</w:t>
+              <w:t>Do not use flattened P/LP as a dominant-actionability claim.</w:t>
             </w:r>
           </w:p>
         </w:tc>
@@ -1694,7 +4001,7 @@
       <w:tr>
         <w:tc>
           <w:tcPr>
-            <w:tcW w:type="dxa" w:w="2074"/>
+            <w:tcW w:type="dxa" w:w="3456"/>
             <w:vAlign w:val="top"/>
           </w:tcPr>
           <w:p>
@@ -1707,13 +4014,13 @@
                 <w:b w:val="0"/>
                 <w:sz w:val="16"/>
               </w:rPr>
-              <w:t>Full HGDP matched set (n = 340)</w:t>
+              <w:t>EVAL_LIMITED</w:t>
             </w:r>
           </w:p>
         </w:tc>
         <w:tc>
           <w:tcPr>
-            <w:tcW w:type="dxa" w:w="2074"/>
+            <w:tcW w:type="dxa" w:w="3456"/>
             <w:vAlign w:val="top"/>
           </w:tcPr>
           <w:p>
@@ -1726,13 +4033,13 @@
                 <w:b w:val="0"/>
                 <w:sz w:val="16"/>
               </w:rPr>
-              <w:t>14 (4.1%)</w:t>
+              <w:t>Not allele-resolved.</w:t>
             </w:r>
           </w:p>
         </w:tc>
         <w:tc>
           <w:tcPr>
-            <w:tcW w:type="dxa" w:w="2074"/>
+            <w:tcW w:type="dxa" w:w="3456"/>
             <w:vAlign w:val="top"/>
           </w:tcPr>
           <w:p>
@@ -1745,142 +4052,7 @@
                 <w:b w:val="0"/>
                 <w:sz w:val="16"/>
               </w:rPr>
-              <w:t>53 (15.6%)</w:t>
-            </w:r>
-          </w:p>
-        </w:tc>
-        <w:tc>
-          <w:tcPr>
-            <w:tcW w:type="dxa" w:w="2074"/>
-            <w:vAlign w:val="top"/>
-          </w:tcPr>
-          <w:p>
-            <w:pPr>
-              <w:jc w:val="left"/>
-            </w:pPr>
-            <w:r/>
-            <w:r>
-              <w:rPr>
-                <w:b w:val="0"/>
-                <w:sz w:val="16"/>
-              </w:rPr>
-              <w:t>273 (80.3%)</w:t>
-            </w:r>
-          </w:p>
-        </w:tc>
-        <w:tc>
-          <w:tcPr>
-            <w:tcW w:type="dxa" w:w="2074"/>
-            <w:vAlign w:val="top"/>
-          </w:tcPr>
-          <w:p>
-            <w:pPr>
-              <w:jc w:val="left"/>
-            </w:pPr>
-            <w:r/>
-            <w:r>
-              <w:rPr>
-                <w:b w:val="0"/>
-                <w:sz w:val="16"/>
-              </w:rPr>
-              <w:t>67 (19.7%)</w:t>
-            </w:r>
-          </w:p>
-        </w:tc>
-      </w:tr>
-      <w:tr>
-        <w:tc>
-          <w:tcPr>
-            <w:tcW w:type="dxa" w:w="2074"/>
-            <w:vAlign w:val="top"/>
-          </w:tcPr>
-          <w:p>
-            <w:pPr>
-              <w:jc w:val="left"/>
-            </w:pPr>
-            <w:r/>
-            <w:r>
-              <w:rPr>
-                <w:b w:val="0"/>
-                <w:sz w:val="16"/>
-              </w:rPr>
-              <w:t>Strict-allele HGDP subset (n = 64)</w:t>
-            </w:r>
-          </w:p>
-        </w:tc>
-        <w:tc>
-          <w:tcPr>
-            <w:tcW w:type="dxa" w:w="2074"/>
-            <w:vAlign w:val="top"/>
-          </w:tcPr>
-          <w:p>
-            <w:pPr>
-              <w:jc w:val="left"/>
-            </w:pPr>
-            <w:r/>
-            <w:r>
-              <w:rPr>
-                <w:b w:val="0"/>
-                <w:sz w:val="16"/>
-              </w:rPr>
-              <w:t>1 (1.6%)</w:t>
-            </w:r>
-          </w:p>
-        </w:tc>
-        <w:tc>
-          <w:tcPr>
-            <w:tcW w:type="dxa" w:w="2074"/>
-            <w:vAlign w:val="top"/>
-          </w:tcPr>
-          <w:p>
-            <w:pPr>
-              <w:jc w:val="left"/>
-            </w:pPr>
-            <w:r/>
-            <w:r>
-              <w:rPr>
-                <w:b w:val="0"/>
-                <w:sz w:val="16"/>
-              </w:rPr>
-              <w:t>3 (4.7%)</w:t>
-            </w:r>
-          </w:p>
-        </w:tc>
-        <w:tc>
-          <w:tcPr>
-            <w:tcW w:type="dxa" w:w="2074"/>
-            <w:vAlign w:val="top"/>
-          </w:tcPr>
-          <w:p>
-            <w:pPr>
-              <w:jc w:val="left"/>
-            </w:pPr>
-            <w:r/>
-            <w:r>
-              <w:rPr>
-                <w:b w:val="0"/>
-                <w:sz w:val="16"/>
-              </w:rPr>
-              <w:t>60 (93.8%)</w:t>
-            </w:r>
-          </w:p>
-        </w:tc>
-        <w:tc>
-          <w:tcPr>
-            <w:tcW w:type="dxa" w:w="2074"/>
-            <w:vAlign w:val="top"/>
-          </w:tcPr>
-          <w:p>
-            <w:pPr>
-              <w:jc w:val="left"/>
-            </w:pPr>
-            <w:r/>
-            <w:r>
-              <w:rPr>
-                <w:b w:val="0"/>
-                <w:sz w:val="16"/>
-              </w:rPr>
-              <w:t>4 (6.2%)</w:t>
+              <w:t>Defer direct actionability; require representation/callability/orthogonal evidence.</w:t>
             </w:r>
           </w:p>
         </w:tc>
@@ -1889,61 +4061,9 @@
     <w:p/>
     <w:p>
       <w:r>
-        <w:t>This distinction is not cosmetic. Position-overlap matching expands the scope of evaluability and highlights where regime shifts may be hiding, but it does not constitute allele-level proof of frequency incompatibility. The public-label problem is therefore two-layered: a structural inability to recover allele-resolved context for most variants, and a second inferential gap between locus-context stress signals and allele-level evidence.</w:t>
+        <w:t>This repair logic is the operational point of VITAL: it separates pathogenicity, evaluability, and actionability instead of letting a flattened public label stand in for all three.</w:t>
       </w:r>
     </w:p>
-    <w:p>
-      <w:pPr>
-        <w:jc w:val="center"/>
-      </w:pPr>
-      <w:r>
-        <w:drawing>
-          <wp:inline xmlns:a="http://schemas.openxmlformats.org/drawingml/2006/main" xmlns:pic="http://schemas.openxmlformats.org/drawingml/2006/picture">
-            <wp:extent cx="6217920" cy="4352544"/>
-            <wp:docPr id="6" name="Picture 6"/>
-            <wp:cNvGraphicFramePr>
-              <a:graphicFrameLocks noChangeAspect="1"/>
-            </wp:cNvGraphicFramePr>
-            <a:graphic>
-              <a:graphicData uri="http://schemas.openxmlformats.org/drawingml/2006/picture">
-                <pic:pic>
-                  <pic:nvPicPr>
-                    <pic:cNvPr id="0" name="hgdp_portability_vs_disease_model.png"/>
-                    <pic:cNvPicPr/>
-                  </pic:nvPicPr>
-                  <pic:blipFill>
-                    <a:blip r:embed="rId14"/>
-                    <a:stretch>
-                      <a:fillRect/>
-                    </a:stretch>
-                  </pic:blipFill>
-                  <pic:spPr>
-                    <a:xfrm>
-                      <a:off x="0" y="0"/>
-                      <a:ext cx="6217920" cy="4352544"/>
-                    </a:xfrm>
-                    <a:prstGeom prst="rect"/>
-                  </pic:spPr>
-                </pic:pic>
-              </a:graphicData>
-            </a:graphic>
-          </wp:inline>
-        </w:drawing>
-      </w:r>
-    </w:p>
-    <w:p>
-      <w:pPr>
-        <w:jc w:val="center"/>
-      </w:pPr>
-      <w:r>
-        <w:rPr>
-          <w:i/>
-          <w:sz w:val="18"/>
-        </w:rPr>
-        <w:t>Figure 6. Disease-model portability versus evaluability in the HGDP summary layer.</w:t>
-      </w:r>
-    </w:p>
-    <w:p/>
     <w:p>
       <w:pPr>
         <w:pStyle w:val="Heading1"/>
@@ -1957,12 +4077,17 @@
         <w:pStyle w:val="Heading2"/>
       </w:pPr>
       <w:r>
-        <w:t>A public P/LP label is a compressed object, not a self-contained disease claim</w:t>
+        <w:t>A Public P/LP Label Is a Compressed Object, Not a Self-Contained Disease Claim</w:t>
       </w:r>
     </w:p>
     <w:p>
       <w:r>
-        <w:t>The most important result of this study is not simply that some P/LP variants are too frequent. It is that the exported label does not reliably preserve the disease-state model required for downstream reuse. In the exome-resolved subset, the same public label spans hard incompatibility, monitoring, and carrier-compatible regimes. In the HGDP layer, the same label can move between dominant-compatible and non-dominant-compatible interpretations depending on whether one works with strict allele identity or with position-overlap rescue.</w:t>
+        <w:t>The main result of this study is a measurable downstream reuse failure mode. Even within the exome Tier 1 usable-AF subset, one exported P/LP label can map to incompatible operational readings once ancestry-aware frequency and mechanism are restored. HGDP contributes only a supplementary regional stress signal, with strict allele matches treated as the primary evidence within that layer and position-overlap results used only for hypothesis generation.</w:t>
+      </w:r>
+    </w:p>
+    <w:p>
+      <w:r>
+        <w:t>This instability arises for three structural reasons. Public labels omit the disease-model parameters needed for reuse; population constraint is ancestry-resolved rather than scalar; and the response to frequency stress is mechanism-dependent. In this framework, decomposition means only incompatibility with the tested dominant high-penetrance model under observed frequency stress, not that the variant is benign, false, or clinically reclassified.</w:t>
       </w:r>
     </w:p>
     <w:p>
@@ -1970,7 +4095,7 @@
         <w:pStyle w:val="Heading2"/>
       </w:pPr>
       <w:r>
-        <w:t>The evaluability boundary is structural, not a pipeline artifact</w:t>
+        <w:t>The Evaluability Boundary Is Structural, Not a Pipeline Artifact</w:t>
       </w:r>
     </w:p>
     <w:p>
@@ -1979,16 +4104,8 @@
       </w:r>
     </w:p>
     <w:p>
-      <w:pPr>
-        <w:pStyle w:val="Heading2"/>
-      </w:pPr>
       <w:r>
-        <w:t>Population structure is not a refinement layer; it is part of the claim</w:t>
-      </w:r>
-    </w:p>
-    <w:p>
-      <w:r>
-        <w:t>Global-only screening missed 88.7% of ancestry-aware exome alerts. In a domain shaped by ancestry-localized enrichment, founder effects, and mixed inheritance architectures, global AF is not a sufficient stand-in for the population signal needed to constrain a disease model. Popmax does not add decorative granularity; it restores biologically relevant structure that global AF suppresses.</w:t>
+        <w:t>This distinction matters for governance. If the evaluability gap were a normalization artifact, it could be solved by better preprocessing. Because it is structural, it requires changes at the level of public assertion metadata: variants must carry explicit evaluability tier information so that downstream users know whether population constraint can be applied at the allele level.</w:t>
       </w:r>
     </w:p>
     <w:p>
@@ -1996,12 +4113,12 @@
         <w:pStyle w:val="Heading2"/>
       </w:pPr>
       <w:r>
-        <w:t>The HGDP layer exposes a second boundary: allele proof versus locus-context stress</w:t>
+        <w:t>Population Structure Is Not a Refinement Layer; It Is Part of the Claim</w:t>
       </w:r>
     </w:p>
     <w:p>
       <w:r>
-        <w:t>The HGDP analysis sharpens the story rather than replacing it. It shows that once one pushes beyond exome popmax into regional stress-testing, most additional coverage is gained through position_overlap, not through allele-resolved rescue. That is valuable because it identifies where regime shifts may be hiding, but it also creates a new evidentiary boundary. A full matched-universe estimate (19.7% non-dominant-compatible) and a strict-allele estimate (6.2%) answer different questions. Both are informative; neither should be reported as though it were the other.</w:t>
+        <w:t>Global-only screening missed 88.7% of ancestry-aware exome alerts. In a domain shaped by ancestry-localized enrichment, founder effects, and mixed inheritance architectures, global AF is not a sufficient stand-in for the population signal needed to constrain a disease model. Popmax does not add decorative granularity; it restores biologically relevant structure that global AF suppresses. Among the 102 missed alerts, the dominant signal came from non-European populations, precisely the populations most underrepresented in historical variant databases and most exposed to systematic under-detection of frequency incompatibility.</w:t>
       </w:r>
     </w:p>
     <w:p>
@@ -2009,12 +4126,51 @@
         <w:pStyle w:val="Heading2"/>
       </w:pPr>
       <w:r>
-        <w:t>Arrhythmia genes act here as a stress-test domain</w:t>
+        <w:t>Decomposition Is Mechanistically Determined, Not Database Noise</w:t>
       </w:r>
     </w:p>
     <w:p>
       <w:r>
-        <w:t>This manuscript does not claim that arrhythmia genes are uniquely affected. Rather, they provide a stringent domain in which ancestry structure, variable penetrance, founder effects, and high-consequence downstream interpretation coexist. That combination makes failures of disease-model portability easier to see. Whether the same quantitative regime burdens recur in other disease areas requires separate empirical work.</w:t>
+        <w:t>The molecular mechanism findings sharpen the interpretation of the regime structure. GoF and dominant-negative genes show 0% decomposition at MCAF thresholds &gt;= 2.5 x 10^-5, not as a trivial result but as a positive control that supports the framework at biologically interpretable thresholds. If decomposition were a pipeline artifact or a consequence of curation error, it would affect all gene classes proportionally. Instead, it is absent where selection theory predicts it should be absent and present in proportion to how much constraint is relaxed in haploinsufficient and recessive genes.</w:t>
+      </w:r>
+    </w:p>
+    <w:p>
+      <w:pPr>
+        <w:pStyle w:val="Heading2"/>
+      </w:pPr>
+      <w:r>
+        <w:t>The HGDP Layer Is Supplementary to the Exome-Resolved Primary Analysis</w:t>
+      </w:r>
+    </w:p>
+    <w:p>
+      <w:r>
+        <w:t>The HGDP analysis is intentionally supplementary to the exome-resolved primary analysis. Its main value is to show that regional stress signals can be mapped more broadly than allele-level proof can be established. Strict allele matches remain the primary HGDP evidence, and the position-overlap-expanded universe is treated only as hypothesis-generating locus-context stress.</w:t>
+      </w:r>
+    </w:p>
+    <w:p>
+      <w:pPr>
+        <w:pStyle w:val="Heading2"/>
+      </w:pPr>
+      <w:r>
+        <w:t>Arrhythmia Genes Act Here as a Stress-Test Domain, Not as a Special Case</w:t>
+      </w:r>
+    </w:p>
+    <w:p>
+      <w:r>
+        <w:t>This manuscript does not claim that arrhythmia genes are uniquely affected. Rather, they provide a stringent stress-test domain in which ancestry structure, variable penetrance, founder effects, and potentially consequential interpretation contexts coexist. The cancer comparison is used only as a structural sanity check. The core claim remains that public P/LP labels lose disease-model portability unless evaluability, inheritance, mechanism, and ancestry-aware AF are made explicit.</w:t>
+      </w:r>
+    </w:p>
+    <w:p>
+      <w:pPr>
+        <w:pStyle w:val="Heading2"/>
+      </w:pPr>
+      <w:r>
+        <w:t>VITAL Is a Routing Layer, Not a Reclassification Engine</w:t>
+      </w:r>
+    </w:p>
+    <w:p>
+      <w:r>
+        <w:t>VITAL does not claim that nonpass variants are benign, incorrect, or clinically irrelevant. It claims that direct actionability cannot be inferred from the flattened label alone. A public pathogenicity label can remain true in its expert context while still being insufficient as a direct-actionability object in a flattened downstream workflow.</w:t>
       </w:r>
     </w:p>
     <w:p>
@@ -2027,17 +4183,17 @@
     </w:p>
     <w:p>
       <w:r>
-        <w:t>First, all exome disease-model conclusions are restricted to the 334 Tier 1 variants with usable allele-resolved AF. The unevaluable majority cannot be assumed to follow the same regime structure.</w:t>
+        <w:t>First, all exome disease-model conclusions are restricted to the 334 Tier 1 variants with usable allele-resolved AF. The unevaluable majority cannot be assumed to follow the same regime structure. Because Tier 1 was enriched for SNVs and depleted of indels and duplications relative to Tier 2, direct extrapolation across variant classes would be inappropriate.</w:t>
       </w:r>
     </w:p>
     <w:p>
       <w:r>
-        <w:t>Second, the HGDP regional analysis is limited by both sparse evaluability and the distinction between strict-allele and position-overlap matching. The expanded matched universe is directionally informative, but the strongest quantitative claims remain concentrated in the strict or representation-rescued allele-level subset.</w:t>
+        <w:t>Second, the HGDP regional analysis is limited by sparse evaluability. Its broader matched universe is useful as a supplementary stress map, but the strongest quantitative claims remain concentrated in the strict or representation-rescued allele-level subset.</w:t>
       </w:r>
     </w:p>
     <w:p>
       <w:r>
-        <w:t>Third, this is a study of disease-model compatibility, not of patient-level outcomes. The clinical-action categories used here identify exposure to consequential decision environments but do not quantify realized downstream harm.</w:t>
+        <w:t>Third, this is a study of disease-model compatibility and actionability routing, not patient-level outcomes. The clinical-action categories used here identify potentially consequential interpretation contexts, not realized downstream clinical consequences.</w:t>
       </w:r>
     </w:p>
     <w:p>
@@ -2047,7 +4203,27 @@
     </w:p>
     <w:p>
       <w:r>
-        <w:t>Fifth, the 1x10^-5 trigger used in the exome screening layer is operational rather than ontological. The qualitative result, especially the large popmax gain over global AF, was stable, but absolute alert counts depend on the screening threshold selected.</w:t>
+        <w:t>Fifth, the 1 x 10^-5 trigger used in the exome screening layer is operational rather than ontological. The qualitative result, especially the large popmax gain over global AF, was stable across a broad threshold range, but absolute alert counts depend on the screening threshold selected.</w:t>
+      </w:r>
+    </w:p>
+    <w:p>
+      <w:r>
+        <w:t>Sixth, the HGDP panel covers approximately 4,000 individuals across 54 populations, so allele frequency estimates for rare variants in individual populations carry substantial sampling uncertainty. The HGDP findings are used here as a falsification test for the dominant high-penetrance model, not as precise frequency estimates.</w:t>
+      </w:r>
+    </w:p>
+    <w:p>
+      <w:r>
+        <w:t>Seventh, the cancer predisposition sanity check uses MCAF thresholds calibrated for dominant high-penetrance arrhythmia models. Cancer genes have different penetrance profiles, age-dependent expressivity, and clinical ascertainment patterns. The deliberate use of identical thresholds tests structural recurrence only; it does not provide clinically calibrated cancer burden estimates.</w:t>
+      </w:r>
+    </w:p>
+    <w:p>
+      <w:r>
+        <w:t>Eighth, most arrhythmia HGDP matches were achieved through position-overlap rather than strict allele-resolved matching. We therefore treat full matched-universe results as supplementary stress signals rather than primary burden estimates.</w:t>
+      </w:r>
+    </w:p>
+    <w:p>
+      <w:r>
+        <w:t>Ninth, the current structural-variant layer is a blocking requirement rather than a fully deployed SV/CNV engine. Loci such as SMN1, STRC, and GJB6 require copy-state, paralog, haplotype, and phase-aware handling before direct portability can be granted.</w:t>
       </w:r>
     </w:p>
     <w:p>
@@ -2060,46 +4236,32 @@
     </w:p>
     <w:p>
       <w:r>
-        <w:t>Three governance-relevant conclusions follow.</w:t>
+        <w:t>Four governance-relevant conclusions follow from the evaluable-subset analysis and from the structural limits observed in the non-evaluable majority.</w:t>
       </w:r>
     </w:p>
     <w:p>
       <w:r>
-        <w:t>First, popmax should be required alongside global AF in inherited arrhythmia variant review. In this study, global-only screening missed 88.7% of ancestry-aware frequency alerts, and 103 of those alerts occurred in clinically consequential gene contexts.</w:t>
+        <w:t>First, population-structured frequency review, including popmax or an equivalent ancestry-aware maximum, should be treated as a minimum evidence layer in inherited arrhythmia variant review workflows whenever the asserted allele is population-evaluable. In this study, global-only screening missed 88.7% of ancestry-aware frequency alerts within the Tier 1 usable-AF subset, and 103 of those alerts occurred in potentially consequential interpretation contexts. Omitting popmax in such settings is not a small methodological omission; it is a systematic failure to apply available population constraint where such constraint is actually available.</w:t>
       </w:r>
     </w:p>
     <w:p>
       <w:r>
-        <w:t>Second, public assertions intended for downstream reuse should carry at least three additional fields alongside pathogenicity category:</w:t>
-      </w:r>
-    </w:p>
-    <w:p>
-      <w:pPr>
-        <w:pStyle w:val="ListNumber"/>
-      </w:pPr>
-      <w:r>
-        <w:t>the disease-state model being asserted, including inheritance class and penetrance logic;</w:t>
-      </w:r>
-    </w:p>
-    <w:p>
-      <w:pPr>
-        <w:pStyle w:val="ListNumber"/>
-      </w:pPr>
-      <w:r>
-        <w:t>the population evaluability tier of the asserted allele; and</w:t>
-      </w:r>
-    </w:p>
-    <w:p>
-      <w:pPr>
-        <w:pStyle w:val="ListNumber"/>
-      </w:pPr>
-      <w:r>
-        <w:t>the allele count supporting any cited population signal, together with explicit acknowledgment of low-count uncertainty.</w:t>
+        <w:t>Second, public assertions intended for downstream reuse should carry at least four additional fields alongside pathogenicity category: the disease-state model being asserted, including inheritance class and penetrance logic; the population evaluability tier of the asserted allele; the allele count supporting any cited population signal, together with explicit acknowledgment of low-count uncertainty; and a coverage-aware negative-lookup status distinguishing true absence from representation failure or non-callable context. These additions do not require a new pathogenicity framework. They operationalize information that downstream users already need but that the flattened public label does not currently preserve.</w:t>
       </w:r>
     </w:p>
     <w:p>
       <w:r>
-        <w:t>Third, downstream users should not equate locus-context stress with allele-level proof. For indels, duplications, splice-disrupting variants, and other representation-sensitive classes, non-observation and same-position overlap are properties of representation before they are properties of biology.</w:t>
+        <w:t>Third, downstream users should not equate locus-context stress with allele-level proof. For indels, duplications, splice-disrupting variants, and other representation-sensitive classes, non-observation and same-position overlap are properties of representation before they are properties of biology. Evaluability metadata, and eventually coverage-aware negative lookup, must therefore remain conceptually distinct from pathogenicity classification.</w:t>
+      </w:r>
+    </w:p>
+    <w:p>
+      <w:r>
+        <w:t>Fourth, downstream users should adopt a four-step population-constrained interpretation workflow as a minimum standard for any application that imports public P/LP labels: determine evaluability tier for the asserted allele; apply ancestry-aware frequency constraint using popmax alongside global AF and preserve negative-lookup uncertainty where callability is unresolved; classify disease-model regime; and require explicit disease-model specification before downstream action. This workflow does not replace expert clinical judgment; it operationalizes a measurable failure mode in downstream reuse.</w:t>
+      </w:r>
+    </w:p>
+    <w:p>
+      <w:r>
+        <w:t>The repository implementation adds two practical governance layers: a simulated CDS alert layer and a minimal repair table. The alert layer converts CHECK_POPMAX and CHECK_MODEL into review alerts, EVAL_LIMITED into deferral alerts, and MODEL_CONFLICT into model-conflict alerts. The repair table converts each nonpass route into an explicit next step rather than a vague warning.</w:t>
       </w:r>
     </w:p>
     <w:p>
@@ -2112,17 +4274,27 @@
     </w:p>
     <w:p>
       <w:r>
-        <w:t>Across 1,731 ClinVar P/LP variants in 20 inherited arrhythmia genes, two problems converge. The first is operational: even after exhaustive reconciliation and reference-based normalization, most public assertions lacked allele-resolved population context in the exome layer, and the HGDP regional layer was even more sharply constrained. The second is biological: among the minority of variants for which population constraint was recoverable, the same exported P/LP label supported mutually inconsistent disease-model readings.</w:t>
+        <w:t>Across 1,731 ClinVar P/LP variants in 20 inherited arrhythmia genes, the central biological result comes from a much smaller evaluable subset. Most public assertions could not be brought into allele-resolved exome frequency space, and primary frequency conclusions therefore rest on the 334 variants with usable AF rather than on the full label universe. HGDP provided only a supplementary regional stress layer and was not used as a co-equal burden estimate.</w:t>
       </w:r>
     </w:p>
     <w:p>
       <w:r>
-        <w:t>These findings establish a structural problem rather than a complete prevalence estimate. The unevaluable majority cannot yet be analyzed at the same depth, and that inability to assess scope is itself part of the governance failure documented here.</w:t>
+        <w:t>Within the evaluable subset, exported P/LP labels did not behave as portable disease-state claims. The same label could remain compatible with a dominant high-penetrance model, trigger ancestry-aware review, or become incompatible with that tested model depending on mechanism and population resolution.</w:t>
       </w:r>
     </w:p>
     <w:p>
       <w:r>
-        <w:t>A public pathogenic label does not reliably preserve the disease-state definition required for safe downstream reuse. Responsible reuse requires, at minimum, explicit specification of the disease model being invoked and explicit declaration of the degree of population evaluability available for the asserted allele.</w:t>
+        <w:t>The pattern was biologically structured rather than random: no dominant-negative/GoF variants decomposed at MCAF &gt;= 2.5 x 10^-5, whereas haploinsufficient and recessive architectures showed substantially higher incompatibility rates. Here, decomposition denotes only model incompatibility under frequency stress; it is not a statement that the variant is wrong, benign, or clinically reclassified. The hereditary-cancer analysis served only as a structural sanity check that the same compression problem can recur outside arrhythmia under a different mechanism mix.</w:t>
+      </w:r>
+    </w:p>
+    <w:p>
+      <w:r>
+        <w:t>When translated into actionability routing, the same structural problem becomes operationally measurable. In the arrhythmia cohort, 1,512/1,731 label-driven direct-actionability decisions required rerouting; across six domains, the mean nonpass rate was 87.7%. Expert-curated evaluable positives were mostly preserved as VITAL_OK or review-level, with only 4/73 hard model conflicts.</w:t>
+      </w:r>
+    </w:p>
+    <w:p>
+      <w:r>
+        <w:t>Public pathogenicity labels therefore lose disease-model portability when downstream systems strip away evaluability, inheritance, mechanism, and ancestry-aware frequency context. VITAL operationalizes that failure mode rather than reclassifying variants, and it suggests a minimal standard for public assertions: preserve the label together with the fields required to interpret it safely downstream.</w:t>
       </w:r>
     </w:p>
     <w:p>
@@ -2135,7 +4307,12 @@
     </w:p>
     <w:p>
       <w:r>
-        <w:t>The computational pipeline used for these analyses is available in the project repository. Historical script names retain the vital prefix, but the current manuscript framing is evaluability- and disease-model-centric rather than tool-centric.</w:t>
+        <w:t>The VITAL pipeline (Variant Interpretation Through Ancestry-aware Labeling) is available as an open-source computational tool in the project repository. In addition to generating the analytical outputs reported here, VITAL includes a minimal annotation layer for downstream reuse. The MVP annotator accepts VCF, CSV, or TSV inputs, supports lookup-based annotation, emits VITAL evaluability and disease-model flags, and can export an ANNOVAR-style table with Chr, Start, End, Ref, Alt, VITAL_evaluability, VITAL_flag, VITAL_regime, VITAL_popmax_af, VITAL_global_af, VITAL_threshold, and VITAL_reason.</w:t>
+      </w:r>
+    </w:p>
+    <w:p>
+      <w:r>
+        <w:t>The tool is designed as a guardrail layer rather than a variant reclassification system: VITAL_OK does not mean benign, CHECK_POPMAX does not mean reclassification, and MODEL_CONFLICT indicates incompatibility with the tested unqualified dominant high-penetrance model. The repository also exposes the routing audit layer (python src/run_vital_routing_validation.py), the cached cohort-level CLI (python run_vital.py --mode full --genes "MYBPC3,MYH7" --pop gnomAD), and machine-readable repair/reason-code tables.</w:t>
       </w:r>
     </w:p>
     <w:p>
@@ -2148,7 +4325,7 @@
     </w:p>
     <w:p>
       <w:r>
-        <w:t>Code, cached intermediate files, processed tables, and figure assets required to reproduce the analyses summarized here are available in the repository. The April 24, 2026 data freeze used ClinVar public assertion snapshots together with gnomAD v4.1.1 exome outputs and gnomAD r3.1.2 genome/HGDP regional outputs already cached in the project workspace.</w:t>
+        <w:t>Code, cached intermediate files, processed tables, and figure assets required to reproduce the analyses summarized here are available in the repository. The April 24, 2026 data freeze used ClinVar public assertion snapshots together with gnomAD v4.1.1 exome outputs and gnomAD r3.1.2 genome/HGDP regional outputs already cached in the project workspace. Machine-readable supplementary tables include evaluability tier classifications, frequency flags, regime assignments, molecular mechanism analysis outputs, routing validation outputs, and cross-domain stress-test tables. Repository: https://github.com/anerecye/New-project</w:t>
       </w:r>
     </w:p>
     <w:sectPr>

</xml_diff>

<commit_message>
Add autopsy de novo decision audit
</commit_message>
<xml_diff>
--- a/manuscript_vital_with_figures_tables.docx
+++ b/manuscript_vital_with_figures_tables.docx
@@ -1197,6 +1197,34 @@
     <w:p>
       <w:r>
         <w:t>This validation suite is intentionally modest. It is not a blinded clinician adjudication study, and the expert-curated arrhythmia subset is small. Its purpose is to check calibration, specificity of hard-conflict behavior, and workflow-level decision change.</w:t>
+      </w:r>
+    </w:p>
+    <w:p>
+      <w:pPr>
+        <w:pStyle w:val="Heading2"/>
+      </w:pPr>
+      <w:r>
+        <w:t>Autopsy x de novo Counterfactual Decision Audit</w:t>
+      </w:r>
+    </w:p>
+    <w:p>
+      <w:r>
+        <w:t>To model negative-autopsy interpretation contexts, we implemented an Autopsy x de novo Counterfactual Decision Audit. This phenotype-null framework simulates scenarios in which no structural post-mortem abnormality is available and genetic findings become the primary explanatory anchor.</w:t>
+      </w:r>
+    </w:p>
+    <w:p>
+      <w:r>
+        <w:t>Each simulated case was assigned a candidate variant, genotype, disease mechanism, inheritance model, population frequency, evaluability tier, autopsy context, and de novo status. The simulation used a hybrid variant universe: empirical ClinVar/gnomAD arrhythmia variants for observed label/frequency structure, plus simulated variants to cover the allele-frequency range from 1 x 10^-6 to 1 x 10^-2. Genotypes were sampled conditional on a candidate alternate allele being present, using AF-derived heterozygous and homozygous probabilities. The primary phenotype-null setting used negative autopsy, absent structural heart disease, no phenotype, and unknown family history.</w:t>
+      </w:r>
+    </w:p>
+    <w:p>
+      <w:r>
+        <w:t>A label-driven baseline treated any public P/LP variant in an arrhythmia-associated gene as sufficient for probable causal attribution, with confirmed trio de novo status increasing confidence to high. VITAL routing instead required allele-level evaluability, ancestry-aware population-frequency compatibility, and disease-model coherence before causal attribution could proceed. De novo status was treated as supportive evidence only when the underlying disease model remained coherent.</w:t>
+      </w:r>
+    </w:p>
+    <w:p>
+      <w:r>
+        <w:t>The primary endpoint was false causal attribution, defined as assignment of a variant as the probable cause of death when the simulated ground-truth disease model did not support causality. Secondary endpoints included de novo override error, prevented false attribution, CHECK/DEFER burden, MODEL_CONFLICT routing, and preservation of gold-standard dominant positives.</w:t>
       </w:r>
     </w:p>
     <w:p>
@@ -3201,7 +3229,243 @@
         <w:pStyle w:val="Heading2"/>
       </w:pPr>
       <w:r>
-        <w:t>11. Actionability Discordance and Simulated CDS Routing</w:t>
+        <w:t>11. Autopsy x de novo Audit Shows How de novo Can Amplify False Causal Attribution</w:t>
+      </w:r>
+    </w:p>
+    <w:p>
+      <w:r>
+        <w:t>In the phenotype-null negative-autopsy simulation, the label-driven baseline frequently converted P/LP status into causal attribution. It assigned 9,348 causal explanations, of which 7,975 were false under the simulated ground-truth disease model (85.3%). Confirmed de novo status further increased baseline confidence, generating 371 de novo override errors.</w:t>
+      </w:r>
+    </w:p>
+    <w:p>
+      <w:r>
+        <w:t>VITAL substantially reduced false causal attribution by reallocating unsupported genetic explanations into CHECK_MODEL, CHECK_POPMAX, EVAL_LIMITED, or MODEL_CONFLICT routes. VITAL supported only 48 causal attributions, of which 10 were false (20.8%), and prevented 7,965 baseline false attributions. Among confirmed de novo cases, VITAL supported 48, routed 361 to CHECK/DEFER, and blocked 47 as MODEL_CONFLICT. De novo status therefore acted as supportive evidence only when the disease model remained coherent.</w:t>
+      </w:r>
+    </w:p>
+    <w:p>
+      <w:r>
+        <w:t>Gold-standard dominant positives were preserved: 42/42 empirical GoF/DN AF-compatible P/LP controls remained VITAL_OK and 0 entered MODEL_CONFLICT. A conflicting-ClinVar layer stayed outside the P/LP baseline rather than being forced into model-conflict routing, supporting the interpretation that VITAL is a routing layer rather than a pathogenicity detector.</w:t>
+      </w:r>
+    </w:p>
+    <w:p>
+      <w:pPr>
+        <w:jc w:val="center"/>
+      </w:pPr>
+      <w:r>
+        <w:drawing>
+          <wp:inline xmlns:a="http://schemas.openxmlformats.org/drawingml/2006/main" xmlns:pic="http://schemas.openxmlformats.org/drawingml/2006/picture">
+            <wp:extent cx="6217920" cy="3169978"/>
+            <wp:docPr id="5" name="Picture 5"/>
+            <wp:cNvGraphicFramePr>
+              <a:graphicFrameLocks noChangeAspect="1"/>
+            </wp:cNvGraphicFramePr>
+            <a:graphic>
+              <a:graphicData uri="http://schemas.openxmlformats.org/drawingml/2006/picture">
+                <pic:pic>
+                  <pic:nvPicPr>
+                    <pic:cNvPr id="0" name="vital_autopsy_denovo_decision_flow.png"/>
+                    <pic:cNvPicPr/>
+                  </pic:nvPicPr>
+                  <pic:blipFill>
+                    <a:blip r:embed="rId13"/>
+                    <a:stretch>
+                      <a:fillRect/>
+                    </a:stretch>
+                  </pic:blipFill>
+                  <pic:spPr>
+                    <a:xfrm>
+                      <a:off x="0" y="0"/>
+                      <a:ext cx="6217920" cy="3169978"/>
+                    </a:xfrm>
+                    <a:prstGeom prst="rect"/>
+                  </pic:spPr>
+                </pic:pic>
+              </a:graphicData>
+            </a:graphic>
+          </wp:inline>
+        </w:drawing>
+      </w:r>
+    </w:p>
+    <w:p>
+      <w:pPr>
+        <w:jc w:val="center"/>
+      </w:pPr>
+      <w:r>
+        <w:rPr>
+          <w:i/>
+          <w:sz w:val="18"/>
+        </w:rPr>
+        <w:t>Figure 5. Autopsy x de novo decision flow.</w:t>
+      </w:r>
+    </w:p>
+    <w:p/>
+    <w:p>
+      <w:pPr>
+        <w:jc w:val="center"/>
+      </w:pPr>
+      <w:r>
+        <w:drawing>
+          <wp:inline xmlns:a="http://schemas.openxmlformats.org/drawingml/2006/main" xmlns:pic="http://schemas.openxmlformats.org/drawingml/2006/picture">
+            <wp:extent cx="6217920" cy="4503695"/>
+            <wp:docPr id="6" name="Picture 6"/>
+            <wp:cNvGraphicFramePr>
+              <a:graphicFrameLocks noChangeAspect="1"/>
+            </wp:cNvGraphicFramePr>
+            <a:graphic>
+              <a:graphicData uri="http://schemas.openxmlformats.org/drawingml/2006/picture">
+                <pic:pic>
+                  <pic:nvPicPr>
+                    <pic:cNvPr id="0" name="vital_autopsy_denovo_false_attribution.png"/>
+                    <pic:cNvPicPr/>
+                  </pic:nvPicPr>
+                  <pic:blipFill>
+                    <a:blip r:embed="rId14"/>
+                    <a:stretch>
+                      <a:fillRect/>
+                    </a:stretch>
+                  </pic:blipFill>
+                  <pic:spPr>
+                    <a:xfrm>
+                      <a:off x="0" y="0"/>
+                      <a:ext cx="6217920" cy="4503695"/>
+                    </a:xfrm>
+                    <a:prstGeom prst="rect"/>
+                  </pic:spPr>
+                </pic:pic>
+              </a:graphicData>
+            </a:graphic>
+          </wp:inline>
+        </w:drawing>
+      </w:r>
+    </w:p>
+    <w:p>
+      <w:pPr>
+        <w:jc w:val="center"/>
+      </w:pPr>
+      <w:r>
+        <w:rPr>
+          <w:i/>
+          <w:sz w:val="18"/>
+        </w:rPr>
+        <w:t>Figure 6. False causal attribution reduction.</w:t>
+      </w:r>
+    </w:p>
+    <w:p/>
+    <w:p>
+      <w:pPr>
+        <w:jc w:val="center"/>
+      </w:pPr>
+      <w:r>
+        <w:drawing>
+          <wp:inline xmlns:a="http://schemas.openxmlformats.org/drawingml/2006/main" xmlns:pic="http://schemas.openxmlformats.org/drawingml/2006/picture">
+            <wp:extent cx="6217920" cy="4118414"/>
+            <wp:docPr id="7" name="Picture 7"/>
+            <wp:cNvGraphicFramePr>
+              <a:graphicFrameLocks noChangeAspect="1"/>
+            </wp:cNvGraphicFramePr>
+            <a:graphic>
+              <a:graphicData uri="http://schemas.openxmlformats.org/drawingml/2006/picture">
+                <pic:pic>
+                  <pic:nvPicPr>
+                    <pic:cNvPr id="0" name="vital_autopsy_denovo_override.png"/>
+                    <pic:cNvPicPr/>
+                  </pic:nvPicPr>
+                  <pic:blipFill>
+                    <a:blip r:embed="rId15"/>
+                    <a:stretch>
+                      <a:fillRect/>
+                    </a:stretch>
+                  </pic:blipFill>
+                  <pic:spPr>
+                    <a:xfrm>
+                      <a:off x="0" y="0"/>
+                      <a:ext cx="6217920" cy="4118414"/>
+                    </a:xfrm>
+                    <a:prstGeom prst="rect"/>
+                  </pic:spPr>
+                </pic:pic>
+              </a:graphicData>
+            </a:graphic>
+          </wp:inline>
+        </w:drawing>
+      </w:r>
+    </w:p>
+    <w:p>
+      <w:pPr>
+        <w:jc w:val="center"/>
+      </w:pPr>
+      <w:r>
+        <w:rPr>
+          <w:i/>
+          <w:sz w:val="18"/>
+        </w:rPr>
+        <w:t>Figure 7. de novo override routing.</w:t>
+      </w:r>
+    </w:p>
+    <w:p/>
+    <w:p>
+      <w:pPr>
+        <w:jc w:val="center"/>
+      </w:pPr>
+      <w:r>
+        <w:drawing>
+          <wp:inline xmlns:a="http://schemas.openxmlformats.org/drawingml/2006/main" xmlns:pic="http://schemas.openxmlformats.org/drawingml/2006/picture">
+            <wp:extent cx="6217920" cy="3986646"/>
+            <wp:docPr id="8" name="Picture 8"/>
+            <wp:cNvGraphicFramePr>
+              <a:graphicFrameLocks noChangeAspect="1"/>
+            </wp:cNvGraphicFramePr>
+            <a:graphic>
+              <a:graphicData uri="http://schemas.openxmlformats.org/drawingml/2006/picture">
+                <pic:pic>
+                  <pic:nvPicPr>
+                    <pic:cNvPr id="0" name="vital_autopsy_denovo_mechanism.png"/>
+                    <pic:cNvPicPr/>
+                  </pic:nvPicPr>
+                  <pic:blipFill>
+                    <a:blip r:embed="rId16"/>
+                    <a:stretch>
+                      <a:fillRect/>
+                    </a:stretch>
+                  </pic:blipFill>
+                  <pic:spPr>
+                    <a:xfrm>
+                      <a:off x="0" y="0"/>
+                      <a:ext cx="6217920" cy="3986646"/>
+                    </a:xfrm>
+                    <a:prstGeom prst="rect"/>
+                  </pic:spPr>
+                </pic:pic>
+              </a:graphicData>
+            </a:graphic>
+          </wp:inline>
+        </w:drawing>
+      </w:r>
+    </w:p>
+    <w:p>
+      <w:pPr>
+        <w:jc w:val="center"/>
+      </w:pPr>
+      <w:r>
+        <w:rPr>
+          <w:i/>
+          <w:sz w:val="18"/>
+        </w:rPr>
+        <w:t>Figure 8. Mechanism stratification in the autopsy audit.</w:t>
+      </w:r>
+    </w:p>
+    <w:p/>
+    <w:p>
+      <w:r>
+        <w:t>These results show that in negative-autopsy contexts, the principal risk is not variant classification alone but causal overextension: a flattened P/LP label, especially when reinforced by de novo status, may be promoted from classification evidence to cause-of-death explanation without sufficient model support.</w:t>
+      </w:r>
+    </w:p>
+    <w:p>
+      <w:pPr>
+        <w:pStyle w:val="Heading2"/>
+      </w:pPr>
+      <w:r>
+        <w:t>12. Actionability Discordance and Simulated CDS Routing</w:t>
       </w:r>
     </w:p>
     <w:p>
@@ -3631,7 +3895,7 @@
         <w:drawing>
           <wp:inline xmlns:a="http://schemas.openxmlformats.org/drawingml/2006/main" xmlns:pic="http://schemas.openxmlformats.org/drawingml/2006/picture">
             <wp:extent cx="6217920" cy="4767297"/>
-            <wp:docPr id="5" name="Picture 5"/>
+            <wp:docPr id="9" name="Picture 9"/>
             <wp:cNvGraphicFramePr>
               <a:graphicFrameLocks noChangeAspect="1"/>
             </wp:cNvGraphicFramePr>
@@ -3643,7 +3907,7 @@
                     <pic:cNvPicPr/>
                   </pic:nvPicPr>
                   <pic:blipFill>
-                    <a:blip r:embed="rId13"/>
+                    <a:blip r:embed="rId17"/>
                     <a:stretch>
                       <a:fillRect/>
                     </a:stretch>
@@ -3671,7 +3935,7 @@
           <w:i/>
           <w:sz w:val="18"/>
         </w:rPr>
-        <w:t>Figure 5. Counterfactual routing validation.</w:t>
+        <w:t>Figure 9. Counterfactual routing validation.</w:t>
       </w:r>
     </w:p>
     <w:p/>
@@ -3680,7 +3944,7 @@
         <w:pStyle w:val="Heading2"/>
       </w:pPr>
       <w:r>
-        <w:t>12. Repair Logic Separates Pathogenicity, Evaluability, and Actionability</w:t>
+        <w:t>13. Repair Logic Separates Pathogenicity, Evaluability, and Actionability</w:t>
       </w:r>
     </w:p>
     <w:p>
@@ -4175,6 +4439,24 @@
     </w:p>
     <w:p>
       <w:pPr>
+        <w:pStyle w:val="Heading2"/>
+      </w:pPr>
+      <w:r>
+        <w:t>De Novo Status Supports a Model; It Does Not Replace One</w:t>
+      </w:r>
+    </w:p>
+    <w:p>
+      <w:r>
+        <w:t>The Autopsy x de novo audit highlights a particularly sensitive failure mode of downstream label reuse. In negative-autopsy settings, phenotypic and structural anchors are absent, increasing the interpretive weight placed on genetic findings. De novo status can further amplify this effect by raising confidence in causal attribution. However, de novo occurrence is orthogonal to disease-model compatibility: it supports causality only when the asserted model remains coherent under population, mechanism, inheritance, and evaluability constraints.</w:t>
+      </w:r>
+    </w:p>
+    <w:p>
+      <w:r>
+        <w:t>VITAL therefore treats de novo status as evidence within a model, not as a substitute for the model itself. A confirmed de novo variant routed to CHECK_MODEL, CHECK_POPMAX, EVAL_LIMITED, or MODEL_CONFLICT remains important, but it should not be promoted directly to cause-of-death explanation in a phenotype-null negative-autopsy context.</w:t>
+      </w:r>
+    </w:p>
+    <w:p>
+      <w:pPr>
         <w:pStyle w:val="Heading1"/>
       </w:pPr>
       <w:r>
@@ -4224,6 +4506,11 @@
     <w:p>
       <w:r>
         <w:t>Ninth, the current structural-variant layer is a blocking requirement rather than a fully deployed SV/CNV engine. Loci such as SMN1, STRC, and GJB6 require copy-state, paralog, haplotype, and phase-aware handling before direct portability can be granted.</w:t>
+      </w:r>
+    </w:p>
+    <w:p>
+      <w:r>
+        <w:t>Tenth, the Autopsy x de novo audit is a simulation of candidate-variant interpretation, not an empirical sudden-death cohort. Its ground truth is generated from explicit mechanism, penetrance, inheritance, AF, and de novo assumptions. The purpose is to stress-test causal overextension under controlled assumptions, not to estimate real-world cause-of-death fractions.</w:t>
       </w:r>
     </w:p>
     <w:p>
@@ -4312,7 +4599,7 @@
     </w:p>
     <w:p>
       <w:r>
-        <w:t>The tool is designed as a guardrail layer rather than a variant reclassification system: VITAL_OK does not mean benign, CHECK_POPMAX does not mean reclassification, and MODEL_CONFLICT indicates incompatibility with the tested unqualified dominant high-penetrance model. The repository also exposes the routing audit layer (python src/run_vital_routing_validation.py), the cached cohort-level CLI (python run_vital.py --mode full --genes "MYBPC3,MYH7" --pop gnomAD), and machine-readable repair/reason-code tables.</w:t>
+        <w:t>The tool is designed as a guardrail layer rather than a variant reclassification system: VITAL_OK does not mean benign, CHECK_POPMAX does not mean reclassification, and MODEL_CONFLICT indicates incompatibility with the tested unqualified dominant high-penetrance model. The repository also exposes the routing audit layer (python src/run_vital_routing_validation.py), the Autopsy x de novo Counterfactual Decision Audit (python src/run_vital_autopsy_denovo_audit.py), the cached cohort-level CLI (python run_vital.py --mode full --genes "MYBPC3,MYH7" --pop gnomAD), and machine-readable repair/reason-code tables.</w:t>
       </w:r>
     </w:p>
     <w:p>

</xml_diff>

<commit_message>
Add autopsy false attribution denominator metrics
</commit_message>
<xml_diff>
--- a/manuscript_vital_with_figures_tables.docx
+++ b/manuscript_vital_with_figures_tables.docx
@@ -1224,7 +1224,7 @@
     </w:p>
     <w:p>
       <w:r>
-        <w:t>The primary endpoint was false causal attribution, defined as assignment of a variant as the probable cause of death when the simulated ground-truth disease model did not support causality. Secondary endpoints included de novo override error, prevented false attribution, CHECK/DEFER burden, MODEL_CONFLICT routing, and preservation of gold-standard dominant positives.</w:t>
+        <w:t>The primary endpoint was false causal attribution, defined as assignment of a variant as the probable cause of death when the simulated ground-truth disease model did not support causality. Denominator-sensitive endpoints included per-case false attribution rate and per-evaluable-case false attribution rate. Secondary endpoints included de novo override error, prevented false attribution, CHECK/DEFER burden, MODEL_CONFLICT routing, and preservation of gold-standard dominant positives.</w:t>
       </w:r>
     </w:p>
     <w:p>
@@ -3234,12 +3234,12 @@
     </w:p>
     <w:p>
       <w:r>
-        <w:t>In the phenotype-null negative-autopsy simulation, the label-driven baseline frequently converted P/LP status into causal attribution. It assigned 9,348 causal explanations, of which 7,975 were false under the simulated ground-truth disease model (85.3%). Confirmed de novo status further increased baseline confidence, generating 371 de novo override errors.</w:t>
+        <w:t>In the phenotype-null negative-autopsy simulation, the label-driven baseline frequently converted P/LP status into causal attribution. It assigned 9,348 causal explanations, of which 7,975 were false under the simulated ground-truth disease model (85.3%). On denominator-based metrics, the baseline per-case false attribution rate was 79.8% (7,975/10,000), and the per-evaluable-case false attribution rate was 69.6% (2,540/3,648). Confirmed de novo status further increased baseline confidence, generating 371 de novo override errors.</w:t>
       </w:r>
     </w:p>
     <w:p>
       <w:r>
-        <w:t>VITAL substantially reduced false causal attribution by reallocating unsupported genetic explanations into CHECK_MODEL, CHECK_POPMAX, EVAL_LIMITED, or MODEL_CONFLICT routes. VITAL supported only 48 causal attributions, of which 10 were false (20.8%), and prevented 7,965 baseline false attributions. Among confirmed de novo cases, VITAL supported 48, routed 361 to CHECK/DEFER, and blocked 47 as MODEL_CONFLICT. De novo status therefore acted as supportive evidence only when the disease model remained coherent.</w:t>
+        <w:t>VITAL substantially reduced false causal attribution by reallocating unsupported genetic explanations into CHECK_MODEL, CHECK_POPMAX, EVAL_LIMITED, or MODEL_CONFLICT routes. VITAL supported only 48 causal attributions, of which 10 were false (20.8%), and prevented 7,965 baseline false attributions. The corresponding VITAL per-case false attribution rate was 0.1% (10/10,000), and the per-evaluable-case false attribution rate was 0.27% (10/3,648). Across all cases, VITAL routes were EVAL_LIMITED 61.9%, CHECK_MODEL 9.5%, CHECK_POPMAX 4.8%, and MODEL_CONFLICT 9.0%. Among evaluable cases, the same breakdown was EVAL_LIMITED 0.0%, CHECK_MODEL 26.1%, CHECK_POPMAX 13.1%, and MODEL_CONFLICT 24.6%. Among confirmed de novo cases, VITAL supported 48, routed 361 to CHECK/DEFER, and blocked 47 as MODEL_CONFLICT. De novo status therefore acted as supportive evidence only when the disease model remained coherent.</w:t>
       </w:r>
     </w:p>
     <w:p>

</xml_diff>

<commit_message>
Clarify VITAL routing and audit framing
Co-authored-by: Codex <noreply@openai.com>
</commit_message>
<xml_diff>
--- a/manuscript_vital_with_figures_tables.docx
+++ b/manuscript_vital_with_figures_tables.docx
@@ -30,17 +30,17 @@
     </w:p>
     <w:p>
       <w:r>
-        <w:t>Applying maximum-credible-allele-frequency (MCAF) stress-testing classified the evaluable exome subset into operationally distinct regimes. Here, decomposition denotes only disease-model incompatibility under population-frequency stress, not a claim that the variant is benign or incorrectly classified. At biologically interpretable thresholds, incompatibility with an unqualified dominant high-penetrance model was mechanism-dependent: gain-of-function/dominant-negative genes showed zero observed decomposition (0/34; 95% CI 0-10.2%), haploinsufficient genes showed intermediate decomposition, and recessive genes showed the highest decomposition. Supplementary HGDP and hereditary-cancer analyses were retained only as secondary stress checks rather than as co-equal burden estimates.</w:t>
+        <w:t>Applying maximum-credible-allele-frequency (MCAF) stress-testing classified the evaluable exome subset into operationally distinct regimes. Here, decomposition denotes only disease-model incompatibility under population-frequency stress, not a claim that the variant is benign or incorrectly classified. Within the usable-AF Tier 1 subset, incompatibility with an unqualified dominant high-penetrance model was mechanism-dependent: gain-of-function/dominant-negative genes showed zero observed decomposition among evaluable variants (0/34; 95% CI 0-10.2%), haploinsufficient genes showed intermediate decomposition, and recessive genes showed the highest decomposition. This mechanism gradient is therefore a conditional allele-resolved result, not an estimate for non-evaluable variants. Supplementary HGDP and hereditary-cancer analyses were retained only as secondary stress checks rather than as co-equal burden estimates.</w:t>
       </w:r>
     </w:p>
     <w:p>
       <w:r>
-        <w:t>We then translated these population and mechanism constraints into VITAL, a post-label actionability routing layer. Under a label-driven baseline, all 1,731 arrhythmia P/LP variants entered a direct-actionable route. After VITAL, 1,512/1,731 decisions (87.3%) were rerouted: 1,397 (80.7%) were evaluation-limiting, 77 (4.4%) were risk-escalating, and 38 (2.2%) were model-correcting. Across six disease domains, the mean nonpass rate was 87.7%. Routing instability persisted among high-review assertions (309/365; 84.7%), while expert-curated evaluable positives were largely preserved (69/73; 94.5% VITAL_OK or review-level; 4/73; 5.5% hard model conflict).</w:t>
+        <w:t>We then translated these population and mechanism constraints into VITAL, a post-label actionability routing layer. Under a label-driven baseline, all 1,731 arrhythmia P/LP variants entered a direct-actionable route. After VITAL, 1,512/1,731 decisions (87.3%) were rerouted, but this aggregate intentionally combines distinct reasons: 1,397 (80.7%) were evidence-unavailable EVAL_LIMITED deferrals, 77 (4.4%) required ancestry-aware frequency review, and 38 (2.2%) required disease-model repair. The evidence-conflict signal is therefore the smaller CHECK/MODEL_CONFLICT component, whereas the larger result is a population-evaluability boundary. Across six disease domains, the mean nonpass rate was 87.7%. Routing instability persisted among high-review assertions (309/365; 84.7%).</w:t>
       </w:r>
     </w:p>
     <w:p>
       <w:r>
-        <w:t>These findings operationalize a measurable downstream reuse failure mode: within the evaluable subset, the portability of a P/LP label as a disease-state claim depends on disease model, molecular mechanism, and population-frequency resolution, none of which are currently encoded in the exported label. Population-structured frequency review should therefore be treated as a minimum evidence layer in downstream interpretation workflows, while preserving explicit uncertainty for non-evaluable variants. VITAL does not reclassify variants; it reroutes actionability when flattened labels no longer carry the constraints required for direct reuse.</w:t>
+        <w:t>These findings operationalize a measurable downstream reuse failure mode with two separable components: evidence unavailable for most labels, and evidence conflicting or model-incomplete for a smaller allele-resolved subset. Within the evaluable subset, the portability of a P/LP label as a disease-state claim depends on disease model, molecular mechanism, and population-frequency resolution, none of which are currently encoded in the exported label. Population-structured frequency review should therefore be treated as a minimum evidence layer in downstream interpretation workflows, while preserving explicit uncertainty for non-evaluable variants. VITAL does not reclassify variants; it reroutes actionability when flattened labels no longer carry the constraints required for direct reuse.</w:t>
       </w:r>
     </w:p>
     <w:p>
@@ -76,7 +76,7 @@
     </w:p>
     <w:p>
       <w:r>
-        <w:t>This flattening scenario is routine. Laboratory information systems, VCF annotation pipelines, decision-support tools, review spreadsheets, and screening filters often import ClinVar as a categorical flag. In each case, the consumer may receive a P/LP label without the disease model that justified it.</w:t>
+        <w:t>This flattening scenario is routine. Laboratory information systems, VCF annotation pipelines, decision-support tools, review spreadsheets, and screening filters often import ClinVar as a categorical flag. Concrete examples include VEP or ANNOVAR consequence tables that append ClinVar significance to a VCF row, laboratory spreadsheets that sort candidate variants by P/LP status, clinical decision-support triggers that watch for actionable genes plus P/LP labels, and research screening filters that retain "pathogenic ClinVar" variants before phenotype-specific review. In each case, the consumer may receive a P/LP label without the disease model that justified it.</w:t>
       </w:r>
     </w:p>
     <w:p>
@@ -96,7 +96,7 @@
     </w:p>
     <w:p>
       <w:r>
-        <w:t>We show that most public arrhythmia assertions cannot be connected to allele-resolved population frequency even after exhaustive reconciliation and reference-based normalization. Among the minority for which allele-resolved context is available, ancestry-aware frequency exposes distinct interpretation regimes concealed beneath the same public P/LP label. Critically, the rate of disease-model decomposition is not random: it is mechanistically determined by molecular mechanism and variant consequence, and the broader compression problem recurs across biologically distinct disease domains. Safe downstream reuse therefore requires more explicit metadata than current public labels provide.</w:t>
+        <w:t>We show that most public arrhythmia assertions cannot be connected to allele-resolved population frequency even after exhaustive reconciliation and reference-based normalization. Among the minority for which allele-resolved context is available, ancestry-aware frequency exposes distinct interpretation regimes concealed beneath the same public P/LP label. Within that evaluable subset, the rate of disease-model decomposition is not random: it is structured by molecular mechanism and variant consequence. Outside that subset, the dominant finding is a transportability boundary rather than an estimable decomposition rate. Safe downstream reuse therefore requires more explicit metadata than current public labels provide.</w:t>
       </w:r>
     </w:p>
     <w:p>
@@ -476,7 +476,7 @@
     <w:p/>
     <w:p>
       <w:r>
-        <w:t>Tier 1 contains the only variants used for allele-level frequency conclusions in the exome analysis. Tier 2 was never interpreted as population-consistent by implication.</w:t>
+        <w:t>Tier 1 contains the only variants used for allele-level frequency conclusions in the exome analysis. Tier 2 was never interpreted as population-consistent by implication. Because evaluability was not random with respect to variant class or gene architecture, all mechanism-stratified decomposition estimates are conditional on usable allele-resolved AF and are not transported to Tier 2.</w:t>
       </w:r>
     </w:p>
     <w:p>
@@ -522,12 +522,12 @@
     </w:p>
     <w:p>
       <w:r>
-        <w:t>The analysis therefore asks whether an observed population frequency is compatible with a specified disease model, not whether the variant is pathogenic. Three thresholds were used to bracket biologically interpretable dominant arrhythmia scenarios: 2.5 x 10^-5 as a strict high-penetrance dominant ceiling, 1 x 10^-4 as a reduced-penetrance or founder-compatible boundary, and 1 x 10^-3 as a deliberately permissive sensitivity extreme. The 1 x 10^-5 exome screen was used only to nominate variants for review before MCAF bracketing, not as the final model-incompatibility definition.</w:t>
+        <w:t>The analysis therefore asks whether an observed population frequency is compatible with a specified disease model, not whether the variant is pathogenic. Three thresholds were used to bracket biologically interpretable dominant arrhythmia scenarios: 2.5 x 10^-5 as a strict high-penetrance dominant ceiling, 1 x 10^-4 as a reduced-penetrance or founder-compatible boundary, and 1 x 10^-3 as a deliberately permissive sensitivity extreme. These are not universal ClinVar thresholds and are not intended to be shared unchanged across all arrhythmia genes. They are stress-test ceilings for the unqualified dominant high-penetrance model; gene- or condition-specific deployment would require disease-specific prevalence, allelic contribution, and penetrance parameters. The 1 x 10^-5 exome screen was used only to nominate variants for review before MCAF bracketing, not as the final model-incompatibility definition.</w:t>
       </w:r>
     </w:p>
     <w:p>
       <w:r>
-        <w:t>This threshold strategy is internally checked in three ways. First, absolute alert counts change under threshold sensitivity, but the ordinal mechanism gradient is preserved. Second, the GoF/dominant-negative class behaves as a positive control: at biologically interpretable MCAF thresholds, it shows 0/34 decomposition. Third, hard conflict is separated from boundary or recessive-compatible routing rather than collapsed into a single "too frequent" label. These safeguards prevent MCAF from becoming an uncalibrated reclassification rule.</w:t>
+        <w:t>This threshold strategy is internally checked in three ways. First, absolute alert counts change under threshold sensitivity, but the ordinal mechanism gradient is preserved within the usable-AF subset. Second, the GoF/dominant-negative class behaves as an internal allele-resolved control: at biologically interpretable MCAF thresholds, it shows 0/34 decomposition among evaluable variants. Third, hard conflict is separated from boundary or recessive-compatible routing rather than collapsed into a single "too frequent" label. These safeguards prevent MCAF from becoming an uncalibrated reclassification rule, but they do not remove the Tier 2 transportability boundary.</w:t>
       </w:r>
     </w:p>
     <w:p>
@@ -541,6 +541,11 @@
     <w:p>
       <w:r>
         <w:t>To connect the frequency-stress analysis with downstream reuse, we formalized a simple label-driven baseline. This baseline is not a clinical recommendation; it is the null model used to audit flattened reuse.</w:t>
+      </w:r>
+    </w:p>
+    <w:p>
+      <w:r>
+        <w:t>The baseline is intentionally concrete rather than adversarial. It reflects common downstream workflows in which a ClinVar P/LP field is appended to a variant row and then used for triage before full model reconstruction: VEP/ANNOVAR-style annotation, laboratory candidate-variant spreadsheets, clinical decision-support triggers for actionable genes, and research filters that retain P/LP variants for review.</w:t>
       </w:r>
     </w:p>
     <w:tbl>
@@ -1191,12 +1196,12 @@
     </w:p>
     <w:p>
       <w:r>
-        <w:t>First, high-review ClinVar assertions tested whether routing instability persisted after excluding the weakest public assertions. Second, ClinVar expert-panel and practice-guideline assertions, including ClinGen-curated sources where present in ClinVar, tested whether VITAL preserved expert-curated positives as compatible or review-level rather than indiscriminately generating hard conflicts. Third, expert-curated benign/likely benign controls tested whether VITAL behaved as a disease-model compatibility layer rather than as a pathogenicity detector. Fourth, the counterfactual decision audit and simulated CDS layer tested whether VITAL changed the route taken by a label-driven workflow.</w:t>
+        <w:t>First, high-review ClinVar assertions tested whether routing instability persisted after excluding the weakest public assertions. Second, benign/likely benign controls tested whether VITAL behaved as a disease-model compatibility layer rather than as a pathogenicity detector. Third, published case-report reconstructions tested whether routing categories mapped onto recognizable clinical interpretation failure modes. Fourth, the counterfactual decision audit and simulated CDS layer tested whether VITAL changed the route taken by a label-driven workflow.</w:t>
       </w:r>
     </w:p>
     <w:p>
       <w:r>
-        <w:t>This validation suite is intentionally modest. It is not a blinded clinician adjudication study, and the expert-curated arrhythmia subset is small. Its purpose is to check calibration, specificity of hard-conflict behavior, and workflow-level decision change.</w:t>
+        <w:t>This validation suite is intentionally modest. It is not a blinded clinician adjudication study. Its purpose is to check calibration, specificity of hard-conflict behavior, clinical interpretability, and workflow-level decision change.</w:t>
       </w:r>
     </w:p>
     <w:p>
@@ -1224,7 +1229,7 @@
     </w:p>
     <w:p>
       <w:r>
-        <w:t>The primary endpoint was false causal attribution, defined as assignment of a variant as the probable cause of death when the simulated ground-truth disease model did not support causality. Denominator-sensitive endpoints included per-case false attribution rate and per-evaluable-case false attribution rate. Secondary endpoints included de novo override error, prevented false attribution, CHECK/DEFER burden, MODEL_CONFLICT routing, and preservation of gold-standard dominant positives.</w:t>
+        <w:t>The primary endpoint was false causal attribution, defined as assignment of a variant as the probable cause of death when the simulated ground-truth disease model did not support causality. Denominator-sensitive endpoints included per-case false attribution rate and per-evaluable-case false attribution rate. Secondary endpoints included de novo override error, prevented false attribution, CHECK/DEFER burden, and MODEL_CONFLICT routing.</w:t>
       </w:r>
     </w:p>
     <w:p>
@@ -1265,7 +1270,7 @@
     </w:p>
     <w:p>
       <w:r>
-        <w:t>All primary disease-model conclusions come from the 334 usable-AF variants. All primary actionability-routing conclusions use the 1,731-label arrhythmia baseline. HGDP, hereditary cancer, and external disease panels are supplementary stress layers: they test structural recurrence and failure modes, not primary burden estimates.</w:t>
+        <w:t>All primary disease-model conclusions come from the 334 usable-AF variants and should be read as conditional on allele-level evaluability. All primary actionability-routing conclusions use the 1,731-label arrhythmia baseline. HGDP, hereditary cancer, and external disease panels are supplementary stress layers: they test structural recurrence and failure modes, not primary burden estimates.</w:t>
       </w:r>
     </w:p>
     <w:tbl>
@@ -1727,12 +1732,523 @@
     </w:p>
     <w:p>
       <w:r>
-        <w:t>Tier 2 is not a homogeneous gray zone. Within its 1,326 variants, 638 (48.1%) showed allele discordance at the queried locus, whereas 688 (51.9%) lacked even a same-locus gnomAD record. Tier 2 was also enriched for representation-sensitive classes: indels, duplications, and insertions accounted for 640 of 1,326 Tier 2 variants (48.3%), compared with 106 of 357 Tier 1 variants (29.7%), corresponding to an odds ratio of 2.21.</w:t>
+        <w:t>Tier 2 is not a homogeneous gray zone. Within its 1,326 variants, 638 (48.1%) showed allele discordance at the queried locus, whereas 688 (51.9%) lacked even a same-locus gnomAD record. Tier 2 was also enriched for representation-sensitive classes: indels, duplications, and insertions accounted for 640 of 1,326 Tier 2 variants (48.3%), compared with 106 of 357 Tier 1 variants (29.7%), corresponding to an odds ratio of 2.21. Duplications showed the same pattern (170/1,326 Tier 2 variants, 12.8%, versus 22/357 Tier 1 variants, 6.2%; odds ratio 2.24).</w:t>
       </w:r>
     </w:p>
     <w:p>
       <w:r>
-        <w:t>This means that non-observation at the allele level is not a uniform proxy for rarity. For precisely the classes most vulnerable to representation instability, absence of an allele-resolved match often reflects discordance between public assertion and aggregation systems rather than genuine population absence. This argument applies most strongly to indels, duplications, and splice-disrupting variants, where representation instability can cause genuine alleles to be absent from frequency databases for technical reasons. For SNVs in well-covered callable regions, allele absence in gnomAD may constitute meaningful rarity evidence with a computable upper bound. This study conservatively treats all non-recovered variants as not allele-level frequency-evaluable rather than absent from the population, and does not apply coverage-based negative-lookup inference.</w:t>
+        <w:t>The mechanism denominator was affected by the same evaluability structure. Only 34/248 GoF/dominant-negative labels (13.7%) had usable AF, compared with 92/564 haploinsufficient labels (16.3%), 70/116 recessive labels (60.3%), and 130/779 mixed-mechanism labels (16.7%). The evaluable GoF/dominant-negative subset was entirely SNV-based and came from RYR2, KCNJ2, and CALM2; non-evaluable CALM1, CALM3, and most RYR2 labels therefore cannot be assigned the same 0% decomposition estimate.</w:t>
+      </w:r>
+    </w:p>
+    <w:tbl>
+      <w:tblPr>
+        <w:tblStyle w:val="TableGrid"/>
+        <w:tblW w:type="auto" w:w="0"/>
+        <w:jc w:val="center"/>
+        <w:tblLook w:firstColumn="1" w:firstRow="1" w:lastColumn="0" w:lastRow="0" w:noHBand="0" w:noVBand="1" w:val="04A0"/>
+      </w:tblPr>
+      <w:tblGrid>
+        <w:gridCol w:w="2074"/>
+        <w:gridCol w:w="2074"/>
+        <w:gridCol w:w="2074"/>
+        <w:gridCol w:w="2074"/>
+        <w:gridCol w:w="2074"/>
+      </w:tblGrid>
+      <w:tr>
+        <w:tc>
+          <w:tcPr>
+            <w:tcW w:type="dxa" w:w="2074"/>
+            <w:vAlign w:val="top"/>
+            <w:shd w:fill="D9EAF7"/>
+          </w:tcPr>
+          <w:p>
+            <w:pPr>
+              <w:jc w:val="left"/>
+            </w:pPr>
+            <w:r/>
+            <w:r>
+              <w:rPr>
+                <w:b/>
+                <w:sz w:val="16"/>
+              </w:rPr>
+              <w:t>Mechanism class</w:t>
+            </w:r>
+          </w:p>
+        </w:tc>
+        <w:tc>
+          <w:tcPr>
+            <w:tcW w:type="dxa" w:w="2074"/>
+            <w:vAlign w:val="top"/>
+            <w:shd w:fill="D9EAF7"/>
+          </w:tcPr>
+          <w:p>
+            <w:pPr>
+              <w:jc w:val="left"/>
+            </w:pPr>
+            <w:r/>
+            <w:r>
+              <w:rPr>
+                <w:b/>
+                <w:sz w:val="16"/>
+              </w:rPr>
+              <w:t>Total P/LP labels</w:t>
+            </w:r>
+          </w:p>
+        </w:tc>
+        <w:tc>
+          <w:tcPr>
+            <w:tcW w:type="dxa" w:w="2074"/>
+            <w:vAlign w:val="top"/>
+            <w:shd w:fill="D9EAF7"/>
+          </w:tcPr>
+          <w:p>
+            <w:pPr>
+              <w:jc w:val="left"/>
+            </w:pPr>
+            <w:r/>
+            <w:r>
+              <w:rPr>
+                <w:b/>
+                <w:sz w:val="16"/>
+              </w:rPr>
+              <w:t>Usable-AF Tier 1 labels</w:t>
+            </w:r>
+          </w:p>
+        </w:tc>
+        <w:tc>
+          <w:tcPr>
+            <w:tcW w:type="dxa" w:w="2074"/>
+            <w:vAlign w:val="top"/>
+            <w:shd w:fill="D9EAF7"/>
+          </w:tcPr>
+          <w:p>
+            <w:pPr>
+              <w:jc w:val="left"/>
+            </w:pPr>
+            <w:r/>
+            <w:r>
+              <w:rPr>
+                <w:b/>
+                <w:sz w:val="16"/>
+              </w:rPr>
+              <w:t>Not usable for MCAF</w:t>
+            </w:r>
+          </w:p>
+        </w:tc>
+        <w:tc>
+          <w:tcPr>
+            <w:tcW w:type="dxa" w:w="2074"/>
+            <w:vAlign w:val="top"/>
+            <w:shd w:fill="D9EAF7"/>
+          </w:tcPr>
+          <w:p>
+            <w:pPr>
+              <w:jc w:val="left"/>
+            </w:pPr>
+            <w:r/>
+            <w:r>
+              <w:rPr>
+                <w:b/>
+                <w:sz w:val="16"/>
+              </w:rPr>
+              <w:t>Transportability implication</w:t>
+            </w:r>
+          </w:p>
+        </w:tc>
+      </w:tr>
+      <w:tr>
+        <w:tc>
+          <w:tcPr>
+            <w:tcW w:type="dxa" w:w="2074"/>
+            <w:vAlign w:val="top"/>
+          </w:tcPr>
+          <w:p>
+            <w:pPr>
+              <w:jc w:val="left"/>
+            </w:pPr>
+            <w:r/>
+            <w:r>
+              <w:rPr>
+                <w:b w:val="0"/>
+                <w:sz w:val="16"/>
+              </w:rPr>
+              <w:t>Gain-of-function / dominant-negative</w:t>
+            </w:r>
+          </w:p>
+        </w:tc>
+        <w:tc>
+          <w:tcPr>
+            <w:tcW w:type="dxa" w:w="2074"/>
+            <w:vAlign w:val="top"/>
+          </w:tcPr>
+          <w:p>
+            <w:pPr>
+              <w:jc w:val="left"/>
+            </w:pPr>
+            <w:r/>
+            <w:r>
+              <w:rPr>
+                <w:b w:val="0"/>
+                <w:sz w:val="16"/>
+              </w:rPr>
+              <w:t>248</w:t>
+            </w:r>
+          </w:p>
+        </w:tc>
+        <w:tc>
+          <w:tcPr>
+            <w:tcW w:type="dxa" w:w="2074"/>
+            <w:vAlign w:val="top"/>
+          </w:tcPr>
+          <w:p>
+            <w:pPr>
+              <w:jc w:val="left"/>
+            </w:pPr>
+            <w:r/>
+            <w:r>
+              <w:rPr>
+                <w:b w:val="0"/>
+                <w:sz w:val="16"/>
+              </w:rPr>
+              <w:t>34 (13.7%)</w:t>
+            </w:r>
+          </w:p>
+        </w:tc>
+        <w:tc>
+          <w:tcPr>
+            <w:tcW w:type="dxa" w:w="2074"/>
+            <w:vAlign w:val="top"/>
+          </w:tcPr>
+          <w:p>
+            <w:pPr>
+              <w:jc w:val="left"/>
+            </w:pPr>
+            <w:r/>
+            <w:r>
+              <w:rPr>
+                <w:b w:val="0"/>
+                <w:sz w:val="16"/>
+              </w:rPr>
+              <w:t>214 (86.3%)</w:t>
+            </w:r>
+          </w:p>
+        </w:tc>
+        <w:tc>
+          <w:tcPr>
+            <w:tcW w:type="dxa" w:w="2074"/>
+            <w:vAlign w:val="top"/>
+          </w:tcPr>
+          <w:p>
+            <w:pPr>
+              <w:jc w:val="left"/>
+            </w:pPr>
+            <w:r/>
+            <w:r>
+              <w:rPr>
+                <w:b w:val="0"/>
+                <w:sz w:val="16"/>
+              </w:rPr>
+              <w:t>0/34 decomposition is an allele-resolved SNV-space result only</w:t>
+            </w:r>
+          </w:p>
+        </w:tc>
+      </w:tr>
+      <w:tr>
+        <w:tc>
+          <w:tcPr>
+            <w:tcW w:type="dxa" w:w="2074"/>
+            <w:vAlign w:val="top"/>
+          </w:tcPr>
+          <w:p>
+            <w:pPr>
+              <w:jc w:val="left"/>
+            </w:pPr>
+            <w:r/>
+            <w:r>
+              <w:rPr>
+                <w:b w:val="0"/>
+                <w:sz w:val="16"/>
+              </w:rPr>
+              <w:t>Haploinsufficient</w:t>
+            </w:r>
+          </w:p>
+        </w:tc>
+        <w:tc>
+          <w:tcPr>
+            <w:tcW w:type="dxa" w:w="2074"/>
+            <w:vAlign w:val="top"/>
+          </w:tcPr>
+          <w:p>
+            <w:pPr>
+              <w:jc w:val="left"/>
+            </w:pPr>
+            <w:r/>
+            <w:r>
+              <w:rPr>
+                <w:b w:val="0"/>
+                <w:sz w:val="16"/>
+              </w:rPr>
+              <w:t>564</w:t>
+            </w:r>
+          </w:p>
+        </w:tc>
+        <w:tc>
+          <w:tcPr>
+            <w:tcW w:type="dxa" w:w="2074"/>
+            <w:vAlign w:val="top"/>
+          </w:tcPr>
+          <w:p>
+            <w:pPr>
+              <w:jc w:val="left"/>
+            </w:pPr>
+            <w:r/>
+            <w:r>
+              <w:rPr>
+                <w:b w:val="0"/>
+                <w:sz w:val="16"/>
+              </w:rPr>
+              <w:t>92 (16.3%)</w:t>
+            </w:r>
+          </w:p>
+        </w:tc>
+        <w:tc>
+          <w:tcPr>
+            <w:tcW w:type="dxa" w:w="2074"/>
+            <w:vAlign w:val="top"/>
+          </w:tcPr>
+          <w:p>
+            <w:pPr>
+              <w:jc w:val="left"/>
+            </w:pPr>
+            <w:r/>
+            <w:r>
+              <w:rPr>
+                <w:b w:val="0"/>
+                <w:sz w:val="16"/>
+              </w:rPr>
+              <w:t>472 (83.7%)</w:t>
+            </w:r>
+          </w:p>
+        </w:tc>
+        <w:tc>
+          <w:tcPr>
+            <w:tcW w:type="dxa" w:w="2074"/>
+            <w:vAlign w:val="top"/>
+          </w:tcPr>
+          <w:p>
+            <w:pPr>
+              <w:jc w:val="left"/>
+            </w:pPr>
+            <w:r/>
+            <w:r>
+              <w:rPr>
+                <w:b w:val="0"/>
+                <w:sz w:val="16"/>
+              </w:rPr>
+              <w:t>Frequency-regime estimates do not cover most labels</w:t>
+            </w:r>
+          </w:p>
+        </w:tc>
+      </w:tr>
+      <w:tr>
+        <w:tc>
+          <w:tcPr>
+            <w:tcW w:type="dxa" w:w="2074"/>
+            <w:vAlign w:val="top"/>
+          </w:tcPr>
+          <w:p>
+            <w:pPr>
+              <w:jc w:val="left"/>
+            </w:pPr>
+            <w:r/>
+            <w:r>
+              <w:rPr>
+                <w:b w:val="0"/>
+                <w:sz w:val="16"/>
+              </w:rPr>
+              <w:t>Recessive</w:t>
+            </w:r>
+          </w:p>
+        </w:tc>
+        <w:tc>
+          <w:tcPr>
+            <w:tcW w:type="dxa" w:w="2074"/>
+            <w:vAlign w:val="top"/>
+          </w:tcPr>
+          <w:p>
+            <w:pPr>
+              <w:jc w:val="left"/>
+            </w:pPr>
+            <w:r/>
+            <w:r>
+              <w:rPr>
+                <w:b w:val="0"/>
+                <w:sz w:val="16"/>
+              </w:rPr>
+              <w:t>116</w:t>
+            </w:r>
+          </w:p>
+        </w:tc>
+        <w:tc>
+          <w:tcPr>
+            <w:tcW w:type="dxa" w:w="2074"/>
+            <w:vAlign w:val="top"/>
+          </w:tcPr>
+          <w:p>
+            <w:pPr>
+              <w:jc w:val="left"/>
+            </w:pPr>
+            <w:r/>
+            <w:r>
+              <w:rPr>
+                <w:b w:val="0"/>
+                <w:sz w:val="16"/>
+              </w:rPr>
+              <w:t>70 (60.3%)</w:t>
+            </w:r>
+          </w:p>
+        </w:tc>
+        <w:tc>
+          <w:tcPr>
+            <w:tcW w:type="dxa" w:w="2074"/>
+            <w:vAlign w:val="top"/>
+          </w:tcPr>
+          <w:p>
+            <w:pPr>
+              <w:jc w:val="left"/>
+            </w:pPr>
+            <w:r/>
+            <w:r>
+              <w:rPr>
+                <w:b w:val="0"/>
+                <w:sz w:val="16"/>
+              </w:rPr>
+              <w:t>46 (39.7%)</w:t>
+            </w:r>
+          </w:p>
+        </w:tc>
+        <w:tc>
+          <w:tcPr>
+            <w:tcW w:type="dxa" w:w="2074"/>
+            <w:vAlign w:val="top"/>
+          </w:tcPr>
+          <w:p>
+            <w:pPr>
+              <w:jc w:val="left"/>
+            </w:pPr>
+            <w:r/>
+            <w:r>
+              <w:rPr>
+                <w:b w:val="0"/>
+                <w:sz w:val="16"/>
+              </w:rPr>
+              <w:t>Recessive labels are more evaluable and therefore not directly comparable to GoF/DN</w:t>
+            </w:r>
+          </w:p>
+        </w:tc>
+      </w:tr>
+      <w:tr>
+        <w:tc>
+          <w:tcPr>
+            <w:tcW w:type="dxa" w:w="2074"/>
+            <w:vAlign w:val="top"/>
+          </w:tcPr>
+          <w:p>
+            <w:pPr>
+              <w:jc w:val="left"/>
+            </w:pPr>
+            <w:r/>
+            <w:r>
+              <w:rPr>
+                <w:b w:val="0"/>
+                <w:sz w:val="16"/>
+              </w:rPr>
+              <w:t>Mixed or context-dependent</w:t>
+            </w:r>
+          </w:p>
+        </w:tc>
+        <w:tc>
+          <w:tcPr>
+            <w:tcW w:type="dxa" w:w="2074"/>
+            <w:vAlign w:val="top"/>
+          </w:tcPr>
+          <w:p>
+            <w:pPr>
+              <w:jc w:val="left"/>
+            </w:pPr>
+            <w:r/>
+            <w:r>
+              <w:rPr>
+                <w:b w:val="0"/>
+                <w:sz w:val="16"/>
+              </w:rPr>
+              <w:t>779</w:t>
+            </w:r>
+          </w:p>
+        </w:tc>
+        <w:tc>
+          <w:tcPr>
+            <w:tcW w:type="dxa" w:w="2074"/>
+            <w:vAlign w:val="top"/>
+          </w:tcPr>
+          <w:p>
+            <w:pPr>
+              <w:jc w:val="left"/>
+            </w:pPr>
+            <w:r/>
+            <w:r>
+              <w:rPr>
+                <w:b w:val="0"/>
+                <w:sz w:val="16"/>
+              </w:rPr>
+              <w:t>130 (16.7%)</w:t>
+            </w:r>
+          </w:p>
+        </w:tc>
+        <w:tc>
+          <w:tcPr>
+            <w:tcW w:type="dxa" w:w="2074"/>
+            <w:vAlign w:val="top"/>
+          </w:tcPr>
+          <w:p>
+            <w:pPr>
+              <w:jc w:val="left"/>
+            </w:pPr>
+            <w:r/>
+            <w:r>
+              <w:rPr>
+                <w:b w:val="0"/>
+                <w:sz w:val="16"/>
+              </w:rPr>
+              <w:t>649 (83.3%)</w:t>
+            </w:r>
+          </w:p>
+        </w:tc>
+        <w:tc>
+          <w:tcPr>
+            <w:tcW w:type="dxa" w:w="2074"/>
+            <w:vAlign w:val="top"/>
+          </w:tcPr>
+          <w:p>
+            <w:pPr>
+              <w:jc w:val="left"/>
+            </w:pPr>
+            <w:r/>
+            <w:r>
+              <w:rPr>
+                <w:b w:val="0"/>
+                <w:sz w:val="16"/>
+              </w:rPr>
+              <w:t>Model-specific inference requires phenotype, inheritance, and allele-level context</w:t>
+            </w:r>
+          </w:p>
+        </w:tc>
+      </w:tr>
+    </w:tbl>
+    <w:p/>
+    <w:p>
+      <w:r>
+        <w:t>This means that non-observation at the allele level is not a uniform proxy for rarity, and that mechanism-stratified decomposition is vulnerable to verifiability bias if generalized outside the usable-AF subset. For precisely the classes most vulnerable to representation instability, absence of an allele-resolved match often reflects discordance between public assertion and aggregation systems rather than genuine population absence. This argument applies most strongly to indels, duplications, and splice-disrupting variants, where representation instability can cause genuine alleles to be absent from frequency databases for technical reasons. For SNVs in well-covered callable regions, allele absence in gnomAD may constitute meaningful rarity evidence with a computable upper bound. This study conservatively treats all non-recovered variants as not allele-level frequency-evaluable rather than absent from the population, and does not apply coverage-based negative-lookup inference.</w:t>
       </w:r>
     </w:p>
     <w:p>
@@ -2174,7 +2690,7 @@
     </w:p>
     <w:p>
       <w:r>
-        <w:t>Most rerouted decisions were evaluation-limited: 1,397/1,731 (80.7%). A smaller subset required direct frequency or model review: 77/1,731 (4.4%) were risk-escalating and 38/1,731 (2.2%) were model-correcting. Across the six-domain meta-analysis, the mean nonpass rate was 87.7%.</w:t>
+        <w:t>The 87.3% nonpass value should not be read as an 87.3% evidence-conflict rate. Most rerouted decisions were evidence-unavailable deferrals: 1,397/1,731 (80.7%) were EVAL_LIMITED because the asserted allele could not be evaluated at allele level in population data. A smaller subset carried evidence-based tension: 77/1,731 (4.4%) required ancestry-aware frequency review and 38/1,731 (2.2%) required model repair. Thus, VITAL separates absence of evaluability from positive evidence against a flattened model. Across the six-domain meta-analysis, the mean nonpass rate was 87.7%, again interpreted as a portability/routing burden rather than a conflict burden.</w:t>
       </w:r>
     </w:p>
     <w:p>
@@ -2231,7 +2747,7 @@
     <w:p/>
     <w:p>
       <w:r>
-        <w:t>The central result is therefore not that 87% of labels are false. It is that 87% of label-driven actionability decisions require rerouting once minimal constraints are restored.</w:t>
+        <w:t>The central result is therefore not that 87% of labels are false, nor that 87% conflict with population evidence. It is that 87% of label-driven actionability decisions require rerouting once minimal constraints are restored, with most rerouting caused by evidence unavailability and a smaller component caused by frequency or model tension.</w:t>
       </w:r>
     </w:p>
     <w:p>
@@ -2280,12 +2796,12 @@
         <w:pStyle w:val="Heading2"/>
       </w:pPr>
       <w:r>
-        <w:t>8. Molecular Mechanism Predicts Disease-Model Stability</w:t>
+        <w:t>8. In the Evaluable Subset, Molecular Mechanism Predicts Disease-Model Stability</w:t>
       </w:r>
     </w:p>
     <w:p>
       <w:r>
-        <w:t>Decomposition rates varied systematically and predictably across gene classes defined by molecular mechanism. These mechanism labels define the disease-model context being stress-tested for each gene, not the intrinsic mechanism of every variant in that gene.</w:t>
+        <w:t>Decomposition rates varied systematically and predictably across gene classes defined by molecular mechanism within the usable-AF Tier 1 subset. These mechanism labels define the disease-model context being stress-tested for each gene, not the intrinsic mechanism of every variant in that gene.</w:t>
       </w:r>
     </w:p>
     <w:tbl>
@@ -2456,7 +2972,7 @@
                 <w:b w:val="0"/>
                 <w:sz w:val="16"/>
               </w:rPr>
-              <w:t>Positive control: strong purifying selection on heterozygotes keeps variants universally rare</w:t>
+              <w:t>Internal allele-resolved control: evaluable SNVs remain below the tested MCAF ceiling</w:t>
             </w:r>
           </w:p>
         </w:tc>
@@ -2621,7 +3137,7 @@
     <w:p/>
     <w:p>
       <w:r>
-        <w:t>The GoF/dominant-negative class at 0% decomposition at MCAF &gt;= 2.5 x 10^-5 constitutes a positive control supporting the interpretation that decomposition at biologically interpretable thresholds reflects genuine biology rather than methodological artifact (0/34 evaluable variants; 95% CI 0-10.2%; rule-of-three upper bound 8.8%). At sub-biological thresholds below 2.5 x 10^-5, GoF/DN variants are also flagged, confirming that threshold choice determines whether the pipeline detects genuine disease-model incompatibility or normal population variation.</w:t>
+        <w:t>The GoF/dominant-negative class at 0% decomposition at MCAF &gt;= 2.5 x 10^-5 constitutes an internal allele-resolved control supporting the interpretation that decomposition at biologically interpretable thresholds reflects genuine biology rather than a uniform pipeline artifact (0/34 evaluable variants; 95% CI 0-10.2%; rule-of-three upper bound 8.8%). It does not establish 0% decomposition for all GoF/dominant-negative labels in ClinVar, because 214/248 GoF/DN labels lacked usable allele-level AF. At sub-biological thresholds below 2.5 x 10^-5, GoF/DN variants are also flagged, confirming that threshold choice determines whether the pipeline detects genuine disease-model incompatibility or normal population variation.</w:t>
       </w:r>
     </w:p>
     <w:p>
@@ -2636,7 +3152,7 @@
     </w:p>
     <w:p>
       <w:r>
-        <w:t>Leave-one-gene-out sensitivity analysis preserved the mechanism gradient in every iteration. The overall decomposition rate ranged from 17.2% to 21.3% (overall 19.5%; maximum single-gene shift 2.3 percentage points, driven by TRDN exclusion). The ordering GoF/DN &lt; HI &lt; AR was preserved without exception. Excluding limited-evidence genes (AKAP9, CACNA2D1, CACNB2, SNTA1), mixed-mechanism genes (SCN5A, KCNQ1, CACNA1C, KCNE1), or all eight disputed/mixed genes still preserved the gradient.</w:t>
+        <w:t>Within the usable-AF subset, leave-one-gene-out sensitivity analysis preserved the mechanism gradient in every iteration. The overall decomposition rate ranged from 17.2% to 21.3% (overall 19.5%; maximum single-gene shift 2.3 percentage points, driven by TRDN exclusion). The ordering GoF/DN &lt; HI &lt; AR was preserved without exception. Excluding limited-evidence genes (AKAP9, CACNA2D1, CACNB2, SNTA1), mixed-mechanism genes (SCN5A, KCNQ1, CACNA1C, KCNE1), or all eight disputed/mixed genes still preserved the gradient.</w:t>
       </w:r>
     </w:p>
     <w:p>
@@ -2654,7 +3170,7 @@
     </w:p>
     <w:p>
       <w:r>
-        <w:t>The cross-domain layers are intentionally demoted to structural sanity checks. The hereditary-cancer analysis asks whether evaluability compression and regime heterogeneity recur under a different mechanism mix; it does not estimate clinically calibrated cancer burden because the thresholds were inherited from arrhythmia.</w:t>
+        <w:t>The cross-domain layers are intentionally demoted to structural sanity checks. The hereditary-cancer analysis asks only whether evaluability compression and regime heterogeneity recur under a different mechanism mix; it does not estimate clinically calibrated cancer burden because the thresholds were inherited from arrhythmia.</w:t>
       </w:r>
     </w:p>
     <w:p>
@@ -2719,7 +3235,7 @@
         <w:pStyle w:val="Heading2"/>
       </w:pPr>
       <w:r>
-        <w:t>10. Validation Is Layered: Expert Positives, Controls, Review Status, and Pipeline Routing</w:t>
+        <w:t>10. Validation Is Layered: Review Status, Controls, Case Reconstruction, and Pipeline Routing</w:t>
       </w:r>
     </w:p>
     <w:p>
@@ -2916,162 +3432,6 @@
                 <w:b w:val="0"/>
                 <w:sz w:val="16"/>
               </w:rPr>
-              <w:t>Expert-curated P/LP positives</w:t>
-            </w:r>
-          </w:p>
-        </w:tc>
-        <w:tc>
-          <w:tcPr>
-            <w:tcW w:type="dxa" w:w="2592"/>
-            <w:vAlign w:val="top"/>
-          </w:tcPr>
-          <w:p>
-            <w:pPr>
-              <w:jc w:val="left"/>
-            </w:pPr>
-            <w:r/>
-            <w:r>
-              <w:rPr>
-                <w:b w:val="0"/>
-                <w:sz w:val="16"/>
-              </w:rPr>
-              <w:t>Does VITAL indiscriminately overturn expert positives?</w:t>
-            </w:r>
-          </w:p>
-        </w:tc>
-        <w:tc>
-          <w:tcPr>
-            <w:tcW w:type="dxa" w:w="2592"/>
-            <w:vAlign w:val="top"/>
-          </w:tcPr>
-          <w:p>
-            <w:pPr>
-              <w:jc w:val="left"/>
-            </w:pPr>
-            <w:r/>
-            <w:r>
-              <w:rPr>
-                <w:b w:val="0"/>
-                <w:sz w:val="16"/>
-              </w:rPr>
-              <w:t>69/73 evaluable expert-curated positives (94.5%) remained VITAL_OK or review-level.</w:t>
-            </w:r>
-          </w:p>
-        </w:tc>
-        <w:tc>
-          <w:tcPr>
-            <w:tcW w:type="dxa" w:w="2592"/>
-            <w:vAlign w:val="top"/>
-          </w:tcPr>
-          <w:p>
-            <w:pPr>
-              <w:jc w:val="left"/>
-            </w:pPr>
-            <w:r/>
-            <w:r>
-              <w:rPr>
-                <w:b w:val="0"/>
-                <w:sz w:val="16"/>
-              </w:rPr>
-              <w:t>Expert truth is mostly preserved.</w:t>
-            </w:r>
-          </w:p>
-        </w:tc>
-      </w:tr>
-      <w:tr>
-        <w:tc>
-          <w:tcPr>
-            <w:tcW w:type="dxa" w:w="2592"/>
-            <w:vAlign w:val="top"/>
-          </w:tcPr>
-          <w:p>
-            <w:pPr>
-              <w:jc w:val="left"/>
-            </w:pPr>
-            <w:r/>
-            <w:r>
-              <w:rPr>
-                <w:b w:val="0"/>
-                <w:sz w:val="16"/>
-              </w:rPr>
-              <w:t>Hard-conflict behavior</w:t>
-            </w:r>
-          </w:p>
-        </w:tc>
-        <w:tc>
-          <w:tcPr>
-            <w:tcW w:type="dxa" w:w="2592"/>
-            <w:vAlign w:val="top"/>
-          </w:tcPr>
-          <w:p>
-            <w:pPr>
-              <w:jc w:val="left"/>
-            </w:pPr>
-            <w:r/>
-            <w:r>
-              <w:rPr>
-                <w:b w:val="0"/>
-                <w:sz w:val="16"/>
-              </w:rPr>
-              <w:t>Is the severe alert burden low in expert positives?</w:t>
-            </w:r>
-          </w:p>
-        </w:tc>
-        <w:tc>
-          <w:tcPr>
-            <w:tcW w:type="dxa" w:w="2592"/>
-            <w:vAlign w:val="top"/>
-          </w:tcPr>
-          <w:p>
-            <w:pPr>
-              <w:jc w:val="left"/>
-            </w:pPr>
-            <w:r/>
-            <w:r>
-              <w:rPr>
-                <w:b w:val="0"/>
-                <w:sz w:val="16"/>
-              </w:rPr>
-              <w:t>4/73 evaluable expert-curated positives (5.5%) entered MODEL_CONFLICT.</w:t>
-            </w:r>
-          </w:p>
-        </w:tc>
-        <w:tc>
-          <w:tcPr>
-            <w:tcW w:type="dxa" w:w="2592"/>
-            <w:vAlign w:val="top"/>
-          </w:tcPr>
-          <w:p>
-            <w:pPr>
-              <w:jc w:val="left"/>
-            </w:pPr>
-            <w:r/>
-            <w:r>
-              <w:rPr>
-                <w:b w:val="0"/>
-                <w:sz w:val="16"/>
-              </w:rPr>
-              <w:t>Hard model-conflict routing is uncommon.</w:t>
-            </w:r>
-          </w:p>
-        </w:tc>
-      </w:tr>
-      <w:tr>
-        <w:tc>
-          <w:tcPr>
-            <w:tcW w:type="dxa" w:w="2592"/>
-            <w:vAlign w:val="top"/>
-          </w:tcPr>
-          <w:p>
-            <w:pPr>
-              <w:jc w:val="left"/>
-            </w:pPr>
-            <w:r/>
-            <w:r>
-              <w:rPr>
-                <w:b w:val="0"/>
-                <w:sz w:val="16"/>
-              </w:rPr>
               <w:t>B/LB controls</w:t>
             </w:r>
           </w:p>
@@ -3130,6 +3490,84 @@
                 <w:sz w:val="16"/>
               </w:rPr>
               <w:t>VITAL detects model incompatibility, not pathogenicity status.</w:t>
+            </w:r>
+          </w:p>
+        </w:tc>
+      </w:tr>
+      <w:tr>
+        <w:tc>
+          <w:tcPr>
+            <w:tcW w:type="dxa" w:w="2592"/>
+            <w:vAlign w:val="top"/>
+          </w:tcPr>
+          <w:p>
+            <w:pPr>
+              <w:jc w:val="left"/>
+            </w:pPr>
+            <w:r/>
+            <w:r>
+              <w:rPr>
+                <w:b w:val="0"/>
+                <w:sz w:val="16"/>
+              </w:rPr>
+              <w:t>Published case reconstructions</w:t>
+            </w:r>
+          </w:p>
+        </w:tc>
+        <w:tc>
+          <w:tcPr>
+            <w:tcW w:type="dxa" w:w="2592"/>
+            <w:vAlign w:val="top"/>
+          </w:tcPr>
+          <w:p>
+            <w:pPr>
+              <w:jc w:val="left"/>
+            </w:pPr>
+            <w:r/>
+            <w:r>
+              <w:rPr>
+                <w:b w:val="0"/>
+                <w:sz w:val="16"/>
+              </w:rPr>
+              <w:t>Do routes map onto real clinical interpretation modes?</w:t>
+            </w:r>
+          </w:p>
+        </w:tc>
+        <w:tc>
+          <w:tcPr>
+            <w:tcW w:type="dxa" w:w="2592"/>
+            <w:vAlign w:val="top"/>
+          </w:tcPr>
+          <w:p>
+            <w:pPr>
+              <w:jc w:val="left"/>
+            </w:pPr>
+            <w:r/>
+            <w:r>
+              <w:rPr>
+                <w:b w:val="0"/>
+                <w:sz w:val="16"/>
+              </w:rPr>
+              <w:t>Six portability modes were reconstructed from arrhythmia case reports.</w:t>
+            </w:r>
+          </w:p>
+        </w:tc>
+        <w:tc>
+          <w:tcPr>
+            <w:tcW w:type="dxa" w:w="2592"/>
+            <w:vAlign w:val="top"/>
+          </w:tcPr>
+          <w:p>
+            <w:pPr>
+              <w:jc w:val="left"/>
+            </w:pPr>
+            <w:r/>
+            <w:r>
+              <w:rPr>
+                <w:b w:val="0"/>
+                <w:sz w:val="16"/>
+              </w:rPr>
+              <w:t>VITAL routes are clinically interpretable, not only simulated states.</w:t>
             </w:r>
           </w:p>
         </w:tc>
@@ -3216,12 +3654,7 @@
     <w:p/>
     <w:p>
       <w:r>
-        <w:t>The expert-curated arrhythmia subset in the current GRCh38 snapshot was small (17 variants total; 9 P/LP and 8 B/LB, concentrated in KCNQ1), so it is not treated as a standalone burden estimate. Its purpose is calibration: CHECK_POPMAX functions primarily as a refinement layer, while rare MODEL_CONFLICT cases define candidates for targeted review rather than broad disagreement with expert classification.</w:t>
-      </w:r>
-    </w:p>
-    <w:p>
-      <w:r>
-        <w:t>This validation architecture is sufficient for the manuscript's claim because the claim is routing, not final clinical adjudication. A larger blinded ClinGen/ClinVar expert-panel validation set would be the natural next external benchmark, but the current data already show that VITAL preserves most expert-curated positives while interrupting label-driven direct-actionability workflows.</w:t>
+        <w:t>This validation architecture is sufficient for the manuscript's claim because the claim is routing, not final clinical adjudication. A larger blinded external validation set would be the natural next benchmark, but the current data already show that VITAL interrupts label-driven direct-actionability workflows while preserving explicit routes for review, model repair, and evaluability-limited deferral.</w:t>
       </w:r>
     </w:p>
     <w:p>
@@ -3229,22 +3662,80 @@
         <w:pStyle w:val="Heading2"/>
       </w:pPr>
       <w:r>
-        <w:t>11. Autopsy x de novo Audit Shows How de novo Can Amplify False Causal Attribution</w:t>
+        <w:t>11. Clinical Reconstruction of Label Portability</w:t>
       </w:r>
     </w:p>
     <w:p>
       <w:r>
-        <w:t>In the phenotype-null negative-autopsy simulation, the label-driven baseline frequently converted P/LP status into causal attribution. It assigned 9,348 causal explanations, of which 7,975 were false under the simulated ground-truth disease model (85.3%). On denominator-based metrics, the baseline per-case false attribution rate was 79.8% (7,975/10,000), and the per-evaluable-case false attribution rate was 69.6% (2,540/3,648). Confirmed de novo status further increased baseline confidence, generating 371 de novo override errors.</w:t>
+        <w:t>To connect the routing framework to real clinical interpretation, we reconstructed a set of published arrhythmia case reports as variant-model-action objects rather than as patient-level outcome claims. Each reconstruction mapped the observed genotype to its current public label, the disease model asserted or implied in the report, the clinical action context, and the resulting VITAL route.</w:t>
       </w:r>
     </w:p>
     <w:p>
       <w:r>
-        <w:t>VITAL substantially reduced false causal attribution by reallocating unsupported genetic explanations into CHECK_MODEL, CHECK_POPMAX, EVAL_LIMITED, or MODEL_CONFLICT routes. VITAL supported only 48 causal attributions, of which 10 were false (20.8%), and prevented 7,965 baseline false attributions. The corresponding VITAL per-case false attribution rate was 0.1% (10/10,000), and the per-evaluable-case false attribution rate was 0.27% (10/3,648). Across all cases, VITAL routes were EVAL_LIMITED 61.9%, CHECK_MODEL 9.5%, CHECK_POPMAX 4.8%, and MODEL_CONFLICT 9.0%. Among evaluable cases, the same breakdown was EVAL_LIMITED 0.0%, CHECK_MODEL 26.1%, CHECK_POPMAX 13.1%, and MODEL_CONFLICT 24.6%. Among confirmed de novo cases, VITAL supported 48, routed 361 to CHECK/DEFER, and blocked 47 as MODEL_CONFLICT. De novo status therefore acted as supportive evidence only when the disease model remained coherent.</w:t>
+        <w:t>Each case was processed through the VITAL routing logic: (1) assignment of the label-driven baseline, (2) allele-level evaluability check, (3) ancestry-aware frequency constraint, (4) disease-model compatibility assessment, and (5) final route assignment.</w:t>
       </w:r>
     </w:p>
     <w:p>
       <w:r>
-        <w:t>Gold-standard dominant positives were preserved: 42/42 empirical GoF/DN AF-compatible P/LP controls remained VITAL_OK and 0 entered MODEL_CONFLICT. A conflicting-ClinVar layer stayed outside the P/LP baseline rather than being forced into model-conflict routing, supporting the interpretation that VITAL is a routing layer rather than a pathogenicity detector.</w:t>
+        <w:t>These reconstructions do not evaluate outcomes; they evaluate whether causal interpretation remains coherent once constraints are restored.</w:t>
+      </w:r>
+    </w:p>
+    <w:p>
+      <w:r>
+        <w:t>The cases separated into six clinically interpretable portability modes. First, preservation controls showed that VITAL does not interrupt actionability when the variant, disease model, and clinical context remain aligned. SCN5A p.Asp1790Gly and KCNH2 p.Ala614Val both illustrate preserved interpretability: the public P/LP label can remain actionable, but only within the correct dominant arrhythmia model and management context.</w:t>
+      </w:r>
+    </w:p>
+    <w:p>
+      <w:r>
+        <w:t>Second, model compression was illustrated by KCNQ1 p.Thr322Met. The same pathogenic label is not equivalent across homozygous Jervell-Lange-Nielsen syndrome, heterozygous Romano-Ward-like disease, borderline QTc, and unaffected carrier states. VITAL therefore routes flattened reuse of the label to CHECK_MODEL unless zygosity and inheritance are preserved.</w:t>
+      </w:r>
+    </w:p>
+    <w:p>
+      <w:r>
+        <w:t>Third, population conflict was represented by SCN5A p.Arg1193Gln. This variant functions as a historical portability failure control: older case-based disease claims become incoherent when ancestry-aware population frequency is restored. Under an unqualified dominant high-penetrance model, VITAL would route the historical claim to MODEL_CONFLICT, while recognizing that there is no current P/LP baseline.</w:t>
+      </w:r>
+    </w:p>
+    <w:p>
+      <w:r>
+        <w:t>Fourth, event-genotype dissociation was illustrated by KCNH2 p.Arg356Cys. The case involved clinically meaningful drug-induced QT prolongation, but the variant remains a VUS. VITAL would not convert a drug-triggered clinical event into portable hereditary P/LP actionability without additional evidence.</w:t>
+      </w:r>
+    </w:p>
+    <w:p>
+      <w:r>
+        <w:t>Fifth, evaluability failure was captured by the KCNQ1 large duplication case. Because copy-number variants cannot be interpreted through ordinary SNV/indel allele-frequency matching, VITAL routes this case to EVAL_LIMITED or SV_BLOCKED pending copy-number-aware interpretation.</w:t>
+      </w:r>
+    </w:p>
+    <w:p>
+      <w:r>
+        <w:t>Sixth, functional rescue was illustrated by RYR2 c.1006-44_1007delinsATTTTG. If allele-level population evaluability is limited, VITAL defers rather than rejects; in this case, segregation and RNA evidence provide orthogonal support that can restore model-specific CPVT actionability.</w:t>
+      </w:r>
+    </w:p>
+    <w:p>
+      <w:r>
+        <w:t>The point is not that VITAL assigns a binary truth value to each report. Rather, it reconstructs whether a public label can travel from "variant observed in a case" to "actionable causal object" without losing the disease model, inheritance state, allele-frequency constraint, or evidentiary basis that made the interpretation coherent in the first place.</w:t>
+      </w:r>
+    </w:p>
+    <w:p>
+      <w:pPr>
+        <w:pStyle w:val="Heading2"/>
+      </w:pPr>
+      <w:r>
+        <w:t>12. Autopsy x de novo Audit Shows How de novo Can Amplify False Causal Attribution</w:t>
+      </w:r>
+    </w:p>
+    <w:p>
+      <w:r>
+        <w:t>In the phenotype-null negative-autopsy simulation, used as a secondary stress test rather than clinical validation, the label-driven baseline frequently converted P/LP status into causal attribution. It assigned 9,348 causal explanations, of which 7,975 were false under the simulated ground-truth disease model (85.3%). On denominator-based metrics, the baseline per-case false attribution rate was 79.8% (7,975/10,000), and the per-evaluable-case false attribution rate was 69.6% (2,540/3,648). Confirmed de novo status further increased baseline confidence, generating 371 de novo override errors.</w:t>
+      </w:r>
+    </w:p>
+    <w:p>
+      <w:r>
+        <w:t>Under those simulated assumptions, VITAL substantially reduced false causal attribution by reallocating unsupported genetic explanations into CHECK_MODEL, CHECK_POPMAX, EVAL_LIMITED, or MODEL_CONFLICT routes. VITAL supported only 48 causal attributions, of which 10 were false (20.8%), and prevented 7,965 baseline false attributions. The corresponding VITAL per-case false attribution rate was 0.1% (10/10,000), and the per-evaluable-case false attribution rate was 0.27% (10/3,648). Across all cases, VITAL routes were EVAL_LIMITED 61.9%, CHECK_MODEL 9.5%, CHECK_POPMAX 4.8%, and MODEL_CONFLICT 9.0%. Among evaluable cases, the same breakdown was EVAL_LIMITED 0.0%, CHECK_MODEL 26.1%, CHECK_POPMAX 13.1%, and MODEL_CONFLICT 24.6%. Among confirmed de novo cases, VITAL supported 48, routed 361 to CHECK/DEFER, and blocked 47 as MODEL_CONFLICT. De novo status therefore acted as supportive evidence only when the disease model remained coherent.</w:t>
+      </w:r>
+    </w:p>
+    <w:p>
+      <w:r>
+        <w:t>A conflicting-ClinVar layer stayed outside the P/LP baseline rather than being forced into model-conflict routing, supporting the interpretation that VITAL is a routing layer rather than a pathogenicity detector.</w:t>
       </w:r>
     </w:p>
     <w:p>
@@ -3457,7 +3948,7 @@
     <w:p/>
     <w:p>
       <w:r>
-        <w:t>These results show that in negative-autopsy contexts, the principal risk is not variant classification alone but causal overextension: a flattened P/LP label, especially when reinforced by de novo status, may be promoted from classification evidence to cause-of-death explanation without sufficient model support.</w:t>
+        <w:t>This secondary audit shows how causal overextension can occur under controlled negative-autopsy assumptions; it does not estimate real-world clinical harm. Its role is to demonstrate that a flattened P/LP label, especially when reinforced by de novo status, can be promoted from classification evidence to cause-of-death explanation without sufficient model support.</w:t>
       </w:r>
     </w:p>
     <w:p>
@@ -3465,7 +3956,7 @@
         <w:pStyle w:val="Heading2"/>
       </w:pPr>
       <w:r>
-        <w:t>12. Actionability Discordance and Simulated CDS Routing</w:t>
+        <w:t>13. Actionability Discordance and Simulated CDS Routing</w:t>
       </w:r>
     </w:p>
     <w:p>
@@ -3884,7 +4375,7 @@
     <w:p/>
     <w:p>
       <w:r>
-        <w:t>In the simulated CDS layer, VITAL would interrupt 1,512/1,731 (87.3%) arrhythmia baseline direct-actionability decisions. The alert burden was mostly orange evaluability-limited alerts: 1,397/1,731 (80.7%). Yellow review alerts accounted for 114/1,731 (6.6%) and red hard model-conflict alerts for 1/1,731 (0.06%). In the high-review subset, the alert rate remained 309/365 (84.7%). A simulated VITAL alert layer would therefore interrupt most label-driven direct-actionability decisions while producing a low hard-conflict rate among expert-curated evaluable positives.</w:t>
+        <w:t>In the simulated CDS layer, VITAL would interrupt 1,512/1,731 (87.3%) arrhythmia baseline direct-actionability decisions. The alert burden was mostly orange evaluability-limited alerts: 1,397/1,731 (80.7%). Yellow review alerts accounted for 114/1,731 (6.6%) and red hard model-conflict alerts for 1/1,731 (0.06%). In the high-review subset, the alert rate remained 309/365 (84.7%). A simulated VITAL alert layer would therefore interrupt most label-driven direct-actionability decisions while keeping hard model-conflict alerts rare.</w:t>
       </w:r>
     </w:p>
     <w:p>
@@ -3944,7 +4435,7 @@
         <w:pStyle w:val="Heading2"/>
       </w:pPr>
       <w:r>
-        <w:t>13. Repair Logic Separates Pathogenicity, Evaluability, and Actionability</w:t>
+        <w:t>14. Repair Logic Separates Pathogenicity, Evaluability, and Actionability</w:t>
       </w:r>
     </w:p>
     <w:p>
@@ -4390,12 +4881,12 @@
         <w:pStyle w:val="Heading2"/>
       </w:pPr>
       <w:r>
-        <w:t>Decomposition Is Mechanistically Determined, Not Database Noise</w:t>
+        <w:t>In the Evaluable Subset, Decomposition Is Mechanism-Structured</w:t>
       </w:r>
     </w:p>
     <w:p>
       <w:r>
-        <w:t>The molecular mechanism findings sharpen the interpretation of the regime structure. GoF and dominant-negative genes show 0% decomposition at MCAF thresholds &gt;= 2.5 x 10^-5, not as a trivial result but as a positive control that supports the framework at biologically interpretable thresholds. If decomposition were a pipeline artifact or a consequence of curation error, it would affect all gene classes proportionally. Instead, it is absent where selection theory predicts it should be absent and present in proportion to how much constraint is relaxed in haploinsufficient and recessive genes.</w:t>
+        <w:t>The molecular mechanism findings sharpen the interpretation of the regime structure within the allele-resolved subset. GoF and dominant-negative genes show 0% decomposition at MCAF thresholds &gt;= 2.5 x 10^-5 among 34 usable-AF variants, not as a trivial result but as an internal control that supports the framework at biologically interpretable thresholds. This does not exclude higher or lower decomposition in the non-evaluable GoF/DN majority. Instead, it means that where allele-level population evidence is available, decomposition is absent where selection theory predicts it should be absent and present in proportion to how much constraint is relaxed in haploinsufficient and recessive genes.</w:t>
       </w:r>
     </w:p>
     <w:p>
@@ -4465,7 +4956,7 @@
     </w:p>
     <w:p>
       <w:r>
-        <w:t>First, all exome disease-model conclusions are restricted to the 334 Tier 1 variants with usable allele-resolved AF. The unevaluable majority cannot be assumed to follow the same regime structure. Because Tier 1 was enriched for SNVs and depleted of indels and duplications relative to Tier 2, direct extrapolation across variant classes would be inappropriate.</w:t>
+        <w:t>First, all exome disease-model conclusions are restricted to the 334 Tier 1 variants with usable allele-resolved AF. The unevaluable majority cannot be assumed to follow the same regime structure. Because Tier 1 was enriched for SNVs and depleted of indels and duplications relative to Tier 2, direct extrapolation across variant classes would be inappropriate. The 0/34 GoF/DN decomposition result is therefore a statement about evaluable GoF/DN SNVs, not about all GoF/DN assertions.</w:t>
       </w:r>
     </w:p>
     <w:p>
@@ -4485,7 +4976,7 @@
     </w:p>
     <w:p>
       <w:r>
-        <w:t>Fifth, the 1 x 10^-5 trigger used in the exome screening layer is operational rather than ontological. The qualitative result, especially the large popmax gain over global AF, was stable across a broad threshold range, but absolute alert counts depend on the screening threshold selected.</w:t>
+        <w:t>Fifth, the 1 x 10^-5 trigger used in the exome screening layer is operational rather than ontological. The qualitative result, especially the large popmax gain over global AF, was stable across a broad threshold range, but absolute alert counts depend on the screening threshold selected. The MCAF ceilings are disease-model stress parameters, not universal pathogenicity cutoffs; clinical deployment should recalibrate them by gene, disease prevalence, penetrance, allelic contribution, and ascertainment context.</w:t>
       </w:r>
     </w:p>
     <w:p>
@@ -4518,44 +5009,6 @@
         <w:pStyle w:val="Heading1"/>
       </w:pPr>
       <w:r>
-        <w:t>Governance Implications</w:t>
-      </w:r>
-    </w:p>
-    <w:p>
-      <w:r>
-        <w:t>Four governance-relevant conclusions follow from the evaluable-subset analysis and from the structural limits observed in the non-evaluable majority.</w:t>
-      </w:r>
-    </w:p>
-    <w:p>
-      <w:r>
-        <w:t>First, population-structured frequency review, including popmax or an equivalent ancestry-aware maximum, should be treated as a minimum evidence layer in inherited arrhythmia variant review workflows whenever the asserted allele is population-evaluable. In this study, global-only screening missed 88.7% of ancestry-aware frequency alerts within the Tier 1 usable-AF subset, and 103 of those alerts occurred in potentially consequential interpretation contexts. Omitting popmax in such settings is not a small methodological omission; it is a systematic failure to apply available population constraint where such constraint is actually available.</w:t>
-      </w:r>
-    </w:p>
-    <w:p>
-      <w:r>
-        <w:t>Second, public assertions intended for downstream reuse should carry at least four additional fields alongside pathogenicity category: the disease-state model being asserted, including inheritance class and penetrance logic; the population evaluability tier of the asserted allele; the allele count supporting any cited population signal, together with explicit acknowledgment of low-count uncertainty; and a coverage-aware negative-lookup status distinguishing true absence from representation failure or non-callable context. These additions do not require a new pathogenicity framework. They operationalize information that downstream users already need but that the flattened public label does not currently preserve.</w:t>
-      </w:r>
-    </w:p>
-    <w:p>
-      <w:r>
-        <w:t>Third, downstream users should not equate locus-context stress with allele-level proof. For indels, duplications, splice-disrupting variants, and other representation-sensitive classes, non-observation and same-position overlap are properties of representation before they are properties of biology. Evaluability metadata, and eventually coverage-aware negative lookup, must therefore remain conceptually distinct from pathogenicity classification.</w:t>
-      </w:r>
-    </w:p>
-    <w:p>
-      <w:r>
-        <w:t>Fourth, downstream users should adopt a four-step population-constrained interpretation workflow as a minimum standard for any application that imports public P/LP labels: determine evaluability tier for the asserted allele; apply ancestry-aware frequency constraint using popmax alongside global AF and preserve negative-lookup uncertainty where callability is unresolved; classify disease-model regime; and require explicit disease-model specification before downstream action. This workflow does not replace expert clinical judgment; it operationalizes a measurable failure mode in downstream reuse.</w:t>
-      </w:r>
-    </w:p>
-    <w:p>
-      <w:r>
-        <w:t>The repository implementation adds two practical governance layers: a simulated CDS alert layer and a minimal repair table. The alert layer converts CHECK_POPMAX and CHECK_MODEL into review alerts, EVAL_LIMITED into deferral alerts, and MODEL_CONFLICT into model-conflict alerts. The repair table converts each nonpass route into an explicit next step rather than a vague warning.</w:t>
-      </w:r>
-    </w:p>
-    <w:p>
-      <w:pPr>
-        <w:pStyle w:val="Heading1"/>
-      </w:pPr>
-      <w:r>
         <w:t>Conclusion</w:t>
       </w:r>
     </w:p>
@@ -4566,7 +5019,7 @@
     </w:p>
     <w:p>
       <w:r>
-        <w:t>Within the evaluable subset, exported P/LP labels did not behave as portable disease-state claims. The same label could remain compatible with a dominant high-penetrance model, trigger ancestry-aware review, or become incompatible with that tested model depending on mechanism and population resolution.</w:t>
+        <w:t>Within the evaluable subset, exported P/LP labels did not behave as portable disease-state claims. The same label could remain compatible with a dominant high-penetrance model, trigger ancestry-aware review, or become incompatible with that tested model depending on mechanism and population resolution. Outside that subset, the main conclusion is not a mechanism-specific decomposition rate but a transportability failure: the label cannot be treated as population-compatible because allele-level population constraint was not evaluable.</w:t>
       </w:r>
     </w:p>
     <w:p>
@@ -4576,7 +5029,7 @@
     </w:p>
     <w:p>
       <w:r>
-        <w:t>When translated into actionability routing, the same structural problem becomes operationally measurable. In the arrhythmia cohort, 1,512/1,731 label-driven direct-actionability decisions required rerouting; across six domains, the mean nonpass rate was 87.7%. Expert-curated evaluable positives were mostly preserved as VITAL_OK or review-level, with only 4/73 hard model conflicts.</w:t>
+        <w:t>When translated into actionability routing, the same structural problem becomes operationally measurable. In the arrhythmia cohort, 1,512/1,731 label-driven direct-actionability decisions required rerouting, but the majority were EVAL_LIMITED deferrals rather than evidence conflicts. Across six domains, the mean nonpass rate was 87.7%, interpreted as structural recurrence of portability burden rather than a calibrated burden estimate for each disease.</w:t>
       </w:r>
     </w:p>
     <w:p>

</xml_diff>